<commit_message>
Update Thesis_Report_English.docx and remove temporary file
</commit_message>
<xml_diff>
--- a/my_report/Thesis_FR.docx
+++ b/my_report/Thesis_FR.docx
@@ -143,7 +143,7 @@
                 <v:stroke joinstyle="miter"/>
                 <v:path gradientshapeok="t" o:connecttype="rect"/>
               </v:shapetype>
-              <v:shape id="Zone de texte 2" o:spid="_x0000_s1026" type="#_x0000_t202" style="position:absolute;left:0;text-align:left;margin-left:166.15pt;margin-top:14.45pt;width:294pt;height:66pt;z-index:251660288;visibility:visible;mso-wrap-style:square;mso-width-percent:0;mso-height-percent:0;mso-wrap-distance-left:9pt;mso-wrap-distance-top:3.6pt;mso-wrap-distance-right:9pt;mso-wrap-distance-bottom:3.6pt;mso-position-horizontal:absolute;mso-position-horizontal-relative:text;mso-position-vertical:absolute;mso-position-vertical-relative:text;mso-width-percent:0;mso-height-percent:0;mso-width-relative:margin;mso-height-relative:margin;v-text-anchor:middle" o:gfxdata="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" stroked="f">
+              <v:shape id="Zone de texte 2" o:spid="_x0000_s1026" type="#_x0000_t202" style="position:absolute;left:0;text-align:left;margin-left:166.15pt;margin-top:14.45pt;width:294pt;height:66pt;z-index:251660288;visibility:visible;mso-wrap-style:square;mso-width-percent:0;mso-height-percent:0;mso-wrap-distance-left:9pt;mso-wrap-distance-top:3.6pt;mso-wrap-distance-right:9pt;mso-wrap-distance-bottom:3.6pt;mso-position-horizontal:absolute;mso-position-horizontal-relative:text;mso-position-vertical:absolute;mso-position-vertical-relative:text;mso-width-percent:0;mso-height-percent:0;mso-width-relative:margin;mso-height-relative:margin;v-text-anchor:middle" o:gfxdata="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" stroked="f">
                 <v:textbox>
                   <w:txbxContent>
                     <w:p>
@@ -734,9 +734,6 @@
       </w:pPr>
       <w:bookmarkStart w:id="1" w:name="_Toc231042689"/>
       <w:r>
-        <w:rPr>
-          <w:lang w:val="en-IN"/>
-        </w:rPr>
         <w:lastRenderedPageBreak/>
         <w:t>M</w:t>
       </w:r>
@@ -748,25 +745,13 @@
         <w:t xml:space="preserve"> </w:t>
       </w:r>
     </w:p>
-    <w:p>
-      <w:pPr>
-        <w:rPr>
-          <w:lang w:val="en-IN"/>
-        </w:rPr>
-      </w:pPr>
-    </w:p>
+    <w:p/>
     <w:p>
       <w:pPr>
         <w:spacing w:after="160" w:line="278" w:lineRule="auto"/>
         <w:jc w:val="left"/>
-        <w:rPr>
-          <w:lang w:val="en-IN"/>
-        </w:rPr>
-      </w:pPr>
-      <w:r>
-        <w:rPr>
-          <w:lang w:val="en-IN"/>
-        </w:rPr>
+      </w:pPr>
+      <w:r>
         <w:br w:type="page"/>
       </w:r>
     </w:p>
@@ -785,14 +770,8 @@
       <w:pPr>
         <w:spacing w:after="160" w:line="278" w:lineRule="auto"/>
         <w:jc w:val="left"/>
-        <w:rPr>
-          <w:lang/>
-        </w:rPr>
-      </w:pPr>
-      <w:r>
-        <w:rPr>
-          <w:lang/>
-        </w:rPr>
+      </w:pPr>
+      <w:r>
         <w:br w:type="page"/>
       </w:r>
     </w:p>
@@ -2437,7 +2416,6 @@
           <w:color w:val="501549" w:themeColor="accent5" w:themeShade="80"/>
           <w:sz w:val="32"/>
         </w:rPr>
-        <w:lastRenderedPageBreak/>
         <w:fldChar w:fldCharType="end"/>
       </w:r>
     </w:p>
@@ -2456,9 +2434,6 @@
     <w:p>
       <w:pPr>
         <w:pStyle w:val="Heading1"/>
-        <w:rPr>
-          <w:lang w:val="en-IN"/>
-        </w:rPr>
       </w:pPr>
       <w:bookmarkStart w:id="7" w:name="_Toc231042695"/>
       <w:r>
@@ -2479,7 +2454,7 @@
         <w:fldChar w:fldCharType="begin"/>
       </w:r>
       <w:r>
-        <w:instrText xml:space="preserve"> ADDIN ZOTERO_ITEM CSL_CITATION {"citationID":"ij8hBw3g","properties":{"unsorted":false,"formattedCitation":"(Richards &amp; Rodgers, 2014)","plainCitation":"(Richards &amp; Rodgers, 2014)","noteIndex":0},"citationItems":[{"id":149,"uris":["http://zotero.org/users/18489330/items/AVDZ9PE3"],"itemData":{"id":149,"type":"book","abstract":"This third edition of Approaches and Methods in Language Teaching is an extensive revision of the popular and accessible text. Like previous editions, this book surveys the major approaches and methods in language teaching such as Grammar Translation, Audiolingualism, Communicative Language Teaching, and the Natural Approach. It examines each approach and method in terms of its theory of language and language learning, goals, syllabus, teaching activities, teacher and learner roles, materials, and classroom techniques. --","ISBN":"978-1-107-67596-4","language":"en","note":"Google-Books-ID: HrhkAwAAQBAJ","number-of-pages":"421","publisher":"Cambridge University Press","source":"Google Books","title":"Approaches and Methods in Language Teaching","author":[{"family":"Richards","given":"Jack C."},{"family":"Rodgers","given":"Theodore S."}],"issued":{"date-parts":[["2014",4,16]]}}}],"schema":"https://github.com/citation-style-language/schema/raw/master/csl-citation.json"} </w:instrText>
+        <w:instrText xml:space="preserve"> ADDIN ZOTERO_ITEM CSL_CITATION {"citationID":"r6QOqkDR","properties":{"unsorted":false,"formattedCitation":"(Richards &amp; Rodgers, 2014)","plainCitation":"(Richards &amp; Rodgers, 2014)","noteIndex":0},"citationItems":[{"id":149,"uris":["http://zotero.org/users/18489330/items/AVDZ9PE3"],"itemData":{"id":149,"type":"book","abstract":"This third edition of Approaches and Methods in Language Teaching is an extensive revision of the popular and accessible text. Like previous editions, this book surveys the major approaches and methods in language teaching such as Grammar Translation, Audiolingualism, Communicative Language Teaching, and the Natural Approach. It examines each approach and method in terms of its theory of language and language learning, goals, syllabus, teaching activities, teacher and learner roles, materials, and classroom techniques. --","ISBN":"978-1-107-67596-4","language":"en","note":"Google-Books-ID: HrhkAwAAQBAJ","number-of-pages":"421","publisher":"Cambridge University Press","source":"Google Books","title":"Approaches and Methods in Language Teaching","author":[{"family":"Richards","given":"Jack C."},{"family":"Rodgers","given":"Theodore S."}],"issued":{"date-parts":[["2014",4,16]]}}}],"schema":"https://github.com/citation-style-language/schema/raw/master/csl-citation.json"} </w:instrText>
       </w:r>
       <w:r>
         <w:fldChar w:fldCharType="separate"/>
@@ -2494,7 +2469,7 @@
         <w:fldChar w:fldCharType="end"/>
       </w:r>
       <w:r>
-        <w:t xml:space="preserve">. </w:t>
+        <w:t>.</w:t>
       </w:r>
     </w:p>
     <w:p>
@@ -5617,9 +5592,6 @@
         <w:t>Interférences /Discussions</w:t>
       </w:r>
       <w:r>
-        <w:rPr>
-          <w:lang w:val="en-IN"/>
-        </w:rPr>
         <w:t xml:space="preserve"> </w:t>
       </w:r>
       <w:r>
@@ -5631,25 +5603,10 @@
       </w:r>
     </w:p>
     <w:p/>
-    <w:p>
-      <w:pPr>
-        <w:pStyle w:val="Heading1"/>
-      </w:pPr>
-      <w:bookmarkStart w:id="15" w:name="_Toc231042703"/>
-      <w:r>
-        <w:lastRenderedPageBreak/>
-        <w:t>Conclusions</w:t>
-      </w:r>
-      <w:bookmarkEnd w:id="15"/>
-      <w:r>
-        <w:t xml:space="preserve"> </w:t>
-      </w:r>
-    </w:p>
-    <w:p/>
-    <w:bookmarkStart w:id="16" w:name="_Toc231042704" w:displacedByCustomXml="next"/>
+    <w:bookmarkStart w:id="15" w:name="_Toc231042703" w:displacedByCustomXml="next"/>
     <w:sdt>
       <w:sdtPr>
-        <w:id w:val="-986327273"/>
+        <w:id w:val="1241443526"/>
         <w:docPartObj>
           <w:docPartGallery w:val="Bibliographies"/>
           <w:docPartUnique/>
@@ -5663,7 +5620,6 @@
           <w:kern w:val="0"/>
           <w:sz w:val="24"/>
           <w:szCs w:val="22"/>
-          <w:lang w:val="fr-FR"/>
           <w14:ligatures w14:val="none"/>
         </w:rPr>
       </w:sdtEndPr>
@@ -5675,99 +5631,54 @@
           <w:r>
             <w:t>Bibliography</w:t>
           </w:r>
-          <w:bookmarkEnd w:id="16"/>
         </w:p>
         <w:sdt>
           <w:sdtPr>
             <w:id w:val="111145805"/>
+            <w:showingPlcHdr/>
             <w:bibliography/>
           </w:sdtPr>
           <w:sdtContent>
             <w:p>
-              <w:pPr>
-                <w:rPr>
-                  <w:lang w:val="en-IN"/>
-                </w:rPr>
-              </w:pPr>
               <w:r>
-                <w:fldChar w:fldCharType="begin"/>
-              </w:r>
-              <w:r>
-                <w:rPr>
-                  <w:lang w:val="en-IN"/>
-                </w:rPr>
-                <w:instrText xml:space="preserve"> BIBLIOGRAPHY </w:instrText>
-              </w:r>
-              <w:r>
-                <w:fldChar w:fldCharType="separate"/>
-              </w:r>
-              <w:r>
-                <w:rPr>
-                  <w:b/>
-                  <w:bCs/>
-                  <w:noProof/>
-                  <w:lang w:val="en-US"/>
-                </w:rPr>
-                <w:t>There are no sources in the current document.</w:t>
-              </w:r>
-              <w:r>
-                <w:rPr>
-                  <w:b/>
-                  <w:bCs/>
-                  <w:noProof/>
-                </w:rPr>
-                <w:fldChar w:fldCharType="end"/>
+                <w:t xml:space="preserve">     </w:t>
               </w:r>
             </w:p>
           </w:sdtContent>
         </w:sdt>
       </w:sdtContent>
     </w:sdt>
-    <w:p>
-      <w:pPr>
-        <w:rPr>
-          <w:lang w:val="en-IN"/>
-        </w:rPr>
-      </w:pPr>
-    </w:p>
-    <w:p>
-      <w:pPr>
-        <w:rPr>
-          <w:lang w:val="en-IN"/>
-        </w:rPr>
-      </w:pPr>
-    </w:p>
-    <w:p>
-      <w:pPr>
-        <w:rPr>
-          <w:lang w:val="en-IN"/>
-        </w:rPr>
-      </w:pPr>
-    </w:p>
-    <w:p>
-      <w:pPr>
-        <w:rPr>
-          <w:lang w:val="en-IN"/>
-        </w:rPr>
-      </w:pPr>
-    </w:p>
-    <w:p>
-      <w:pPr>
-        <w:rPr>
-          <w:lang w:val="en-IN"/>
-        </w:rPr>
-      </w:pPr>
-    </w:p>
+    <w:p/>
     <w:p>
       <w:pPr>
         <w:pStyle w:val="Heading1"/>
       </w:pPr>
-      <w:bookmarkStart w:id="17" w:name="_Toc231042705"/>
+      <w:r>
+        <w:lastRenderedPageBreak/>
+        <w:t>Conclusions</w:t>
+      </w:r>
+      <w:bookmarkEnd w:id="15"/>
+      <w:r>
+        <w:t xml:space="preserve"> </w:t>
+      </w:r>
+    </w:p>
+    <w:p/>
+    <w:p/>
+    <w:p/>
+    <w:p/>
+    <w:p/>
+    <w:p/>
+    <w:p/>
+    <w:p>
+      <w:pPr>
+        <w:pStyle w:val="Heading1"/>
+      </w:pPr>
+      <w:bookmarkStart w:id="16" w:name="_Toc231042705"/>
       <w:r>
         <w:lastRenderedPageBreak/>
         <w:t>Index</w:t>
       </w:r>
-      <w:bookmarkEnd w:id="17"/>
+      <w:bookmarkEnd w:id="16"/>
       <w:r>
         <w:t xml:space="preserve"> </w:t>
       </w:r>
@@ -5777,12 +5688,12 @@
       <w:pPr>
         <w:pStyle w:val="Heading1"/>
       </w:pPr>
-      <w:bookmarkStart w:id="18" w:name="_Toc231042706"/>
+      <w:bookmarkStart w:id="17" w:name="_Toc231042706"/>
       <w:r>
         <w:lastRenderedPageBreak/>
         <w:t>Tables des Illustrations</w:t>
       </w:r>
-      <w:bookmarkEnd w:id="18"/>
+      <w:bookmarkEnd w:id="17"/>
       <w:r>
         <w:t xml:space="preserve"> </w:t>
       </w:r>
@@ -5806,12 +5717,12 @@
       <w:pPr>
         <w:pStyle w:val="Heading1"/>
       </w:pPr>
-      <w:bookmarkStart w:id="19" w:name="_Toc231042707"/>
+      <w:bookmarkStart w:id="18" w:name="_Toc231042707"/>
       <w:r>
         <w:lastRenderedPageBreak/>
         <w:t>Annexes</w:t>
       </w:r>
-      <w:bookmarkEnd w:id="19"/>
+      <w:bookmarkEnd w:id="18"/>
       <w:r>
         <w:t xml:space="preserve"> </w:t>
       </w:r>
@@ -6422,7 +6333,7 @@
         <w:kern w:val="2"/>
         <w:sz w:val="24"/>
         <w:szCs w:val="24"/>
-        <w:lang w:eastAsia="en-US" w:bidi="ar-SA"/>
+        <w:lang w:val="en-FR" w:eastAsia="en-US" w:bidi="ar-SA"/>
         <w14:ligatures w14:val="standardContextual"/>
       </w:rPr>
     </w:rPrDefault>
@@ -6849,7 +6760,6 @@
       <w:kern w:val="2"/>
       <w:sz w:val="48"/>
       <w:szCs w:val="40"/>
-      <w:lang/>
       <w14:ligatures w14:val="standardContextual"/>
     </w:rPr>
   </w:style>
@@ -7058,7 +6968,6 @@
   <w:style w:type="character" w:default="1" w:styleId="DefaultParagraphFont">
     <w:name w:val="Default Paragraph Font"/>
     <w:uiPriority w:val="1"/>
-    <w:semiHidden/>
     <w:unhideWhenUsed/>
   </w:style>
   <w:style w:type="table" w:default="1" w:styleId="TableNormal">
@@ -7495,6 +7404,15 @@
       <w:ind w:left="480"/>
     </w:pPr>
   </w:style>
+  <w:style w:type="paragraph" w:styleId="Bibliography">
+    <w:name w:val="Bibliography"/>
+    <w:basedOn w:val="Normal"/>
+    <w:next w:val="Normal"/>
+    <w:uiPriority w:val="37"/>
+    <w:semiHidden/>
+    <w:unhideWhenUsed/>
+    <w:rsid w:val="009B1082"/>
+  </w:style>
 </w:styles>
 </file>
 
@@ -7794,11 +7712,11 @@
 </file>
 
 <file path=customXml/item1.xml><?xml version="1.0" encoding="utf-8"?>
-<b:Sources xmlns:b="http://schemas.openxmlformats.org/officeDocument/2006/bibliography" xmlns="http://schemas.openxmlformats.org/officeDocument/2006/bibliography" SelectedStyle="\APASixthEditionOfficeOnline.xsl" StyleName="APA" Version="6"/>
+<b:Sources xmlns:b="http://schemas.openxmlformats.org/officeDocument/2006/bibliography" xmlns="http://schemas.openxmlformats.org/officeDocument/2006/bibliography" SelectedStyle="/APASixthEditionOfficeOnline.xsl" StyleName="APA" Version="6"/>
 </file>
 
 <file path=customXml/itemProps1.xml><?xml version="1.0" encoding="utf-8"?>
-<ds:datastoreItem xmlns:ds="http://schemas.openxmlformats.org/officeDocument/2006/customXml" ds:itemID="{C005A963-D6D9-4C2A-B407-CC214C18387F}">
+<ds:datastoreItem xmlns:ds="http://schemas.openxmlformats.org/officeDocument/2006/customXml" ds:itemID="{5D436077-C7D7-BB4B-BF56-C9EFFC325813}">
   <ds:schemaRefs>
     <ds:schemaRef ds:uri="http://schemas.openxmlformats.org/officeDocument/2006/bibliography"/>
   </ds:schemaRefs>

</xml_diff>

<commit_message>
Lit review fin 🫠
</commit_message>
<xml_diff>
--- a/my_report/Thesis_FR.docx
+++ b/my_report/Thesis_FR.docx
@@ -174,7 +174,7 @@
                                     <pic:cNvPicPr/>
                                   </pic:nvPicPr>
                                   <pic:blipFill>
-                                    <a:blip r:embed="rId9">
+                                    <a:blip r:embed="rId8">
                                       <a:extLst>
                                         <a:ext uri="{28A0092B-C50C-407E-A947-70E740481C1C}">
                                           <a14:useLocalDpi xmlns:a14="http://schemas.microsoft.com/office/drawing/2010/main" val="0"/>
@@ -238,7 +238,7 @@
                     <pic:cNvPicPr/>
                   </pic:nvPicPr>
                   <pic:blipFill>
-                    <a:blip r:embed="rId10" cstate="print">
+                    <a:blip r:embed="rId9" cstate="print">
                       <a:extLst>
                         <a:ext uri="{28A0092B-C50C-407E-A947-70E740481C1C}">
                           <a14:useLocalDpi xmlns:a14="http://schemas.microsoft.com/office/drawing/2010/main" val="0"/>
@@ -4878,9 +4878,9 @@
     <w:p>
       <w:pPr>
         <w:sectPr>
-          <w:headerReference w:type="default" r:id="rId11"/>
-          <w:footerReference w:type="even" r:id="rId12"/>
-          <w:footerReference w:type="default" r:id="rId13"/>
+          <w:headerReference w:type="default" r:id="rId10"/>
+          <w:footerReference w:type="even" r:id="rId11"/>
+          <w:footerReference w:type="default" r:id="rId12"/>
           <w:pgSz w:w="11906" w:h="16838"/>
           <w:pgMar w:top="1440" w:right="1440" w:bottom="1440" w:left="1440" w:header="708" w:footer="708" w:gutter="0"/>
           <w:pgNumType w:chapStyle="1" w:chapSep="emDash"/>
@@ -6463,7 +6463,7 @@
                     <pic:cNvPicPr/>
                   </pic:nvPicPr>
                   <pic:blipFill>
-                    <a:blip r:embed="rId14" cstate="print">
+                    <a:blip r:embed="rId13" cstate="print">
                       <a:extLst>
                         <a:ext uri="{28A0092B-C50C-407E-A947-70E740481C1C}">
                           <a14:useLocalDpi xmlns:a14="http://schemas.microsoft.com/office/drawing/2010/main" val="0"/>
@@ -6687,6 +6687,7 @@
       </w:r>
     </w:p>
     <w:p/>
+    <w:p/>
     <w:p>
       <w:pPr>
         <w:pStyle w:val="Heading2"/>
@@ -6946,7 +6947,6 @@
         </w:numPr>
       </w:pPr>
       <w:r>
-        <w:lastRenderedPageBreak/>
         <w:t xml:space="preserve"> </w:t>
       </w:r>
       <w:bookmarkStart w:id="22" w:name="_Toc231678091"/>
@@ -7023,7 +7023,6 @@
         <w:rPr>
           <w:lang w:val="en-FR"/>
         </w:rPr>
-        <w:lastRenderedPageBreak/>
         <w:t xml:space="preserve"> </w:t>
       </w:r>
       <w:bookmarkStart w:id="23" w:name="_Toc231678092"/>
@@ -7369,7 +7368,14 @@
         <w:rPr>
           <w:lang w:val="en-FR"/>
         </w:rPr>
-        <w:t xml:space="preserve"> d’enseignants se montrent réticents à utiliser l’IA générative au vu de ses avantages malgré tout possibles. Il suffit de rappeler que ces approches ne prennent pas en compte tous les défis auxquels sont confrontés les enseignants.</w:t>
+        <w:t xml:space="preserve"> d’enseignants se montrent </w:t>
+      </w:r>
+      <w:r>
+        <w:rPr>
+          <w:lang w:val="en-FR"/>
+        </w:rPr>
+        <w:lastRenderedPageBreak/>
+        <w:t>réticents à utiliser l’IA générative au vu de ses avantages malgré tout possibles. Il suffit de rappeler que ces approches ne prennent pas en compte tous les défis auxquels sont confrontés les enseignants.</w:t>
       </w:r>
     </w:p>
     <w:p>
@@ -7378,129 +7384,132 @@
       </w:pPr>
       <w:bookmarkStart w:id="24" w:name="_Toc231678093"/>
       <w:r>
+        <w:t>Barrières et facteurs influençant l'adoption</w:t>
+      </w:r>
+      <w:bookmarkEnd w:id="24"/>
+      <w:r>
+        <w:br/>
+      </w:r>
+    </w:p>
+    <w:p>
+      <w:r>
+        <w:t>Bien que plusieurs facteurs facilitant expliquent pourquoi cette formation peut être acceptée dans ce contexte, ils ne résolvent pas la question de savoir quelles sont les difficultés que ces enseignants ont. Effectivement, ces derniers sont confrontés à des obstacles qui empêchent et limitent l'utilisation de ce modèle malgré son adaptabilité. Selon</w:t>
+      </w:r>
+      <w:r>
+        <w:fldChar w:fldCharType="begin"/>
+      </w:r>
+      <w:r>
+        <w:instrText xml:space="preserve"> ADDIN ZOTERO_ITEM CSL_CITATION {"citationID":"lyLA4LZA","properties":{"unsorted":false,"formattedCitation":"(Ertmer, 1999)","plainCitation":"(Ertmer, 1999)","dontUpdate":true,"noteIndex":0},"citationItems":[{"id":251,"uris":["http://zotero.org/users/18489330/items/H327W8UN"],"itemData":{"id":251,"type":"article-journal","abstract":"Although teachers today recognize the importance of integrating technology into their curricula, efforts are often limited by both external (first-order) and internal (second-order) barriers. Traditionally, technology training, for both preservice and inservice teachers, has focused on helping teachers overcome first-order barriers (e.g., acquiring technical skills needed to operate a computer). More recently, training programs have incorporated pedagogical models of technology use as one means of addressing second-order barriers. However, little discussion has occurred that clarifies the relationship between these different types of barriers or that delineates effective strategies for addressing different barriers. If pre- and inservice teachers are to become effective users of technology, they will need practical strategies for dealing with the different types of barriers they will face. In this paper, I discuss the relationship between first- and second-order barriers and then describe specific strategies for circumventing, overcoming, and eliminating the changing barriers teachers face as they work to achieve technology integration.","container-title":"Educational Technology Research and Development","DOI":"10.1007/BF02299597","ISSN":"1556-6501","issue":"4","journalAbbreviation":"ETR&amp;D","language":"en","page":"47-61","source":"Springer Link","title":"Addressing first- and second-order barriers to change: Strategies for technology integration","title-short":"Addressing first- and second-order barriers to change","volume":"47","author":[{"family":"Ertmer","given":"Peggy A."}],"issued":{"date-parts":[["1999",12,1]]}}}],"schema":"https://github.com/citation-style-language/schema/raw/master/csl-citation.json"} </w:instrText>
+      </w:r>
+      <w:r>
+        <w:fldChar w:fldCharType="separate"/>
+      </w:r>
+      <w:r>
+        <w:rPr>
+          <w:noProof/>
+        </w:rPr>
+        <w:t xml:space="preserve"> Ertmer (1999)</w:t>
+      </w:r>
+      <w:r>
+        <w:fldChar w:fldCharType="end"/>
+      </w:r>
+      <w:r>
+        <w:t>, il existe deux sortes d'obstacles ; le premier est externe et concerne la personne qui est touchée tandis que le second est interne à la personne.</w:t>
+      </w:r>
+    </w:p>
+    <w:p/>
+    <w:p>
+      <w:r>
+        <w:t>Il s'agit d'obstacles à l'égard desquels l'enseignant n'a rien du tout à faire étant donné qu'ils proviennent de l'extérieur et qu'ils sont imposés de façon irréductible. Nous trouvons notamment le manque de temps pour une formation, le manque de matériel adapté, la difficulté relative à la charge de travail de programmation et d'orientation institutionnelle. Cela est une grande difficulté surtout pour les enseignants de langues vivantes puisque leur charge de travail est déjà élevée.</w:t>
+      </w:r>
+    </w:p>
+    <w:p/>
+    <w:p>
+      <w:r>
+        <w:t xml:space="preserve">Obstacles internes de deuxième niveau, font référence aux obstacles internes, qui sont principalement basés sur des aspects psychologiques, culturels et professionnels </w:t>
+      </w:r>
+      <w:r>
+        <w:fldChar w:fldCharType="begin"/>
+      </w:r>
+      <w:r>
+        <w:instrText xml:space="preserve"> ADDIN ZOTERO_ITEM CSL_CITATION {"citationID":"NZMVVaTm","properties":{"unsorted":false,"formattedCitation":"(Ertmer &amp; Ottenbreit-Leftwich, 2010)","plainCitation":"(Ertmer &amp; Ottenbreit-Leftwich, 2010)","noteIndex":0},"citationItems":[{"id":263,"uris":["http://zotero.org/users/18489330/items/MCM2VCA9"],"itemData":{"id":263,"type":"article-journal","abstract":"Despite increases in computer access and technology training, technology is not being used to support the kinds of instruction believed to be most powerful. In this paper, we examine technology integration through the lens of the teacher as an agent of change: What are the necessary characteristics, or qualities, that enable teachers to leverage technology resources as meaningful pedagogical tools? To answer this question, we discuss the literature related to four variables of teacher change: knowledge, self-efficacy, pedagogical beliefs, and subject and school culture. Specifically, we propose that teachers’ mindsets must change to include the idea that “teaching is not effective without the appropriate use of information and communication technologies (ICT) resources to facilitate student learning.” Implications are discussed in terms of both teacher education and professional development programs.","container-title":"Journal of Research on Technology in Education","DOI":"10.1080/15391523.2010.10782551","ISSN":"1539-1523","issue":"3","note":"_eprint: https://doi.org/10.1080/15391523.2010.10782551","page":"255-284","publisher":"Routledge","source":"Taylor and Francis+NEJM","title":"Teacher Technology Change: How Knowledge, Confidence, Beliefs, and Culture Intersect","title-short":"Teacher Technology Change","volume":"42","author":[{"family":"Ertmer","given":"Peggy A."},{"family":"Ottenbreit-Leftwich","given":"Anne T."}],"issued":{"date-parts":[["2010",3,1]]}}}],"schema":"https://github.com/citation-style-language/schema/raw/master/csl-citation.json"} </w:instrText>
+      </w:r>
+      <w:r>
+        <w:fldChar w:fldCharType="separate"/>
+      </w:r>
+      <w:r>
+        <w:rPr>
+          <w:noProof/>
+        </w:rPr>
+        <w:t>(Ertmer &amp; Ottenbreit-Leftwich, 2010)</w:t>
+      </w:r>
+      <w:r>
+        <w:fldChar w:fldCharType="end"/>
+      </w:r>
+      <w:r>
+        <w:t xml:space="preserve">. Parmi eux on peut citer conceptions pédagogiques individuelles, </w:t>
+      </w:r>
+      <w:r>
+        <w:t>nervosité liée</w:t>
+      </w:r>
+      <w:r>
+        <w:t xml:space="preserve"> à l'utilisation de nouvelles technologies, peur de perdre sa position autoritaire et professionnelle et résistance au changement. Par exemple, en ce qui concerne l'application de l'intelligence artificielle générative dans l'apprentissage d'une nouvelle langue, l'enseignant pourra avoir des inquiétudes </w:t>
+      </w:r>
+      <w:r>
+        <w:t xml:space="preserve">concernant </w:t>
+      </w:r>
+      <w:r>
+        <w:t xml:space="preserve">l'influence sur l'authenticité d'apprentissage d'une nouvelle langue et le prestige de son activité créatrice. </w:t>
+      </w:r>
+    </w:p>
+    <w:p/>
+    <w:p>
+      <w:proofErr w:type="spellStart"/>
+      <w:r>
+        <w:t>Kohnke</w:t>
+      </w:r>
+      <w:proofErr w:type="spellEnd"/>
+      <w:r>
+        <w:t xml:space="preserve">, </w:t>
+      </w:r>
+      <w:proofErr w:type="spellStart"/>
+      <w:r>
+        <w:t>Moorhouse</w:t>
+      </w:r>
+      <w:proofErr w:type="spellEnd"/>
+      <w:r>
+        <w:t xml:space="preserve"> et Zou</w:t>
+      </w:r>
+      <w:r>
+        <w:t xml:space="preserve"> </w:t>
+      </w:r>
+      <w:r>
+        <w:fldChar w:fldCharType="begin"/>
+      </w:r>
+      <w:r>
+        <w:instrText xml:space="preserve"> ADDIN ZOTERO_ITEM CSL_CITATION {"citationID":"4gh14G6C","properties":{"unsorted":false,"formattedCitation":"(Kohnke et al., 2023)","plainCitation":"(Kohnke et al., 2023)","noteIndex":0},"citationItems":[{"id":255,"uris":["http://zotero.org/users/18489330/items/RFDMJBQC"],"itemData":{"id":255,"type":"article-journal","abstract":"In this technology review, we explore the affordances of the generative AI chatbot ChatGPT for language teaching and learning. In addition to this, we also present debates and drawbacks of ChatGPT. Finally, we present the digital competencies teachers and learners require to use this chatbot ethically and effectively to support language learning.","container-title":"RELC Journal","DOI":"10.1177/00336882231162868","journalAbbreviation":"RELC Journal","source":"ResearchGate","title":"ChatGPT for Language Teaching and Learning","volume":"54","author":[{"family":"Kohnke","given":"Lucas"},{"family":"Moorhouse","given":"Benjamin"},{"family":"Zou","given":"Di"}],"issued":{"date-parts":[["2023",4,3]]}}}],"schema":"https://github.com/citation-style-language/schema/raw/master/csl-citation.json"} </w:instrText>
+      </w:r>
+      <w:r>
+        <w:fldChar w:fldCharType="separate"/>
+      </w:r>
+      <w:r>
+        <w:rPr>
+          <w:noProof/>
+        </w:rPr>
+        <w:t>(Kohnke et al., 2023)</w:t>
+      </w:r>
+      <w:r>
+        <w:fldChar w:fldCharType="end"/>
+      </w:r>
+      <w:r>
+        <w:t xml:space="preserve"> </w:t>
+      </w:r>
+      <w:r>
+        <w:t xml:space="preserve">rapportent également deux questions spécifiques soulevées par les enseignants de langues vivantes : d'une part, l'inquiétude liée à la possibilité que l'IA génère des erreurs linguistiques ou même du biais culturel, et d'autre part, la crainte que les étudiants perdent le bon réflexe de se plonger activement dans la rédaction individuelle. À cela s'ajoute le fait, dans le cas spécifique de la France, qu'au-delà des barrières </w:t>
+      </w:r>
+      <w:r>
         <w:lastRenderedPageBreak/>
-        <w:t>Barrières et facteurs influençant l'adoption</w:t>
-      </w:r>
-      <w:bookmarkEnd w:id="24"/>
-      <w:r>
-        <w:br/>
-      </w:r>
-    </w:p>
-    <w:p>
-      <w:r>
-        <w:t>Bien que plusieurs facteurs facilitant expliquent pourquoi cette formation peut être acceptée dans ce contexte, ils ne résolvent pas la question de savoir quelles sont les difficultés que ces enseignants ont. Effectivement, ces derniers sont confrontés à des obstacles qui empêchent et limitent l'utilisation de ce modèle malgré son adaptabilité. Selon</w:t>
-      </w:r>
-      <w:r>
-        <w:fldChar w:fldCharType="begin"/>
-      </w:r>
-      <w:r>
-        <w:instrText xml:space="preserve"> ADDIN ZOTERO_ITEM CSL_CITATION {"citationID":"lyLA4LZA","properties":{"unsorted":false,"formattedCitation":"(Ertmer, 1999)","plainCitation":"(Ertmer, 1999)","noteIndex":0},"citationItems":[{"id":251,"uris":["http://zotero.org/users/18489330/items/H327W8UN"],"itemData":{"id":251,"type":"article-journal","abstract":"Although teachers today recognize the importance of integrating technology into their curricula, efforts are often limited by both external (first-order) and internal (second-order) barriers. Traditionally, technology training, for both preservice and inservice teachers, has focused on helping teachers overcome first-order barriers (e.g., acquiring technical skills needed to operate a computer). More recently, training programs have incorporated pedagogical models of technology use as one means of addressing second-order barriers. However, little discussion has occurred that clarifies the relationship between these different types of barriers or that delineates effective strategies for addressing different barriers. If pre- and inservice teachers are to become effective users of technology, they will need practical strategies for dealing with the different types of barriers they will face. In this paper, I discuss the relationship between first- and second-order barriers and then describe specific strategies for circumventing, overcoming, and eliminating the changing barriers teachers face as they work to achieve technology integration.","container-title":"Educational Technology Research and Development","DOI":"10.1007/BF02299597","ISSN":"1556-6501","issue":"4","journalAbbreviation":"ETR&amp;D","language":"en","page":"47-61","source":"Springer Link","title":"Addressing first- and second-order barriers to change: Strategies for technology integration","title-short":"Addressing first- and second-order barriers to change","volume":"47","author":[{"family":"Ertmer","given":"Peggy A."}],"issued":{"date-parts":[["1999",12,1]]}}}],"schema":"https://github.com/citation-style-language/schema/raw/master/csl-citation.json"} </w:instrText>
-      </w:r>
-      <w:r>
-        <w:fldChar w:fldCharType="separate"/>
-      </w:r>
-      <w:r>
-        <w:rPr>
-          <w:noProof/>
-        </w:rPr>
-        <w:t xml:space="preserve"> Ertmer (1999)</w:t>
-      </w:r>
-      <w:r>
-        <w:fldChar w:fldCharType="end"/>
-      </w:r>
-      <w:r>
-        <w:t>, il existe deux sortes d'obstacles ; le premier est externe et concerne la personne qui est touchée tandis que le second est interne à la personne.</w:t>
-      </w:r>
-    </w:p>
-    <w:p/>
-    <w:p>
-      <w:r>
-        <w:t>Il s'agit d'obstacles à l'égard desquels l'enseignant n'a rien du tout à faire étant donné qu'ils proviennent de l'extérieur et qu'ils sont imposés de façon irréductible. Nous trouvons notamment le manque de temps pour une formation, le manque de matériel adapté, la difficulté relative à la charge de travail de programmation et d'orientation institutionnelle. Cela est une grande difficulté surtout pour les enseignants de langues vivantes puisque leur charge de travail est déjà élevée.</w:t>
-      </w:r>
-    </w:p>
-    <w:p/>
-    <w:p>
-      <w:r>
-        <w:t xml:space="preserve">Obstacles internes de deuxième niveau, font référence aux obstacles internes, qui sont principalement basés sur des aspects psychologiques, culturels et professionnels </w:t>
-      </w:r>
-      <w:r>
-        <w:fldChar w:fldCharType="begin"/>
-      </w:r>
-      <w:r>
-        <w:instrText xml:space="preserve"> ADDIN ZOTERO_ITEM CSL_CITATION {"citationID":"NZMVVaTm","properties":{"unsorted":false,"formattedCitation":"(Ertmer &amp; Ottenbreit-Leftwich, 2010)","plainCitation":"(Ertmer &amp; Ottenbreit-Leftwich, 2010)","noteIndex":0},"citationItems":[{"id":263,"uris":["http://zotero.org/users/18489330/items/MCM2VCA9"],"itemData":{"id":263,"type":"article-journal","abstract":"Despite increases in computer access and technology training, technology is not being used to support the kinds of instruction believed to be most powerful. In this paper, we examine technology integration through the lens of the teacher as an agent of change: What are the necessary characteristics, or qualities, that enable teachers to leverage technology resources as meaningful pedagogical tools? To answer this question, we discuss the literature related to four variables of teacher change: knowledge, self-efficacy, pedagogical beliefs, and subject and school culture. Specifically, we propose that teachers’ mindsets must change to include the idea that “teaching is not effective without the appropriate use of information and communication technologies (ICT) resources to facilitate student learning.” Implications are discussed in terms of both teacher education and professional development programs.","container-title":"Journal of Research on Technology in Education","DOI":"10.1080/15391523.2010.10782551","ISSN":"1539-1523","issue":"3","note":"_eprint: https://doi.org/10.1080/15391523.2010.10782551","page":"255-284","publisher":"Routledge","source":"Taylor and Francis+NEJM","title":"Teacher Technology Change: How Knowledge, Confidence, Beliefs, and Culture Intersect","title-short":"Teacher Technology Change","volume":"42","author":[{"family":"Ertmer","given":"Peggy A."},{"family":"Ottenbreit-Leftwich","given":"Anne T."}],"issued":{"date-parts":[["2010",3,1]]}}}],"schema":"https://github.com/citation-style-language/schema/raw/master/csl-citation.json"} </w:instrText>
-      </w:r>
-      <w:r>
-        <w:fldChar w:fldCharType="separate"/>
-      </w:r>
-      <w:r>
-        <w:rPr>
-          <w:noProof/>
-        </w:rPr>
-        <w:t>(Ertmer &amp; Ottenbreit-Leftwich, 2010)</w:t>
-      </w:r>
-      <w:r>
-        <w:fldChar w:fldCharType="end"/>
-      </w:r>
-      <w:r>
-        <w:t xml:space="preserve">. Parmi eux on peut citer conceptions pédagogiques individuelles, </w:t>
-      </w:r>
-      <w:r>
-        <w:t>nervosité liée</w:t>
-      </w:r>
-      <w:r>
-        <w:t xml:space="preserve"> à l'utilisation de nouvelles technologies, peur de perdre sa position autoritaire et professionnelle et résistance au changement. Par exemple, en ce qui concerne l'application de l'intelligence artificielle générative dans l'apprentissage d'une nouvelle langue, l'enseignant pourra avoir des inquiétudes </w:t>
-      </w:r>
-      <w:r>
-        <w:t xml:space="preserve">concernant </w:t>
-      </w:r>
-      <w:r>
-        <w:t xml:space="preserve">l'influence sur l'authenticité d'apprentissage d'une nouvelle langue et le prestige de son activité créatrice. </w:t>
-      </w:r>
-    </w:p>
-    <w:p/>
-    <w:p>
-      <w:proofErr w:type="spellStart"/>
-      <w:r>
-        <w:t>Kohnke</w:t>
-      </w:r>
-      <w:proofErr w:type="spellEnd"/>
-      <w:r>
-        <w:t xml:space="preserve">, </w:t>
-      </w:r>
-      <w:proofErr w:type="spellStart"/>
-      <w:r>
-        <w:t>Moorhouse</w:t>
-      </w:r>
-      <w:proofErr w:type="spellEnd"/>
-      <w:r>
-        <w:t xml:space="preserve"> et Zou</w:t>
-      </w:r>
-      <w:r>
-        <w:t xml:space="preserve"> </w:t>
-      </w:r>
-      <w:r>
-        <w:fldChar w:fldCharType="begin"/>
-      </w:r>
-      <w:r>
-        <w:instrText xml:space="preserve"> ADDIN ZOTERO_ITEM CSL_CITATION {"citationID":"4gh14G6C","properties":{"unsorted":false,"formattedCitation":"(Kohnke et al., 2023)","plainCitation":"(Kohnke et al., 2023)","noteIndex":0},"citationItems":[{"id":255,"uris":["http://zotero.org/users/18489330/items/RFDMJBQC"],"itemData":{"id":255,"type":"article-journal","abstract":"In this technology review, we explore the affordances of the generative AI chatbot ChatGPT for language teaching and learning. In addition to this, we also present debates and drawbacks of ChatGPT. Finally, we present the digital competencies teachers and learners require to use this chatbot ethically and effectively to support language learning.","container-title":"RELC Journal","DOI":"10.1177/00336882231162868","journalAbbreviation":"RELC Journal","source":"ResearchGate","title":"ChatGPT for Language Teaching and Learning","volume":"54","author":[{"family":"Kohnke","given":"Lucas"},{"family":"Moorhouse","given":"Benjamin"},{"family":"Zou","given":"Di"}],"issued":{"date-parts":[["2023",4,3]]}}}],"schema":"https://github.com/citation-style-language/schema/raw/master/csl-citation.json"} </w:instrText>
-      </w:r>
-      <w:r>
-        <w:fldChar w:fldCharType="separate"/>
-      </w:r>
-      <w:r>
-        <w:rPr>
-          <w:noProof/>
-        </w:rPr>
-        <w:t>(Kohnke et al., 2023)</w:t>
-      </w:r>
-      <w:r>
-        <w:fldChar w:fldCharType="end"/>
-      </w:r>
-      <w:r>
-        <w:t xml:space="preserve"> </w:t>
-      </w:r>
-      <w:r>
-        <w:t xml:space="preserve">rapportent également deux questions spécifiques soulevées par les enseignants de langues vivantes : d'une part, l'inquiétude liée à la possibilité que l'IA génère des erreurs linguistiques ou même du biais culturel, et d'autre part, la crainte que les étudiants perdent le bon réflexe de se plonger activement dans la rédaction individuelle. À cela s'ajoute le fait, dans le cas spécifique de la France, qu'au-delà des barrières liées au risque potentiel, l'utilisation d'une telle technologie est tout simplement impossible : en effet, l'interdiction des appareils portables en classe </w:t>
+        <w:t xml:space="preserve">liées au risque potentiel, l'utilisation d'une telle technologie est tout simplement impossible : en effet, l'interdiction des appareils portables en classe </w:t>
       </w:r>
       <w:r>
         <w:fldChar w:fldCharType="begin"/>
@@ -7549,160 +7558,145 @@
     </w:p>
     <w:p>
       <w:r>
+        <w:t>Il convient donc de comprendre ces difficultés propres aux enseignants de langues vivantes pour approcher comment ces personnes peuvent contourner ces problèmes dans l'intégration. C'est exactement le but poursuivi dans le paragraphe suivant.</w:t>
+      </w:r>
+    </w:p>
+    <w:p/>
+    <w:p>
+      <w:pPr>
+        <w:pStyle w:val="Heading3"/>
+      </w:pPr>
+      <w:bookmarkStart w:id="25" w:name="_Toc231678094"/>
+      <w:r>
+        <w:t>A</w:t>
+      </w:r>
+      <w:r>
+        <w:t>pplication aux enseignants de langues vivantes et à l'IA générative</w:t>
+      </w:r>
+      <w:bookmarkEnd w:id="25"/>
+      <w:r>
+        <w:br/>
+      </w:r>
+    </w:p>
+    <w:p>
+      <w:r>
+        <w:t xml:space="preserve">Les problèmes d’adoption de la technologie sont reflétés de manière spéciale dans le cadre spécifique de l’enseignement des langues vivantes avec l’IA générative. À l'inverse de la technologie générale, l'IA générative crée le contenu linguistique et, par conséquent, les enseignants de langues ont non seulement besoin d'évaluer le potentiel d'un outil pour la réalisation des objectifs didactiques, mais aussi ses qualités linguistiques, la conformité culturelle </w:t>
+      </w:r>
+      <w:r>
+        <w:fldChar w:fldCharType="begin"/>
+      </w:r>
+      <w:r>
+        <w:instrText xml:space="preserve"> ADDIN ZOTERO_ITEM CSL_CITATION {"citationID":"isS6obeF","properties":{"unsorted":false,"formattedCitation":"(Kohnke et al., 2023)","plainCitation":"(Kohnke et al., 2023)","noteIndex":0},"citationItems":[{"id":255,"uris":["http://zotero.org/users/18489330/items/RFDMJBQC"],"itemData":{"id":255,"type":"article-journal","abstract":"In this technology review, we explore the affordances of the generative AI chatbot ChatGPT for language teaching and learning. In addition to this, we also present debates and drawbacks of ChatGPT. Finally, we present the digital competencies teachers and learners require to use this chatbot ethically and effectively to support language learning.","container-title":"RELC Journal","DOI":"10.1177/00336882231162868","journalAbbreviation":"RELC Journal","source":"ResearchGate","title":"ChatGPT for Language Teaching and Learning","volume":"54","author":[{"family":"Kohnke","given":"Lucas"},{"family":"Moorhouse","given":"Benjamin"},{"family":"Zou","given":"Di"}],"issued":{"date-parts":[["2023",4,3]]}}}],"schema":"https://github.com/citation-style-language/schema/raw/master/csl-citation.json"} </w:instrText>
+      </w:r>
+      <w:r>
+        <w:fldChar w:fldCharType="separate"/>
+      </w:r>
+      <w:r>
+        <w:rPr>
+          <w:noProof/>
+        </w:rPr>
+        <w:t>(Kohnke et al., 2023)</w:t>
+      </w:r>
+      <w:r>
+        <w:fldChar w:fldCharType="end"/>
+      </w:r>
+      <w:r>
+        <w:t xml:space="preserve">. Pour l'enseignant d'anglais ou de français est nécessaire de vérifier la grammaticalité, l 'appropriabilité des registres de langue et la conformité culturelle. Cette tâche supplémentaire d’évaluation devient une barrière cognitive importante, car </w:t>
+      </w:r>
+      <w:proofErr w:type="gramStart"/>
+      <w:r>
+        <w:t>malgré</w:t>
+      </w:r>
+      <w:proofErr w:type="gramEnd"/>
+      <w:r>
+        <w:t xml:space="preserve"> que l'IA générative crée le contenu linguistique pendant quelques secondes, l'enseignant doit dépenser du temps pour l'évaluation critique.</w:t>
+      </w:r>
+    </w:p>
+    <w:p/>
+    <w:p>
+      <w:r>
+        <w:t xml:space="preserve">En outre, l’intégration de l'IA générative requiert un nouveau type de littératie pédagogique appelée « Intelligent TPACK » par </w:t>
+      </w:r>
+      <w:r>
+        <w:fldChar w:fldCharType="begin"/>
+      </w:r>
+      <w:r>
+        <w:instrText xml:space="preserve"> ADDIN ZOTERO_ITEM CSL_CITATION {"citationID":"P2noP0Pd","properties":{"unsorted":false,"formattedCitation":"(Celik, 2023)","plainCitation":"(Celik, 2023)","dontUpdate":true,"noteIndex":0},"citationItems":[{"id":257,"uris":["http://zotero.org/users/18489330/items/RLPRT7KU"],"itemData":{"id":257,"type":"article-journal","abstract":"The affordances of artificial intelligence (AI) have not been totally utilized in education. To effectively integrate AI into education, teachers’ AI-specific technological and pedagogical knowledge is important. Furthermore, due to novel ethical issues caused by Al, teachers also must have the knowledge to assess AI-based decisions. None of the previous studies so far explored teacher knowledge to pedagogically and ethically use AI-based tools. Considering this gap, we first developed a scale to measure the knowledge for instructional AI use based on the technological, pedagogical, and content knowledge (TPACK) framework. We extended TPACK with ethical aspects. Secondly, we built a model to investigate the interplay of TPACK components and ethics. The results indicated that as long as teachers have more knowledge to interact with AI-based tools, they will have a better understanding of the pedagogical contributions of AI. Further, technological knowledge (TK) allows teachers to better assess decisions of AI. However, only TK is not sufficient educational integration of AI-based tools. For teachers to deploy AI in education efficiently, TK is meaningful when it is combined with pedagogical knowledge (PK), reflected in technological pedagogical knowledge (TPK). Given pedagogical and technological affordances of AI-based tools, the current study suggests the Intelligent-TPACK framework.","container-title":"Computers in Human Behavior","DOI":"10.1016/j.chb.2022.107468","ISSN":"07475632","journalAbbreviation":"Computers in Human Behavior","language":"en","page":"107468","source":"DOI.org (Crossref)","title":"Towards Intelligent-TPACK: An empirical study on teachers’ professional knowledge to ethically integrate artificial intelligence (AI)-based tools into education","title-short":"Towards Intelligent-TPACK","volume":"138","author":[{"family":"Celik","given":"Ismail"}],"issued":{"date-parts":[["2023",1]]}}}],"schema":"https://github.com/citation-style-language/schema/raw/master/csl-citation.json"} </w:instrText>
+      </w:r>
+      <w:r>
+        <w:fldChar w:fldCharType="separate"/>
+      </w:r>
+      <w:r>
+        <w:rPr>
+          <w:noProof/>
+        </w:rPr>
+        <w:t>Celik (2023)</w:t>
+      </w:r>
+      <w:r>
+        <w:fldChar w:fldCharType="end"/>
+      </w:r>
+      <w:r>
+        <w:t xml:space="preserve">. </w:t>
+      </w:r>
+      <w:r>
+        <w:t>Ce terme est une évolution du cadre de littératie pédagogique TPACK (</w:t>
+      </w:r>
+      <w:proofErr w:type="spellStart"/>
+      <w:r>
+        <w:t>Technological</w:t>
+      </w:r>
+      <w:proofErr w:type="spellEnd"/>
+      <w:r>
+        <w:t xml:space="preserve">, </w:t>
+      </w:r>
+      <w:proofErr w:type="spellStart"/>
+      <w:r>
+        <w:t>Pedagogical</w:t>
+      </w:r>
+      <w:proofErr w:type="spellEnd"/>
+      <w:r>
+        <w:t xml:space="preserve"> and </w:t>
+      </w:r>
+      <w:r>
+        <w:t xml:space="preserve">Content </w:t>
+      </w:r>
+      <w:proofErr w:type="spellStart"/>
+      <w:r>
+        <w:t>Knowledge</w:t>
+      </w:r>
+      <w:proofErr w:type="spellEnd"/>
+      <w:r>
+        <w:t>) dans lequel il est reconnu que, à part la maîtrise de la technologie, l'enseignant doit être capable de créer une interaction entre la machine et l'être humain pour promouvoir l'apprentissage. L'idée ici est que l'enseignant doit savoir comment formuler des invités (prompt engineering), comprendre les résultats générés par l'AI, et modifier le contenu afin qu'il soit conforme aux besoins des élèves</w:t>
+      </w:r>
+      <w:r>
+        <w:t xml:space="preserve"> </w:t>
+      </w:r>
+      <w:r>
+        <w:fldChar w:fldCharType="begin"/>
+      </w:r>
+      <w:r>
+        <w:instrText xml:space="preserve"> ADDIN ZOTERO_ITEM CSL_CITATION {"citationID":"xDJsJP64","properties":{"unsorted":false,"formattedCitation":"(Lee, 2024)","plainCitation":"(Lee, 2024)","noteIndex":0},"citationItems":[{"id":259,"uris":["http://zotero.org/users/18489330/items/NUBM4MT8"],"itemData":{"id":259,"type":"article-journal","abstract":"The growing interest in AI chatbots for language learning has highlighted their potential value in educational technology, particularly in teacher training for professional development (PD). This exploratory study extended this discussion by exploring how chatbot-integrated lesson planning modules supported pre-service teachers’ Technological Pedagogical Content Knowledge (TPACK). Two types of qualitative data, including teaching artifacts (e.g., lesson plans and chatbot tasks) and self-reports (e.g., interviews and reflection papers), were collected from twenty-one pre-service English as a Foreign Language (EFL) teachers who participated in five TPACK training modules over sixteen weeks: (a) TPACK comprehension, (b) chatbot-design training, (c) lesson planning, (d) micro-teaching, and (e) TPACK reflection. Data analysis involved two TPACK assessment methods: (a) TPACK levels demonstrated in lesson plans and the associations of chatbot-integrated lesson plans with TPACK levels; (b) thematic analysis of self-reports for the perceived affordances of the TPACK training. The findings indicate that chatbot-integrated lesson plans demonstrated the participants’ TPACK resulting from the training activities. They reported that the training modules had afforded their TPACK in diverse aspects of using chatbots in lesson development despite some constraints. This study provided insights into how to utilize chatbot-integrated lesson study for pre-service language teachers’ TPACK.","language":"en","source":"Zotero","title":"Enhancing pre-service EFL teachers’ TPACK through chatbot-integrated lesson planning projects","author":[{"family":"Lee","given":"Seongyong"}],"issued":{"date-parts":[["2024"]]}}}],"schema":"https://github.com/citation-style-language/schema/raw/master/csl-citation.json"} </w:instrText>
+      </w:r>
+      <w:r>
+        <w:fldChar w:fldCharType="separate"/>
+      </w:r>
+      <w:r>
+        <w:rPr>
+          <w:noProof/>
+        </w:rPr>
+        <w:t>(Lee, 2024)</w:t>
+      </w:r>
+      <w:r>
+        <w:fldChar w:fldCharType="end"/>
+      </w:r>
+      <w:r>
+        <w:t xml:space="preserve">. Ce nouveau savoir implique un apprentissage additionnel pour l'enseignant qui peut déjà se sentir surchargé, ce qui pourrait représenter une barrière de second ordre. </w:t>
+      </w:r>
+    </w:p>
+    <w:p/>
+    <w:p>
+      <w:r>
         <w:lastRenderedPageBreak/>
-        <w:t>Il convient donc de comprendre ces difficultés propres aux enseignants de langues vivantes pour approcher comment ces personnes peuvent contourner ces problèmes dans l'intégration. C'est exactement le but poursuivi dans le paragraphe suivant.</w:t>
-      </w:r>
-    </w:p>
-    <w:p/>
-    <w:p>
-      <w:pPr>
-        <w:pStyle w:val="Heading3"/>
-      </w:pPr>
-      <w:bookmarkStart w:id="25" w:name="_Toc231678094"/>
-      <w:r>
-        <w:t>A</w:t>
-      </w:r>
-      <w:r>
-        <w:t>pplication aux enseignants de langues vivantes et à l'IA générative</w:t>
-      </w:r>
-      <w:bookmarkEnd w:id="25"/>
-      <w:r>
-        <w:br/>
-      </w:r>
-    </w:p>
-    <w:p>
-      <w:r>
-        <w:t>Les problèmes d’adoption de la technologie sont reflétés de manière spéciale dans le cadre spécifique de l’enseignement des langues vivantes avec l’IA générative. À l'inverse de la technologie générale, l'IA générative crée le contenu linguistique et, par conséquent, les enseignants de langues ont non seulement besoin d'évaluer le potentiel d'un outil pour la réalisation des objectifs didactiques, mais aussi ses qualités linguistiques, la conformité culturelle</w:t>
-      </w:r>
-      <w:r>
-        <w:t xml:space="preserve"> </w:t>
-      </w:r>
-      <w:r>
-        <w:fldChar w:fldCharType="begin"/>
-      </w:r>
-      <w:r>
-        <w:instrText xml:space="preserve"> ADDIN ZOTERO_ITEM CSL_CITATION {"citationID":"isS6obeF","properties":{"unsorted":false,"formattedCitation":"(Kohnke et al., 2023)","plainCitation":"(Kohnke et al., 2023)","noteIndex":0},"citationItems":[{"id":255,"uris":["http://zotero.org/users/18489330/items/RFDMJBQC"],"itemData":{"id":255,"type":"article-journal","abstract":"In this technology review, we explore the affordances of the generative AI chatbot ChatGPT for language teaching and learning. In addition to this, we also present debates and drawbacks of ChatGPT. Finally, we present the digital competencies teachers and learners require to use this chatbot ethically and effectively to support language learning.","container-title":"RELC Journal","DOI":"10.1177/00336882231162868","journalAbbreviation":"RELC Journal","source":"ResearchGate","title":"ChatGPT for Language Teaching and Learning","volume":"54","author":[{"family":"Kohnke","given":"Lucas"},{"family":"Moorhouse","given":"Benjamin"},{"family":"Zou","given":"Di"}],"issued":{"date-parts":[["2023",4,3]]}}}],"schema":"https://github.com/citation-style-language/schema/raw/master/csl-citation.json"} </w:instrText>
-      </w:r>
-      <w:r>
-        <w:fldChar w:fldCharType="separate"/>
-      </w:r>
-      <w:r>
-        <w:rPr>
-          <w:noProof/>
-        </w:rPr>
-        <w:t>(Kohnke et al., 2023)</w:t>
-      </w:r>
-      <w:r>
-        <w:fldChar w:fldCharType="end"/>
-      </w:r>
-      <w:r>
-        <w:t xml:space="preserve">. Pour l'enseignant d'anglais ou de français est nécessaire de vérifier la grammaticalité, l 'appropriabilité des registres de langue et la conformité culturelle. Cette tâche supplémentaire d’évaluation devient une barrière cognitive importante, car </w:t>
-      </w:r>
-      <w:proofErr w:type="gramStart"/>
-      <w:r>
-        <w:t>malgré</w:t>
-      </w:r>
-      <w:proofErr w:type="gramEnd"/>
-      <w:r>
-        <w:t xml:space="preserve"> que l'IA générative crée le contenu linguistique pendant quelques secondes, l'enseignant doit dépenser du temps pour l'évaluation critique.</w:t>
-      </w:r>
-    </w:p>
-    <w:p/>
-    <w:p>
-      <w:r>
-        <w:t>En outre, l’intégration de l'IA générative requiert un nouveau type de littératie pédagogique appelée</w:t>
-      </w:r>
-      <w:r>
-        <w:t xml:space="preserve"> « Intelligent</w:t>
-      </w:r>
-      <w:r>
-        <w:t xml:space="preserve"> TPACK</w:t>
-      </w:r>
-      <w:r>
-        <w:t xml:space="preserve"> </w:t>
-      </w:r>
-      <w:r>
-        <w:t xml:space="preserve">» par </w:t>
-      </w:r>
-      <w:r>
-        <w:fldChar w:fldCharType="begin"/>
-      </w:r>
-      <w:r>
-        <w:instrText xml:space="preserve"> ADDIN ZOTERO_ITEM CSL_CITATION {"citationID":"P2noP0Pd","properties":{"unsorted":false,"formattedCitation":"(Celik, 2023)","plainCitation":"(Celik, 2023)","noteIndex":0},"citationItems":[{"id":257,"uris":["http://zotero.org/users/18489330/items/RLPRT7KU"],"itemData":{"id":257,"type":"article-journal","abstract":"The affordances of artificial intelligence (AI) have not been totally utilized in education. To effectively integrate AI into education, teachers’ AI-specific technological and pedagogical knowledge is important. Furthermore, due to novel ethical issues caused by Al, teachers also must have the knowledge to assess AI-based decisions. None of the previous studies so far explored teacher knowledge to pedagogically and ethically use AI-based tools. Considering this gap, we first developed a scale to measure the knowledge for instructional AI use based on the technological, pedagogical, and content knowledge (TPACK) framework. We extended TPACK with ethical aspects. Secondly, we built a model to investigate the interplay of TPACK components and ethics. The results indicated that as long as teachers have more knowledge to interact with AI-based tools, they will have a better understanding of the pedagogical contributions of AI. Further, technological knowledge (TK) allows teachers to better assess decisions of AI. However, only TK is not sufficient educational integration of AI-based tools. For teachers to deploy AI in education efficiently, TK is meaningful when it is combined with pedagogical knowledge (PK), reflected in technological pedagogical knowledge (TPK). Given pedagogical and technological affordances of AI-based tools, the current study suggests the Intelligent-TPACK framework.","container-title":"Computers in Human Behavior","DOI":"10.1016/j.chb.2022.107468","ISSN":"07475632","journalAbbreviation":"Computers in Human Behavior","language":"en","page":"107468","source":"DOI.org (Crossref)","title":"Towards Intelligent-TPACK: An empirical study on teachers’ professional knowledge to ethically integrate artificial intelligence (AI)-based tools into education","title-short":"Towards Intelligent-TPACK","volume":"138","author":[{"family":"Celik","given":"Ismail"}],"issued":{"date-parts":[["2023",1]]}}}],"schema":"https://github.com/citation-style-language/schema/raw/master/csl-citation.json"} </w:instrText>
-      </w:r>
-      <w:r>
-        <w:fldChar w:fldCharType="separate"/>
-      </w:r>
-      <w:r>
-        <w:rPr>
-          <w:noProof/>
-        </w:rPr>
-        <w:t>Celik (2023)</w:t>
-      </w:r>
-      <w:r>
-        <w:fldChar w:fldCharType="end"/>
-      </w:r>
-      <w:r>
-        <w:t xml:space="preserve">. </w:t>
-      </w:r>
-      <w:r>
-        <w:t>Ce terme est une évolution du cadre de littératie pédagogique TPACK (</w:t>
-      </w:r>
-      <w:proofErr w:type="spellStart"/>
-      <w:r>
-        <w:t>Technological</w:t>
-      </w:r>
-      <w:proofErr w:type="spellEnd"/>
-      <w:r>
-        <w:t xml:space="preserve">, </w:t>
-      </w:r>
-      <w:proofErr w:type="spellStart"/>
-      <w:r>
-        <w:t>Pedagogical</w:t>
-      </w:r>
-      <w:proofErr w:type="spellEnd"/>
-      <w:r>
-        <w:t xml:space="preserve"> and </w:t>
-      </w:r>
-      <w:r>
-        <w:t xml:space="preserve">Content </w:t>
-      </w:r>
-      <w:proofErr w:type="spellStart"/>
-      <w:r>
-        <w:t>Knowledge</w:t>
-      </w:r>
-      <w:proofErr w:type="spellEnd"/>
-      <w:r>
-        <w:t>) dans lequel il est reconnu que, à part la maîtrise de la technologie, l'enseignant doit être capable de créer une interaction entre la machine et l'être humain pour promouvoir l'apprentissage. L'idée ici est que l'enseignant doit savoir comment formuler des invités (prompt engineering), comprendre les résultats générés par l'AI, et modifier le contenu afin qu'il soit conforme aux besoins des élèves</w:t>
-      </w:r>
-      <w:r>
-        <w:t xml:space="preserve"> </w:t>
-      </w:r>
-      <w:r>
-        <w:fldChar w:fldCharType="begin"/>
-      </w:r>
-      <w:r>
-        <w:instrText xml:space="preserve"> ADDIN ZOTERO_ITEM CSL_CITATION {"citationID":"xDJsJP64","properties":{"unsorted":false,"formattedCitation":"(Lee, 2024)","plainCitation":"(Lee, 2024)","noteIndex":0},"citationItems":[{"id":259,"uris":["http://zotero.org/users/18489330/items/NUBM4MT8"],"itemData":{"id":259,"type":"article-journal","abstract":"The growing interest in AI chatbots for language learning has highlighted their potential value in educational technology, particularly in teacher training for professional development (PD). This exploratory study extended this discussion by exploring how chatbot-integrated lesson planning modules supported pre-service teachers’ Technological Pedagogical Content Knowledge (TPACK). Two types of qualitative data, including teaching artifacts (e.g., lesson plans and chatbot tasks) and self-reports (e.g., interviews and reflection papers), were collected from twenty-one pre-service English as a Foreign Language (EFL) teachers who participated in five TPACK training modules over sixteen weeks: (a) TPACK comprehension, (b) chatbot-design training, (c) lesson planning, (d) micro-teaching, and (e) TPACK reflection. Data analysis involved two TPACK assessment methods: (a) TPACK levels demonstrated in lesson plans and the associations of chatbot-integrated lesson plans with TPACK levels; (b) thematic analysis of self-reports for the perceived affordances of the TPACK training. The findings indicate that chatbot-integrated lesson plans demonstrated the participants’ TPACK resulting from the training activities. They reported that the training modules had afforded their TPACK in diverse aspects of using chatbots in lesson development despite some constraints. This study provided insights into how to utilize chatbot-integrated lesson study for pre-service language teachers’ TPACK.","language":"en","source":"Zotero","title":"Enhancing pre-service EFL teachers’ TPACK through chatbot-integrated lesson planning projects","author":[{"family":"Lee","given":"Seongyong"}],"issued":{"date-parts":[["2024"]]}}}],"schema":"https://github.com/citation-style-language/schema/raw/master/csl-citation.json"} </w:instrText>
-      </w:r>
-      <w:r>
-        <w:fldChar w:fldCharType="separate"/>
-      </w:r>
-      <w:r>
-        <w:rPr>
-          <w:noProof/>
-        </w:rPr>
-        <w:t>(Lee, 2024)</w:t>
-      </w:r>
-      <w:r>
-        <w:fldChar w:fldCharType="end"/>
-      </w:r>
-      <w:r>
-        <w:t xml:space="preserve">. Ce nouveau savoir implique un apprentissage additionnel pour l'enseignant qui peut déjà se sentir surchargé, ce qui pourrait représenter une barrière de second ordre. </w:t>
-      </w:r>
-    </w:p>
-    <w:p/>
-    <w:p>
-      <w:r>
         <w:t xml:space="preserve">Pour l'adoption des technologies IA génératrices d'idées dans un contexte de langue française, on observe plusieurs contraintes. D'abord, dans l'enseignement au collège français, les professeurs doivent respecter le programme officiel du </w:t>
       </w:r>
       <w:r>
@@ -7712,7 +7706,6 @@
         <w:t xml:space="preserve">La situation entraîne une forme d'ambiguïté en ce sens que les professeurs ne savent pas précisément s'ils peuvent recourir à ces outils. De plus, l'interdiction légale des téléphones mobiles en classe </w:t>
       </w:r>
       <w:r>
-        <w:lastRenderedPageBreak/>
         <w:fldChar w:fldCharType="begin"/>
       </w:r>
       <w:r>
@@ -7778,6 +7771,401 @@
         <w:t>C'est dans le cadre de ces contradictions et de ces opportunités que se situe cette étude qui porte sur la façon dont les enseignants en France perçoivent et intègrent la génération IA dans leur démarche de planning pédagogique.</w:t>
       </w:r>
     </w:p>
+    <w:p/>
+    <w:p>
+      <w:pPr>
+        <w:pStyle w:val="Heading2"/>
+      </w:pPr>
+      <w:r>
+        <w:t>L'intelligence artificielle dans</w:t>
+      </w:r>
+      <w:r>
+        <w:t xml:space="preserve"> </w:t>
+      </w:r>
+      <w:r>
+        <w:t>l'enseignement des langues vivantes</w:t>
+      </w:r>
+      <w:r>
+        <w:br/>
+      </w:r>
+    </w:p>
+    <w:p>
+      <w:r>
+        <w:t xml:space="preserve">Après avoir examiné les théories générales de l'adoption technologique et les obstacles spécifiques que rencontrent les enseignants, il est essentiel d'explorer comment l'IA générative est actuellement utilisée dans l'enseignement des langues vivantes et quelles sont ses affordances pédagogiques réelles </w:t>
+      </w:r>
+      <w:r>
+        <w:fldChar w:fldCharType="begin"/>
+      </w:r>
+      <w:r>
+        <w:instrText xml:space="preserve"> ADDIN ZOTERO_ITEM CSL_CITATION {"citationID":"3BPobde1","properties":{"unsorted":false,"formattedCitation":"(Godwin-Jones, 2023; Hockly, 2023)","plainCitation":"(Godwin-Jones, 2023; Hockly, 2023)","noteIndex":0},"citationItems":[{"id":265,"uris":["http://zotero.org/users/18489330/items/CXEHYY4V"],"itemData":{"id":265,"type":"webpage","abstract":"Looking at human communication from the perspective of semiotics extends our view beyond verbal language to consider other sign systems and meaning-making resources. Those …","language":"en","title":"Emerging spaces for language learning: AI bots, ambient intelligence, and the metaverse","title-short":"Emerging spaces for language learning","URL":"https://www.lltjournal.org/item/10125-73501/","author":[{"family":"Godwin-Jones","given":"R"}],"accessed":{"date-parts":[["2026",6,7]]},"issued":{"date-parts":[["2023"]]}}},{"id":266,"uris":["http://zotero.org/users/18489330/items/4K9CXPAD"],"itemData":{"id":266,"type":"webpage","DOI":"10.1177/00336882231168504","language":"en","note":"DOI: 10.1177/00336882231168504","title":"Artificial Intelligence in English Language Teaching: The Good, the Bad and the Ugly","title-short":"Artificial Intelligence in English Language Teaching","URL":"https://journals.sagepub.com/doi/epub/10.1177/00336882231168504","author":[{"family":"Hockly","given":"Nicky"}],"accessed":{"date-parts":[["2026",6,7]]},"issued":{"date-parts":[["2023",4]]}}}],"schema":"https://github.com/citation-style-language/schema/raw/master/csl-citation.json"} </w:instrText>
+      </w:r>
+      <w:r>
+        <w:fldChar w:fldCharType="separate"/>
+      </w:r>
+      <w:r>
+        <w:rPr>
+          <w:noProof/>
+        </w:rPr>
+        <w:t>(Godwin-Jones, 2023; Hockly, 2023)</w:t>
+      </w:r>
+      <w:r>
+        <w:fldChar w:fldCharType="end"/>
+      </w:r>
+      <w:r>
+        <w:t xml:space="preserve">. </w:t>
+      </w:r>
+    </w:p>
+    <w:p/>
+    <w:p>
+      <w:r>
+        <w:t>L’IA générative possède des applications concrètes</w:t>
+      </w:r>
+      <w:r>
+        <w:t xml:space="preserve"> </w:t>
+      </w:r>
+      <w:r>
+        <w:t>pour la conception de matériaux authentiques, la différenciation pédagogique et la rétroaction formative, ce qui pourrait transformer le travail de préparation des enseignants</w:t>
+      </w:r>
+      <w:r>
+        <w:t xml:space="preserve"> </w:t>
+      </w:r>
+      <w:r>
+        <w:fldChar w:fldCharType="begin"/>
+      </w:r>
+      <w:r>
+        <w:instrText xml:space="preserve"> ADDIN ZOTERO_ITEM CSL_CITATION {"citationID":"JqUp49C7","properties":{"unsorted":false,"formattedCitation":"(Kohnke et al., 2023)","plainCitation":"(Kohnke et al., 2023)","noteIndex":0},"citationItems":[{"id":255,"uris":["http://zotero.org/users/18489330/items/RFDMJBQC"],"itemData":{"id":255,"type":"article-journal","abstract":"In this technology review, we explore the affordances of the generative AI chatbot ChatGPT for language teaching and learning. In addition to this, we also present debates and drawbacks of ChatGPT. Finally, we present the digital competencies teachers and learners require to use this chatbot ethically and effectively to support language learning.","container-title":"RELC Journal","DOI":"10.1177/00336882231162868","journalAbbreviation":"RELC Journal","source":"ResearchGate","title":"ChatGPT for Language Teaching and Learning","volume":"54","author":[{"family":"Kohnke","given":"Lucas"},{"family":"Moorhouse","given":"Benjamin"},{"family":"Zou","given":"Di"}],"issued":{"date-parts":[["2023",4,3]]}}}],"schema":"https://github.com/citation-style-language/schema/raw/master/csl-citation.json"} </w:instrText>
+      </w:r>
+      <w:r>
+        <w:fldChar w:fldCharType="separate"/>
+      </w:r>
+      <w:r>
+        <w:rPr>
+          <w:noProof/>
+        </w:rPr>
+        <w:t>(Kohnke et al., 2023)</w:t>
+      </w:r>
+      <w:r>
+        <w:fldChar w:fldCharType="end"/>
+      </w:r>
+      <w:r>
+        <w:t xml:space="preserve">. </w:t>
+      </w:r>
+      <w:r>
+        <w:t>La recherche empirique montre toutefois des limites majeures : l’IA générative corrige bien les erreurs morphosyntaxiques, mais elle a du mal à saisir les nuances pragmatiques et culturelles du langage</w:t>
+      </w:r>
+      <w:r>
+        <w:t xml:space="preserve"> </w:t>
+      </w:r>
+      <w:r>
+        <w:fldChar w:fldCharType="begin"/>
+      </w:r>
+      <w:r>
+        <w:instrText xml:space="preserve"> ADDIN ZOTERO_ITEM CSL_CITATION {"citationID":"KzXRyTdw","properties":{"unsorted":false,"formattedCitation":"(Feng et al., 2025)","plainCitation":"(Feng et al., 2025)","noteIndex":0},"citationItems":[{"id":268,"uris":["http://zotero.org/users/18489330/items/8V3NUZY7"],"itemData":{"id":268,"type":"article-journal","abstract":"The rapid advancement of artificial intelligence (AI) technologies has introduced both opportunities and challenges to second language (L2) writing, and a new dimension to L2 writing research. To map the evolving landscape of AI-integrated L2 writing research, this systematic review analyzed 112 studies published between January 2014 and June 2024. The review focused on research contexts and participants, theoretical and methodological orientations, research setups, and key research issues. The analysis revealed that the majority of studies were conducted with undergraduates in the English as a Foreign Language (EFL) context. Most studies did not specify a theoretical framework; however, the predominant theoretical orientations were cognitive, technological-pedagogical, social, critical, and genre. The literature commonly employed eclectic or mixed methodologies, favoring (quasi-)experimental designs with short duration. The writing tasks investigated were varied, with a notable emphasis on elemental genres such as argumentative essays. The main research issues addressed included AI functionalities; students' perceptions and experiences; impacts on students' writing, cognitive, affective, and behavioral performance; teachers' perceptions, teaching practices, and literacy development; and factors influencing AI use. The findings highlight the need for future research, particularly longitudinal studies focusing on the development of AI literacy in L2 writing.","container-title":"Language, Learning and Technology","DOI":"10.64152/10125/73629","journalAbbreviation":"Language, Learning and Technology","page":"1-27","source":"ResearchGate","title":"What does AI bring to second language writing? A systematic review (2014-2024)","title-short":"What does AI bring to second language writing?","volume":"29","author":[{"family":"Feng","given":"Haiying"},{"family":"Li","given":"Kexin"},{"family":"Zhang","given":"Lawrence Jun"}],"issued":{"date-parts":[["2025",5,20]]}}}],"schema":"https://github.com/citation-style-language/schema/raw/master/csl-citation.json"} </w:instrText>
+      </w:r>
+      <w:r>
+        <w:fldChar w:fldCharType="separate"/>
+      </w:r>
+      <w:r>
+        <w:rPr>
+          <w:noProof/>
+        </w:rPr>
+        <w:t>(Feng et al., 2025)</w:t>
+      </w:r>
+      <w:r>
+        <w:fldChar w:fldCharType="end"/>
+      </w:r>
+      <w:r>
+        <w:t xml:space="preserve">. En contexte français spécifiquement, des chercheurs comme </w:t>
+      </w:r>
+      <w:r>
+        <w:lastRenderedPageBreak/>
+        <w:fldChar w:fldCharType="begin"/>
+      </w:r>
+      <w:r>
+        <w:instrText xml:space="preserve"> ADDIN ZOTERO_ITEM CSL_CITATION {"citationID":"UYQvBFTb","properties":{"unsorted":false,"formattedCitation":"(Devauchelle, 2025b)","plainCitation":"(Devauchelle, 2025b)","noteIndex":0},"citationItems":[{"id":272,"uris":["http://zotero.org/users/18489330/items/92YPHBY8"],"itemData":{"id":272,"type":"post-weblog","abstract":"L’IA fait l’objet de tellement de propos, faits, injonctions, préconisations et autres prises de paroles et actions que chacun peut s’y perdre. Quand on travaille auprès des enseignants et de","container-title":"Le Café pédagogique","language":"fr-FR","title":"Enjeux économiques et politiques autour de l’IA à l’école","URL":"https://www.cafepedagogique.net/2025/05/02/enjeux-economiques-et-politiques-autour-de-lia-a-lecole/","author":[{"family":"Devauchelle","given":"Bruno"}],"accessed":{"date-parts":[["2026",6,8]]},"issued":{"date-parts":[["2025",5,2]]}}}],"schema":"https://github.com/citation-style-language/schema/raw/master/csl-citation.json"} </w:instrText>
+      </w:r>
+      <w:r>
+        <w:fldChar w:fldCharType="separate"/>
+      </w:r>
+      <w:r>
+        <w:rPr>
+          <w:noProof/>
+        </w:rPr>
+        <w:t>(Devauchelle, 2025b)</w:t>
+      </w:r>
+      <w:r>
+        <w:fldChar w:fldCharType="end"/>
+      </w:r>
+      <w:r>
+        <w:t xml:space="preserve"> </w:t>
+      </w:r>
+      <w:r>
+        <w:t xml:space="preserve">et </w:t>
+      </w:r>
+      <w:r>
+        <w:fldChar w:fldCharType="begin"/>
+      </w:r>
+      <w:r>
+        <w:instrText xml:space="preserve"> ADDIN ZOTERO_ITEM CSL_CITATION {"citationID":"gnoDbL7J","properties":{"unsorted":false,"formattedCitation":"(Ollivier, 2018)","plainCitation":"(Ollivier, 2018)","noteIndex":0},"citationItems":[{"id":271,"uris":["http://zotero.org/users/18489330/items/3JMKDIX4"],"itemData":{"id":271,"type":"article-journal","language":"fr","source":"Zotero","title":"Littératie numérique et approche socio-interactionnelle pour l’enseignement-apprentissage des langues","author":[{"family":"Ollivier","given":"Christian"}],"issued":{"date-parts":[["2018"]]}}}],"schema":"https://github.com/citation-style-language/schema/raw/master/csl-citation.json"} </w:instrText>
+      </w:r>
+      <w:r>
+        <w:fldChar w:fldCharType="separate"/>
+      </w:r>
+      <w:r>
+        <w:rPr>
+          <w:noProof/>
+        </w:rPr>
+        <w:t>(Ollivier, 2018)</w:t>
+      </w:r>
+      <w:r>
+        <w:fldChar w:fldCharType="end"/>
+      </w:r>
+      <w:r>
+        <w:t xml:space="preserve"> </w:t>
+      </w:r>
+      <w:r>
+        <w:t>insistent sur la nécessité de développer une littératie critique de l’IA chez les enseignants, rappelant que l’outil ne crée de valeur pédagogique que s’il est intégré dans un projet d’apprentissage explicite.</w:t>
+      </w:r>
+      <w:r>
+        <w:t xml:space="preserve"> </w:t>
+      </w:r>
+      <w:r>
+        <w:t>Cette section explore ces usages, possibilités et limites, afin de mieux comprendre comment et pourquoi les enseignants de langues vivantes adoptent ou résistent à l’intégration de l’IA générative dans leur pratique de planification de cours.</w:t>
+      </w:r>
+    </w:p>
+    <w:p/>
+    <w:p>
+      <w:pPr>
+        <w:pStyle w:val="Heading3"/>
+        <w:numPr>
+          <w:ilvl w:val="2"/>
+          <w:numId w:val="23"/>
+        </w:numPr>
+      </w:pPr>
+      <w:r>
+        <w:t>Applications et affordances de l'IA dans l'enseignement des langues</w:t>
+      </w:r>
+    </w:p>
+    <w:p/>
+    <w:p>
+      <w:r>
+        <w:t>Il est essentiel d’analyser les usages émergents de l’IA pour saisir la manière dont ces technologies transforment les gestes professionnels, l’ingénierie didactique et les choix méthodologiques quotidiens des praticiens. L'IA générative ouvre des possibilités concrètes dans l'enseignement des langues vivantes, bien au-delà d'une simple automatisation instrumentale. Ces technologies repensent la transposition didactique, le positionnement des ressources et la personnalisation des parcours d’apprentissage.</w:t>
+      </w:r>
+    </w:p>
+    <w:p/>
+    <w:p>
+      <w:r>
+        <w:t xml:space="preserve">Godwin-Jones (2023) fait le point sur l’évolution technologique des premiers </w:t>
+      </w:r>
+      <w:proofErr w:type="spellStart"/>
+      <w:r>
+        <w:t>chatbots</w:t>
+      </w:r>
+      <w:proofErr w:type="spellEnd"/>
+      <w:r>
+        <w:t xml:space="preserve"> fondés sur des règles rigides vers les modèles de langage de grande taille actuels. L’auteur montre que les LLM réalisent un saut qualitatif majeur dans la production de texte fluide, qui se caractérise par une plasticité morphosyntaxique et une adaptabilité sociolinguistique face aux requêtes de l’utilisateur. Pour les enseignants, cela signifie que l’accès aux supports ciblés ne dépend plus d’une recherche documentaire chronophage ; l’outil agit comme un système dynamique, capable de générer à la demande des dialogues réalistes, des textes de fiction ou des documents authentiques adaptés aux besoins linguistiques et cognitifs immédiats de la classe.</w:t>
+      </w:r>
+    </w:p>
+    <w:p/>
+    <w:p>
+      <w:proofErr w:type="spellStart"/>
+      <w:r>
+        <w:t>Moorhouse</w:t>
+      </w:r>
+      <w:proofErr w:type="spellEnd"/>
+      <w:r>
+        <w:t xml:space="preserve"> &amp; </w:t>
+      </w:r>
+      <w:proofErr w:type="spellStart"/>
+      <w:r>
+        <w:t>Kohnke</w:t>
+      </w:r>
+      <w:proofErr w:type="spellEnd"/>
+      <w:r>
+        <w:t xml:space="preserve"> (2024) examinent la façon dont les enseignants emploient l'ingénierie des invites dans leur préparation. Ils montrent que cette compétence fait de l’IA un « copilote » cognitif, qui optimise le travail invisible en produisant instantanément des grilles d’évaluation, des planifications de séquences ou des activités de systématisation lexicale. Selon </w:t>
+      </w:r>
+      <w:proofErr w:type="spellStart"/>
+      <w:r>
+        <w:t>Hockly</w:t>
+      </w:r>
+      <w:proofErr w:type="spellEnd"/>
+      <w:r>
+        <w:t xml:space="preserve"> (2023), l’IA générative est particulièrement douée pour l’échafaudage textuel, la simplification morphosyntaxique contrôlée et la déclinaison d’un support en plusieurs niveaux de complexité linguistique. Cela permet de concrétiser la différenciation pédagogique en </w:t>
+      </w:r>
+      <w:r>
+        <w:lastRenderedPageBreak/>
+        <w:t>adaptant un document source aux profils hétérogènes des élèves (A1-B2 du CECRL), atténuant ainsi la surcharge de travail associée à l'hétérogénéité.</w:t>
+      </w:r>
+    </w:p>
+    <w:p/>
+    <w:p>
+      <w:pPr>
+        <w:pStyle w:val="Heading3"/>
+      </w:pPr>
+      <w:r>
+        <w:t>Efficacité et limites de l'IA pour l'enseignement des langues</w:t>
+      </w:r>
+    </w:p>
+    <w:p/>
+    <w:p>
+      <w:r>
+        <w:t xml:space="preserve">Les applications ont </w:t>
+      </w:r>
+      <w:proofErr w:type="spellStart"/>
+      <w:proofErr w:type="gramStart"/>
+      <w:r>
+        <w:t>fais</w:t>
+      </w:r>
+      <w:proofErr w:type="spellEnd"/>
+      <w:proofErr w:type="gramEnd"/>
+      <w:r>
+        <w:t xml:space="preserve"> forte impression, mais la recherche empirique montre une réalité plus nuancée : un décalage entre les promesses technologiques et les contraintes de validation didactique. Son efficacité repose beaucoup sur l’expertise critique de l’enseignant, la clarification de ses objectifs pédagogiques et son suivi continu des productions algorithmiques.</w:t>
+      </w:r>
+    </w:p>
+    <w:p>
+      <w:r>
+        <w:t>Feng et coll. (2024) ont réalisé une analyse systématique des outils d’IA utilisés pour l’évaluation et la rétroaction en écriture. Leurs résultats montrent que ces outils améliorent l’évaluation formative en fournissant un soutien individualisé, itératif et immédiatement utilisable, ce qui favorise l’autonomie et diminue les temps de correction. L'IA est habile à détecter les erreurs morphosyntaxiques récurrentes, à homogénéiser les corrections grammaticales et à proposer des alternatives lexicales adaptées dans des formulations standardisées.</w:t>
+      </w:r>
+    </w:p>
+    <w:p/>
+    <w:p>
+      <w:r>
+        <w:t xml:space="preserve">Cependant, les mêmes chercheurs identifient des </w:t>
+      </w:r>
+      <w:r>
+        <w:t>limitations :</w:t>
+      </w:r>
+      <w:r>
+        <w:t xml:space="preserve"> l'IA générative échoue à évaluer la cohérence macro-discursive, à décoder l'implicite textuel, à interpréter les nuances pragmatiques ou à manifester une sensibilité aux variations interculturelles. Le traitement didactique requiert une réévaluation par l'enseignant, seul garant de la validation du sens et de l'accompagnement stylistique. </w:t>
+      </w:r>
+      <w:proofErr w:type="spellStart"/>
+      <w:r>
+        <w:t>Hockly</w:t>
+      </w:r>
+      <w:proofErr w:type="spellEnd"/>
+      <w:r>
+        <w:t xml:space="preserve"> (2023) avertit aussi que l'usage non encadré comporte le risque d'induire une uniformisation stylistique, de masquer les véritables processus d'acquisition et de propager des biais de genre, d'ethnocentrisme ou des stéréotypes culturels sédimentés dans les données d'entraînement.</w:t>
+      </w:r>
+    </w:p>
+    <w:p>
+      <w:pPr>
+        <w:rPr>
+          <w:rFonts w:ascii="Arial" w:hAnsi="Arial" w:cs="Arial"/>
+          <w:color w:val="000000"/>
+          <w:sz w:val="22"/>
+        </w:rPr>
+      </w:pPr>
+    </w:p>
+    <w:p>
+      <w:pPr>
+        <w:pStyle w:val="Heading3"/>
+      </w:pPr>
+      <w:r>
+        <w:t>Perspectives critiques et contexte français</w:t>
+      </w:r>
+    </w:p>
+    <w:p/>
+    <w:p>
+      <w:proofErr w:type="spellStart"/>
+      <w:r>
+        <w:t>Devauçelle</w:t>
+      </w:r>
+      <w:proofErr w:type="spellEnd"/>
+      <w:r>
+        <w:t xml:space="preserve"> (2023) est l'autorité qui donne la vision critique nécessaire pour alerter sur le déterminisme technologique et l'illusion technique qui postule que la nouvelle innovation logicielle peut prendre la place des relations de l'enseignement. En fait, l'utilisation de l'IA n'a </w:t>
+      </w:r>
+      <w:r>
+        <w:lastRenderedPageBreak/>
+        <w:t>d'avantage que s'il est placé sous un projet de formation éthique et réglementé défini par le praticien dans le contexte particulier.</w:t>
+      </w:r>
+    </w:p>
+    <w:p/>
+    <w:p>
+      <w:r>
+        <w:t xml:space="preserve">En complément, Ollivier (2023) s'attaque à la littératie numérique critique nécessaire à chaque enseignant des langues. En effet, l'usage de modèles de langages impliquent des hégémonies linguistiques, stéréotypes et </w:t>
+      </w:r>
+      <w:proofErr w:type="spellStart"/>
+      <w:r>
+        <w:t>occidentalo</w:t>
+      </w:r>
+      <w:proofErr w:type="spellEnd"/>
+      <w:r>
+        <w:t>-centristes. Pour cet effet, les enseignants ont à développer une conscience critique et des compétences en matière de déconstruction pour permettre à leurs élèves d'analyser les outils de communication sur un plan politique, idéologique et culturel.</w:t>
+      </w:r>
+    </w:p>
+    <w:p/>
+    <w:p>
+      <w:pPr>
+        <w:pStyle w:val="Heading3"/>
+      </w:pPr>
+      <w:r>
+        <w:t>Perspectives critiques et contexte français</w:t>
+      </w:r>
+    </w:p>
+    <w:p/>
+    <w:p>
+      <w:proofErr w:type="spellStart"/>
+      <w:r>
+        <w:t>Devauçelle</w:t>
+      </w:r>
+      <w:proofErr w:type="spellEnd"/>
+      <w:r>
+        <w:t xml:space="preserve"> (2023) est l'autorité qui donne la vision critique nécessaire pour alerter sur le déterminisme technologique et l'illusion technique qui postule que la nouvelle innovation logicielle peut prendre la place des relations de l'enseignement. En fait, l'utilisation de l'IA n'a d'avantage que s'il est placé sous un projet de formation éthique et réglementé défini par le praticien dans le contexte particulier.</w:t>
+      </w:r>
+    </w:p>
+    <w:p/>
+    <w:p>
+      <w:r>
+        <w:t xml:space="preserve">En complément, Ollivier (2023) s'attaque à la littératie numérique critique nécessaire à chaque enseignant des langues. En effet, l'usage de modèles de langages impliquent des hégémonies linguistiques, stéréotypes et </w:t>
+      </w:r>
+      <w:proofErr w:type="spellStart"/>
+      <w:r>
+        <w:t>occidentalo</w:t>
+      </w:r>
+      <w:proofErr w:type="spellEnd"/>
+      <w:r>
+        <w:t>-centristes. Pour cet effet, les enseignants ont à développer une conscience critique et des compétences en matière de déconstruction pour permettre à leurs élèves d'analyser les outils de communication sur un plan politique, idéologique et culturel.</w:t>
+      </w:r>
+    </w:p>
+    <w:p/>
+    <w:p>
+      <w:pPr>
+        <w:pStyle w:val="Heading3"/>
+      </w:pPr>
+      <w:r>
+        <w:t xml:space="preserve"> </w:t>
+      </w:r>
+      <w:r>
+        <w:t>Synthèse et lacune de recherche</w:t>
+      </w:r>
+    </w:p>
+    <w:p/>
+    <w:p>
+      <w:r>
+        <w:t xml:space="preserve">Cette étude permet ainsi de constater que l'IA générative propose des affordances prometteuses dans la perspective d'un renouvellement de la préparation, de l'enrichissement des activités et d'une rationalisation du travail invisible, mais qu'elle présente également des difficultés liées à son manque de fiabilité, le risque d'aliénation instrumentale, et la réévaluation de l'effort d'apprentissage. Son adoption ne repose pas tant sur la technologie elle-même que sur la </w:t>
+      </w:r>
+      <w:r>
+        <w:lastRenderedPageBreak/>
+        <w:t>correspondance entre ses facteurs internes (connaissances, croyances et auto-efficacité) et ses éléments structurels d'appui institutionnel.</w:t>
+      </w:r>
+    </w:p>
+    <w:p/>
+    <w:p>
+      <w:r>
+        <w:t>Il convient de noter néanmoins qu'une grande partie des recherches disponibles s'intéressent soit aux applications universitaires, soit au rendement des algorithmes. La littérature n'a pas encore établi d'études centrées sur les facteurs d'acceptabilité de ces outils, leurs utilisations de préparation concrètes et sur leurs difficultés concrètes. Cette recherche se veut un apport pour combler cette lacune en se centrant sur les conceptions professionnelles, l'appropriation technologique et les modalités d'intégration de l'IA générative chez les enseignants de langues vivantes en collège, soumis à des prescriptions programmatiques nationales.</w:t>
+      </w:r>
+    </w:p>
+    <w:p/>
+    <w:p>
+      <w:r>
+        <w:t>Cette littérature revêt donc dans ce chapitre une valeur théorique et empirique importante en ce qu'elle contribue à fonder un cadre de recherche qui tienne compte de toutes les composantes nécessaires pour analyser la question de l'adoption de l'IA générative par les enseignants de langues vivantes : celle-ci ne se résume pas à des facteurs technologiques mais est le fruit d'une complexe négociation entre les affordances pédagogiques de l'outil, les barrières institutionnelles et contextuelles, et la croyance professionnelle des enseignants eux-mêmes. Il faut néanmoins noter que ces recherches existent principalement au sein d'un corpus anglophone et universitaire et qu'il existe un manque flagrant de recherche à ce sujet dans le cadre scolaire et francophone en général et à l'école secondaire en particulier. C'est justement à combler cette lacune que cette recherche s'attèle dans le cadre d'un stage de Master 2 en collège de l'académie de Lyon. Le prochain chapitre est consacré au contexte dans lequel se réalise ce stage.</w:t>
+      </w:r>
+      <w:r>
+        <w:t xml:space="preserve"> </w:t>
+      </w:r>
+    </w:p>
+    <w:p/>
+    <w:p/>
     <w:p>
       <w:pPr>
         <w:pStyle w:val="Heading1"/>
@@ -8698,7 +9086,7 @@
         <w:rPr>
           <w:lang w:val="en-FR"/>
         </w:rPr>
-        <w:instrText xml:space="preserve"> ADDIN ZOTERO_ITEM CSL_CITATION {"citationID":"nFuALUeY","properties":{"unsorted":false,"formattedCitation":"(Devauchelle, 2025)","plainCitation":"(Devauchelle, 2025)","noteIndex":0},"citationItems":[{"id":212,"uris":["http://zotero.org/users/18489330/items/JGMUQMZS"],"itemData":{"id":212,"type":"article-journal","abstract":"Cet article explore l’impact de l’intelligence artificielle (IA) sur l’enseignement et la formation, mettant en lumière les tensions entre fascination, crainte, et adaptation. En France, l’IA générative reste marginale en classe, mais est utilisée en périphérie par les élèves et enseignants pour des tâches comme la préparation des cours ou les travaux scolaires. Les enseignants reconnaissent son potentiel tout en redoutant les risques, notamment en matière d’éthique et de tricherie. L’IA adaptative, en phase d’expérimentation, pourrait personnaliser les apprentissages, mais l’accès limité aux équipements reste un obstacle. Les formateurs et cadres éducatifs voient dans l’IA un outil pour optimiser la gestion et soutenir pédagogiquement les enseignants sans les remplacer. Toutefois, des préoccupations éthiques et juridiques, notamment sur la collecte des données, freinent son intégration. La « liberté pédagogique » reste essentielle pour les enseignants, qui souhaitent conserver leur autorité et leur rôle décisionnel. L’intégration généralisée de l’IA nécessitera du temps et un cadre d’usage clair.","container-title":"Revue internationale d’éducation de Sèvres","DOI":"10.4000/146vm","ISSN":"1254-4590","issue":"HS - 4","language":"fr","license":"https://creativecommons.org/licenses/by-nc-nd/4.0/","publisher":"France Education international","source":"journals.openedition.org","title":"Les enseignants, les formateurs et les cadres éducatifs français face à l’intelligence artificielle","URL":"https://journals.openedition.org/ries/17246","author":[{"family":"Devauchelle","given":"Bruno"}],"accessed":{"date-parts":[["2026",5,29]]},"issued":{"date-parts":[["2025"]],"season":"juin"}}}],"schema":"https://github.com/citation-style-language/schema/raw/master/csl-citation.json"} </w:instrText>
+        <w:instrText xml:space="preserve"> ADDIN ZOTERO_ITEM CSL_CITATION {"citationID":"nFuALUeY","properties":{"unsorted":false,"formattedCitation":"(Devauchelle, 2025a)","plainCitation":"(Devauchelle, 2025a)","noteIndex":0},"citationItems":[{"id":212,"uris":["http://zotero.org/users/18489330/items/JGMUQMZS"],"itemData":{"id":212,"type":"article-journal","abstract":"Cet article explore l’impact de l’intelligence artificielle (IA) sur l’enseignement et la formation, mettant en lumière les tensions entre fascination, crainte, et adaptation. En France, l’IA générative reste marginale en classe, mais est utilisée en périphérie par les élèves et enseignants pour des tâches comme la préparation des cours ou les travaux scolaires. Les enseignants reconnaissent son potentiel tout en redoutant les risques, notamment en matière d’éthique et de tricherie. L’IA adaptative, en phase d’expérimentation, pourrait personnaliser les apprentissages, mais l’accès limité aux équipements reste un obstacle. Les formateurs et cadres éducatifs voient dans l’IA un outil pour optimiser la gestion et soutenir pédagogiquement les enseignants sans les remplacer. Toutefois, des préoccupations éthiques et juridiques, notamment sur la collecte des données, freinent son intégration. La « liberté pédagogique » reste essentielle pour les enseignants, qui souhaitent conserver leur autorité et leur rôle décisionnel. L’intégration généralisée de l’IA nécessitera du temps et un cadre d’usage clair.","container-title":"Revue internationale d’éducation de Sèvres","DOI":"10.4000/146vm","ISSN":"1254-4590","issue":"HS - 4","language":"fr","license":"https://creativecommons.org/licenses/by-nc-nd/4.0/","publisher":"France Education international","source":"journals.openedition.org","title":"Les enseignants, les formateurs et les cadres éducatifs français face à l’intelligence artificielle","URL":"https://journals.openedition.org/ries/17246","author":[{"family":"Devauchelle","given":"Bruno"}],"accessed":{"date-parts":[["2026",5,29]]},"issued":{"date-parts":[["2025"]],"season":"juin"}}}],"schema":"https://github.com/citation-style-language/schema/raw/master/csl-citation.json"} </w:instrText>
       </w:r>
       <w:r>
         <w:rPr>
@@ -8711,7 +9099,7 @@
           <w:noProof/>
           <w:lang w:val="en-FR"/>
         </w:rPr>
-        <w:t>(Devauchelle, 2025)</w:t>
+        <w:t>(Devauchelle, 2025a)</w:t>
       </w:r>
       <w:r>
         <w:rPr>
@@ -10177,7 +10565,7 @@
           <w:color w:val="008080"/>
           <w:sz w:val="20"/>
         </w:rPr>
-        <w:t xml:space="preserve">Devauchelle, B. (2025). Les enseignants, les formateurs et les cadres éducatifs français face à l’intelligence artificielle. </w:t>
+        <w:t xml:space="preserve">Devauchelle, B. (2025a). Les enseignants, les formateurs et les cadres éducatifs français face à l’intelligence artificielle. </w:t>
       </w:r>
       <w:r>
         <w:rPr>
@@ -10196,6 +10584,42 @@
           <w:sz w:val="20"/>
         </w:rPr>
         <w:t>, (HS-4). https://doi.org/10.4000/146vm</w:t>
+      </w:r>
+    </w:p>
+    <w:p>
+      <w:pPr>
+        <w:pStyle w:val="Bibliography"/>
+        <w:rPr>
+          <w:rFonts w:cs="Times New Roman"/>
+          <w:color w:val="008080"/>
+          <w:sz w:val="20"/>
+        </w:rPr>
+      </w:pPr>
+      <w:r>
+        <w:rPr>
+          <w:rFonts w:cs="Times New Roman"/>
+          <w:color w:val="008080"/>
+          <w:sz w:val="20"/>
+        </w:rPr>
+        <w:t xml:space="preserve">Devauchelle, B. (2025b, May 2). Enjeux économiques et politiques autour de l’IA à l’école. </w:t>
+      </w:r>
+      <w:r>
+        <w:rPr>
+          <w:rFonts w:cs="Times New Roman"/>
+          <w:i/>
+          <w:iCs/>
+          <w:color w:val="008080"/>
+          <w:sz w:val="20"/>
+        </w:rPr>
+        <w:t>Le Café pédagogique</w:t>
+      </w:r>
+      <w:r>
+        <w:rPr>
+          <w:rFonts w:cs="Times New Roman"/>
+          <w:color w:val="008080"/>
+          <w:sz w:val="20"/>
+        </w:rPr>
+        <w:t>. https://www.cafepedagogique.net/2025/05/02/enjeux-economiques-et-politiques-autour-de-lia-a-lecole/</w:t>
       </w:r>
     </w:p>
     <w:p>
@@ -10546,89 +10970,16 @@
           <w:rFonts w:cs="Times New Roman"/>
           <w:color w:val="008080"/>
           <w:sz w:val="20"/>
-        </w:rPr>
-      </w:pPr>
-      <w:proofErr w:type="spellStart"/>
+          <w:lang w:val="en-GB"/>
+        </w:rPr>
+      </w:pPr>
       <w:r>
         <w:rPr>
           <w:rFonts w:cs="Times New Roman"/>
           <w:color w:val="008080"/>
           <w:sz w:val="20"/>
         </w:rPr>
-        <w:t>Goigoux</w:t>
-      </w:r>
-      <w:proofErr w:type="spellEnd"/>
-      <w:r>
-        <w:rPr>
-          <w:rFonts w:cs="Times New Roman"/>
-          <w:color w:val="008080"/>
-          <w:sz w:val="20"/>
-        </w:rPr>
-        <w:t xml:space="preserve">, R. (2007). Un modèle d’analyse de l’activité des enseignants. </w:t>
-      </w:r>
-      <w:r>
-        <w:rPr>
-          <w:rFonts w:cs="Times New Roman"/>
-          <w:i/>
-          <w:iCs/>
-          <w:color w:val="008080"/>
-          <w:sz w:val="20"/>
-        </w:rPr>
-        <w:t>Éducation et didactique</w:t>
-      </w:r>
-      <w:r>
-        <w:rPr>
-          <w:rFonts w:cs="Times New Roman"/>
-          <w:color w:val="008080"/>
-          <w:sz w:val="20"/>
-        </w:rPr>
-        <w:t>, (1–3), Article 1–3. https://doi.org/10.4000/educationdidactique.232</w:t>
-      </w:r>
-    </w:p>
-    <w:p>
-      <w:pPr>
-        <w:pStyle w:val="Bibliography"/>
-        <w:rPr>
-          <w:rFonts w:cs="Times New Roman"/>
-          <w:color w:val="008080"/>
-          <w:sz w:val="20"/>
-        </w:rPr>
-      </w:pPr>
-      <w:proofErr w:type="spellStart"/>
-      <w:r>
-        <w:rPr>
-          <w:rFonts w:cs="Times New Roman"/>
-          <w:color w:val="008080"/>
-          <w:sz w:val="20"/>
-        </w:rPr>
-        <w:t>Kohnke</w:t>
-      </w:r>
-      <w:proofErr w:type="spellEnd"/>
-      <w:r>
-        <w:rPr>
-          <w:rFonts w:cs="Times New Roman"/>
-          <w:color w:val="008080"/>
-          <w:sz w:val="20"/>
-        </w:rPr>
-        <w:t xml:space="preserve">, L., </w:t>
-      </w:r>
-      <w:proofErr w:type="spellStart"/>
-      <w:r>
-        <w:rPr>
-          <w:rFonts w:cs="Times New Roman"/>
-          <w:color w:val="008080"/>
-          <w:sz w:val="20"/>
-        </w:rPr>
-        <w:t>Moorhouse</w:t>
-      </w:r>
-      <w:proofErr w:type="spellEnd"/>
-      <w:r>
-        <w:rPr>
-          <w:rFonts w:cs="Times New Roman"/>
-          <w:color w:val="008080"/>
-          <w:sz w:val="20"/>
-        </w:rPr>
-        <w:t xml:space="preserve">, B., &amp; Zou, D. (2023). </w:t>
+        <w:t xml:space="preserve">Feng, H., Li, K., &amp; Zhang, L. J. (2025). </w:t>
       </w:r>
       <w:r>
         <w:rPr>
@@ -10637,217 +10988,7 @@
           <w:sz w:val="20"/>
           <w:lang w:val="en-GB"/>
         </w:rPr>
-        <w:t xml:space="preserve">ChatGPT for Language Teaching and Learning. </w:t>
-      </w:r>
-      <w:r>
-        <w:rPr>
-          <w:rFonts w:cs="Times New Roman"/>
-          <w:i/>
-          <w:iCs/>
-          <w:color w:val="008080"/>
-          <w:sz w:val="20"/>
-        </w:rPr>
-        <w:t>RELC Journal</w:t>
-      </w:r>
-      <w:r>
-        <w:rPr>
-          <w:rFonts w:cs="Times New Roman"/>
-          <w:color w:val="008080"/>
-          <w:sz w:val="20"/>
-        </w:rPr>
-        <w:t xml:space="preserve">, </w:t>
-      </w:r>
-      <w:r>
-        <w:rPr>
-          <w:rFonts w:cs="Times New Roman"/>
-          <w:i/>
-          <w:iCs/>
-          <w:color w:val="008080"/>
-          <w:sz w:val="20"/>
-        </w:rPr>
-        <w:t>54</w:t>
-      </w:r>
-      <w:r>
-        <w:rPr>
-          <w:rFonts w:cs="Times New Roman"/>
-          <w:color w:val="008080"/>
-          <w:sz w:val="20"/>
-        </w:rPr>
-        <w:t>. https://doi.org/10.1177/00336882231162868</w:t>
-      </w:r>
-    </w:p>
-    <w:p>
-      <w:pPr>
-        <w:pStyle w:val="Bibliography"/>
-        <w:rPr>
-          <w:rFonts w:cs="Times New Roman"/>
-          <w:color w:val="008080"/>
-          <w:sz w:val="20"/>
-        </w:rPr>
-      </w:pPr>
-      <w:proofErr w:type="gramStart"/>
-      <w:r>
-        <w:rPr>
-          <w:rFonts w:cs="Times New Roman"/>
-          <w:color w:val="008080"/>
-          <w:sz w:val="20"/>
-        </w:rPr>
-        <w:t>l’Europe</w:t>
-      </w:r>
-      <w:proofErr w:type="gramEnd"/>
-      <w:r>
-        <w:rPr>
-          <w:rFonts w:cs="Times New Roman"/>
-          <w:color w:val="008080"/>
-          <w:sz w:val="20"/>
-        </w:rPr>
-        <w:t xml:space="preserve">, C. de. (2022). </w:t>
-      </w:r>
-      <w:r>
-        <w:rPr>
-          <w:rFonts w:cs="Times New Roman"/>
-          <w:i/>
-          <w:iCs/>
-          <w:color w:val="008080"/>
-          <w:sz w:val="20"/>
-        </w:rPr>
-        <w:t xml:space="preserve">Cadre européen commun de référence pour les </w:t>
-      </w:r>
-      <w:proofErr w:type="gramStart"/>
-      <w:r>
-        <w:rPr>
-          <w:rFonts w:cs="Times New Roman"/>
-          <w:i/>
-          <w:iCs/>
-          <w:color w:val="008080"/>
-          <w:sz w:val="20"/>
-        </w:rPr>
-        <w:t>langues:</w:t>
-      </w:r>
-      <w:proofErr w:type="gramEnd"/>
-      <w:r>
-        <w:rPr>
-          <w:rFonts w:cs="Times New Roman"/>
-          <w:i/>
-          <w:iCs/>
-          <w:color w:val="008080"/>
-          <w:sz w:val="20"/>
-        </w:rPr>
-        <w:t xml:space="preserve"> Apprendre, enseigner, </w:t>
-      </w:r>
-      <w:proofErr w:type="gramStart"/>
-      <w:r>
-        <w:rPr>
-          <w:rFonts w:cs="Times New Roman"/>
-          <w:i/>
-          <w:iCs/>
-          <w:color w:val="008080"/>
-          <w:sz w:val="20"/>
-        </w:rPr>
-        <w:t>évaluer:</w:t>
-      </w:r>
-      <w:proofErr w:type="gramEnd"/>
-      <w:r>
-        <w:rPr>
-          <w:rFonts w:cs="Times New Roman"/>
-          <w:i/>
-          <w:iCs/>
-          <w:color w:val="008080"/>
-          <w:sz w:val="20"/>
-        </w:rPr>
-        <w:t xml:space="preserve"> Volume complémentaire</w:t>
-      </w:r>
-      <w:r>
-        <w:rPr>
-          <w:rFonts w:cs="Times New Roman"/>
-          <w:color w:val="008080"/>
-          <w:sz w:val="20"/>
-        </w:rPr>
-        <w:t>. Council of Europe.</w:t>
-      </w:r>
-    </w:p>
-    <w:p>
-      <w:pPr>
-        <w:pStyle w:val="Bibliography"/>
-        <w:rPr>
-          <w:rFonts w:cs="Times New Roman"/>
-          <w:color w:val="008080"/>
-          <w:sz w:val="20"/>
-        </w:rPr>
-      </w:pPr>
-      <w:r>
-        <w:rPr>
-          <w:rFonts w:cs="Times New Roman"/>
-          <w:i/>
-          <w:iCs/>
-          <w:color w:val="008080"/>
-          <w:sz w:val="20"/>
-        </w:rPr>
-        <w:t>La protection des élèves et de leurs données sur Internet</w:t>
-      </w:r>
-      <w:r>
-        <w:rPr>
-          <w:rFonts w:cs="Times New Roman"/>
-          <w:color w:val="008080"/>
-          <w:sz w:val="20"/>
-        </w:rPr>
-        <w:t xml:space="preserve">. (2019, </w:t>
-      </w:r>
-      <w:proofErr w:type="spellStart"/>
-      <w:r>
-        <w:rPr>
-          <w:rFonts w:cs="Times New Roman"/>
-          <w:color w:val="008080"/>
-          <w:sz w:val="20"/>
-        </w:rPr>
-        <w:t>November</w:t>
-      </w:r>
-      <w:proofErr w:type="spellEnd"/>
-      <w:r>
-        <w:rPr>
-          <w:rFonts w:cs="Times New Roman"/>
-          <w:color w:val="008080"/>
-          <w:sz w:val="20"/>
-        </w:rPr>
-        <w:t xml:space="preserve"> 7). Ministère de l’</w:t>
-      </w:r>
-      <w:proofErr w:type="spellStart"/>
-      <w:r>
-        <w:rPr>
-          <w:rFonts w:cs="Times New Roman"/>
-          <w:color w:val="008080"/>
-          <w:sz w:val="20"/>
-        </w:rPr>
-        <w:t>Education</w:t>
-      </w:r>
-      <w:proofErr w:type="spellEnd"/>
-      <w:r>
-        <w:rPr>
-          <w:rFonts w:cs="Times New Roman"/>
-          <w:color w:val="008080"/>
-          <w:sz w:val="20"/>
-        </w:rPr>
-        <w:t xml:space="preserve"> nationale. https://www.education.gouv.fr/la-protection-des-eleves-et-de-leurs-donnees-sur-internet-7073</w:t>
-      </w:r>
-    </w:p>
-    <w:p>
-      <w:pPr>
-        <w:pStyle w:val="Bibliography"/>
-        <w:rPr>
-          <w:rFonts w:cs="Times New Roman"/>
-          <w:color w:val="008080"/>
-          <w:sz w:val="20"/>
-          <w:lang w:val="en-GB"/>
-        </w:rPr>
-      </w:pPr>
-      <w:r>
-        <w:rPr>
-          <w:rFonts w:cs="Times New Roman"/>
-          <w:color w:val="008080"/>
-          <w:sz w:val="20"/>
-          <w:lang w:val="en-GB"/>
-        </w:rPr>
-        <w:t xml:space="preserve">Lee, S. (2024). </w:t>
+        <w:t xml:space="preserve">What does AI bring to second language writing? A systematic review (2014-2024). </w:t>
       </w:r>
       <w:r>
         <w:rPr>
@@ -10858,7 +10999,7 @@
           <w:sz w:val="20"/>
           <w:lang w:val="en-GB"/>
         </w:rPr>
-        <w:t>Enhancing pre-service EFL teachers’ TPACK through chatbot-integrated lesson planning projects</w:t>
+        <w:t>Language, Learning and Technology</w:t>
       </w:r>
       <w:r>
         <w:rPr>
@@ -10867,26 +11008,7 @@
           <w:sz w:val="20"/>
           <w:lang w:val="en-GB"/>
         </w:rPr>
-        <w:t>.</w:t>
-      </w:r>
-    </w:p>
-    <w:p>
-      <w:pPr>
-        <w:pStyle w:val="Bibliography"/>
-        <w:rPr>
-          <w:rFonts w:cs="Times New Roman"/>
-          <w:color w:val="008080"/>
-          <w:sz w:val="20"/>
-        </w:rPr>
-      </w:pPr>
-      <w:r>
-        <w:rPr>
-          <w:rFonts w:cs="Times New Roman"/>
-          <w:color w:val="008080"/>
-          <w:sz w:val="20"/>
-          <w:lang w:val="en-GB"/>
-        </w:rPr>
-        <w:t xml:space="preserve">Liu, Y., &amp; Wang, H. (2024). </w:t>
+        <w:t xml:space="preserve">, </w:t>
       </w:r>
       <w:r>
         <w:rPr>
@@ -10897,9 +11019,37 @@
           <w:sz w:val="20"/>
           <w:lang w:val="en-GB"/>
         </w:rPr>
-        <w:t xml:space="preserve">Who on Earth Is Using Generative </w:t>
-      </w:r>
-      <w:proofErr w:type="gramStart"/>
+        <w:t>29</w:t>
+      </w:r>
+      <w:r>
+        <w:rPr>
+          <w:rFonts w:cs="Times New Roman"/>
+          <w:color w:val="008080"/>
+          <w:sz w:val="20"/>
+          <w:lang w:val="en-GB"/>
+        </w:rPr>
+        <w:t>, 1–27. https://doi.org/10.64152/10125/73629</w:t>
+      </w:r>
+    </w:p>
+    <w:p>
+      <w:pPr>
+        <w:pStyle w:val="Bibliography"/>
+        <w:rPr>
+          <w:rFonts w:cs="Times New Roman"/>
+          <w:color w:val="008080"/>
+          <w:sz w:val="20"/>
+          <w:lang w:val="en-GB"/>
+        </w:rPr>
+      </w:pPr>
+      <w:r>
+        <w:rPr>
+          <w:rFonts w:cs="Times New Roman"/>
+          <w:color w:val="008080"/>
+          <w:sz w:val="20"/>
+          <w:lang w:val="en-GB"/>
+        </w:rPr>
+        <w:t xml:space="preserve">Godwin-Jones, R. (2023). </w:t>
+      </w:r>
       <w:r>
         <w:rPr>
           <w:rFonts w:cs="Times New Roman"/>
@@ -10909,9 +11059,8 @@
           <w:sz w:val="20"/>
           <w:lang w:val="en-GB"/>
         </w:rPr>
-        <w:t>AI ?</w:t>
-      </w:r>
-      <w:proofErr w:type="gramEnd"/>
+        <w:t>Emerging spaces for language learning: AI bots, ambient intelligence, and the metaverse</w:t>
+      </w:r>
       <w:r>
         <w:rPr>
           <w:rFonts w:cs="Times New Roman"/>
@@ -10919,72 +11068,36 @@
           <w:sz w:val="20"/>
           <w:lang w:val="en-GB"/>
         </w:rPr>
-        <w:t xml:space="preserve"> </w:t>
-      </w:r>
-      <w:r>
+        <w:t>. https://www.lltjournal.org/item/10125-73501/</w:t>
+      </w:r>
+    </w:p>
+    <w:p>
+      <w:pPr>
+        <w:pStyle w:val="Bibliography"/>
         <w:rPr>
           <w:rFonts w:cs="Times New Roman"/>
           <w:color w:val="008080"/>
           <w:sz w:val="20"/>
         </w:rPr>
-        <w:t xml:space="preserve">Washington, </w:t>
-      </w:r>
-      <w:proofErr w:type="gramStart"/>
+      </w:pPr>
+      <w:proofErr w:type="spellStart"/>
       <w:r>
         <w:rPr>
           <w:rFonts w:cs="Times New Roman"/>
           <w:color w:val="008080"/>
           <w:sz w:val="20"/>
         </w:rPr>
-        <w:t>DC:</w:t>
-      </w:r>
-      <w:proofErr w:type="gramEnd"/>
+        <w:t>Goigoux</w:t>
+      </w:r>
+      <w:proofErr w:type="spellEnd"/>
       <w:r>
         <w:rPr>
           <w:rFonts w:cs="Times New Roman"/>
           <w:color w:val="008080"/>
           <w:sz w:val="20"/>
         </w:rPr>
-        <w:t xml:space="preserve"> World Bank. https://doi.org/10.1596/1813-9450-10870</w:t>
-      </w:r>
-    </w:p>
-    <w:p>
-      <w:pPr>
-        <w:pStyle w:val="Bibliography"/>
-        <w:rPr>
-          <w:rFonts w:cs="Times New Roman"/>
-          <w:color w:val="008080"/>
-          <w:sz w:val="20"/>
-          <w:lang w:val="en-GB"/>
-        </w:rPr>
-      </w:pPr>
-      <w:r>
-        <w:rPr>
-          <w:rFonts w:cs="Times New Roman"/>
-          <w:color w:val="008080"/>
-          <w:sz w:val="20"/>
-        </w:rPr>
-        <w:t xml:space="preserve">LOI N° 2005-380 Du 23 Avril 2005 d’orientation et de Programme Pour l’avenir de l’école (1) - Légifrance, LOI n° 2005-380. </w:t>
-      </w:r>
-      <w:r>
-        <w:rPr>
-          <w:rFonts w:cs="Times New Roman"/>
-          <w:color w:val="008080"/>
-          <w:sz w:val="20"/>
-          <w:lang w:val="en-GB"/>
-        </w:rPr>
-        <w:t>Retrieved May 30, 2026, from https://www.legifrance.gouv.fr/jorf/id/JORFTEXT000000259787/</w:t>
-      </w:r>
-    </w:p>
-    <w:p>
-      <w:pPr>
-        <w:pStyle w:val="Bibliography"/>
-        <w:rPr>
-          <w:rFonts w:cs="Times New Roman"/>
-          <w:color w:val="008080"/>
-          <w:sz w:val="20"/>
-        </w:rPr>
-      </w:pPr>
+        <w:t xml:space="preserve">, R. (2007). Un modèle d’analyse de l’activité des enseignants. </w:t>
+      </w:r>
       <w:r>
         <w:rPr>
           <w:rFonts w:cs="Times New Roman"/>
@@ -10993,55 +11106,15 @@
           <w:color w:val="008080"/>
           <w:sz w:val="20"/>
         </w:rPr>
-        <w:t>Ministère de l’</w:t>
-      </w:r>
-      <w:proofErr w:type="spellStart"/>
-      <w:r>
-        <w:rPr>
-          <w:rFonts w:cs="Times New Roman"/>
-          <w:i/>
-          <w:iCs/>
+        <w:t>Éducation et didactique</w:t>
+      </w:r>
+      <w:r>
+        <w:rPr>
+          <w:rFonts w:cs="Times New Roman"/>
           <w:color w:val="008080"/>
           <w:sz w:val="20"/>
         </w:rPr>
-        <w:t>Education</w:t>
-      </w:r>
-      <w:proofErr w:type="spellEnd"/>
-      <w:r>
-        <w:rPr>
-          <w:rFonts w:cs="Times New Roman"/>
-          <w:i/>
-          <w:iCs/>
-          <w:color w:val="008080"/>
-          <w:sz w:val="20"/>
-        </w:rPr>
-        <w:t xml:space="preserve"> nationale 2025a</w:t>
-      </w:r>
-      <w:r>
-        <w:rPr>
-          <w:rFonts w:cs="Times New Roman"/>
-          <w:color w:val="008080"/>
-          <w:sz w:val="20"/>
-        </w:rPr>
-        <w:t>. (2025, June 13). Ministère de l’</w:t>
-      </w:r>
-      <w:proofErr w:type="spellStart"/>
-      <w:r>
-        <w:rPr>
-          <w:rFonts w:cs="Times New Roman"/>
-          <w:color w:val="008080"/>
-          <w:sz w:val="20"/>
-        </w:rPr>
-        <w:t>Education</w:t>
-      </w:r>
-      <w:proofErr w:type="spellEnd"/>
-      <w:r>
-        <w:rPr>
-          <w:rFonts w:cs="Times New Roman"/>
-          <w:color w:val="008080"/>
-          <w:sz w:val="20"/>
-        </w:rPr>
-        <w:t xml:space="preserve"> nationale. https://www.education.gouv.fr/cadre-d-usage-de-l-ia-en-education-450647</w:t>
+        <w:t>, (1–3), Article 1–3. https://doi.org/10.4000/educationdidactique.232</w:t>
       </w:r>
     </w:p>
     <w:p>
@@ -11054,17 +11127,24 @@
           <w:lang w:val="en-GB"/>
         </w:rPr>
       </w:pPr>
+      <w:proofErr w:type="spellStart"/>
       <w:r>
         <w:rPr>
           <w:rFonts w:cs="Times New Roman"/>
           <w:color w:val="008080"/>
           <w:sz w:val="20"/>
-          <w:lang w:val="en-GB"/>
-        </w:rPr>
-        <w:lastRenderedPageBreak/>
-        <w:t xml:space="preserve">Mishra, P., Henriksen, D., Woo, L. J., &amp; Oster, N. (2025). Control vs. Agency: Exploring the History of AI in Education. </w:t>
-      </w:r>
-      <w:proofErr w:type="spellStart"/>
+        </w:rPr>
+        <w:t>Hockly</w:t>
+      </w:r>
+      <w:proofErr w:type="spellEnd"/>
+      <w:r>
+        <w:rPr>
+          <w:rFonts w:cs="Times New Roman"/>
+          <w:color w:val="008080"/>
+          <w:sz w:val="20"/>
+        </w:rPr>
+        <w:t xml:space="preserve">, N. (2023, April). </w:t>
+      </w:r>
       <w:r>
         <w:rPr>
           <w:rFonts w:cs="Times New Roman"/>
@@ -11074,9 +11154,8 @@
           <w:sz w:val="20"/>
           <w:lang w:val="en-GB"/>
         </w:rPr>
-        <w:t>TechTrends</w:t>
-      </w:r>
-      <w:proofErr w:type="spellEnd"/>
+        <w:t>Artificial Intelligence in English Language Teaching: The Good, the Bad and the Ugly</w:t>
+      </w:r>
       <w:r>
         <w:rPr>
           <w:rFonts w:cs="Times New Roman"/>
@@ -11084,7 +11163,236 @@
           <w:sz w:val="20"/>
           <w:lang w:val="en-GB"/>
         </w:rPr>
+        <w:t>. https://doi.org/10.1177/00336882231168504</w:t>
+      </w:r>
+    </w:p>
+    <w:p>
+      <w:pPr>
+        <w:pStyle w:val="Bibliography"/>
+        <w:rPr>
+          <w:rFonts w:cs="Times New Roman"/>
+          <w:color w:val="008080"/>
+          <w:sz w:val="20"/>
+        </w:rPr>
+      </w:pPr>
+      <w:r>
+        <w:rPr>
+          <w:rFonts w:cs="Times New Roman"/>
+          <w:color w:val="008080"/>
+          <w:sz w:val="20"/>
+          <w:lang w:val="en-GB"/>
+        </w:rPr>
+        <w:t xml:space="preserve">Kohnke, L., Moorhouse, B., &amp; Zou, D. (2023). ChatGPT for Language Teaching and Learning. </w:t>
+      </w:r>
+      <w:r>
+        <w:rPr>
+          <w:rFonts w:cs="Times New Roman"/>
+          <w:i/>
+          <w:iCs/>
+          <w:color w:val="008080"/>
+          <w:sz w:val="20"/>
+        </w:rPr>
+        <w:t>RELC Journal</w:t>
+      </w:r>
+      <w:r>
+        <w:rPr>
+          <w:rFonts w:cs="Times New Roman"/>
+          <w:color w:val="008080"/>
+          <w:sz w:val="20"/>
+        </w:rPr>
         <w:t xml:space="preserve">, </w:t>
+      </w:r>
+      <w:r>
+        <w:rPr>
+          <w:rFonts w:cs="Times New Roman"/>
+          <w:i/>
+          <w:iCs/>
+          <w:color w:val="008080"/>
+          <w:sz w:val="20"/>
+        </w:rPr>
+        <w:t>54</w:t>
+      </w:r>
+      <w:r>
+        <w:rPr>
+          <w:rFonts w:cs="Times New Roman"/>
+          <w:color w:val="008080"/>
+          <w:sz w:val="20"/>
+        </w:rPr>
+        <w:t>. https://doi.org/10.1177/00336882231162868</w:t>
+      </w:r>
+    </w:p>
+    <w:p>
+      <w:pPr>
+        <w:pStyle w:val="Bibliography"/>
+        <w:rPr>
+          <w:rFonts w:cs="Times New Roman"/>
+          <w:color w:val="008080"/>
+          <w:sz w:val="20"/>
+        </w:rPr>
+      </w:pPr>
+      <w:proofErr w:type="gramStart"/>
+      <w:r>
+        <w:rPr>
+          <w:rFonts w:cs="Times New Roman"/>
+          <w:color w:val="008080"/>
+          <w:sz w:val="20"/>
+        </w:rPr>
+        <w:t>l’Europe</w:t>
+      </w:r>
+      <w:proofErr w:type="gramEnd"/>
+      <w:r>
+        <w:rPr>
+          <w:rFonts w:cs="Times New Roman"/>
+          <w:color w:val="008080"/>
+          <w:sz w:val="20"/>
+        </w:rPr>
+        <w:t xml:space="preserve">, C. de. (2022). </w:t>
+      </w:r>
+      <w:r>
+        <w:rPr>
+          <w:rFonts w:cs="Times New Roman"/>
+          <w:i/>
+          <w:iCs/>
+          <w:color w:val="008080"/>
+          <w:sz w:val="20"/>
+        </w:rPr>
+        <w:t xml:space="preserve">Cadre européen commun de référence pour les </w:t>
+      </w:r>
+      <w:proofErr w:type="gramStart"/>
+      <w:r>
+        <w:rPr>
+          <w:rFonts w:cs="Times New Roman"/>
+          <w:i/>
+          <w:iCs/>
+          <w:color w:val="008080"/>
+          <w:sz w:val="20"/>
+        </w:rPr>
+        <w:t>langues:</w:t>
+      </w:r>
+      <w:proofErr w:type="gramEnd"/>
+      <w:r>
+        <w:rPr>
+          <w:rFonts w:cs="Times New Roman"/>
+          <w:i/>
+          <w:iCs/>
+          <w:color w:val="008080"/>
+          <w:sz w:val="20"/>
+        </w:rPr>
+        <w:t xml:space="preserve"> Apprendre, enseigner, </w:t>
+      </w:r>
+      <w:proofErr w:type="gramStart"/>
+      <w:r>
+        <w:rPr>
+          <w:rFonts w:cs="Times New Roman"/>
+          <w:i/>
+          <w:iCs/>
+          <w:color w:val="008080"/>
+          <w:sz w:val="20"/>
+        </w:rPr>
+        <w:t>évaluer:</w:t>
+      </w:r>
+      <w:proofErr w:type="gramEnd"/>
+      <w:r>
+        <w:rPr>
+          <w:rFonts w:cs="Times New Roman"/>
+          <w:i/>
+          <w:iCs/>
+          <w:color w:val="008080"/>
+          <w:sz w:val="20"/>
+        </w:rPr>
+        <w:t xml:space="preserve"> Volume complémentaire</w:t>
+      </w:r>
+      <w:r>
+        <w:rPr>
+          <w:rFonts w:cs="Times New Roman"/>
+          <w:color w:val="008080"/>
+          <w:sz w:val="20"/>
+        </w:rPr>
+        <w:t>. Council of Europe.</w:t>
+      </w:r>
+    </w:p>
+    <w:p>
+      <w:pPr>
+        <w:pStyle w:val="Bibliography"/>
+        <w:rPr>
+          <w:rFonts w:cs="Times New Roman"/>
+          <w:color w:val="008080"/>
+          <w:sz w:val="20"/>
+        </w:rPr>
+      </w:pPr>
+      <w:r>
+        <w:rPr>
+          <w:rFonts w:cs="Times New Roman"/>
+          <w:i/>
+          <w:iCs/>
+          <w:color w:val="008080"/>
+          <w:sz w:val="20"/>
+        </w:rPr>
+        <w:t>La protection des élèves et de leurs données sur Internet</w:t>
+      </w:r>
+      <w:r>
+        <w:rPr>
+          <w:rFonts w:cs="Times New Roman"/>
+          <w:color w:val="008080"/>
+          <w:sz w:val="20"/>
+        </w:rPr>
+        <w:t xml:space="preserve">. (2019, </w:t>
+      </w:r>
+      <w:proofErr w:type="spellStart"/>
+      <w:r>
+        <w:rPr>
+          <w:rFonts w:cs="Times New Roman"/>
+          <w:color w:val="008080"/>
+          <w:sz w:val="20"/>
+        </w:rPr>
+        <w:t>November</w:t>
+      </w:r>
+      <w:proofErr w:type="spellEnd"/>
+      <w:r>
+        <w:rPr>
+          <w:rFonts w:cs="Times New Roman"/>
+          <w:color w:val="008080"/>
+          <w:sz w:val="20"/>
+        </w:rPr>
+        <w:t xml:space="preserve"> 7). Ministère de l’</w:t>
+      </w:r>
+      <w:proofErr w:type="spellStart"/>
+      <w:r>
+        <w:rPr>
+          <w:rFonts w:cs="Times New Roman"/>
+          <w:color w:val="008080"/>
+          <w:sz w:val="20"/>
+        </w:rPr>
+        <w:t>Education</w:t>
+      </w:r>
+      <w:proofErr w:type="spellEnd"/>
+      <w:r>
+        <w:rPr>
+          <w:rFonts w:cs="Times New Roman"/>
+          <w:color w:val="008080"/>
+          <w:sz w:val="20"/>
+        </w:rPr>
+        <w:t xml:space="preserve"> nationale. https://www.education.gouv.fr/la-protection-des-eleves-et-de-leurs-donnees-sur-internet-7073</w:t>
+      </w:r>
+    </w:p>
+    <w:p>
+      <w:pPr>
+        <w:pStyle w:val="Bibliography"/>
+        <w:rPr>
+          <w:rFonts w:cs="Times New Roman"/>
+          <w:color w:val="008080"/>
+          <w:sz w:val="20"/>
+          <w:lang w:val="en-GB"/>
+        </w:rPr>
+      </w:pPr>
+      <w:r>
+        <w:rPr>
+          <w:rFonts w:cs="Times New Roman"/>
+          <w:color w:val="008080"/>
+          <w:sz w:val="20"/>
+          <w:lang w:val="en-GB"/>
+        </w:rPr>
+        <w:t xml:space="preserve">Lee, S. (2024). </w:t>
       </w:r>
       <w:r>
         <w:rPr>
@@ -11095,7 +11403,7 @@
           <w:sz w:val="20"/>
           <w:lang w:val="en-GB"/>
         </w:rPr>
-        <w:t>69</w:t>
+        <w:t>Enhancing pre-service EFL teachers’ TPACK through chatbot-integrated lesson planning projects</w:t>
       </w:r>
       <w:r>
         <w:rPr>
@@ -11104,27 +11412,27 @@
           <w:sz w:val="20"/>
           <w:lang w:val="en-GB"/>
         </w:rPr>
-        <w:t>(2), 247–253. https://doi.org/10.1007/s11528-025-01064-2</w:t>
+        <w:t>.</w:t>
       </w:r>
     </w:p>
     <w:p>
       <w:pPr>
         <w:pStyle w:val="Bibliography"/>
+        <w:rPr>
+          <w:rFonts w:cs="Times New Roman"/>
+          <w:color w:val="008080"/>
+          <w:sz w:val="20"/>
+        </w:rPr>
+      </w:pPr>
+      <w:r>
         <w:rPr>
           <w:rFonts w:cs="Times New Roman"/>
           <w:color w:val="008080"/>
           <w:sz w:val="20"/>
           <w:lang w:val="en-GB"/>
         </w:rPr>
-      </w:pPr>
-      <w:r>
-        <w:rPr>
-          <w:rFonts w:cs="Times New Roman"/>
-          <w:color w:val="008080"/>
-          <w:sz w:val="20"/>
-          <w:lang w:val="en-GB"/>
-        </w:rPr>
-        <w:t xml:space="preserve">Morgan, K. L. K. (2025). Phonemic Awareness and AI: Evaluating ChatGPT Plus for Structured Lesson Development. </w:t>
+        <w:lastRenderedPageBreak/>
+        <w:t xml:space="preserve">Liu, Y., &amp; Wang, H. (2024). </w:t>
       </w:r>
       <w:r>
         <w:rPr>
@@ -11135,17 +11443,9 @@
           <w:sz w:val="20"/>
           <w:lang w:val="en-GB"/>
         </w:rPr>
-        <w:t>Texas Journal of Literacy Education</w:t>
-      </w:r>
-      <w:r>
-        <w:rPr>
-          <w:rFonts w:cs="Times New Roman"/>
-          <w:color w:val="008080"/>
-          <w:sz w:val="20"/>
-          <w:lang w:val="en-GB"/>
-        </w:rPr>
-        <w:t xml:space="preserve">, </w:t>
-      </w:r>
+        <w:t xml:space="preserve">Who on Earth Is Using Generative </w:t>
+      </w:r>
+      <w:proofErr w:type="gramStart"/>
       <w:r>
         <w:rPr>
           <w:rFonts w:cs="Times New Roman"/>
@@ -11155,8 +11455,9 @@
           <w:sz w:val="20"/>
           <w:lang w:val="en-GB"/>
         </w:rPr>
-        <w:t>12</w:t>
-      </w:r>
+        <w:t>AI ?</w:t>
+      </w:r>
+      <w:proofErr w:type="gramEnd"/>
       <w:r>
         <w:rPr>
           <w:rFonts w:cs="Times New Roman"/>
@@ -11164,7 +11465,287 @@
           <w:sz w:val="20"/>
           <w:lang w:val="en-GB"/>
         </w:rPr>
+        <w:t xml:space="preserve"> </w:t>
+      </w:r>
+      <w:r>
+        <w:rPr>
+          <w:rFonts w:cs="Times New Roman"/>
+          <w:color w:val="008080"/>
+          <w:sz w:val="20"/>
+        </w:rPr>
+        <w:t xml:space="preserve">Washington, </w:t>
+      </w:r>
+      <w:proofErr w:type="gramStart"/>
+      <w:r>
+        <w:rPr>
+          <w:rFonts w:cs="Times New Roman"/>
+          <w:color w:val="008080"/>
+          <w:sz w:val="20"/>
+        </w:rPr>
+        <w:t>DC:</w:t>
+      </w:r>
+      <w:proofErr w:type="gramEnd"/>
+      <w:r>
+        <w:rPr>
+          <w:rFonts w:cs="Times New Roman"/>
+          <w:color w:val="008080"/>
+          <w:sz w:val="20"/>
+        </w:rPr>
+        <w:t xml:space="preserve"> World Bank. https://doi.org/10.1596/1813-9450-10870</w:t>
+      </w:r>
+    </w:p>
+    <w:p>
+      <w:pPr>
+        <w:pStyle w:val="Bibliography"/>
+        <w:rPr>
+          <w:rFonts w:cs="Times New Roman"/>
+          <w:color w:val="008080"/>
+          <w:sz w:val="20"/>
+          <w:lang w:val="en-GB"/>
+        </w:rPr>
+      </w:pPr>
+      <w:r>
+        <w:rPr>
+          <w:rFonts w:cs="Times New Roman"/>
+          <w:color w:val="008080"/>
+          <w:sz w:val="20"/>
+        </w:rPr>
+        <w:t xml:space="preserve">LOI N° 2005-380 Du 23 Avril 2005 d’orientation et de Programme Pour l’avenir de l’école (1) - Légifrance, LOI n° 2005-380. </w:t>
+      </w:r>
+      <w:r>
+        <w:rPr>
+          <w:rFonts w:cs="Times New Roman"/>
+          <w:color w:val="008080"/>
+          <w:sz w:val="20"/>
+          <w:lang w:val="en-GB"/>
+        </w:rPr>
+        <w:t>Retrieved May 30, 2026, from https://www.legifrance.gouv.fr/jorf/id/JORFTEXT000000259787/</w:t>
+      </w:r>
+    </w:p>
+    <w:p>
+      <w:pPr>
+        <w:pStyle w:val="Bibliography"/>
+        <w:rPr>
+          <w:rFonts w:cs="Times New Roman"/>
+          <w:color w:val="008080"/>
+          <w:sz w:val="20"/>
+        </w:rPr>
+      </w:pPr>
+      <w:r>
+        <w:rPr>
+          <w:rFonts w:cs="Times New Roman"/>
+          <w:i/>
+          <w:iCs/>
+          <w:color w:val="008080"/>
+          <w:sz w:val="20"/>
+        </w:rPr>
+        <w:t>Ministère de l’</w:t>
+      </w:r>
+      <w:proofErr w:type="spellStart"/>
+      <w:r>
+        <w:rPr>
+          <w:rFonts w:cs="Times New Roman"/>
+          <w:i/>
+          <w:iCs/>
+          <w:color w:val="008080"/>
+          <w:sz w:val="20"/>
+        </w:rPr>
+        <w:t>Education</w:t>
+      </w:r>
+      <w:proofErr w:type="spellEnd"/>
+      <w:r>
+        <w:rPr>
+          <w:rFonts w:cs="Times New Roman"/>
+          <w:i/>
+          <w:iCs/>
+          <w:color w:val="008080"/>
+          <w:sz w:val="20"/>
+        </w:rPr>
+        <w:t xml:space="preserve"> nationale 2025a</w:t>
+      </w:r>
+      <w:r>
+        <w:rPr>
+          <w:rFonts w:cs="Times New Roman"/>
+          <w:color w:val="008080"/>
+          <w:sz w:val="20"/>
+        </w:rPr>
+        <w:t>. (2025, June 13). Ministère de l’</w:t>
+      </w:r>
+      <w:proofErr w:type="spellStart"/>
+      <w:r>
+        <w:rPr>
+          <w:rFonts w:cs="Times New Roman"/>
+          <w:color w:val="008080"/>
+          <w:sz w:val="20"/>
+        </w:rPr>
+        <w:t>Education</w:t>
+      </w:r>
+      <w:proofErr w:type="spellEnd"/>
+      <w:r>
+        <w:rPr>
+          <w:rFonts w:cs="Times New Roman"/>
+          <w:color w:val="008080"/>
+          <w:sz w:val="20"/>
+        </w:rPr>
+        <w:t xml:space="preserve"> nationale. https://www.education.gouv.fr/cadre-d-usage-de-l-ia-en-education-450647</w:t>
+      </w:r>
+    </w:p>
+    <w:p>
+      <w:pPr>
+        <w:pStyle w:val="Bibliography"/>
+        <w:rPr>
+          <w:rFonts w:cs="Times New Roman"/>
+          <w:color w:val="008080"/>
+          <w:sz w:val="20"/>
+          <w:lang w:val="en-GB"/>
+        </w:rPr>
+      </w:pPr>
+      <w:r>
+        <w:rPr>
+          <w:rFonts w:cs="Times New Roman"/>
+          <w:color w:val="008080"/>
+          <w:sz w:val="20"/>
+          <w:lang w:val="en-GB"/>
+        </w:rPr>
+        <w:t xml:space="preserve">Mishra, P., Henriksen, D., Woo, L. J., &amp; Oster, N. (2025). Control vs. Agency: Exploring the History of AI in Education. </w:t>
+      </w:r>
+      <w:proofErr w:type="spellStart"/>
+      <w:r>
+        <w:rPr>
+          <w:rFonts w:cs="Times New Roman"/>
+          <w:i/>
+          <w:iCs/>
+          <w:color w:val="008080"/>
+          <w:sz w:val="20"/>
+          <w:lang w:val="en-GB"/>
+        </w:rPr>
+        <w:t>TechTrends</w:t>
+      </w:r>
+      <w:proofErr w:type="spellEnd"/>
+      <w:r>
+        <w:rPr>
+          <w:rFonts w:cs="Times New Roman"/>
+          <w:color w:val="008080"/>
+          <w:sz w:val="20"/>
+          <w:lang w:val="en-GB"/>
+        </w:rPr>
+        <w:t xml:space="preserve">, </w:t>
+      </w:r>
+      <w:r>
+        <w:rPr>
+          <w:rFonts w:cs="Times New Roman"/>
+          <w:i/>
+          <w:iCs/>
+          <w:color w:val="008080"/>
+          <w:sz w:val="20"/>
+          <w:lang w:val="en-GB"/>
+        </w:rPr>
+        <w:t>69</w:t>
+      </w:r>
+      <w:r>
+        <w:rPr>
+          <w:rFonts w:cs="Times New Roman"/>
+          <w:color w:val="008080"/>
+          <w:sz w:val="20"/>
+          <w:lang w:val="en-GB"/>
+        </w:rPr>
+        <w:t>(2), 247–253. https://doi.org/10.1007/s11528-025-01064-2</w:t>
+      </w:r>
+    </w:p>
+    <w:p>
+      <w:pPr>
+        <w:pStyle w:val="Bibliography"/>
+        <w:rPr>
+          <w:rFonts w:cs="Times New Roman"/>
+          <w:color w:val="008080"/>
+          <w:sz w:val="20"/>
+          <w:lang w:val="en-GB"/>
+        </w:rPr>
+      </w:pPr>
+      <w:r>
+        <w:rPr>
+          <w:rFonts w:cs="Times New Roman"/>
+          <w:color w:val="008080"/>
+          <w:sz w:val="20"/>
+          <w:lang w:val="en-GB"/>
+        </w:rPr>
+        <w:t xml:space="preserve">Morgan, K. L. K. (2025). Phonemic Awareness and AI: Evaluating ChatGPT Plus for Structured Lesson Development. </w:t>
+      </w:r>
+      <w:r>
+        <w:rPr>
+          <w:rFonts w:cs="Times New Roman"/>
+          <w:i/>
+          <w:iCs/>
+          <w:color w:val="008080"/>
+          <w:sz w:val="20"/>
+          <w:lang w:val="en-GB"/>
+        </w:rPr>
+        <w:t>Texas Journal of Literacy Education</w:t>
+      </w:r>
+      <w:r>
+        <w:rPr>
+          <w:rFonts w:cs="Times New Roman"/>
+          <w:color w:val="008080"/>
+          <w:sz w:val="20"/>
+          <w:lang w:val="en-GB"/>
+        </w:rPr>
+        <w:t xml:space="preserve">, </w:t>
+      </w:r>
+      <w:r>
+        <w:rPr>
+          <w:rFonts w:cs="Times New Roman"/>
+          <w:i/>
+          <w:iCs/>
+          <w:color w:val="008080"/>
+          <w:sz w:val="20"/>
+          <w:lang w:val="en-GB"/>
+        </w:rPr>
+        <w:t>12</w:t>
+      </w:r>
+      <w:r>
+        <w:rPr>
+          <w:rFonts w:cs="Times New Roman"/>
+          <w:color w:val="008080"/>
+          <w:sz w:val="20"/>
+          <w:lang w:val="en-GB"/>
+        </w:rPr>
         <w:t>(1). https://www.talejournal.com/index.php/TJLE/article/view/175</w:t>
+      </w:r>
+    </w:p>
+    <w:p>
+      <w:pPr>
+        <w:pStyle w:val="Bibliography"/>
+        <w:rPr>
+          <w:rFonts w:cs="Times New Roman"/>
+          <w:color w:val="008080"/>
+          <w:sz w:val="20"/>
+        </w:rPr>
+      </w:pPr>
+      <w:r>
+        <w:rPr>
+          <w:rFonts w:cs="Times New Roman"/>
+          <w:color w:val="008080"/>
+          <w:sz w:val="20"/>
+        </w:rPr>
+        <w:t xml:space="preserve">Ollivier, C. (2018). </w:t>
+      </w:r>
+      <w:r>
+        <w:rPr>
+          <w:rFonts w:cs="Times New Roman"/>
+          <w:i/>
+          <w:iCs/>
+          <w:color w:val="008080"/>
+          <w:sz w:val="20"/>
+        </w:rPr>
+        <w:t>Littératie numérique et approche socio-interactionnelle pour l’enseignement-apprentissage des langues</w:t>
+      </w:r>
+      <w:r>
+        <w:rPr>
+          <w:rFonts w:cs="Times New Roman"/>
+          <w:color w:val="008080"/>
+          <w:sz w:val="20"/>
+        </w:rPr>
+        <w:t>.</w:t>
       </w:r>
     </w:p>
     <w:p>
@@ -11788,7 +12369,7 @@
             <wp:extent cx="5740400" cy="4889500"/>
             <wp:effectExtent l="0" t="0" r="0" b="0"/>
             <wp:docPr id="220501641" name="Picture 2">
-              <a:hlinkClick xmlns:a="http://schemas.openxmlformats.org/drawingml/2006/main" r:id="rId15"/>
+              <a:hlinkClick xmlns:a="http://schemas.openxmlformats.org/drawingml/2006/main" r:id="rId14"/>
             </wp:docPr>
             <wp:cNvGraphicFramePr>
               <a:graphicFrameLocks xmlns:a="http://schemas.openxmlformats.org/drawingml/2006/main" noChangeAspect="1"/>
@@ -11798,14 +12379,14 @@
                 <pic:pic xmlns:pic="http://schemas.openxmlformats.org/drawingml/2006/picture">
                   <pic:nvPicPr>
                     <pic:cNvPr id="220501641" name="Picture 2">
-                      <a:hlinkClick r:id="rId15"/>
+                      <a:hlinkClick r:id="rId14"/>
                     </pic:cNvPr>
                     <pic:cNvPicPr>
                       <a:picLocks noChangeAspect="1" noChangeArrowheads="1"/>
                     </pic:cNvPicPr>
                   </pic:nvPicPr>
                   <pic:blipFill>
-                    <a:blip r:embed="rId16">
+                    <a:blip r:embed="rId15">
                       <a:extLst>
                         <a:ext uri="{28A0092B-C50C-407E-A947-70E740481C1C}">
                           <a14:useLocalDpi xmlns:a14="http://schemas.microsoft.com/office/drawing/2010/main" val="0"/>
@@ -24597,6 +25178,36 @@
   </w:num>
   <w:num w:numId="22" w16cid:durableId="72944314">
     <w:abstractNumId w:val="6"/>
+  </w:num>
+  <w:num w:numId="23" w16cid:durableId="1685665462">
+    <w:abstractNumId w:val="4"/>
+    <w:lvlOverride w:ilvl="0">
+      <w:startOverride w:val="1"/>
+    </w:lvlOverride>
+    <w:lvlOverride w:ilvl="1">
+      <w:startOverride w:val="1"/>
+    </w:lvlOverride>
+    <w:lvlOverride w:ilvl="2">
+      <w:startOverride w:val="1"/>
+    </w:lvlOverride>
+    <w:lvlOverride w:ilvl="3">
+      <w:startOverride w:val="1"/>
+    </w:lvlOverride>
+    <w:lvlOverride w:ilvl="4">
+      <w:startOverride w:val="1"/>
+    </w:lvlOverride>
+    <w:lvlOverride w:ilvl="5">
+      <w:startOverride w:val="1"/>
+    </w:lvlOverride>
+    <w:lvlOverride w:ilvl="6">
+      <w:startOverride w:val="1"/>
+    </w:lvlOverride>
+    <w:lvlOverride w:ilvl="7">
+      <w:startOverride w:val="1"/>
+    </w:lvlOverride>
+    <w:lvlOverride w:ilvl="8">
+      <w:startOverride w:val="1"/>
+    </w:lvlOverride>
   </w:num>
 </w:numbering>
 </file>
@@ -25245,7 +25856,6 @@
   <w:style w:type="character" w:default="1" w:styleId="DefaultParagraphFont">
     <w:name w:val="Default Paragraph Font"/>
     <w:uiPriority w:val="1"/>
-    <w:semiHidden/>
     <w:unhideWhenUsed/>
   </w:style>
   <w:style w:type="table" w:default="1" w:styleId="TableNormal">

</xml_diff>

<commit_message>
tavle of contents updated
</commit_message>
<xml_diff>
--- a/my_report/Thesis_FR.docx
+++ b/my_report/Thesis_FR.docx
@@ -713,7 +713,7 @@
       <w:pPr>
         <w:pStyle w:val="Heading1"/>
       </w:pPr>
-      <w:bookmarkStart w:id="0" w:name="_Toc231678072"/>
+      <w:bookmarkStart w:id="0" w:name="_Toc232092722"/>
       <w:r>
         <w:lastRenderedPageBreak/>
         <w:t>Résumé</w:t>
@@ -748,7 +748,7 @@
       <w:pPr>
         <w:pStyle w:val="Heading1"/>
       </w:pPr>
-      <w:bookmarkStart w:id="1" w:name="_Toc231678073"/>
+      <w:bookmarkStart w:id="1" w:name="_Toc232092723"/>
       <w:r>
         <w:lastRenderedPageBreak/>
         <w:t>M</w:t>
@@ -775,7 +775,7 @@
       <w:pPr>
         <w:pStyle w:val="Heading1"/>
       </w:pPr>
-      <w:bookmarkStart w:id="2" w:name="_Toc231678074"/>
+      <w:bookmarkStart w:id="2" w:name="_Toc232092724"/>
       <w:r>
         <w:lastRenderedPageBreak/>
         <w:t>Glossaire</w:t>
@@ -795,7 +795,7 @@
       <w:pPr>
         <w:pStyle w:val="Heading1"/>
       </w:pPr>
-      <w:bookmarkStart w:id="3" w:name="_Toc231678075"/>
+      <w:bookmarkStart w:id="3" w:name="_Toc232092725"/>
       <w:r>
         <w:lastRenderedPageBreak/>
         <w:t>Liste des Abréviations</w:t>
@@ -819,7 +819,7 @@
       <w:pPr>
         <w:pStyle w:val="Heading1"/>
       </w:pPr>
-      <w:bookmarkStart w:id="4" w:name="_Toc231678076"/>
+      <w:bookmarkStart w:id="4" w:name="_Toc232092726"/>
       <w:r>
         <w:lastRenderedPageBreak/>
         <w:t>Remerciements</w:t>
@@ -840,7 +840,7 @@
       <w:pPr>
         <w:pStyle w:val="Heading1"/>
       </w:pPr>
-      <w:bookmarkStart w:id="5" w:name="_Toc231678077"/>
+      <w:bookmarkStart w:id="5" w:name="_Toc232092727"/>
       <w:r>
         <w:lastRenderedPageBreak/>
         <w:t>Avertissement</w:t>
@@ -867,7 +867,7 @@
           <w:lang w:val="en-IN"/>
         </w:rPr>
       </w:pPr>
-      <w:bookmarkStart w:id="6" w:name="_Toc231678078"/>
+      <w:bookmarkStart w:id="6" w:name="_Toc232092728"/>
       <w:r>
         <w:lastRenderedPageBreak/>
         <w:t>Sommaire</w:t>
@@ -913,7 +913,7 @@
         </w:rPr>
         <w:fldChar w:fldCharType="separate"/>
       </w:r>
-      <w:hyperlink w:anchor="_Toc231678072" w:history="1">
+      <w:hyperlink w:anchor="_Toc232092722" w:history="1">
         <w:r>
           <w:rPr>
             <w:rStyle w:val="Hyperlink"/>
@@ -940,7 +940,7 @@
             <w:noProof/>
             <w:webHidden/>
           </w:rPr>
-          <w:instrText xml:space="preserve"> PAGEREF _Toc231678072 \h </w:instrText>
+          <w:instrText xml:space="preserve"> PAGEREF _Toc232092722 \h </w:instrText>
         </w:r>
         <w:r>
           <w:rPr>
@@ -988,7 +988,7 @@
           <w14:ligatures w14:val="standardContextual"/>
         </w:rPr>
       </w:pPr>
-      <w:hyperlink w:anchor="_Toc231678073" w:history="1">
+      <w:hyperlink w:anchor="_Toc232092723" w:history="1">
         <w:r>
           <w:rPr>
             <w:rStyle w:val="Hyperlink"/>
@@ -1015,7 +1015,7 @@
             <w:noProof/>
             <w:webHidden/>
           </w:rPr>
-          <w:instrText xml:space="preserve"> PAGEREF _Toc231678073 \h </w:instrText>
+          <w:instrText xml:space="preserve"> PAGEREF _Toc232092723 \h </w:instrText>
         </w:r>
         <w:r>
           <w:rPr>
@@ -1063,7 +1063,7 @@
           <w14:ligatures w14:val="standardContextual"/>
         </w:rPr>
       </w:pPr>
-      <w:hyperlink w:anchor="_Toc231678074" w:history="1">
+      <w:hyperlink w:anchor="_Toc232092724" w:history="1">
         <w:r>
           <w:rPr>
             <w:rStyle w:val="Hyperlink"/>
@@ -1090,7 +1090,7 @@
             <w:noProof/>
             <w:webHidden/>
           </w:rPr>
-          <w:instrText xml:space="preserve"> PAGEREF _Toc231678074 \h </w:instrText>
+          <w:instrText xml:space="preserve"> PAGEREF _Toc232092724 \h </w:instrText>
         </w:r>
         <w:r>
           <w:rPr>
@@ -1138,7 +1138,7 @@
           <w14:ligatures w14:val="standardContextual"/>
         </w:rPr>
       </w:pPr>
-      <w:hyperlink w:anchor="_Toc231678075" w:history="1">
+      <w:hyperlink w:anchor="_Toc232092725" w:history="1">
         <w:r>
           <w:rPr>
             <w:rStyle w:val="Hyperlink"/>
@@ -1165,7 +1165,7 @@
             <w:noProof/>
             <w:webHidden/>
           </w:rPr>
-          <w:instrText xml:space="preserve"> PAGEREF _Toc231678075 \h </w:instrText>
+          <w:instrText xml:space="preserve"> PAGEREF _Toc232092725 \h </w:instrText>
         </w:r>
         <w:r>
           <w:rPr>
@@ -1213,7 +1213,7 @@
           <w14:ligatures w14:val="standardContextual"/>
         </w:rPr>
       </w:pPr>
-      <w:hyperlink w:anchor="_Toc231678076" w:history="1">
+      <w:hyperlink w:anchor="_Toc232092726" w:history="1">
         <w:r>
           <w:rPr>
             <w:rStyle w:val="Hyperlink"/>
@@ -1240,7 +1240,7 @@
             <w:noProof/>
             <w:webHidden/>
           </w:rPr>
-          <w:instrText xml:space="preserve"> PAGEREF _Toc231678076 \h </w:instrText>
+          <w:instrText xml:space="preserve"> PAGEREF _Toc232092726 \h </w:instrText>
         </w:r>
         <w:r>
           <w:rPr>
@@ -1288,7 +1288,7 @@
           <w14:ligatures w14:val="standardContextual"/>
         </w:rPr>
       </w:pPr>
-      <w:hyperlink w:anchor="_Toc231678077" w:history="1">
+      <w:hyperlink w:anchor="_Toc232092727" w:history="1">
         <w:r>
           <w:rPr>
             <w:rStyle w:val="Hyperlink"/>
@@ -1315,7 +1315,7 @@
             <w:noProof/>
             <w:webHidden/>
           </w:rPr>
-          <w:instrText xml:space="preserve"> PAGEREF _Toc231678077 \h </w:instrText>
+          <w:instrText xml:space="preserve"> PAGEREF _Toc232092727 \h </w:instrText>
         </w:r>
         <w:r>
           <w:rPr>
@@ -1363,7 +1363,7 @@
           <w14:ligatures w14:val="standardContextual"/>
         </w:rPr>
       </w:pPr>
-      <w:hyperlink w:anchor="_Toc231678078" w:history="1">
+      <w:hyperlink w:anchor="_Toc232092728" w:history="1">
         <w:r>
           <w:rPr>
             <w:rStyle w:val="Hyperlink"/>
@@ -1390,7 +1390,7 @@
             <w:noProof/>
             <w:webHidden/>
           </w:rPr>
-          <w:instrText xml:space="preserve"> PAGEREF _Toc231678078 \h </w:instrText>
+          <w:instrText xml:space="preserve"> PAGEREF _Toc232092728 \h </w:instrText>
         </w:r>
         <w:r>
           <w:rPr>
@@ -1438,7 +1438,7 @@
           <w14:ligatures w14:val="standardContextual"/>
         </w:rPr>
       </w:pPr>
-      <w:hyperlink w:anchor="_Toc231678079" w:history="1">
+      <w:hyperlink w:anchor="_Toc232092729" w:history="1">
         <w:r>
           <w:rPr>
             <w:rStyle w:val="Hyperlink"/>
@@ -1465,7 +1465,7 @@
             <w:noProof/>
             <w:webHidden/>
           </w:rPr>
-          <w:instrText xml:space="preserve"> PAGEREF _Toc231678079 \h </w:instrText>
+          <w:instrText xml:space="preserve"> PAGEREF _Toc232092729 \h </w:instrText>
         </w:r>
         <w:r>
           <w:rPr>
@@ -1485,7 +1485,7 @@
             <w:noProof/>
             <w:webHidden/>
           </w:rPr>
-          <w:t>12</w:t>
+          <w:t>13</w:t>
         </w:r>
         <w:r>
           <w:rPr>
@@ -1513,7 +1513,7 @@
           <w14:ligatures w14:val="standardContextual"/>
         </w:rPr>
       </w:pPr>
-      <w:hyperlink w:anchor="_Toc231678080" w:history="1">
+      <w:hyperlink w:anchor="_Toc232092730" w:history="1">
         <w:r>
           <w:rPr>
             <w:rStyle w:val="Hyperlink"/>
@@ -1540,7 +1540,7 @@
             <w:noProof/>
             <w:webHidden/>
           </w:rPr>
-          <w:instrText xml:space="preserve"> PAGEREF _Toc231678080 \h </w:instrText>
+          <w:instrText xml:space="preserve"> PAGEREF _Toc232092730 \h </w:instrText>
         </w:r>
         <w:r>
           <w:rPr>
@@ -1560,7 +1560,7 @@
             <w:noProof/>
             <w:webHidden/>
           </w:rPr>
-          <w:t>14</w:t>
+          <w:t>15</w:t>
         </w:r>
         <w:r>
           <w:rPr>
@@ -1587,7 +1587,7 @@
           <w14:ligatures w14:val="standardContextual"/>
         </w:rPr>
       </w:pPr>
-      <w:hyperlink w:anchor="_Toc231678081" w:history="1">
+      <w:hyperlink w:anchor="_Toc232092731" w:history="1">
         <w:r>
           <w:rPr>
             <w:rStyle w:val="Hyperlink"/>
@@ -1632,7 +1632,7 @@
             <w:noProof/>
             <w:webHidden/>
           </w:rPr>
-          <w:instrText xml:space="preserve"> PAGEREF _Toc231678081 \h </w:instrText>
+          <w:instrText xml:space="preserve"> PAGEREF _Toc232092731 \h </w:instrText>
         </w:r>
         <w:r>
           <w:rPr>
@@ -1652,7 +1652,7 @@
             <w:noProof/>
             <w:webHidden/>
           </w:rPr>
-          <w:t>14</w:t>
+          <w:t>15</w:t>
         </w:r>
         <w:r>
           <w:rPr>
@@ -1679,13 +1679,13 @@
           <w14:ligatures w14:val="standardContextual"/>
         </w:rPr>
       </w:pPr>
-      <w:hyperlink w:anchor="_Toc231678082" w:history="1">
+      <w:hyperlink w:anchor="_Toc232092732" w:history="1">
         <w:r>
           <w:rPr>
             <w:rStyle w:val="Hyperlink"/>
             <w:noProof/>
           </w:rPr>
-          <w:t>(b)</w:t>
+          <w:t>(a)</w:t>
         </w:r>
         <w:r>
           <w:rPr>
@@ -1724,7 +1724,7 @@
             <w:noProof/>
             <w:webHidden/>
           </w:rPr>
-          <w:instrText xml:space="preserve"> PAGEREF _Toc231678082 \h </w:instrText>
+          <w:instrText xml:space="preserve"> PAGEREF _Toc232092732 \h </w:instrText>
         </w:r>
         <w:r>
           <w:rPr>
@@ -1744,7 +1744,7 @@
             <w:noProof/>
             <w:webHidden/>
           </w:rPr>
-          <w:t>15</w:t>
+          <w:t>16</w:t>
         </w:r>
         <w:r>
           <w:rPr>
@@ -1771,7 +1771,7 @@
           <w14:ligatures w14:val="standardContextual"/>
         </w:rPr>
       </w:pPr>
-      <w:hyperlink w:anchor="_Toc231678083" w:history="1">
+      <w:hyperlink w:anchor="_Toc232092733" w:history="1">
         <w:r>
           <w:rPr>
             <w:rStyle w:val="Hyperlink"/>
@@ -1779,7 +1779,7 @@
             <w:noProof/>
             <w:lang w:val="en-FR" w:eastAsia="en-GB"/>
           </w:rPr>
-          <w:t>(c)</w:t>
+          <w:t>(b)</w:t>
         </w:r>
         <w:r>
           <w:rPr>
@@ -1820,7 +1820,7 @@
             <w:noProof/>
             <w:webHidden/>
           </w:rPr>
-          <w:instrText xml:space="preserve"> PAGEREF _Toc231678083 \h </w:instrText>
+          <w:instrText xml:space="preserve"> PAGEREF _Toc232092733 \h </w:instrText>
         </w:r>
         <w:r>
           <w:rPr>
@@ -1840,7 +1840,7 @@
             <w:noProof/>
             <w:webHidden/>
           </w:rPr>
-          <w:t>15</w:t>
+          <w:t>16</w:t>
         </w:r>
         <w:r>
           <w:rPr>
@@ -1867,7 +1867,7 @@
           <w14:ligatures w14:val="standardContextual"/>
         </w:rPr>
       </w:pPr>
-      <w:hyperlink w:anchor="_Toc231678084" w:history="1">
+      <w:hyperlink w:anchor="_Toc232092734" w:history="1">
         <w:r>
           <w:rPr>
             <w:rStyle w:val="Hyperlink"/>
@@ -1875,7 +1875,7 @@
             <w:noProof/>
             <w:lang w:eastAsia="en-GB"/>
           </w:rPr>
-          <w:t>(d)</w:t>
+          <w:t>(c)</w:t>
         </w:r>
         <w:r>
           <w:rPr>
@@ -1916,7 +1916,7 @@
             <w:noProof/>
             <w:webHidden/>
           </w:rPr>
-          <w:instrText xml:space="preserve"> PAGEREF _Toc231678084 \h </w:instrText>
+          <w:instrText xml:space="preserve"> PAGEREF _Toc232092734 \h </w:instrText>
         </w:r>
         <w:r>
           <w:rPr>
@@ -1936,7 +1936,7 @@
             <w:noProof/>
             <w:webHidden/>
           </w:rPr>
-          <w:t>16</w:t>
+          <w:t>17</w:t>
         </w:r>
         <w:r>
           <w:rPr>
@@ -1963,7 +1963,7 @@
           <w14:ligatures w14:val="standardContextual"/>
         </w:rPr>
       </w:pPr>
-      <w:hyperlink w:anchor="_Toc231678085" w:history="1">
+      <w:hyperlink w:anchor="_Toc232092735" w:history="1">
         <w:r>
           <w:rPr>
             <w:rStyle w:val="Hyperlink"/>
@@ -2008,7 +2008,7 @@
             <w:noProof/>
             <w:webHidden/>
           </w:rPr>
-          <w:instrText xml:space="preserve"> PAGEREF _Toc231678085 \h </w:instrText>
+          <w:instrText xml:space="preserve"> PAGEREF _Toc232092735 \h </w:instrText>
         </w:r>
         <w:r>
           <w:rPr>
@@ -2028,7 +2028,7 @@
             <w:noProof/>
             <w:webHidden/>
           </w:rPr>
-          <w:t>17</w:t>
+          <w:t>18</w:t>
         </w:r>
         <w:r>
           <w:rPr>
@@ -2055,7 +2055,7 @@
           <w14:ligatures w14:val="standardContextual"/>
         </w:rPr>
       </w:pPr>
-      <w:hyperlink w:anchor="_Toc231678086" w:history="1">
+      <w:hyperlink w:anchor="_Toc232092736" w:history="1">
         <w:r>
           <w:rPr>
             <w:rStyle w:val="Hyperlink"/>
@@ -2100,7 +2100,7 @@
             <w:noProof/>
             <w:webHidden/>
           </w:rPr>
-          <w:instrText xml:space="preserve"> PAGEREF _Toc231678086 \h </w:instrText>
+          <w:instrText xml:space="preserve"> PAGEREF _Toc232092736 \h </w:instrText>
         </w:r>
         <w:r>
           <w:rPr>
@@ -2120,7 +2120,7 @@
             <w:noProof/>
             <w:webHidden/>
           </w:rPr>
-          <w:t>17</w:t>
+          <w:t>18</w:t>
         </w:r>
         <w:r>
           <w:rPr>
@@ -2147,7 +2147,7 @@
           <w14:ligatures w14:val="standardContextual"/>
         </w:rPr>
       </w:pPr>
-      <w:hyperlink w:anchor="_Toc231678087" w:history="1">
+      <w:hyperlink w:anchor="_Toc232092737" w:history="1">
         <w:r>
           <w:rPr>
             <w:rStyle w:val="Hyperlink"/>
@@ -2196,7 +2196,7 @@
             <w:noProof/>
             <w:webHidden/>
           </w:rPr>
-          <w:instrText xml:space="preserve"> PAGEREF _Toc231678087 \h </w:instrText>
+          <w:instrText xml:space="preserve"> PAGEREF _Toc232092737 \h </w:instrText>
         </w:r>
         <w:r>
           <w:rPr>
@@ -2216,7 +2216,7 @@
             <w:noProof/>
             <w:webHidden/>
           </w:rPr>
-          <w:t>18</w:t>
+          <w:t>19</w:t>
         </w:r>
         <w:r>
           <w:rPr>
@@ -2243,7 +2243,7 @@
           <w14:ligatures w14:val="standardContextual"/>
         </w:rPr>
       </w:pPr>
-      <w:hyperlink w:anchor="_Toc231678088" w:history="1">
+      <w:hyperlink w:anchor="_Toc232092738" w:history="1">
         <w:r>
           <w:rPr>
             <w:rStyle w:val="Hyperlink"/>
@@ -2290,7 +2290,7 @@
             <w:noProof/>
             <w:webHidden/>
           </w:rPr>
-          <w:instrText xml:space="preserve"> PAGEREF _Toc231678088 \h </w:instrText>
+          <w:instrText xml:space="preserve"> PAGEREF _Toc232092738 \h </w:instrText>
         </w:r>
         <w:r>
           <w:rPr>
@@ -2310,7 +2310,7 @@
             <w:noProof/>
             <w:webHidden/>
           </w:rPr>
-          <w:t>18</w:t>
+          <w:t>19</w:t>
         </w:r>
         <w:r>
           <w:rPr>
@@ -2337,7 +2337,7 @@
           <w14:ligatures w14:val="standardContextual"/>
         </w:rPr>
       </w:pPr>
-      <w:hyperlink w:anchor="_Toc231678089" w:history="1">
+      <w:hyperlink w:anchor="_Toc232092739" w:history="1">
         <w:r>
           <w:rPr>
             <w:rStyle w:val="Hyperlink"/>
@@ -2384,7 +2384,7 @@
             <w:noProof/>
             <w:webHidden/>
           </w:rPr>
-          <w:instrText xml:space="preserve"> PAGEREF _Toc231678089 \h </w:instrText>
+          <w:instrText xml:space="preserve"> PAGEREF _Toc232092739 \h </w:instrText>
         </w:r>
         <w:r>
           <w:rPr>
@@ -2404,7 +2404,7 @@
             <w:noProof/>
             <w:webHidden/>
           </w:rPr>
-          <w:t>20</w:t>
+          <w:t>21</w:t>
         </w:r>
         <w:r>
           <w:rPr>
@@ -2431,7 +2431,7 @@
           <w14:ligatures w14:val="standardContextual"/>
         </w:rPr>
       </w:pPr>
-      <w:hyperlink w:anchor="_Toc231678090" w:history="1">
+      <w:hyperlink w:anchor="_Toc232092740" w:history="1">
         <w:r>
           <w:rPr>
             <w:rStyle w:val="Hyperlink"/>
@@ -2476,7 +2476,7 @@
             <w:noProof/>
             <w:webHidden/>
           </w:rPr>
-          <w:instrText xml:space="preserve"> PAGEREF _Toc231678090 \h </w:instrText>
+          <w:instrText xml:space="preserve"> PAGEREF _Toc232092740 \h </w:instrText>
         </w:r>
         <w:r>
           <w:rPr>
@@ -2496,7 +2496,7 @@
             <w:noProof/>
             <w:webHidden/>
           </w:rPr>
-          <w:t>21</w:t>
+          <w:t>22</w:t>
         </w:r>
         <w:r>
           <w:rPr>
@@ -2523,7 +2523,7 @@
           <w14:ligatures w14:val="standardContextual"/>
         </w:rPr>
       </w:pPr>
-      <w:hyperlink w:anchor="_Toc231678091" w:history="1">
+      <w:hyperlink w:anchor="_Toc232092741" w:history="1">
         <w:r>
           <w:rPr>
             <w:rStyle w:val="Hyperlink"/>
@@ -2568,7 +2568,7 @@
             <w:noProof/>
             <w:webHidden/>
           </w:rPr>
-          <w:instrText xml:space="preserve"> PAGEREF _Toc231678091 \h </w:instrText>
+          <w:instrText xml:space="preserve"> PAGEREF _Toc232092741 \h </w:instrText>
         </w:r>
         <w:r>
           <w:rPr>
@@ -2588,7 +2588,7 @@
             <w:noProof/>
             <w:webHidden/>
           </w:rPr>
-          <w:t>22</w:t>
+          <w:t>23</w:t>
         </w:r>
         <w:r>
           <w:rPr>
@@ -2615,7 +2615,7 @@
           <w14:ligatures w14:val="standardContextual"/>
         </w:rPr>
       </w:pPr>
-      <w:hyperlink w:anchor="_Toc231678092" w:history="1">
+      <w:hyperlink w:anchor="_Toc232092742" w:history="1">
         <w:r>
           <w:rPr>
             <w:rStyle w:val="Hyperlink"/>
@@ -2662,7 +2662,7 @@
             <w:noProof/>
             <w:webHidden/>
           </w:rPr>
-          <w:instrText xml:space="preserve"> PAGEREF _Toc231678092 \h </w:instrText>
+          <w:instrText xml:space="preserve"> PAGEREF _Toc232092742 \h </w:instrText>
         </w:r>
         <w:r>
           <w:rPr>
@@ -2682,7 +2682,7 @@
             <w:noProof/>
             <w:webHidden/>
           </w:rPr>
-          <w:t>23</w:t>
+          <w:t>24</w:t>
         </w:r>
         <w:r>
           <w:rPr>
@@ -2709,7 +2709,7 @@
           <w14:ligatures w14:val="standardContextual"/>
         </w:rPr>
       </w:pPr>
-      <w:hyperlink w:anchor="_Toc231678093" w:history="1">
+      <w:hyperlink w:anchor="_Toc232092743" w:history="1">
         <w:r>
           <w:rPr>
             <w:rStyle w:val="Hyperlink"/>
@@ -2754,7 +2754,7 @@
             <w:noProof/>
             <w:webHidden/>
           </w:rPr>
-          <w:instrText xml:space="preserve"> PAGEREF _Toc231678093 \h </w:instrText>
+          <w:instrText xml:space="preserve"> PAGEREF _Toc232092743 \h </w:instrText>
         </w:r>
         <w:r>
           <w:rPr>
@@ -2774,7 +2774,7 @@
             <w:noProof/>
             <w:webHidden/>
           </w:rPr>
-          <w:t>24</w:t>
+          <w:t>25</w:t>
         </w:r>
         <w:r>
           <w:rPr>
@@ -2801,7 +2801,7 @@
           <w14:ligatures w14:val="standardContextual"/>
         </w:rPr>
       </w:pPr>
-      <w:hyperlink w:anchor="_Toc231678094" w:history="1">
+      <w:hyperlink w:anchor="_Toc232092744" w:history="1">
         <w:r>
           <w:rPr>
             <w:rStyle w:val="Hyperlink"/>
@@ -2846,7 +2846,7 @@
             <w:noProof/>
             <w:webHidden/>
           </w:rPr>
-          <w:instrText xml:space="preserve"> PAGEREF _Toc231678094 \h </w:instrText>
+          <w:instrText xml:space="preserve"> PAGEREF _Toc232092744 \h </w:instrText>
         </w:r>
         <w:r>
           <w:rPr>
@@ -2866,7 +2866,467 @@
             <w:noProof/>
             <w:webHidden/>
           </w:rPr>
-          <w:t>25</w:t>
+          <w:t>26</w:t>
+        </w:r>
+        <w:r>
+          <w:rPr>
+            <w:noProof/>
+            <w:webHidden/>
+          </w:rPr>
+          <w:fldChar w:fldCharType="end"/>
+        </w:r>
+      </w:hyperlink>
+    </w:p>
+    <w:p>
+      <w:pPr>
+        <w:pStyle w:val="TOC2"/>
+        <w:tabs>
+          <w:tab w:val="left" w:pos="720"/>
+          <w:tab w:val="right" w:leader="dot" w:pos="9016"/>
+        </w:tabs>
+        <w:rPr>
+          <w:rFonts w:asciiTheme="minorHAnsi" w:eastAsiaTheme="minorEastAsia" w:hAnsiTheme="minorHAnsi"/>
+          <w:noProof/>
+          <w:kern w:val="2"/>
+          <w:szCs w:val="24"/>
+          <w:lang w:val="en-FR" w:eastAsia="en-GB"/>
+          <w14:ligatures w14:val="standardContextual"/>
+        </w:rPr>
+      </w:pPr>
+      <w:hyperlink w:anchor="_Toc232092745" w:history="1">
+        <w:r>
+          <w:rPr>
+            <w:rStyle w:val="Hyperlink"/>
+            <w:noProof/>
+          </w:rPr>
+          <w:t>4)</w:t>
+        </w:r>
+        <w:r>
+          <w:rPr>
+            <w:rFonts w:asciiTheme="minorHAnsi" w:eastAsiaTheme="minorEastAsia" w:hAnsiTheme="minorHAnsi"/>
+            <w:noProof/>
+            <w:kern w:val="2"/>
+            <w:szCs w:val="24"/>
+            <w:lang w:val="en-FR" w:eastAsia="en-GB"/>
+            <w14:ligatures w14:val="standardContextual"/>
+          </w:rPr>
+          <w:tab/>
+        </w:r>
+        <w:r>
+          <w:rPr>
+            <w:rStyle w:val="Hyperlink"/>
+            <w:noProof/>
+          </w:rPr>
+          <w:t>L'intelligence artificielle dans l'enseignement des langues vivantes</w:t>
+        </w:r>
+        <w:r>
+          <w:rPr>
+            <w:noProof/>
+            <w:webHidden/>
+          </w:rPr>
+          <w:tab/>
+        </w:r>
+        <w:r>
+          <w:rPr>
+            <w:noProof/>
+            <w:webHidden/>
+          </w:rPr>
+          <w:fldChar w:fldCharType="begin"/>
+        </w:r>
+        <w:r>
+          <w:rPr>
+            <w:noProof/>
+            <w:webHidden/>
+          </w:rPr>
+          <w:instrText xml:space="preserve"> PAGEREF _Toc232092745 \h </w:instrText>
+        </w:r>
+        <w:r>
+          <w:rPr>
+            <w:noProof/>
+            <w:webHidden/>
+          </w:rPr>
+        </w:r>
+        <w:r>
+          <w:rPr>
+            <w:noProof/>
+            <w:webHidden/>
+          </w:rPr>
+          <w:fldChar w:fldCharType="separate"/>
+        </w:r>
+        <w:r>
+          <w:rPr>
+            <w:noProof/>
+            <w:webHidden/>
+          </w:rPr>
+          <w:t>27</w:t>
+        </w:r>
+        <w:r>
+          <w:rPr>
+            <w:noProof/>
+            <w:webHidden/>
+          </w:rPr>
+          <w:fldChar w:fldCharType="end"/>
+        </w:r>
+      </w:hyperlink>
+    </w:p>
+    <w:p>
+      <w:pPr>
+        <w:pStyle w:val="TOC3"/>
+        <w:tabs>
+          <w:tab w:val="left" w:pos="1200"/>
+          <w:tab w:val="right" w:leader="dot" w:pos="9016"/>
+        </w:tabs>
+        <w:rPr>
+          <w:rFonts w:asciiTheme="minorHAnsi" w:eastAsiaTheme="minorEastAsia" w:hAnsiTheme="minorHAnsi"/>
+          <w:noProof/>
+          <w:kern w:val="2"/>
+          <w:szCs w:val="24"/>
+          <w:lang w:val="en-FR" w:eastAsia="en-GB"/>
+          <w14:ligatures w14:val="standardContextual"/>
+        </w:rPr>
+      </w:pPr>
+      <w:hyperlink w:anchor="_Toc232092746" w:history="1">
+        <w:r>
+          <w:rPr>
+            <w:rStyle w:val="Hyperlink"/>
+            <w:noProof/>
+          </w:rPr>
+          <w:t>(a)</w:t>
+        </w:r>
+        <w:r>
+          <w:rPr>
+            <w:rFonts w:asciiTheme="minorHAnsi" w:eastAsiaTheme="minorEastAsia" w:hAnsiTheme="minorHAnsi"/>
+            <w:noProof/>
+            <w:kern w:val="2"/>
+            <w:szCs w:val="24"/>
+            <w:lang w:val="en-FR" w:eastAsia="en-GB"/>
+            <w14:ligatures w14:val="standardContextual"/>
+          </w:rPr>
+          <w:tab/>
+        </w:r>
+        <w:r>
+          <w:rPr>
+            <w:rStyle w:val="Hyperlink"/>
+            <w:noProof/>
+          </w:rPr>
+          <w:t>Applications et affordances de l'IA dans l'enseignement des langues</w:t>
+        </w:r>
+        <w:r>
+          <w:rPr>
+            <w:noProof/>
+            <w:webHidden/>
+          </w:rPr>
+          <w:tab/>
+        </w:r>
+        <w:r>
+          <w:rPr>
+            <w:noProof/>
+            <w:webHidden/>
+          </w:rPr>
+          <w:fldChar w:fldCharType="begin"/>
+        </w:r>
+        <w:r>
+          <w:rPr>
+            <w:noProof/>
+            <w:webHidden/>
+          </w:rPr>
+          <w:instrText xml:space="preserve"> PAGEREF _Toc232092746 \h </w:instrText>
+        </w:r>
+        <w:r>
+          <w:rPr>
+            <w:noProof/>
+            <w:webHidden/>
+          </w:rPr>
+        </w:r>
+        <w:r>
+          <w:rPr>
+            <w:noProof/>
+            <w:webHidden/>
+          </w:rPr>
+          <w:fldChar w:fldCharType="separate"/>
+        </w:r>
+        <w:r>
+          <w:rPr>
+            <w:noProof/>
+            <w:webHidden/>
+          </w:rPr>
+          <w:t>28</w:t>
+        </w:r>
+        <w:r>
+          <w:rPr>
+            <w:noProof/>
+            <w:webHidden/>
+          </w:rPr>
+          <w:fldChar w:fldCharType="end"/>
+        </w:r>
+      </w:hyperlink>
+    </w:p>
+    <w:p>
+      <w:pPr>
+        <w:pStyle w:val="TOC3"/>
+        <w:tabs>
+          <w:tab w:val="left" w:pos="1200"/>
+          <w:tab w:val="right" w:leader="dot" w:pos="9016"/>
+        </w:tabs>
+        <w:rPr>
+          <w:rFonts w:asciiTheme="minorHAnsi" w:eastAsiaTheme="minorEastAsia" w:hAnsiTheme="minorHAnsi"/>
+          <w:noProof/>
+          <w:kern w:val="2"/>
+          <w:szCs w:val="24"/>
+          <w:lang w:val="en-FR" w:eastAsia="en-GB"/>
+          <w14:ligatures w14:val="standardContextual"/>
+        </w:rPr>
+      </w:pPr>
+      <w:hyperlink w:anchor="_Toc232092747" w:history="1">
+        <w:r>
+          <w:rPr>
+            <w:rStyle w:val="Hyperlink"/>
+            <w:noProof/>
+          </w:rPr>
+          <w:t>(b)</w:t>
+        </w:r>
+        <w:r>
+          <w:rPr>
+            <w:rFonts w:asciiTheme="minorHAnsi" w:eastAsiaTheme="minorEastAsia" w:hAnsiTheme="minorHAnsi"/>
+            <w:noProof/>
+            <w:kern w:val="2"/>
+            <w:szCs w:val="24"/>
+            <w:lang w:val="en-FR" w:eastAsia="en-GB"/>
+            <w14:ligatures w14:val="standardContextual"/>
+          </w:rPr>
+          <w:tab/>
+        </w:r>
+        <w:r>
+          <w:rPr>
+            <w:rStyle w:val="Hyperlink"/>
+            <w:noProof/>
+          </w:rPr>
+          <w:t>Efficacité et limites de l'IA pour l'enseignement des langues</w:t>
+        </w:r>
+        <w:r>
+          <w:rPr>
+            <w:noProof/>
+            <w:webHidden/>
+          </w:rPr>
+          <w:tab/>
+        </w:r>
+        <w:r>
+          <w:rPr>
+            <w:noProof/>
+            <w:webHidden/>
+          </w:rPr>
+          <w:fldChar w:fldCharType="begin"/>
+        </w:r>
+        <w:r>
+          <w:rPr>
+            <w:noProof/>
+            <w:webHidden/>
+          </w:rPr>
+          <w:instrText xml:space="preserve"> PAGEREF _Toc232092747 \h </w:instrText>
+        </w:r>
+        <w:r>
+          <w:rPr>
+            <w:noProof/>
+            <w:webHidden/>
+          </w:rPr>
+        </w:r>
+        <w:r>
+          <w:rPr>
+            <w:noProof/>
+            <w:webHidden/>
+          </w:rPr>
+          <w:fldChar w:fldCharType="separate"/>
+        </w:r>
+        <w:r>
+          <w:rPr>
+            <w:noProof/>
+            <w:webHidden/>
+          </w:rPr>
+          <w:t>29</w:t>
+        </w:r>
+        <w:r>
+          <w:rPr>
+            <w:noProof/>
+            <w:webHidden/>
+          </w:rPr>
+          <w:fldChar w:fldCharType="end"/>
+        </w:r>
+      </w:hyperlink>
+    </w:p>
+    <w:p>
+      <w:pPr>
+        <w:pStyle w:val="TOC3"/>
+        <w:tabs>
+          <w:tab w:val="left" w:pos="1200"/>
+          <w:tab w:val="right" w:leader="dot" w:pos="9016"/>
+        </w:tabs>
+        <w:rPr>
+          <w:rFonts w:asciiTheme="minorHAnsi" w:eastAsiaTheme="minorEastAsia" w:hAnsiTheme="minorHAnsi"/>
+          <w:noProof/>
+          <w:kern w:val="2"/>
+          <w:szCs w:val="24"/>
+          <w:lang w:val="en-FR" w:eastAsia="en-GB"/>
+          <w14:ligatures w14:val="standardContextual"/>
+        </w:rPr>
+      </w:pPr>
+      <w:hyperlink w:anchor="_Toc232092748" w:history="1">
+        <w:r>
+          <w:rPr>
+            <w:rStyle w:val="Hyperlink"/>
+            <w:noProof/>
+          </w:rPr>
+          <w:t>(c)</w:t>
+        </w:r>
+        <w:r>
+          <w:rPr>
+            <w:rFonts w:asciiTheme="minorHAnsi" w:eastAsiaTheme="minorEastAsia" w:hAnsiTheme="minorHAnsi"/>
+            <w:noProof/>
+            <w:kern w:val="2"/>
+            <w:szCs w:val="24"/>
+            <w:lang w:val="en-FR" w:eastAsia="en-GB"/>
+            <w14:ligatures w14:val="standardContextual"/>
+          </w:rPr>
+          <w:tab/>
+        </w:r>
+        <w:r>
+          <w:rPr>
+            <w:rStyle w:val="Hyperlink"/>
+            <w:noProof/>
+          </w:rPr>
+          <w:t>Perspectives critiques et contexte français</w:t>
+        </w:r>
+        <w:r>
+          <w:rPr>
+            <w:noProof/>
+            <w:webHidden/>
+          </w:rPr>
+          <w:tab/>
+        </w:r>
+        <w:r>
+          <w:rPr>
+            <w:noProof/>
+            <w:webHidden/>
+          </w:rPr>
+          <w:fldChar w:fldCharType="begin"/>
+        </w:r>
+        <w:r>
+          <w:rPr>
+            <w:noProof/>
+            <w:webHidden/>
+          </w:rPr>
+          <w:instrText xml:space="preserve"> PAGEREF _Toc232092748 \h </w:instrText>
+        </w:r>
+        <w:r>
+          <w:rPr>
+            <w:noProof/>
+            <w:webHidden/>
+          </w:rPr>
+        </w:r>
+        <w:r>
+          <w:rPr>
+            <w:noProof/>
+            <w:webHidden/>
+          </w:rPr>
+          <w:fldChar w:fldCharType="separate"/>
+        </w:r>
+        <w:r>
+          <w:rPr>
+            <w:noProof/>
+            <w:webHidden/>
+          </w:rPr>
+          <w:t>29</w:t>
+        </w:r>
+        <w:r>
+          <w:rPr>
+            <w:noProof/>
+            <w:webHidden/>
+          </w:rPr>
+          <w:fldChar w:fldCharType="end"/>
+        </w:r>
+      </w:hyperlink>
+    </w:p>
+    <w:p>
+      <w:pPr>
+        <w:pStyle w:val="TOC3"/>
+        <w:tabs>
+          <w:tab w:val="left" w:pos="1200"/>
+          <w:tab w:val="right" w:leader="dot" w:pos="9016"/>
+        </w:tabs>
+        <w:rPr>
+          <w:rFonts w:asciiTheme="minorHAnsi" w:eastAsiaTheme="minorEastAsia" w:hAnsiTheme="minorHAnsi"/>
+          <w:noProof/>
+          <w:kern w:val="2"/>
+          <w:szCs w:val="24"/>
+          <w:lang w:val="en-FR" w:eastAsia="en-GB"/>
+          <w14:ligatures w14:val="standardContextual"/>
+        </w:rPr>
+      </w:pPr>
+      <w:hyperlink w:anchor="_Toc232092749" w:history="1">
+        <w:r>
+          <w:rPr>
+            <w:rStyle w:val="Hyperlink"/>
+            <w:noProof/>
+          </w:rPr>
+          <w:t>(d)</w:t>
+        </w:r>
+        <w:r>
+          <w:rPr>
+            <w:rFonts w:asciiTheme="minorHAnsi" w:eastAsiaTheme="minorEastAsia" w:hAnsiTheme="minorHAnsi"/>
+            <w:noProof/>
+            <w:kern w:val="2"/>
+            <w:szCs w:val="24"/>
+            <w:lang w:val="en-FR" w:eastAsia="en-GB"/>
+            <w14:ligatures w14:val="standardContextual"/>
+          </w:rPr>
+          <w:tab/>
+        </w:r>
+        <w:r>
+          <w:rPr>
+            <w:rStyle w:val="Hyperlink"/>
+            <w:noProof/>
+          </w:rPr>
+          <w:t>Synthèse et lacune de recherche</w:t>
+        </w:r>
+        <w:r>
+          <w:rPr>
+            <w:noProof/>
+            <w:webHidden/>
+          </w:rPr>
+          <w:tab/>
+        </w:r>
+        <w:r>
+          <w:rPr>
+            <w:noProof/>
+            <w:webHidden/>
+          </w:rPr>
+          <w:fldChar w:fldCharType="begin"/>
+        </w:r>
+        <w:r>
+          <w:rPr>
+            <w:noProof/>
+            <w:webHidden/>
+          </w:rPr>
+          <w:instrText xml:space="preserve"> PAGEREF _Toc232092749 \h </w:instrText>
+        </w:r>
+        <w:r>
+          <w:rPr>
+            <w:noProof/>
+            <w:webHidden/>
+          </w:rPr>
+        </w:r>
+        <w:r>
+          <w:rPr>
+            <w:noProof/>
+            <w:webHidden/>
+          </w:rPr>
+          <w:fldChar w:fldCharType="separate"/>
+        </w:r>
+        <w:r>
+          <w:rPr>
+            <w:noProof/>
+            <w:webHidden/>
+          </w:rPr>
+          <w:t>30</w:t>
         </w:r>
         <w:r>
           <w:rPr>
@@ -2894,7 +3354,7 @@
           <w14:ligatures w14:val="standardContextual"/>
         </w:rPr>
       </w:pPr>
-      <w:hyperlink w:anchor="_Toc231678095" w:history="1">
+      <w:hyperlink w:anchor="_Toc232092750" w:history="1">
         <w:r>
           <w:rPr>
             <w:rStyle w:val="Hyperlink"/>
@@ -2921,7 +3381,7 @@
             <w:noProof/>
             <w:webHidden/>
           </w:rPr>
-          <w:instrText xml:space="preserve"> PAGEREF _Toc231678095 \h </w:instrText>
+          <w:instrText xml:space="preserve"> PAGEREF _Toc232092750 \h </w:instrText>
         </w:r>
         <w:r>
           <w:rPr>
@@ -2941,7 +3401,7 @@
             <w:noProof/>
             <w:webHidden/>
           </w:rPr>
-          <w:t>27</w:t>
+          <w:t>32</w:t>
         </w:r>
         <w:r>
           <w:rPr>
@@ -2968,7 +3428,7 @@
           <w14:ligatures w14:val="standardContextual"/>
         </w:rPr>
       </w:pPr>
-      <w:hyperlink w:anchor="_Toc231678096" w:history="1">
+      <w:hyperlink w:anchor="_Toc232092751" w:history="1">
         <w:r>
           <w:rPr>
             <w:rStyle w:val="Hyperlink"/>
@@ -3013,7 +3473,7 @@
             <w:noProof/>
             <w:webHidden/>
           </w:rPr>
-          <w:instrText xml:space="preserve"> PAGEREF _Toc231678096 \h </w:instrText>
+          <w:instrText xml:space="preserve"> PAGEREF _Toc232092751 \h </w:instrText>
         </w:r>
         <w:r>
           <w:rPr>
@@ -3033,7 +3493,7 @@
             <w:noProof/>
             <w:webHidden/>
           </w:rPr>
-          <w:t>27</w:t>
+          <w:t>32</w:t>
         </w:r>
         <w:r>
           <w:rPr>
@@ -3060,7 +3520,7 @@
           <w14:ligatures w14:val="standardContextual"/>
         </w:rPr>
       </w:pPr>
-      <w:hyperlink w:anchor="_Toc231678097" w:history="1">
+      <w:hyperlink w:anchor="_Toc232092752" w:history="1">
         <w:r>
           <w:rPr>
             <w:rStyle w:val="Hyperlink"/>
@@ -3105,7 +3565,7 @@
             <w:noProof/>
             <w:webHidden/>
           </w:rPr>
-          <w:instrText xml:space="preserve"> PAGEREF _Toc231678097 \h </w:instrText>
+          <w:instrText xml:space="preserve"> PAGEREF _Toc232092752 \h </w:instrText>
         </w:r>
         <w:r>
           <w:rPr>
@@ -3125,7 +3585,7 @@
             <w:noProof/>
             <w:webHidden/>
           </w:rPr>
-          <w:t>27</w:t>
+          <w:t>32</w:t>
         </w:r>
         <w:r>
           <w:rPr>
@@ -3152,7 +3612,7 @@
           <w14:ligatures w14:val="standardContextual"/>
         </w:rPr>
       </w:pPr>
-      <w:hyperlink w:anchor="_Toc231678098" w:history="1">
+      <w:hyperlink w:anchor="_Toc232092753" w:history="1">
         <w:r>
           <w:rPr>
             <w:rStyle w:val="Hyperlink"/>
@@ -3197,7 +3657,7 @@
             <w:noProof/>
             <w:webHidden/>
           </w:rPr>
-          <w:instrText xml:space="preserve"> PAGEREF _Toc231678098 \h </w:instrText>
+          <w:instrText xml:space="preserve"> PAGEREF _Toc232092753 \h </w:instrText>
         </w:r>
         <w:r>
           <w:rPr>
@@ -3217,7 +3677,7 @@
             <w:noProof/>
             <w:webHidden/>
           </w:rPr>
-          <w:t>29</w:t>
+          <w:t>34</w:t>
         </w:r>
         <w:r>
           <w:rPr>
@@ -3244,7 +3704,7 @@
           <w14:ligatures w14:val="standardContextual"/>
         </w:rPr>
       </w:pPr>
-      <w:hyperlink w:anchor="_Toc231678099" w:history="1">
+      <w:hyperlink w:anchor="_Toc232092754" w:history="1">
         <w:r>
           <w:rPr>
             <w:rStyle w:val="Hyperlink"/>
@@ -3291,7 +3751,7 @@
             <w:noProof/>
             <w:webHidden/>
           </w:rPr>
-          <w:instrText xml:space="preserve"> PAGEREF _Toc231678099 \h </w:instrText>
+          <w:instrText xml:space="preserve"> PAGEREF _Toc232092754 \h </w:instrText>
         </w:r>
         <w:r>
           <w:rPr>
@@ -3311,7 +3771,7 @@
             <w:noProof/>
             <w:webHidden/>
           </w:rPr>
-          <w:t>30</w:t>
+          <w:t>35</w:t>
         </w:r>
         <w:r>
           <w:rPr>
@@ -3339,7 +3799,7 @@
           <w14:ligatures w14:val="standardContextual"/>
         </w:rPr>
       </w:pPr>
-      <w:hyperlink w:anchor="_Toc231678100" w:history="1">
+      <w:hyperlink w:anchor="_Toc232092755" w:history="1">
         <w:r>
           <w:rPr>
             <w:rStyle w:val="Hyperlink"/>
@@ -3366,7 +3826,7 @@
             <w:noProof/>
             <w:webHidden/>
           </w:rPr>
-          <w:instrText xml:space="preserve"> PAGEREF _Toc231678100 \h </w:instrText>
+          <w:instrText xml:space="preserve"> PAGEREF _Toc232092755 \h </w:instrText>
         </w:r>
         <w:r>
           <w:rPr>
@@ -3386,7 +3846,7 @@
             <w:noProof/>
             <w:webHidden/>
           </w:rPr>
-          <w:t>32</w:t>
+          <w:t>37</w:t>
         </w:r>
         <w:r>
           <w:rPr>
@@ -3413,7 +3873,7 @@
           <w14:ligatures w14:val="standardContextual"/>
         </w:rPr>
       </w:pPr>
-      <w:hyperlink w:anchor="_Toc231678101" w:history="1">
+      <w:hyperlink w:anchor="_Toc232092756" w:history="1">
         <w:r>
           <w:rPr>
             <w:rStyle w:val="Hyperlink"/>
@@ -3458,7 +3918,7 @@
             <w:noProof/>
             <w:webHidden/>
           </w:rPr>
-          <w:instrText xml:space="preserve"> PAGEREF _Toc231678101 \h </w:instrText>
+          <w:instrText xml:space="preserve"> PAGEREF _Toc232092756 \h </w:instrText>
         </w:r>
         <w:r>
           <w:rPr>
@@ -3478,7 +3938,7 @@
             <w:noProof/>
             <w:webHidden/>
           </w:rPr>
-          <w:t>32</w:t>
+          <w:t>37</w:t>
         </w:r>
         <w:r>
           <w:rPr>
@@ -3505,7 +3965,7 @@
           <w14:ligatures w14:val="standardContextual"/>
         </w:rPr>
       </w:pPr>
-      <w:hyperlink w:anchor="_Toc231678102" w:history="1">
+      <w:hyperlink w:anchor="_Toc232092757" w:history="1">
         <w:r>
           <w:rPr>
             <w:rStyle w:val="Hyperlink"/>
@@ -3550,7 +4010,7 @@
             <w:noProof/>
             <w:webHidden/>
           </w:rPr>
-          <w:instrText xml:space="preserve"> PAGEREF _Toc231678102 \h </w:instrText>
+          <w:instrText xml:space="preserve"> PAGEREF _Toc232092757 \h </w:instrText>
         </w:r>
         <w:r>
           <w:rPr>
@@ -3570,7 +4030,7 @@
             <w:noProof/>
             <w:webHidden/>
           </w:rPr>
-          <w:t>32</w:t>
+          <w:t>37</w:t>
         </w:r>
         <w:r>
           <w:rPr>
@@ -3597,7 +4057,7 @@
           <w14:ligatures w14:val="standardContextual"/>
         </w:rPr>
       </w:pPr>
-      <w:hyperlink w:anchor="_Toc231678103" w:history="1">
+      <w:hyperlink w:anchor="_Toc232092758" w:history="1">
         <w:r>
           <w:rPr>
             <w:rStyle w:val="Hyperlink"/>
@@ -3642,7 +4102,7 @@
             <w:noProof/>
             <w:webHidden/>
           </w:rPr>
-          <w:instrText xml:space="preserve"> PAGEREF _Toc231678103 \h </w:instrText>
+          <w:instrText xml:space="preserve"> PAGEREF _Toc232092758 \h </w:instrText>
         </w:r>
         <w:r>
           <w:rPr>
@@ -3662,7 +4122,7 @@
             <w:noProof/>
             <w:webHidden/>
           </w:rPr>
-          <w:t>33</w:t>
+          <w:t>38</w:t>
         </w:r>
         <w:r>
           <w:rPr>
@@ -3689,7 +4149,7 @@
           <w14:ligatures w14:val="standardContextual"/>
         </w:rPr>
       </w:pPr>
-      <w:hyperlink w:anchor="_Toc231678104" w:history="1">
+      <w:hyperlink w:anchor="_Toc232092759" w:history="1">
         <w:r>
           <w:rPr>
             <w:rStyle w:val="Hyperlink"/>
@@ -3734,7 +4194,7 @@
             <w:noProof/>
             <w:webHidden/>
           </w:rPr>
-          <w:instrText xml:space="preserve"> PAGEREF _Toc231678104 \h </w:instrText>
+          <w:instrText xml:space="preserve"> PAGEREF _Toc232092759 \h </w:instrText>
         </w:r>
         <w:r>
           <w:rPr>
@@ -3754,7 +4214,7 @@
             <w:noProof/>
             <w:webHidden/>
           </w:rPr>
-          <w:t>34</w:t>
+          <w:t>39</w:t>
         </w:r>
         <w:r>
           <w:rPr>
@@ -3781,7 +4241,7 @@
           <w14:ligatures w14:val="standardContextual"/>
         </w:rPr>
       </w:pPr>
-      <w:hyperlink w:anchor="_Toc231678105" w:history="1">
+      <w:hyperlink w:anchor="_Toc232092760" w:history="1">
         <w:r>
           <w:rPr>
             <w:rStyle w:val="Hyperlink"/>
@@ -3826,7 +4286,7 @@
             <w:noProof/>
             <w:webHidden/>
           </w:rPr>
-          <w:instrText xml:space="preserve"> PAGEREF _Toc231678105 \h </w:instrText>
+          <w:instrText xml:space="preserve"> PAGEREF _Toc232092760 \h </w:instrText>
         </w:r>
         <w:r>
           <w:rPr>
@@ -3846,7 +4306,7 @@
             <w:noProof/>
             <w:webHidden/>
           </w:rPr>
-          <w:t>35</w:t>
+          <w:t>40</w:t>
         </w:r>
         <w:r>
           <w:rPr>
@@ -3873,7 +4333,7 @@
           <w14:ligatures w14:val="standardContextual"/>
         </w:rPr>
       </w:pPr>
-      <w:hyperlink w:anchor="_Toc231678106" w:history="1">
+      <w:hyperlink w:anchor="_Toc232092761" w:history="1">
         <w:r>
           <w:rPr>
             <w:rStyle w:val="Hyperlink"/>
@@ -3918,7 +4378,7 @@
             <w:noProof/>
             <w:webHidden/>
           </w:rPr>
-          <w:instrText xml:space="preserve"> PAGEREF _Toc231678106 \h </w:instrText>
+          <w:instrText xml:space="preserve"> PAGEREF _Toc232092761 \h </w:instrText>
         </w:r>
         <w:r>
           <w:rPr>
@@ -3938,7 +4398,7 @@
             <w:noProof/>
             <w:webHidden/>
           </w:rPr>
-          <w:t>36</w:t>
+          <w:t>41</w:t>
         </w:r>
         <w:r>
           <w:rPr>
@@ -3966,7 +4426,7 @@
           <w14:ligatures w14:val="standardContextual"/>
         </w:rPr>
       </w:pPr>
-      <w:hyperlink w:anchor="_Toc231678107" w:history="1">
+      <w:hyperlink w:anchor="_Toc232092762" w:history="1">
         <w:r>
           <w:rPr>
             <w:rStyle w:val="Hyperlink"/>
@@ -3993,7 +4453,7 @@
             <w:noProof/>
             <w:webHidden/>
           </w:rPr>
-          <w:instrText xml:space="preserve"> PAGEREF _Toc231678107 \h </w:instrText>
+          <w:instrText xml:space="preserve"> PAGEREF _Toc232092762 \h </w:instrText>
         </w:r>
         <w:r>
           <w:rPr>
@@ -4013,7 +4473,7 @@
             <w:noProof/>
             <w:webHidden/>
           </w:rPr>
-          <w:t>38</w:t>
+          <w:t>43</w:t>
         </w:r>
         <w:r>
           <w:rPr>
@@ -4041,13 +4501,13 @@
           <w14:ligatures w14:val="standardContextual"/>
         </w:rPr>
       </w:pPr>
-      <w:hyperlink w:anchor="_Toc231678108" w:history="1">
+      <w:hyperlink w:anchor="_Toc232092763" w:history="1">
         <w:r>
           <w:rPr>
             <w:rStyle w:val="Hyperlink"/>
             <w:noProof/>
           </w:rPr>
-          <w:t>Bibliographie</w:t>
+          <w:t>Références</w:t>
         </w:r>
         <w:r>
           <w:rPr>
@@ -4068,7 +4528,7 @@
             <w:noProof/>
             <w:webHidden/>
           </w:rPr>
-          <w:instrText xml:space="preserve"> PAGEREF _Toc231678108 \h </w:instrText>
+          <w:instrText xml:space="preserve"> PAGEREF _Toc232092763 \h </w:instrText>
         </w:r>
         <w:r>
           <w:rPr>
@@ -4088,7 +4548,7 @@
             <w:noProof/>
             <w:webHidden/>
           </w:rPr>
-          <w:t>39</w:t>
+          <w:t>44</w:t>
         </w:r>
         <w:r>
           <w:rPr>
@@ -4116,7 +4576,7 @@
           <w14:ligatures w14:val="standardContextual"/>
         </w:rPr>
       </w:pPr>
-      <w:hyperlink w:anchor="_Toc231678109" w:history="1">
+      <w:hyperlink w:anchor="_Toc232092764" w:history="1">
         <w:r>
           <w:rPr>
             <w:rStyle w:val="Hyperlink"/>
@@ -4143,7 +4603,7 @@
             <w:noProof/>
             <w:webHidden/>
           </w:rPr>
-          <w:instrText xml:space="preserve"> PAGEREF _Toc231678109 \h </w:instrText>
+          <w:instrText xml:space="preserve"> PAGEREF _Toc232092764 \h </w:instrText>
         </w:r>
         <w:r>
           <w:rPr>
@@ -4163,7 +4623,7 @@
             <w:noProof/>
             <w:webHidden/>
           </w:rPr>
-          <w:t>42</w:t>
+          <w:t>48</w:t>
         </w:r>
         <w:r>
           <w:rPr>
@@ -4191,7 +4651,7 @@
           <w14:ligatures w14:val="standardContextual"/>
         </w:rPr>
       </w:pPr>
-      <w:hyperlink w:anchor="_Toc231678110" w:history="1">
+      <w:hyperlink w:anchor="_Toc232092765" w:history="1">
         <w:r>
           <w:rPr>
             <w:rStyle w:val="Hyperlink"/>
@@ -4218,7 +4678,7 @@
             <w:noProof/>
             <w:webHidden/>
           </w:rPr>
-          <w:instrText xml:space="preserve"> PAGEREF _Toc231678110 \h </w:instrText>
+          <w:instrText xml:space="preserve"> PAGEREF _Toc232092765 \h </w:instrText>
         </w:r>
         <w:r>
           <w:rPr>
@@ -4238,7 +4698,7 @@
             <w:noProof/>
             <w:webHidden/>
           </w:rPr>
-          <w:t>43</w:t>
+          <w:t>49</w:t>
         </w:r>
         <w:r>
           <w:rPr>
@@ -4266,7 +4726,7 @@
           <w14:ligatures w14:val="standardContextual"/>
         </w:rPr>
       </w:pPr>
-      <w:hyperlink w:anchor="_Toc231678111" w:history="1">
+      <w:hyperlink w:anchor="_Toc232092766" w:history="1">
         <w:r>
           <w:rPr>
             <w:rStyle w:val="Hyperlink"/>
@@ -4293,7 +4753,7 @@
             <w:noProof/>
             <w:webHidden/>
           </w:rPr>
-          <w:instrText xml:space="preserve"> PAGEREF _Toc231678111 \h </w:instrText>
+          <w:instrText xml:space="preserve"> PAGEREF _Toc232092766 \h </w:instrText>
         </w:r>
         <w:r>
           <w:rPr>
@@ -4313,7 +4773,7 @@
             <w:noProof/>
             <w:webHidden/>
           </w:rPr>
-          <w:t>44</w:t>
+          <w:t>50</w:t>
         </w:r>
         <w:r>
           <w:rPr>
@@ -4341,7 +4801,7 @@
           <w14:ligatures w14:val="standardContextual"/>
         </w:rPr>
       </w:pPr>
-      <w:hyperlink w:anchor="_Toc231678112" w:history="1">
+      <w:hyperlink w:anchor="_Toc232092767" w:history="1">
         <w:r>
           <w:rPr>
             <w:rStyle w:val="Hyperlink"/>
@@ -4368,7 +4828,7 @@
             <w:noProof/>
             <w:webHidden/>
           </w:rPr>
-          <w:instrText xml:space="preserve"> PAGEREF _Toc231678112 \h </w:instrText>
+          <w:instrText xml:space="preserve"> PAGEREF _Toc232092767 \h </w:instrText>
         </w:r>
         <w:r>
           <w:rPr>
@@ -4415,7 +4875,7 @@
           <w14:ligatures w14:val="standardContextual"/>
         </w:rPr>
       </w:pPr>
-      <w:hyperlink w:anchor="_Toc231678113" w:history="1">
+      <w:hyperlink w:anchor="_Toc232092768" w:history="1">
         <w:r>
           <w:rPr>
             <w:rStyle w:val="Hyperlink"/>
@@ -4439,7 +4899,7 @@
             <w:rStyle w:val="Hyperlink"/>
             <w:noProof/>
           </w:rPr>
-          <w:t>Annexe 1</w:t>
+          <w:t xml:space="preserve"> Annexe – Questionnaire 1</w:t>
         </w:r>
         <w:r>
           <w:rPr>
@@ -4460,7 +4920,7 @@
             <w:noProof/>
             <w:webHidden/>
           </w:rPr>
-          <w:instrText xml:space="preserve"> PAGEREF _Toc231678113 \h </w:instrText>
+          <w:instrText xml:space="preserve"> PAGEREF _Toc232092768 \h </w:instrText>
         </w:r>
         <w:r>
           <w:rPr>
@@ -4507,7 +4967,7 @@
           <w14:ligatures w14:val="standardContextual"/>
         </w:rPr>
       </w:pPr>
-      <w:hyperlink w:anchor="_Toc231678114" w:history="1">
+      <w:hyperlink w:anchor="_Toc232092769" w:history="1">
         <w:r>
           <w:rPr>
             <w:rStyle w:val="Hyperlink"/>
@@ -4531,7 +4991,7 @@
             <w:rStyle w:val="Hyperlink"/>
             <w:noProof/>
           </w:rPr>
-          <w:t>Annexe 2</w:t>
+          <w:t>Annexe – Formulaire de consentement, Anglais.</w:t>
         </w:r>
         <w:r>
           <w:rPr>
@@ -4552,7 +5012,7 @@
             <w:noProof/>
             <w:webHidden/>
           </w:rPr>
-          <w:instrText xml:space="preserve"> PAGEREF _Toc231678114 \h </w:instrText>
+          <w:instrText xml:space="preserve"> PAGEREF _Toc232092769 \h </w:instrText>
         </w:r>
         <w:r>
           <w:rPr>
@@ -4599,12 +5059,11 @@
           <w14:ligatures w14:val="standardContextual"/>
         </w:rPr>
       </w:pPr>
-      <w:hyperlink w:anchor="_Toc231678115" w:history="1">
+      <w:hyperlink w:anchor="_Toc232092770" w:history="1">
         <w:r>
           <w:rPr>
             <w:rStyle w:val="Hyperlink"/>
             <w:noProof/>
-            <w:lang w:val="en-US"/>
           </w:rPr>
           <w:t>(c)</w:t>
         </w:r>
@@ -4623,9 +5082,8 @@
           <w:rPr>
             <w:rStyle w:val="Hyperlink"/>
             <w:noProof/>
-            <w:lang w:val="en-US"/>
-          </w:rPr>
-          <w:t>Annexe 3</w:t>
+          </w:rPr>
+          <w:t>Annexe – Formulaire de commentaires post-expérience, Anglais</w:t>
         </w:r>
         <w:r>
           <w:rPr>
@@ -4646,7 +5104,7 @@
             <w:noProof/>
             <w:webHidden/>
           </w:rPr>
-          <w:instrText xml:space="preserve"> PAGEREF _Toc231678115 \h </w:instrText>
+          <w:instrText xml:space="preserve"> PAGEREF _Toc232092770 \h </w:instrText>
         </w:r>
         <w:r>
           <w:rPr>
@@ -4693,7 +5151,7 @@
           <w14:ligatures w14:val="standardContextual"/>
         </w:rPr>
       </w:pPr>
-      <w:hyperlink w:anchor="_Toc231678116" w:history="1">
+      <w:hyperlink w:anchor="_Toc232092771" w:history="1">
         <w:r>
           <w:rPr>
             <w:rStyle w:val="Hyperlink"/>
@@ -4717,7 +5175,7 @@
             <w:rStyle w:val="Hyperlink"/>
             <w:noProof/>
           </w:rPr>
-          <w:t>Annexe 4</w:t>
+          <w:t>Annexe - Formulaire de consentement, Anglais</w:t>
         </w:r>
         <w:r>
           <w:rPr>
@@ -4738,7 +5196,7 @@
             <w:noProof/>
             <w:webHidden/>
           </w:rPr>
-          <w:instrText xml:space="preserve"> PAGEREF _Toc231678116 \h </w:instrText>
+          <w:instrText xml:space="preserve"> PAGEREF _Toc232092771 \h </w:instrText>
         </w:r>
         <w:r>
           <w:rPr>
@@ -4785,7 +5243,7 @@
           <w14:ligatures w14:val="standardContextual"/>
         </w:rPr>
       </w:pPr>
-      <w:hyperlink w:anchor="_Toc231678117" w:history="1">
+      <w:hyperlink w:anchor="_Toc232092772" w:history="1">
         <w:r>
           <w:rPr>
             <w:rStyle w:val="Hyperlink"/>
@@ -4809,7 +5267,7 @@
             <w:rStyle w:val="Hyperlink"/>
             <w:noProof/>
           </w:rPr>
-          <w:t>Annexe 5</w:t>
+          <w:t>Annexe - Formulaire de commentaires post-expérience, Français</w:t>
         </w:r>
         <w:r>
           <w:rPr>
@@ -4830,7 +5288,7 @@
             <w:noProof/>
             <w:webHidden/>
           </w:rPr>
-          <w:instrText xml:space="preserve"> PAGEREF _Toc231678117 \h </w:instrText>
+          <w:instrText xml:space="preserve"> PAGEREF _Toc232092772 \h </w:instrText>
         </w:r>
         <w:r>
           <w:rPr>
@@ -4851,6 +5309,102 @@
             <w:webHidden/>
           </w:rPr>
           <w:t>8</w:t>
+        </w:r>
+        <w:r>
+          <w:rPr>
+            <w:noProof/>
+            <w:webHidden/>
+          </w:rPr>
+          <w:fldChar w:fldCharType="end"/>
+        </w:r>
+      </w:hyperlink>
+    </w:p>
+    <w:p>
+      <w:pPr>
+        <w:pStyle w:val="TOC3"/>
+        <w:tabs>
+          <w:tab w:val="left" w:pos="1200"/>
+          <w:tab w:val="right" w:leader="dot" w:pos="9016"/>
+        </w:tabs>
+        <w:rPr>
+          <w:rFonts w:asciiTheme="minorHAnsi" w:eastAsiaTheme="minorEastAsia" w:hAnsiTheme="minorHAnsi"/>
+          <w:noProof/>
+          <w:kern w:val="2"/>
+          <w:szCs w:val="24"/>
+          <w:lang w:val="en-FR" w:eastAsia="en-GB"/>
+          <w14:ligatures w14:val="standardContextual"/>
+        </w:rPr>
+      </w:pPr>
+      <w:hyperlink w:anchor="_Toc232092773" w:history="1">
+        <w:r>
+          <w:rPr>
+            <w:rStyle w:val="Hyperlink"/>
+            <w:rFonts w:eastAsia="Arial"/>
+            <w:noProof/>
+            <w:lang w:eastAsia="en-GB"/>
+          </w:rPr>
+          <w:t>(f)</w:t>
+        </w:r>
+        <w:r>
+          <w:rPr>
+            <w:rFonts w:asciiTheme="minorHAnsi" w:eastAsiaTheme="minorEastAsia" w:hAnsiTheme="minorHAnsi"/>
+            <w:noProof/>
+            <w:kern w:val="2"/>
+            <w:szCs w:val="24"/>
+            <w:lang w:val="en-FR" w:eastAsia="en-GB"/>
+            <w14:ligatures w14:val="standardContextual"/>
+          </w:rPr>
+          <w:tab/>
+        </w:r>
+        <w:r>
+          <w:rPr>
+            <w:rStyle w:val="Hyperlink"/>
+            <w:rFonts w:eastAsia="Arial"/>
+            <w:noProof/>
+            <w:lang w:eastAsia="en-GB"/>
+          </w:rPr>
+          <w:t>Annexe 6 – Fiche d’évaluation du stage</w:t>
+        </w:r>
+        <w:r>
+          <w:rPr>
+            <w:noProof/>
+            <w:webHidden/>
+          </w:rPr>
+          <w:tab/>
+        </w:r>
+        <w:r>
+          <w:rPr>
+            <w:noProof/>
+            <w:webHidden/>
+          </w:rPr>
+          <w:fldChar w:fldCharType="begin"/>
+        </w:r>
+        <w:r>
+          <w:rPr>
+            <w:noProof/>
+            <w:webHidden/>
+          </w:rPr>
+          <w:instrText xml:space="preserve"> PAGEREF _Toc232092773 \h </w:instrText>
+        </w:r>
+        <w:r>
+          <w:rPr>
+            <w:noProof/>
+            <w:webHidden/>
+          </w:rPr>
+        </w:r>
+        <w:r>
+          <w:rPr>
+            <w:noProof/>
+            <w:webHidden/>
+          </w:rPr>
+          <w:fldChar w:fldCharType="separate"/>
+        </w:r>
+        <w:r>
+          <w:rPr>
+            <w:noProof/>
+            <w:webHidden/>
+          </w:rPr>
+          <w:t>12</w:t>
         </w:r>
         <w:r>
           <w:rPr>
@@ -4891,7 +5445,7 @@
       <w:pPr>
         <w:pStyle w:val="Heading1"/>
       </w:pPr>
-      <w:bookmarkStart w:id="7" w:name="_Toc231678079"/>
+      <w:bookmarkStart w:id="7" w:name="_Toc232092729"/>
       <w:r>
         <w:lastRenderedPageBreak/>
         <w:t>Introduction</w:t>
@@ -5288,7 +5842,7 @@
       <w:pPr>
         <w:pStyle w:val="Heading1"/>
       </w:pPr>
-      <w:bookmarkStart w:id="8" w:name="_Toc231678080"/>
+      <w:bookmarkStart w:id="8" w:name="_Toc232092730"/>
       <w:r>
         <w:lastRenderedPageBreak/>
         <w:t>Cadre théorique</w:t>
@@ -5336,7 +5890,7 @@
       <w:pPr>
         <w:pStyle w:val="Heading2"/>
       </w:pPr>
-      <w:bookmarkStart w:id="10" w:name="_Toc231678081"/>
+      <w:bookmarkStart w:id="10" w:name="_Toc232092731"/>
       <w:r>
         <w:t>L'évolution technologique et la planification des cours en enseignement des langues</w:t>
       </w:r>
@@ -5511,7 +6065,7 @@
       <w:pPr>
         <w:pStyle w:val="Heading3"/>
       </w:pPr>
-      <w:bookmarkStart w:id="11" w:name="_Toc231678082"/>
+      <w:bookmarkStart w:id="11" w:name="_Toc232092732"/>
       <w:r>
         <w:t>La planification des cours dans l'enseignement des langues avant l'IA</w:t>
       </w:r>
@@ -5540,7 +6094,7 @@
           <w:lang w:val="en-FR" w:eastAsia="en-GB"/>
         </w:rPr>
       </w:pPr>
-      <w:bookmarkStart w:id="12" w:name="_Toc231678083"/>
+      <w:bookmarkStart w:id="12" w:name="_Toc232092733"/>
       <w:r>
         <w:rPr>
           <w:rFonts w:eastAsia="Times New Roman"/>
@@ -5758,7 +6312,7 @@
           <w:lang w:eastAsia="en-GB"/>
         </w:rPr>
       </w:pPr>
-      <w:bookmarkStart w:id="13" w:name="_Toc231678084"/>
+      <w:bookmarkStart w:id="13" w:name="_Toc232092734"/>
       <w:r>
         <w:rPr>
           <w:rFonts w:eastAsia="Times New Roman"/>
@@ -5847,7 +6401,7 @@
       <w:pPr>
         <w:pStyle w:val="Heading2"/>
       </w:pPr>
-      <w:bookmarkStart w:id="14" w:name="_Toc231678085"/>
+      <w:bookmarkStart w:id="14" w:name="_Toc232092735"/>
       <w:r>
         <w:t>La cognition enseignante et la planification des cours</w:t>
       </w:r>
@@ -5899,7 +6453,7 @@
       <w:r>
         <w:t xml:space="preserve"> </w:t>
       </w:r>
-      <w:bookmarkStart w:id="15" w:name="_Toc231678086"/>
+      <w:bookmarkStart w:id="15" w:name="_Toc232092736"/>
       <w:r>
         <w:t>L'alignement entre croyances et pratiques des enseignants</w:t>
       </w:r>
@@ -6003,7 +6557,7 @@
           <w:lang w:eastAsia="en-GB"/>
         </w:rPr>
       </w:pPr>
-      <w:bookmarkStart w:id="16" w:name="_Toc231678087"/>
+      <w:bookmarkStart w:id="16" w:name="_Toc232092737"/>
       <w:r>
         <w:rPr>
           <w:rFonts w:eastAsia="Times New Roman"/>
@@ -6294,7 +6848,7 @@
           <w:lang w:eastAsia="en-GB"/>
         </w:rPr>
       </w:pPr>
-      <w:bookmarkStart w:id="17" w:name="_Toc231678088"/>
+      <w:bookmarkStart w:id="17" w:name="_Toc232092738"/>
       <w:r>
         <w:rPr>
           <w:lang w:eastAsia="en-GB"/>
@@ -6515,7 +7069,7 @@
           <w:lang w:eastAsia="en-GB"/>
         </w:rPr>
       </w:pPr>
-      <w:bookmarkStart w:id="18" w:name="_Toc231678089"/>
+      <w:bookmarkStart w:id="18" w:name="_Toc232092739"/>
       <w:r>
         <w:rPr>
           <w:lang w:val="en-FR" w:eastAsia="en-GB"/>
@@ -6814,7 +7368,7 @@
       <w:pPr>
         <w:pStyle w:val="Heading2"/>
       </w:pPr>
-      <w:bookmarkStart w:id="21" w:name="_Toc231678090"/>
+      <w:bookmarkStart w:id="21" w:name="_Toc232092740"/>
       <w:r>
         <w:t>L'adoption technologique en éducation : Théories et obstacles</w:t>
       </w:r>
@@ -7071,7 +7625,7 @@
       <w:r>
         <w:t xml:space="preserve"> </w:t>
       </w:r>
-      <w:bookmarkStart w:id="22" w:name="_Toc231678091"/>
+      <w:bookmarkStart w:id="22" w:name="_Toc232092741"/>
       <w:r>
         <w:t>Qu'est-ce que l'adoption technologique ?</w:t>
       </w:r>
@@ -7147,7 +7701,7 @@
         </w:rPr>
         <w:t xml:space="preserve"> </w:t>
       </w:r>
-      <w:bookmarkStart w:id="23" w:name="_Toc231678092"/>
+      <w:bookmarkStart w:id="23" w:name="_Toc232092742"/>
       <w:r>
         <w:rPr>
           <w:lang w:val="en-FR"/>
@@ -7504,7 +8058,7 @@
       <w:pPr>
         <w:pStyle w:val="Heading3"/>
       </w:pPr>
-      <w:bookmarkStart w:id="24" w:name="_Toc231678093"/>
+      <w:bookmarkStart w:id="24" w:name="_Toc232092743"/>
       <w:r>
         <w:t>Barrières et facteurs influençant l'adoption</w:t>
       </w:r>
@@ -7688,7 +8242,7 @@
       <w:pPr>
         <w:pStyle w:val="Heading3"/>
       </w:pPr>
-      <w:bookmarkStart w:id="25" w:name="_Toc231678094"/>
+      <w:bookmarkStart w:id="25" w:name="_Toc232092744"/>
       <w:r>
         <w:t>A</w:t>
       </w:r>
@@ -7898,6 +8452,7 @@
       <w:pPr>
         <w:pStyle w:val="Heading2"/>
       </w:pPr>
+      <w:bookmarkStart w:id="26" w:name="_Toc232092745"/>
       <w:r>
         <w:t>L'intelligence artificielle dans</w:t>
       </w:r>
@@ -7907,6 +8462,7 @@
       <w:r>
         <w:t>l'enseignement des langues vivantes</w:t>
       </w:r>
+      <w:bookmarkEnd w:id="26"/>
       <w:r>
         <w:br/>
       </w:r>
@@ -8064,9 +8620,11 @@
           <w:numId w:val="23"/>
         </w:numPr>
       </w:pPr>
+      <w:bookmarkStart w:id="27" w:name="_Toc232092746"/>
       <w:r>
         <w:t>Applications et affordances de l'IA dans l'enseignement des langues</w:t>
       </w:r>
+      <w:bookmarkEnd w:id="27"/>
     </w:p>
     <w:p/>
     <w:p>
@@ -8124,9 +8682,11 @@
       <w:pPr>
         <w:pStyle w:val="Heading3"/>
       </w:pPr>
+      <w:bookmarkStart w:id="28" w:name="_Toc232092747"/>
       <w:r>
         <w:t>Efficacité et limites de l'IA pour l'enseignement des langues</w:t>
       </w:r>
+      <w:bookmarkEnd w:id="28"/>
     </w:p>
     <w:p/>
     <w:p>
@@ -8176,9 +8736,11 @@
       <w:pPr>
         <w:pStyle w:val="Heading3"/>
       </w:pPr>
+      <w:bookmarkStart w:id="29" w:name="_Toc232092748"/>
       <w:r>
         <w:t>Perspectives critiques et contexte français</w:t>
       </w:r>
+      <w:bookmarkEnd w:id="29"/>
     </w:p>
     <w:p/>
     <w:p>
@@ -8217,9 +8779,11 @@
       <w:r>
         <w:t xml:space="preserve"> </w:t>
       </w:r>
+      <w:bookmarkStart w:id="30" w:name="_Toc232092749"/>
       <w:r>
         <w:t>Synthèse et lacune de recherche</w:t>
       </w:r>
+      <w:bookmarkEnd w:id="30"/>
     </w:p>
     <w:p/>
     <w:p>
@@ -8252,12 +8816,12 @@
       <w:pPr>
         <w:pStyle w:val="Heading1"/>
       </w:pPr>
-      <w:bookmarkStart w:id="26" w:name="_Toc231678095"/>
+      <w:bookmarkStart w:id="31" w:name="_Toc232092750"/>
       <w:r>
         <w:lastRenderedPageBreak/>
         <w:t>Contexte</w:t>
       </w:r>
-      <w:bookmarkEnd w:id="26"/>
+      <w:bookmarkEnd w:id="31"/>
       <w:r>
         <w:t xml:space="preserve"> </w:t>
       </w:r>
@@ -8279,11 +8843,11 @@
           <w:numId w:val="10"/>
         </w:numPr>
       </w:pPr>
-      <w:bookmarkStart w:id="27" w:name="_Ref231073408"/>
-      <w:bookmarkStart w:id="28" w:name="_Ref231073419"/>
-      <w:bookmarkStart w:id="29" w:name="_Ref231073420"/>
-      <w:bookmarkStart w:id="30" w:name="_Ref231073422"/>
-      <w:bookmarkStart w:id="31" w:name="_Toc231678096"/>
+      <w:bookmarkStart w:id="32" w:name="_Ref231073408"/>
+      <w:bookmarkStart w:id="33" w:name="_Ref231073419"/>
+      <w:bookmarkStart w:id="34" w:name="_Ref231073420"/>
+      <w:bookmarkStart w:id="35" w:name="_Ref231073422"/>
+      <w:bookmarkStart w:id="36" w:name="_Toc232092751"/>
       <w:r>
         <w:t xml:space="preserve">Le </w:t>
       </w:r>
@@ -8293,11 +8857,11 @@
       <w:r>
         <w:t xml:space="preserve"> du stage : Collège Charles de Gaulle, Saint-Pierre-de-Chandieu</w:t>
       </w:r>
-      <w:bookmarkEnd w:id="27"/>
-      <w:bookmarkEnd w:id="28"/>
-      <w:bookmarkEnd w:id="29"/>
-      <w:bookmarkEnd w:id="30"/>
-      <w:bookmarkEnd w:id="31"/>
+      <w:bookmarkEnd w:id="32"/>
+      <w:bookmarkEnd w:id="33"/>
+      <w:bookmarkEnd w:id="34"/>
+      <w:bookmarkEnd w:id="35"/>
+      <w:bookmarkEnd w:id="36"/>
       <w:r>
         <w:br/>
       </w:r>
@@ -8378,7 +8942,7 @@
       <w:pPr>
         <w:pStyle w:val="Heading2"/>
       </w:pPr>
-      <w:bookmarkStart w:id="32" w:name="_Toc231678097"/>
+      <w:bookmarkStart w:id="37" w:name="_Toc232092752"/>
       <w:r>
         <w:t>Le système scolaire en France et</w:t>
       </w:r>
@@ -8391,7 +8955,7 @@
       <w:r>
         <w:t> :</w:t>
       </w:r>
-      <w:bookmarkEnd w:id="32"/>
+      <w:bookmarkEnd w:id="37"/>
       <w:r>
         <w:t xml:space="preserve"> </w:t>
       </w:r>
@@ -8605,11 +9169,11 @@
       <w:pPr>
         <w:pStyle w:val="Heading2"/>
       </w:pPr>
-      <w:bookmarkStart w:id="33" w:name="_Toc231678098"/>
+      <w:bookmarkStart w:id="38" w:name="_Toc232092753"/>
       <w:r>
         <w:t>Le cadre réglementaire relatif aux outils TICE et IA dans les écoles Françaises</w:t>
       </w:r>
-      <w:bookmarkEnd w:id="33"/>
+      <w:bookmarkEnd w:id="38"/>
     </w:p>
     <w:p>
       <w:pPr>
@@ -8911,7 +9475,7 @@
         </w:rPr>
         <w:t xml:space="preserve">. Dans le cas des élèves, ils ont un usage spécifique de ces technologies et ne peuvent en faire usage que dans le cadre du niveau de classe de Quatrième, en présence de l'enseignant et dans le cadre définis précisément </w:t>
       </w:r>
-      <w:bookmarkStart w:id="34" w:name="_Hlk231071207"/>
+      <w:bookmarkStart w:id="39" w:name="_Hlk231071207"/>
       <w:r>
         <w:rPr>
           <w:lang w:val="en-FR"/>
@@ -8978,7 +9542,7 @@
         </w:rPr>
         <w:fldChar w:fldCharType="end"/>
       </w:r>
-      <w:bookmarkEnd w:id="34"/>
+      <w:bookmarkEnd w:id="39"/>
       <w:r>
         <w:rPr>
           <w:lang w:val="en-FR"/>
@@ -9210,14 +9774,14 @@
           <w:lang w:val="en-FR"/>
         </w:rPr>
       </w:pPr>
-      <w:bookmarkStart w:id="35" w:name="_Toc231678099"/>
+      <w:bookmarkStart w:id="40" w:name="_Toc232092754"/>
       <w:r>
         <w:rPr>
           <w:lang w:val="en-FR"/>
         </w:rPr>
         <w:t>Le Public visé</w:t>
       </w:r>
-      <w:bookmarkEnd w:id="35"/>
+      <w:bookmarkEnd w:id="40"/>
       <w:r>
         <w:rPr>
           <w:lang w:val="en-FR"/>
@@ -9375,12 +9939,12 @@
       <w:pPr>
         <w:pStyle w:val="Heading1"/>
       </w:pPr>
-      <w:bookmarkStart w:id="36" w:name="_Toc231678100"/>
+      <w:bookmarkStart w:id="41" w:name="_Toc232092755"/>
       <w:r>
         <w:lastRenderedPageBreak/>
         <w:t>Méthodologie</w:t>
       </w:r>
-      <w:bookmarkEnd w:id="36"/>
+      <w:bookmarkEnd w:id="41"/>
       <w:r>
         <w:t xml:space="preserve"> </w:t>
       </w:r>
@@ -9407,11 +9971,11 @@
           <w:numId w:val="19"/>
         </w:numPr>
       </w:pPr>
-      <w:bookmarkStart w:id="37" w:name="_Toc231678101"/>
+      <w:bookmarkStart w:id="42" w:name="_Toc232092756"/>
       <w:r>
         <w:t>Objectif</w:t>
       </w:r>
-      <w:bookmarkEnd w:id="37"/>
+      <w:bookmarkEnd w:id="42"/>
     </w:p>
     <w:p>
       <w:r>
@@ -9423,11 +9987,11 @@
       <w:pPr>
         <w:pStyle w:val="Heading2"/>
       </w:pPr>
-      <w:bookmarkStart w:id="38" w:name="_Toc231678102"/>
+      <w:bookmarkStart w:id="43" w:name="_Toc232092757"/>
       <w:r>
         <w:t>Les Participants et l’examinatrice</w:t>
       </w:r>
-      <w:bookmarkEnd w:id="38"/>
+      <w:bookmarkEnd w:id="43"/>
       <w:r>
         <w:t xml:space="preserve"> </w:t>
       </w:r>
@@ -9485,11 +10049,11 @@
       <w:pPr>
         <w:pStyle w:val="Heading2"/>
       </w:pPr>
-      <w:bookmarkStart w:id="39" w:name="_Toc231678103"/>
+      <w:bookmarkStart w:id="44" w:name="_Toc232092758"/>
       <w:r>
         <w:t>Liste des outils</w:t>
       </w:r>
-      <w:bookmarkEnd w:id="39"/>
+      <w:bookmarkEnd w:id="44"/>
     </w:p>
     <w:p/>
     <w:p>
@@ -9670,11 +10234,11 @@
       <w:pPr>
         <w:pStyle w:val="Heading2"/>
       </w:pPr>
-      <w:bookmarkStart w:id="40" w:name="_Toc231678104"/>
+      <w:bookmarkStart w:id="45" w:name="_Toc232092759"/>
       <w:r>
         <w:t>Avertissement concernant la collecte de données</w:t>
       </w:r>
-      <w:bookmarkEnd w:id="40"/>
+      <w:bookmarkEnd w:id="45"/>
     </w:p>
     <w:p/>
     <w:p>
@@ -9718,11 +10282,11 @@
         </w:numPr>
         <w:spacing w:before="0"/>
       </w:pPr>
-      <w:bookmarkStart w:id="41" w:name="_Toc231678105"/>
+      <w:bookmarkStart w:id="46" w:name="_Toc232092760"/>
       <w:r>
         <w:t>Phase I</w:t>
       </w:r>
-      <w:bookmarkEnd w:id="41"/>
+      <w:bookmarkEnd w:id="46"/>
       <w:r>
         <w:br/>
       </w:r>
@@ -9833,11 +10397,11 @@
       <w:pPr>
         <w:pStyle w:val="Heading3"/>
       </w:pPr>
-      <w:bookmarkStart w:id="42" w:name="_Toc231678106"/>
+      <w:bookmarkStart w:id="47" w:name="_Toc232092761"/>
       <w:r>
         <w:t>Phase II</w:t>
       </w:r>
-      <w:bookmarkEnd w:id="42"/>
+      <w:bookmarkEnd w:id="47"/>
     </w:p>
     <w:p>
       <w:r>
@@ -9928,7 +10492,7 @@
       <w:pPr>
         <w:pStyle w:val="Heading1"/>
       </w:pPr>
-      <w:bookmarkStart w:id="43" w:name="_Toc231678107"/>
+      <w:bookmarkStart w:id="48" w:name="_Toc232092762"/>
       <w:r>
         <w:lastRenderedPageBreak/>
         <w:t>Interférences /Discussions</w:t>
@@ -9939,7 +10503,7 @@
       <w:r>
         <w:t>?</w:t>
       </w:r>
-      <w:bookmarkEnd w:id="43"/>
+      <w:bookmarkEnd w:id="48"/>
       <w:r>
         <w:t xml:space="preserve"> </w:t>
       </w:r>
@@ -9949,12 +10513,15 @@
       <w:pPr>
         <w:pStyle w:val="Heading1"/>
       </w:pPr>
-      <w:bookmarkStart w:id="44" w:name="_Toc231678108"/>
+      <w:bookmarkStart w:id="49" w:name="_Toc232092763"/>
       <w:r>
         <w:lastRenderedPageBreak/>
-        <w:t>Bibliographie</w:t>
-      </w:r>
-      <w:bookmarkEnd w:id="44"/>
+        <w:t>Références</w:t>
+      </w:r>
+      <w:bookmarkEnd w:id="49"/>
+      <w:r>
+        <w:t xml:space="preserve"> </w:t>
+      </w:r>
       <w:r>
         <w:t xml:space="preserve"> </w:t>
       </w:r>
@@ -11764,12 +12331,12 @@
       <w:pPr>
         <w:pStyle w:val="Heading1"/>
       </w:pPr>
-      <w:bookmarkStart w:id="45" w:name="_Toc231678109"/>
+      <w:bookmarkStart w:id="50" w:name="_Toc232092764"/>
       <w:r>
         <w:lastRenderedPageBreak/>
         <w:t>Conclusions</w:t>
       </w:r>
-      <w:bookmarkEnd w:id="45"/>
+      <w:bookmarkEnd w:id="50"/>
       <w:r>
         <w:t xml:space="preserve"> </w:t>
       </w:r>
@@ -11785,12 +12352,12 @@
       <w:pPr>
         <w:pStyle w:val="Heading1"/>
       </w:pPr>
-      <w:bookmarkStart w:id="46" w:name="_Toc231678110"/>
+      <w:bookmarkStart w:id="51" w:name="_Toc232092765"/>
       <w:r>
         <w:lastRenderedPageBreak/>
         <w:t>Index</w:t>
       </w:r>
-      <w:bookmarkEnd w:id="46"/>
+      <w:bookmarkEnd w:id="51"/>
       <w:r>
         <w:t xml:space="preserve"> </w:t>
       </w:r>
@@ -11800,12 +12367,12 @@
       <w:pPr>
         <w:pStyle w:val="Heading1"/>
       </w:pPr>
-      <w:bookmarkStart w:id="47" w:name="_Toc231678111"/>
+      <w:bookmarkStart w:id="52" w:name="_Toc232092766"/>
       <w:r>
         <w:lastRenderedPageBreak/>
         <w:t>Tables des Illustrations</w:t>
       </w:r>
-      <w:bookmarkEnd w:id="47"/>
+      <w:bookmarkEnd w:id="52"/>
       <w:r>
         <w:t xml:space="preserve"> </w:t>
       </w:r>
@@ -11894,15 +12461,6 @@
       </w:hyperlink>
     </w:p>
     <w:p>
-      <w:r>
-        <w:fldChar w:fldCharType="end"/>
-      </w:r>
-    </w:p>
-    <w:p/>
-    <w:p/>
-    <w:p/>
-    <w:p/>
-    <w:p>
       <w:pPr>
         <w:sectPr>
           <w:pgSz w:w="11906" w:h="16838"/>
@@ -11911,10 +12469,18 @@
           <w:docGrid w:linePitch="360"/>
         </w:sectPr>
       </w:pPr>
+      <w:r>
+        <w:fldChar w:fldCharType="end"/>
+      </w:r>
     </w:p>
     <w:p>
       <w:pPr>
         <w:pStyle w:val="Heading1"/>
+        <w:numPr>
+          <w:ilvl w:val="0"/>
+          <w:numId w:val="0"/>
+        </w:numPr>
+        <w:jc w:val="both"/>
         <w:sectPr>
           <w:pgSz w:w="11906" w:h="16838"/>
           <w:pgMar w:top="1440" w:right="1440" w:bottom="1440" w:left="1440" w:header="708" w:footer="708" w:gutter="0"/>
@@ -11927,12 +12493,12 @@
       <w:pPr>
         <w:pStyle w:val="Heading1"/>
       </w:pPr>
-      <w:bookmarkStart w:id="48" w:name="_Toc231678112"/>
+      <w:bookmarkStart w:id="53" w:name="_Toc232092767"/>
       <w:r>
         <w:lastRenderedPageBreak/>
         <w:t>Annexes</w:t>
       </w:r>
-      <w:bookmarkEnd w:id="48"/>
+      <w:bookmarkEnd w:id="53"/>
       <w:r>
         <w:t xml:space="preserve"> </w:t>
       </w:r>
@@ -11945,8 +12511,8 @@
           <w:numId w:val="14"/>
         </w:numPr>
       </w:pPr>
-      <w:bookmarkStart w:id="49" w:name="_Ref231413552"/>
-      <w:bookmarkStart w:id="50" w:name="_Toc231678113"/>
+      <w:bookmarkStart w:id="54" w:name="_Ref231413552"/>
+      <w:bookmarkStart w:id="55" w:name="_Toc232092768"/>
       <w:r>
         <w:rPr>
           <w:noProof/>
@@ -11974,7 +12540,7 @@
           <v:shape id="_x0000_s2050" type="#_x0000_t75" alt="" style="position:absolute;left:0;text-align:left;margin-left:-14.55pt;margin-top:28.7pt;width:6in;height:658.95pt;z-index:251663360;mso-wrap-edited:f;mso-width-percent:0;mso-height-percent:0;mso-position-horizontal-relative:text;mso-position-vertical-relative:text;mso-width-percent:0;mso-height-percent:0">
             <v:imagedata r:id="rId15" o:title=""/>
           </v:shape>
-          <o:OLEObject Type="Embed" ProgID="Word.Document.12" ShapeID="_x0000_s2050" DrawAspect="Content" ObjectID="_1842694658" r:id="rId16">
+          <o:OLEObject Type="Embed" ProgID="Word.Document.12" ShapeID="_x0000_s2050" DrawAspect="Content" ObjectID="_1842705461" r:id="rId16">
             <o:FieldCodes>\s</o:FieldCodes>
           </o:OLEObject>
         </w:object>
@@ -11985,11 +12551,11 @@
       <w:r>
         <w:t>Annexe</w:t>
       </w:r>
-      <w:bookmarkEnd w:id="49"/>
-      <w:bookmarkEnd w:id="50"/>
+      <w:bookmarkEnd w:id="54"/>
       <w:r>
         <w:t> – Questionnaire 1</w:t>
       </w:r>
+      <w:bookmarkEnd w:id="55"/>
     </w:p>
     <w:p>
       <w:pPr>
@@ -12034,17 +12600,29 @@
       <w:pPr>
         <w:pStyle w:val="Heading3"/>
       </w:pPr>
-      <w:bookmarkStart w:id="51" w:name="_Toc231678114"/>
       <w:r>
         <w:lastRenderedPageBreak/>
         <w:t xml:space="preserve"> </w:t>
       </w:r>
-      <w:r>
-        <w:t xml:space="preserve">Annexe </w:t>
-      </w:r>
-      <w:bookmarkEnd w:id="51"/>
-      <w:r>
-        <w:t xml:space="preserve">- Formulaire de consentement, Anglais. </w:t>
+      <w:bookmarkStart w:id="56" w:name="_Toc232092769"/>
+      <w:r>
+        <w:t>Annexe</w:t>
+      </w:r>
+      <w:r>
+        <w:t xml:space="preserve"> </w:t>
+      </w:r>
+      <w:r>
+        <w:t>–</w:t>
+      </w:r>
+      <w:r>
+        <w:t xml:space="preserve"> </w:t>
+      </w:r>
+      <w:r>
+        <w:t>Formulaire de consentement, Anglais.</w:t>
+      </w:r>
+      <w:bookmarkEnd w:id="56"/>
+      <w:r>
+        <w:t xml:space="preserve"> </w:t>
       </w:r>
     </w:p>
     <w:tbl>
@@ -13224,25 +13802,20 @@
       <w:pPr>
         <w:pStyle w:val="Heading3"/>
       </w:pPr>
-      <w:bookmarkStart w:id="52" w:name="_Toc231678115"/>
-      <w:proofErr w:type="gramStart"/>
+      <w:bookmarkStart w:id="57" w:name="_Toc232092770"/>
       <w:r>
         <w:lastRenderedPageBreak/>
-        <w:t xml:space="preserve">Annexe </w:t>
-      </w:r>
-      <w:bookmarkEnd w:id="52"/>
-      <w:r>
-        <w:t xml:space="preserve"> –</w:t>
-      </w:r>
-      <w:proofErr w:type="gramEnd"/>
+        <w:t>Annexe –</w:t>
+      </w:r>
+      <w:r>
+        <w:t xml:space="preserve"> Formulaire de commentaires post-expérience</w:t>
+      </w:r>
+      <w:r>
+        <w:t>, Anglais</w:t>
+      </w:r>
+      <w:bookmarkEnd w:id="57"/>
       <w:r>
         <w:t xml:space="preserve"> </w:t>
-      </w:r>
-      <w:r>
-        <w:t>Formulaire de commentaires post-expérience</w:t>
-      </w:r>
-      <w:r>
-        <w:t xml:space="preserve">, Anglais </w:t>
       </w:r>
     </w:p>
     <w:p>
@@ -17767,18 +18340,15 @@
       <w:pPr>
         <w:pStyle w:val="Heading3"/>
       </w:pPr>
-      <w:bookmarkStart w:id="53" w:name="_Toc231678116"/>
+      <w:bookmarkStart w:id="58" w:name="_Toc232092771"/>
       <w:r>
         <w:lastRenderedPageBreak/>
         <w:t xml:space="preserve">Annexe </w:t>
       </w:r>
-      <w:bookmarkEnd w:id="53"/>
-      <w:r>
-        <w:t xml:space="preserve">- </w:t>
-      </w:r>
-      <w:r>
-        <w:t>Formulaire de consentement, Anglais</w:t>
-      </w:r>
+      <w:r>
+        <w:t>- Formulaire de consentement, Anglais</w:t>
+      </w:r>
+      <w:bookmarkEnd w:id="58"/>
     </w:p>
     <w:tbl>
       <w:tblPr>
@@ -18907,12 +19477,11 @@
       <w:pPr>
         <w:pStyle w:val="Heading3"/>
       </w:pPr>
-      <w:bookmarkStart w:id="54" w:name="_Toc231678117"/>
+      <w:bookmarkStart w:id="59" w:name="_Toc232092772"/>
       <w:r>
         <w:lastRenderedPageBreak/>
         <w:t xml:space="preserve">Annexe </w:t>
       </w:r>
-      <w:bookmarkEnd w:id="54"/>
       <w:r>
         <w:t xml:space="preserve">- </w:t>
       </w:r>
@@ -18922,6 +19491,7 @@
       <w:r>
         <w:t>, Français</w:t>
       </w:r>
+      <w:bookmarkEnd w:id="59"/>
     </w:p>
     <w:p>
       <w:pPr>
@@ -23094,6 +23664,7 @@
           <w:lang w:eastAsia="en-GB"/>
         </w:rPr>
       </w:pPr>
+      <w:bookmarkStart w:id="60" w:name="_Toc232092773"/>
       <w:r>
         <w:rPr>
           <w:rFonts w:eastAsia="Arial"/>
@@ -23109,6 +23680,7 @@
         </w:rPr>
         <w:t xml:space="preserve"> – Fiche d’évaluation du stage</w:t>
       </w:r>
+      <w:bookmarkEnd w:id="60"/>
     </w:p>
     <w:p>
       <w:pPr>
@@ -23116,6 +23688,74 @@
           <w:lang w:eastAsia="en-GB"/>
         </w:rPr>
       </w:pPr>
+      <w:r>
+        <w:rPr>
+          <w:noProof/>
+          <w:lang w:eastAsia="en-GB"/>
+        </w:rPr>
+        <w:drawing>
+          <wp:anchor distT="0" distB="0" distL="114300" distR="114300" simplePos="0" relativeHeight="251664384" behindDoc="0" locked="0" layoutInCell="1" allowOverlap="1" wp14:anchorId="672102C7" wp14:editId="387F7ABF">
+            <wp:simplePos x="0" y="0"/>
+            <wp:positionH relativeFrom="column">
+              <wp:posOffset>0</wp:posOffset>
+            </wp:positionH>
+            <wp:positionV relativeFrom="paragraph">
+              <wp:posOffset>0</wp:posOffset>
+            </wp:positionV>
+            <wp:extent cx="5727700" cy="8788400"/>
+            <wp:effectExtent l="0" t="0" r="0" b="0"/>
+            <wp:wrapNone/>
+            <wp:docPr id="1735167815" name="Picture 11"/>
+            <wp:cNvGraphicFramePr>
+              <a:graphicFrameLocks xmlns:a="http://schemas.openxmlformats.org/drawingml/2006/main" noChangeAspect="1"/>
+            </wp:cNvGraphicFramePr>
+            <a:graphic xmlns:a="http://schemas.openxmlformats.org/drawingml/2006/main">
+              <a:graphicData uri="http://schemas.openxmlformats.org/drawingml/2006/picture">
+                <pic:pic xmlns:pic="http://schemas.openxmlformats.org/drawingml/2006/picture">
+                  <pic:nvPicPr>
+                    <pic:cNvPr id="0" name="Picture 2"/>
+                    <pic:cNvPicPr>
+                      <a:picLocks noChangeAspect="1" noChangeArrowheads="1"/>
+                    </pic:cNvPicPr>
+                  </pic:nvPicPr>
+                  <pic:blipFill>
+                    <a:blip r:embed="rId17">
+                      <a:extLst>
+                        <a:ext uri="{28A0092B-C50C-407E-A947-70E740481C1C}">
+                          <a14:useLocalDpi xmlns:a14="http://schemas.microsoft.com/office/drawing/2010/main" val="0"/>
+                        </a:ext>
+                      </a:extLst>
+                    </a:blip>
+                    <a:srcRect/>
+                    <a:stretch>
+                      <a:fillRect/>
+                    </a:stretch>
+                  </pic:blipFill>
+                  <pic:spPr bwMode="auto">
+                    <a:xfrm>
+                      <a:off x="0" y="0"/>
+                      <a:ext cx="5727700" cy="8788400"/>
+                    </a:xfrm>
+                    <a:prstGeom prst="rect">
+                      <a:avLst/>
+                    </a:prstGeom>
+                    <a:noFill/>
+                    <a:ln>
+                      <a:noFill/>
+                    </a:ln>
+                  </pic:spPr>
+                </pic:pic>
+              </a:graphicData>
+            </a:graphic>
+            <wp14:sizeRelH relativeFrom="page">
+              <wp14:pctWidth>0</wp14:pctWidth>
+            </wp14:sizeRelH>
+            <wp14:sizeRelV relativeFrom="page">
+              <wp14:pctHeight>0</wp14:pctHeight>
+            </wp14:sizeRelV>
+          </wp:anchor>
+        </w:drawing>
+      </w:r>
     </w:p>
     <w:p>
       <w:pPr>

</xml_diff>

<commit_message>
maybe this is working again?
</commit_message>
<xml_diff>
--- a/my_report/Thesis_FR.docx
+++ b/my_report/Thesis_FR.docx
@@ -174,7 +174,7 @@
                                     <pic:cNvPicPr/>
                                   </pic:nvPicPr>
                                   <pic:blipFill>
-                                    <a:blip r:embed="rId8">
+                                    <a:blip r:embed="rId9">
                                       <a:extLst>
                                         <a:ext uri="{28A0092B-C50C-407E-A947-70E740481C1C}">
                                           <a14:useLocalDpi xmlns:a14="http://schemas.microsoft.com/office/drawing/2010/main" val="0"/>
@@ -238,7 +238,7 @@
                     <pic:cNvPicPr/>
                   </pic:nvPicPr>
                   <pic:blipFill>
-                    <a:blip r:embed="rId9" cstate="print">
+                    <a:blip r:embed="rId10" cstate="print">
                       <a:extLst>
                         <a:ext uri="{28A0092B-C50C-407E-A947-70E740481C1C}">
                           <a14:useLocalDpi xmlns:a14="http://schemas.microsoft.com/office/drawing/2010/main" val="0"/>
@@ -6001,9 +6001,9 @@
     <w:p>
       <w:pPr>
         <w:sectPr>
-          <w:headerReference w:type="default" r:id="rId10"/>
-          <w:footerReference w:type="even" r:id="rId11"/>
-          <w:footerReference w:type="default" r:id="rId12"/>
+          <w:headerReference w:type="default" r:id="rId11"/>
+          <w:footerReference w:type="even" r:id="rId12"/>
+          <w:footerReference w:type="default" r:id="rId13"/>
           <w:pgSz w:w="11906" w:h="16838"/>
           <w:pgMar w:top="1440" w:right="1440" w:bottom="1440" w:left="1440" w:header="708" w:footer="708" w:gutter="0"/>
           <w:pgNumType w:chapStyle="1" w:chapSep="emDash"/>
@@ -6131,7 +6131,21 @@
           <w:rFonts w:cs="Times New Roman"/>
           <w:lang w:val="en-FR"/>
         </w:rPr>
-        <w:t>Parlant plus precisisement de la contexte francçaise n</w:t>
+        <w:t>Parlant plus precisisement d</w:t>
+      </w:r>
+      <w:r>
+        <w:rPr>
+          <w:rFonts w:cs="Times New Roman"/>
+          <w:lang w:val="en-FR"/>
+        </w:rPr>
+        <w:t>u</w:t>
+      </w:r>
+      <w:r>
+        <w:rPr>
+          <w:rFonts w:cs="Times New Roman"/>
+          <w:lang w:val="en-FR"/>
+        </w:rPr>
+        <w:t xml:space="preserve"> contexte francçaise n</w:t>
       </w:r>
       <w:r>
         <w:rPr>
@@ -6336,7 +6350,55 @@
         <w:rPr>
           <w:rFonts w:cs="Times New Roman"/>
         </w:rPr>
-        <w:t>Le mémoire se divise en quatre chapitres. Le premier offre une revue de la littérature autour des cognitions enseignantes et de la planification pédagogique, des modèles d’adoption de technologies en éducation, et de l’arrivée de l’IA dans l’enseignement des langues. Ensuite, les détails sur le terrain du stage. Puis, la détaille de la méthodologie employée. De plus, je présente les résultats de l’étude expérimentale. Enfin, le dernier chapitre analyse ces résultats et en tire les conséquences pour les pratiques des enseignants.</w:t>
+        <w:t xml:space="preserve">Le mémoire se divise en </w:t>
+      </w:r>
+      <w:r>
+        <w:rPr>
+          <w:rFonts w:cs="Times New Roman"/>
+        </w:rPr>
+        <w:t>trois</w:t>
+      </w:r>
+      <w:r>
+        <w:rPr>
+          <w:rFonts w:cs="Times New Roman"/>
+        </w:rPr>
+        <w:t xml:space="preserve"> chapitres. Le premier offre une revue de la littérature autour des cognitions enseignantes et de la planification pédagogique, des modèles d’adoption de technologies en éducation, et de l’arrivée de l’IA dans l’enseignement des langues. Ensuite</w:t>
+      </w:r>
+      <w:r>
+        <w:rPr>
+          <w:rFonts w:cs="Times New Roman"/>
+        </w:rPr>
+        <w:t>,</w:t>
+      </w:r>
+      <w:r>
+        <w:rPr>
+          <w:rFonts w:cs="Times New Roman"/>
+        </w:rPr>
+        <w:t xml:space="preserve"> </w:t>
+      </w:r>
+      <w:r>
+        <w:rPr>
+          <w:rFonts w:cs="Times New Roman"/>
+        </w:rPr>
+        <w:t>le détail</w:t>
+      </w:r>
+      <w:r>
+        <w:rPr>
+          <w:rFonts w:cs="Times New Roman"/>
+        </w:rPr>
+        <w:t xml:space="preserve"> de la méthodologie employée</w:t>
+      </w:r>
+      <w:r>
+        <w:rPr>
+          <w:rFonts w:cs="Times New Roman"/>
+        </w:rPr>
+        <w:t xml:space="preserve"> y compris une partie expliquant le terrain du stage</w:t>
+      </w:r>
+      <w:r>
+        <w:rPr>
+          <w:rFonts w:cs="Times New Roman"/>
+        </w:rPr>
+        <w:t>. De plus, je présente les résultats de l’étude expérimentale. Enfin, le dernier chapitre analyse ces résultats et en tire les conséquences pour les pratiques des enseignants.</w:t>
       </w:r>
     </w:p>
     <w:p>
@@ -6558,10 +6620,7 @@
         <w:t>pédagogique :</w:t>
       </w:r>
       <w:r>
-        <w:t xml:space="preserve"> désormais, il s’agit moins de créer le contenu de toutes pièces et plus d’évaluer, d’ajuster et de contrôler la qualité de ce que produit la machine. Mais l’intégration de ces technologies ne dépend pas uniquement de la volonté individuelle : un cadre institutionnel et réglementaire très précis en France encadre ces</w:t>
-      </w:r>
-      <w:r>
-        <w:t xml:space="preserve"> </w:t>
+        <w:t xml:space="preserve"> désormais, il s’agit moins de créer le contenu de toutes pièces et plus d’évaluer, d’ajuster et de contrôler la qualité de ce que produit la machine. Mais l’intégration de ces technologies ne dépend pas uniquement de la volonté individuelle : un cadre institutionnel et réglementaire très précis en France </w:t>
       </w:r>
       <w:r>
         <w:fldChar w:fldCharType="begin"/>
@@ -6655,6 +6714,13 @@
           <w:rFonts w:eastAsia="Times New Roman"/>
           <w:lang w:val="en-FR" w:eastAsia="en-GB"/>
         </w:rPr>
+        <w:t xml:space="preserve"> </w:t>
+      </w:r>
+      <w:r>
+        <w:rPr>
+          <w:rFonts w:eastAsia="Times New Roman"/>
+          <w:lang w:val="en-FR" w:eastAsia="en-GB"/>
+        </w:rPr>
         <w:t>L'émergence des TICE dans l'apprentissage des langues</w:t>
       </w:r>
       <w:bookmarkEnd w:id="12"/>
@@ -6855,6 +6921,13 @@
           <w:rFonts w:eastAsia="Times New Roman"/>
           <w:lang w:eastAsia="en-GB"/>
         </w:rPr>
+        <w:t xml:space="preserve"> </w:t>
+      </w:r>
+      <w:r>
+        <w:rPr>
+          <w:rFonts w:eastAsia="Times New Roman"/>
+          <w:lang w:eastAsia="en-GB"/>
+        </w:rPr>
         <w:t>L'intégration de l'IA générative dans l'apprentissage des langues</w:t>
       </w:r>
       <w:bookmarkEnd w:id="13"/>
@@ -6921,14 +6994,26 @@
       <w:r>
         <w:t>La recherche a commencé à examiner le potentiel de l'IA dans l'enseignement des langues et l'adoption des technologies par les enseignants de manière plus large. Cependant, peu de travaux ont spécifiquement étudié la façon dont les enseignants évaluent, intègrent et prennent des décisions pédagogiques concernant l'IA générative dans la planification des cours, notamment dans le contexte de l'enseignement secondaire français. Comprendre ces perspectives et pratiques enseignantes est essentiel compte tenu de l'intégration rapide des outils d'IA et de la nécessité de soutenir une adoption pédagogique éclairée.</w:t>
       </w:r>
+      <w:r>
+        <w:t xml:space="preserve"> </w:t>
+      </w:r>
+      <w:r>
+        <w:t>Cependant, pour y parvenir, nous devons d'abord comprendre le raisonnement qui sous-tend les choix pédagogiques des enseignants.</w:t>
+      </w:r>
+      <w:r>
+        <w:t xml:space="preserve"> </w:t>
+      </w:r>
     </w:p>
     <w:p/>
+    <w:p/>
+    <w:p/>
     <w:p>
       <w:pPr>
         <w:pStyle w:val="Heading2"/>
       </w:pPr>
       <w:bookmarkStart w:id="14" w:name="_Toc232455107"/>
       <w:r>
+        <w:lastRenderedPageBreak/>
         <w:t>La cognition enseignante et la planification des cours</w:t>
       </w:r>
       <w:bookmarkEnd w:id="9"/>
@@ -6964,11 +7049,7 @@
         <w:fldChar w:fldCharType="end"/>
       </w:r>
       <w:r>
-        <w:t xml:space="preserve">. Elle joue un rôle déterminant dans la conception des cours et des approches </w:t>
-      </w:r>
-      <w:r>
-        <w:lastRenderedPageBreak/>
-        <w:t>pédagogiques. La compréhension de la cognition enseignante est fondamentale pour cette thèse, car elle établit le socle à partir duquel les enseignants conçoivent actuellement leurs cours, et donc la manière dont l'IA pourrait remodeler ce processus. La partie suivante de ce travail abordera quatre dimensions importantes de la cognition enseignante et de la planification des cours : les croyances et pratiques des enseignants, les contraintes contextuelles pesant sur la planification, l'expérience et l'expertise des enseignants, ainsi que la flexibilité dans la planification des cours.</w:t>
+        <w:t>. Elle joue un rôle déterminant dans la conception des cours et des approches pédagogiques. La compréhension de la cognition enseignante est fondamentale pour cette thèse, car elle établit le socle à partir duquel les enseignants conçoivent actuellement leurs cours, et donc la manière dont l'IA pourrait remodeler ce processus. La partie suivante de ce travail abordera quatre dimensions importantes de la cognition enseignante et de la planification des cours : les croyances et pratiques des enseignants, les contraintes contextuelles pesant sur la planification, l'expérience et l'expertise des enseignants, ainsi que la flexibilité dans la planification des cours.</w:t>
       </w:r>
     </w:p>
     <w:p/>
@@ -7049,8 +7130,6 @@
     <w:p>
       <w:pPr>
         <w:rPr>
-          <w:rFonts w:cs="Times New Roman"/>
-          <w:szCs w:val="24"/>
           <w:lang w:val="en-FR" w:eastAsia="en-GB"/>
         </w:rPr>
       </w:pPr>
@@ -7058,7 +7137,14 @@
         <w:rPr>
           <w:lang w:val="en-FR" w:eastAsia="en-GB"/>
         </w:rPr>
-        <w:t>La planification des cours révèle les croyances des enseignants, car elle implique de nombreuses décisions à petite échelle portant sur le choix des activités, leur durée, l'importance accordée à certains contenus et l'adaptation des supports pédagogiques. Toutes ces décisions sont influencées par les croyances des enseignants sur l'apprentissage et l'enseignement des langues. Par exemple, un enseignant convaincu que les élèves apprennent par la pratique de la langue planifiera des cours radicalement différents de celui qui estime que la précision grammaticale est essentielle. Comprendre cette nature fondée sur les croyances est déterminant pour saisir comment les enseignants évalueront et adopteront les outils d'IA générative : ils accepteront ou résisteront à l'IA selon que ses résultats correspondent ou non à leurs convictions pédagogiques.</w:t>
+        <w:t xml:space="preserve">La planification des cours révèle les croyances des enseignants, car elle implique de nombreuses décisions à petite échelle portant sur le choix des activités, leur durée, l'importance accordée à certains contenus et l'adaptation des supports pédagogiques. Toutes ces décisions sont influencées par les croyances des enseignants sur l'apprentissage et l'enseignement des langues. Par exemple, un enseignant convaincu que les élèves apprennent par la pratique de la langue planifiera des cours radicalement différents de celui qui estime que la précision grammaticale est essentielle. Comprendre cette nature fondée sur les croyances est déterminant pour saisir comment les enseignants évalueront et adopteront les outils d'IA générative : ils </w:t>
+      </w:r>
+      <w:r>
+        <w:rPr>
+          <w:lang w:val="en-FR" w:eastAsia="en-GB"/>
+        </w:rPr>
+        <w:lastRenderedPageBreak/>
+        <w:t>accepteront ou résisteront à l'IA selon que ses résultats correspondent ou non à leurs convictions pédagogiques.</w:t>
       </w:r>
     </w:p>
     <w:p>
@@ -7107,7 +7193,6 @@
         <w:rPr>
           <w:lang w:eastAsia="en-GB"/>
         </w:rPr>
-        <w:lastRenderedPageBreak/>
         <w:t xml:space="preserve">La planification des cours n'est pas un exercice purement cognitif </w:t>
       </w:r>
       <w:r>
@@ -7384,7 +7469,14 @@
         <w:rPr>
           <w:lang w:eastAsia="en-GB"/>
         </w:rPr>
-        <w:t xml:space="preserve">La planification des cours est le reflet de l'expérience et de la compréhension professionnelle d'un enseignant. L'efficacité dans l'enseignement exige des enseignants bien plus que des connaissances disciplinaires ou des compétences en gestion de classe. Elle repose au contraire sur les Connaissances Pédagogiques du Contenu (CPC), ce mélange spécialisé de connaissances disciplinaires et de stratégies pédagogiques que les enseignants développent au fil des années de pratique </w:t>
+        <w:t xml:space="preserve">La planification des cours est le reflet de l'expérience et de la compréhension professionnelle d'un enseignant. L'efficacité dans l'enseignement exige des enseignants bien plus que des connaissances disciplinaires ou des compétences en gestion de classe. Elle repose au contraire sur les Connaissances Pédagogiques du Contenu (CPC), ce mélange spécialisé de </w:t>
+      </w:r>
+      <w:r>
+        <w:rPr>
+          <w:lang w:eastAsia="en-GB"/>
+        </w:rPr>
+        <w:lastRenderedPageBreak/>
+        <w:t xml:space="preserve">connaissances disciplinaires et de stratégies pédagogiques que les enseignants développent au fil des années de pratique </w:t>
       </w:r>
       <w:r>
         <w:rPr>
@@ -7441,14 +7533,7 @@
         <w:rPr>
           <w:lang w:eastAsia="en-GB"/>
         </w:rPr>
-        <w:t xml:space="preserve">Les enseignants expérimentés transforment des concepts académiques abstraits en cours accessibles et adaptés au contexte de leurs élèves, grâce à leurs années d'expérience </w:t>
-      </w:r>
-      <w:r>
-        <w:rPr>
-          <w:lang w:eastAsia="en-GB"/>
-        </w:rPr>
-        <w:lastRenderedPageBreak/>
-        <w:t xml:space="preserve">professionnelle. Par exemple, un professeur de langues </w:t>
+        <w:t xml:space="preserve">Les enseignants expérimentés transforment des concepts académiques abstraits en cours accessibles et adaptés au contexte de leurs élèves, grâce à leurs années d'expérience professionnelle. Par exemple, un professeur de langues </w:t>
       </w:r>
       <w:r>
         <w:rPr>
@@ -7616,7 +7701,17 @@
           <w:szCs w:val="24"/>
           <w:lang w:val="en-FR" w:eastAsia="en-GB"/>
         </w:rPr>
-        <w:t>Les enseignants mettent rarement en œuvre leurs cours exactement comme prévu. Plutôt que de traiter les supports pédagogiques comme des scripts rigides, ils les adaptent pour les aligner sur le contexte spécifique de leur classe. Cette flexibilité est essentielle car aucun groupe d'élèves n'est identique, et les objectifs d'apprentissage doivent rester évolutifs pour correspondre aux besoins réels de chaque groupe.</w:t>
+        <w:t xml:space="preserve">Les enseignants mettent rarement en œuvre leurs cours exactement comme prévu. Plutôt que de traiter les supports pédagogiques comme des scripts rigides, ils les adaptent pour les aligner </w:t>
+      </w:r>
+      <w:r>
+        <w:rPr>
+          <w:rFonts w:eastAsia="Times New Roman" w:cs="Times New Roman"/>
+          <w:color w:val="000000"/>
+          <w:szCs w:val="24"/>
+          <w:lang w:val="en-FR" w:eastAsia="en-GB"/>
+        </w:rPr>
+        <w:lastRenderedPageBreak/>
+        <w:t>sur le contexte spécifique de leur classe. Cette flexibilité est essentielle car aucun groupe d'élèves n'est identique, et les objectifs d'apprentissage doivent rester évolutifs pour correspondre aux besoins réels de chaque groupe.</w:t>
       </w:r>
     </w:p>
     <w:p>
@@ -7636,7 +7731,6 @@
           <w:lang w:val="en-FR" w:eastAsia="en-GB"/>
           <w14:ligatures w14:val="standardContextual"/>
         </w:rPr>
-        <w:lastRenderedPageBreak/>
         <w:drawing>
           <wp:anchor distT="0" distB="0" distL="114300" distR="114300" simplePos="0" relativeHeight="251661312" behindDoc="0" locked="0" layoutInCell="1" allowOverlap="1" wp14:anchorId="1CBF2584" wp14:editId="2819FC48">
             <wp:simplePos x="0" y="0"/>
@@ -7661,7 +7755,7 @@
                     <pic:cNvPicPr/>
                   </pic:nvPicPr>
                   <pic:blipFill>
-                    <a:blip r:embed="rId13" cstate="print">
+                    <a:blip r:embed="rId14" cstate="print">
                       <a:extLst>
                         <a:ext uri="{28A0092B-C50C-407E-A947-70E740481C1C}">
                           <a14:useLocalDpi xmlns:a14="http://schemas.microsoft.com/office/drawing/2010/main" val="0"/>
@@ -7880,25 +7974,27 @@
     </w:p>
     <w:p>
       <w:r>
-        <w:t>En définitive, cette capacité d'adaptation a des implications significatives sur la qualité des cours. Lorsque les enseignants adaptent activement les supports à leurs apprenants spécifiques, ils peuvent anticiper les obstacles à l'apprentissage et concevoir des expériences pertinentes répondant aux besoins individuels. Cette réactivité améliore les résultats d'apprentissage, ce qui prouve que l'adaptation des supports n'est pas facultative, mais centrale dans un enseignement véritablement adaptatif.</w:t>
+        <w:t xml:space="preserve">En définitive, cette capacité d'adaptation a des implications significatives sur la qualité des cours. Lorsque les enseignants adaptent activement les supports à leurs apprenants spécifiques, ils peuvent anticiper les obstacles à l'apprentissage et concevoir des expériences pertinentes répondant aux besoins individuels. Cette réactivité améliore les résultats d'apprentissage, ce </w:t>
+      </w:r>
+      <w:r>
+        <w:lastRenderedPageBreak/>
+        <w:t>qui prouve que l'adaptation des supports n'est pas facultative, mais centrale dans un enseignement véritablement adaptatif.</w:t>
       </w:r>
     </w:p>
     <w:p/>
+    <w:p>
+      <w:pPr>
+        <w:pStyle w:val="Heading2"/>
+      </w:pPr>
+      <w:bookmarkStart w:id="21" w:name="_Toc232455112"/>
+      <w:r>
+        <w:t>L'adoption technologique en éducation : Théories et obstacles</w:t>
+      </w:r>
+      <w:bookmarkEnd w:id="21"/>
+    </w:p>
     <w:p/>
     <w:p>
       <w:pPr>
-        <w:pStyle w:val="Heading2"/>
-      </w:pPr>
-      <w:bookmarkStart w:id="21" w:name="_Toc232455112"/>
-      <w:r>
-        <w:lastRenderedPageBreak/>
-        <w:t>L'adoption technologique en éducation : Théories et obstacles</w:t>
-      </w:r>
-      <w:bookmarkEnd w:id="21"/>
-    </w:p>
-    <w:p/>
-    <w:p>
-      <w:pPr>
         <w:rPr>
           <w:lang w:val="en-FR"/>
         </w:rPr>
@@ -8105,7 +8201,19 @@
         <w:rPr>
           <w:lang w:val="en-FR"/>
         </w:rPr>
-        <w:t>se penche sur les caractéristiques de l'avantage relatif et compatibilité, entre autres.</w:t>
+        <w:t>se penche sur les caractéristiques de l'avantage relatif et compatibilité</w:t>
+      </w:r>
+      <w:r>
+        <w:rPr>
+          <w:lang w:val="en-FR"/>
+        </w:rPr>
+        <w:t xml:space="preserve"> d’adoptation d’une innovation</w:t>
+      </w:r>
+      <w:r>
+        <w:rPr>
+          <w:lang w:val="en-FR"/>
+        </w:rPr>
+        <w:t>.</w:t>
       </w:r>
     </w:p>
     <w:p>
@@ -8168,7 +8276,19 @@
         <w:rPr>
           <w:lang w:val="en-FR"/>
         </w:rPr>
-        <w:t>. Cette section examine ces cadres théoriques, identifie les obstacles spécifiques que rencontrent les enseignants, et applique ces insights au contexte particulier des enseignants de langues vivantes face à l'IA générative.</w:t>
+        <w:t xml:space="preserve">. Cette section examine ces cadres théoriques, identifie les obstacles spécifiques que rencontrent les enseignants, et applique ces </w:t>
+      </w:r>
+      <w:r>
+        <w:rPr>
+          <w:lang w:val="en-FR"/>
+        </w:rPr>
+        <w:t>aperçu</w:t>
+      </w:r>
+      <w:r>
+        <w:rPr>
+          <w:lang w:val="en-FR"/>
+        </w:rPr>
+        <w:t xml:space="preserve"> au contexte particulier des enseignants de langues vivantes face à l'IA générative.</w:t>
       </w:r>
     </w:p>
     <w:p>
@@ -8221,11 +8341,11 @@
         <w:fldChar w:fldCharType="end"/>
       </w:r>
       <w:r>
-        <w:t xml:space="preserve">, l'adoption technologique ne représente pas seulement une simple opération technique ou acquisition. Il s'agit d'un processus psychologique et comportemental qui implique l'évaluation de </w:t>
+        <w:t xml:space="preserve">, l'adoption </w:t>
       </w:r>
       <w:r>
         <w:lastRenderedPageBreak/>
-        <w:t>l'innovation par le praticien, ainsi que la prise d'une décision consciente de modifier ses habitudes professionnelles existantes.</w:t>
+        <w:t>technologique ne représente pas seulement une simple opération technique ou acquisition. Il s'agit d'un processus psychologique et comportemental qui implique l'évaluation de l'innovation par le praticien, ainsi que la prise d'une décision consciente de modifier ses habitudes professionnelles existantes.</w:t>
       </w:r>
     </w:p>
     <w:p/>
@@ -8245,7 +8365,7 @@
       </w:r>
       <w:proofErr w:type="spellEnd"/>
       <w:r>
-        <w:t>, il reste libre de décider de ne pas l'utiliser dans son activité quotidiennement. En effet, l'adoption n'est pas déterminée par le fait que l'outil soit disponible techniquement ; au contraire, elle est influencée par un ensemble de facteurs psychologiques, pédagogiques et contextuels. En effet, l'adoption de l'outil nécessite la mise en place active des nouveaux schémas de comportement, de son accord avec les convictions pédagogiques et de son intégration consciente lors de la préparation des cours.</w:t>
+        <w:t xml:space="preserve">, il reste libre de décider de ne pas l'utiliser dans son activité quotidiennement. En effet, l'adoption n'est pas déterminée par le fait que l'outil soit disponible techniquement ; au contraire, elle est influencée par un ensemble de facteurs psychologiques, pédagogiques et contextuels. </w:t>
       </w:r>
     </w:p>
     <w:p/>
@@ -8255,527 +8375,535 @@
       </w:r>
     </w:p>
     <w:p/>
+    <w:p>
+      <w:pPr>
+        <w:pStyle w:val="Heading3"/>
+        <w:rPr>
+          <w:lang w:val="en-FR"/>
+        </w:rPr>
+      </w:pPr>
+      <w:r>
+        <w:rPr>
+          <w:lang w:val="en-FR"/>
+        </w:rPr>
+        <w:t xml:space="preserve"> </w:t>
+      </w:r>
+      <w:bookmarkStart w:id="23" w:name="_Toc232455114"/>
+      <w:r>
+        <w:rPr>
+          <w:lang w:val="en-FR"/>
+        </w:rPr>
+        <w:t>Modèles théoriques de l'adoption technologique</w:t>
+      </w:r>
+      <w:bookmarkEnd w:id="23"/>
+      <w:r>
+        <w:rPr>
+          <w:lang w:val="en-FR"/>
+        </w:rPr>
+        <w:br/>
+      </w:r>
+    </w:p>
+    <w:p>
+      <w:pPr>
+        <w:rPr>
+          <w:lang w:val="en-FR"/>
+        </w:rPr>
+      </w:pPr>
+      <w:r>
+        <w:rPr>
+          <w:lang w:val="en-FR"/>
+        </w:rPr>
+        <w:t>Il existe plusieurs cadres théoriques qui expliquent les raisons et les moyens par lesquels les enseignants choisissent d'adopter ou de rejeter des technologies données. Ce sont des outils de pensée qui servent à analyser divers déterminants psychologiques, techniques et environnementaux qui influencent la prise de décision concernant une innovation</w:t>
+      </w:r>
+      <w:r>
+        <w:rPr>
+          <w:lang w:val="en-FR"/>
+        </w:rPr>
+        <w:t xml:space="preserve"> </w:t>
+      </w:r>
+      <w:r>
+        <w:rPr>
+          <w:lang w:val="en-FR"/>
+        </w:rPr>
+        <w:fldChar w:fldCharType="begin"/>
+      </w:r>
+      <w:r>
+        <w:rPr>
+          <w:lang w:val="en-FR"/>
+        </w:rPr>
+        <w:instrText xml:space="preserve"> ADDIN ZOTERO_ITEM CSL_CITATION {"citationID":"d0lqfl2q","properties":{"unsorted":false,"formattedCitation":"(Straub, 2009)","plainCitation":"(Straub, 2009)","noteIndex":0},"citationItems":[{"id":260,"uris":["http://zotero.org/users/18489330/items/YZ5WA6LS"],"itemData":{"id":260,"type":"webpage","DOI":"10.3102/0034654308325896","language":"en","note":"DOI: 10.3102/0034654308325896","title":"Understanding Technology Adoption: Theory and Future Directions for Informal Learning","title-short":"Understanding Technology Adoption","URL":"https://journals.sagepub.com/doi/epub/10.3102/0034654308325896","author":[{"family":"Straub","given":"Evan T."}],"accessed":{"date-parts":[["2026",6,6]]},"issued":{"date-parts":[["2009"]]}}}],"schema":"https://github.com/citation-style-language/schema/raw/master/csl-citation.json"} </w:instrText>
+      </w:r>
+      <w:r>
+        <w:rPr>
+          <w:lang w:val="en-FR"/>
+        </w:rPr>
+        <w:fldChar w:fldCharType="separate"/>
+      </w:r>
+      <w:r>
+        <w:rPr>
+          <w:noProof/>
+          <w:lang w:val="en-FR"/>
+        </w:rPr>
+        <w:t xml:space="preserve">(Straub, </w:t>
+      </w:r>
+      <w:r>
+        <w:rPr>
+          <w:noProof/>
+          <w:lang w:val="en-FR"/>
+        </w:rPr>
+        <w:lastRenderedPageBreak/>
+        <w:t>2009)</w:t>
+      </w:r>
+      <w:r>
+        <w:rPr>
+          <w:lang w:val="en-FR"/>
+        </w:rPr>
+        <w:fldChar w:fldCharType="end"/>
+      </w:r>
+      <w:r>
+        <w:rPr>
+          <w:lang w:val="en-FR"/>
+        </w:rPr>
+        <w:t>.</w:t>
+      </w:r>
+      <w:r>
+        <w:rPr>
+          <w:lang w:val="en-FR"/>
+        </w:rPr>
+        <w:br/>
+      </w:r>
+    </w:p>
+    <w:p>
+      <w:pPr>
+        <w:rPr>
+          <w:lang w:val="en-FR"/>
+        </w:rPr>
+      </w:pPr>
+      <w:r>
+        <w:rPr>
+          <w:lang w:val="en-FR"/>
+        </w:rPr>
+        <w:t xml:space="preserve">Le Modèle d'Acceptation Technologique (TAM) de </w:t>
+      </w:r>
+      <w:r>
+        <w:rPr>
+          <w:lang w:val="en-FR"/>
+        </w:rPr>
+        <w:fldChar w:fldCharType="begin"/>
+      </w:r>
+      <w:r>
+        <w:rPr>
+          <w:lang w:val="en-FR"/>
+        </w:rPr>
+        <w:instrText xml:space="preserve"> ADDIN ZOTERO_ITEM CSL_CITATION {"citationID":"t01EDYTV","properties":{"unsorted":false,"formattedCitation":"(Davis, 1989)","plainCitation":"(Davis, 1989)","dontUpdate":true,"noteIndex":0},"citationItems":[{"id":247,"uris":["http://zotero.org/users/18489330/items/2MWF9GXV"],"itemData":{"id":247,"type":"article-journal","abstract":"Valid measurement scales for predicting user acceptance of computers are in short supply. Most subjective measures used in practice are unvalidated, and their relationship to system usage is unknown. The present research develops and validates new scales for two specific variables, perceived usefulness and perceived ease of use, which are hypothesized to be fundamental determinants of user acceptance. Definitions for these two variables were used to develop scale items that were pretested for content validity and then tested for reliability and construct validity in two studies involving a total of 152 users and four application programs. The measures were refined and stream-lined, resulting in two six-item scales with reliabilities of.98 for usefulness and.94 for ease of use. The scales exhibited high convergent, discriminant, and factorial validity. Perceived usefulness was significantly correlated with both self-reported current usage (r=.63, Study 1) and self-predicted future usage (r=.85, Study 2). Perceived ease of use was also significantly correlated with current usage (r=.45, Study 1) and future usage (r=.59, Study 2). In both studies, usefulness had a significantly greater correlation with usage behavior than did ease of use. Regression analyses suggest that perceived ease of use may actually be a causal antecedent to perceived usefulness, as opposed to a parallel, direct determinant of system usage. Implications are drawn for future research on user acceptance.","container-title":"MIS Quarterly","DOI":"10.2307/249008","ISSN":"0276-7783","issue":"3","page":"319-340","publisher":"Management Information Systems Research Center, University of Minnesota","source":"JSTOR","title":"Perceived Usefulness, Perceived Ease of Use, and User Acceptance of Information Technology","volume":"13","author":[{"family":"Davis","given":"Fred D."}],"issued":{"date-parts":[["1989"]]}}}],"schema":"https://github.com/citation-style-language/schema/raw/master/csl-citation.json"} </w:instrText>
+      </w:r>
+      <w:r>
+        <w:rPr>
+          <w:lang w:val="en-FR"/>
+        </w:rPr>
+        <w:fldChar w:fldCharType="separate"/>
+      </w:r>
+      <w:r>
+        <w:rPr>
+          <w:noProof/>
+          <w:lang w:val="en-FR"/>
+        </w:rPr>
+        <w:t>Davis (1989)</w:t>
+      </w:r>
+      <w:r>
+        <w:rPr>
+          <w:lang w:val="en-FR"/>
+        </w:rPr>
+        <w:fldChar w:fldCharType="end"/>
+      </w:r>
+      <w:r>
+        <w:rPr>
+          <w:lang w:val="en-FR"/>
+        </w:rPr>
+        <w:t xml:space="preserve"> </w:t>
+      </w:r>
+      <w:r>
+        <w:rPr>
+          <w:lang w:val="en-FR"/>
+        </w:rPr>
+        <w:t>indique qu'il y a deux variables principales déterminantes qui influencent l'acceptation technologique</w:t>
+      </w:r>
+      <w:r>
+        <w:rPr>
+          <w:lang w:val="en-FR"/>
+        </w:rPr>
+        <w:t xml:space="preserve"> : </w:t>
+      </w:r>
+      <w:r>
+        <w:rPr>
+          <w:lang w:val="en-FR"/>
+        </w:rPr>
+        <w:t>c'est la perception de l'utilité et la facilité d'utilisation</w:t>
+      </w:r>
+      <w:r>
+        <w:rPr>
+          <w:lang w:val="en-FR"/>
+        </w:rPr>
+        <w:t xml:space="preserve"> « Perceived </w:t>
+      </w:r>
+      <w:r>
+        <w:rPr>
+          <w:lang w:val="en-FR"/>
+        </w:rPr>
+        <w:t>usefulness</w:t>
+      </w:r>
+      <w:r>
+        <w:rPr>
+          <w:lang w:val="en-FR"/>
+        </w:rPr>
+        <w:t xml:space="preserve"> »</w:t>
+      </w:r>
+      <w:r>
+        <w:rPr>
+          <w:lang w:val="en-FR"/>
+        </w:rPr>
+        <w:t>. Par utilité perçue, nous entendons dans ce cas, la perception de l'enseignant sur la capacité de l'outil à aider à améliorer son efficacité et à soulager ses tâches. La facilité d'utilisation est le niveau à laquelle l'enseignant trouve cet outil facile à utiliser</w:t>
+      </w:r>
+      <w:r>
+        <w:rPr>
+          <w:lang w:val="en-FR"/>
+        </w:rPr>
+        <w:t xml:space="preserve"> « Perceived ease of use »</w:t>
+      </w:r>
+      <w:r>
+        <w:rPr>
+          <w:lang w:val="en-FR"/>
+        </w:rPr>
+        <w:t>.</w:t>
+      </w:r>
+    </w:p>
+    <w:p>
+      <w:pPr>
+        <w:rPr>
+          <w:lang w:val="en-FR"/>
+        </w:rPr>
+      </w:pPr>
+    </w:p>
+    <w:p>
+      <w:pPr>
+        <w:rPr>
+          <w:lang w:val="en-FR"/>
+        </w:rPr>
+      </w:pPr>
+      <w:r>
+        <w:rPr>
+          <w:lang w:val="en-FR"/>
+        </w:rPr>
+        <w:fldChar w:fldCharType="begin"/>
+      </w:r>
+      <w:r>
+        <w:rPr>
+          <w:lang w:val="en-FR"/>
+        </w:rPr>
+        <w:instrText xml:space="preserve"> ADDIN ZOTERO_ITEM CSL_CITATION {"citationID":"7cuADtxf","properties":{"unsorted":false,"formattedCitation":"(Rogers, 2003)","plainCitation":"(Rogers, 2003)","dontUpdate":true,"noteIndex":0},"citationItems":[{"id":249,"uris":["http://zotero.org/users/18489330/items/L5NPF4LT"],"itemData":{"id":249,"type":"book","abstract":"Now in its fifth edition, Diffusion of Innovations is a classic work on the spread of new ideas.In this renowned book, Everett M. Rogers, professor and chair of the Department of Communication &amp; Journalism at the University of New Mexico, explains how new ideas spread via communication channels over time. Such innovations are initially perceived as uncertain and even risky. To overcome this uncertainty, most people seek out others like themselves who have already adopted the new idea. Thus the diffusion process consists of a few individuals who first adopt an innovation, then spread the word among their circle of acquaintances—a process which typically takes months or years. But there are exceptions: use of the Internet in the 1990s, for example, may have spread more rapidly than any other innovation in the history of humankind. Furthermore, the Internet is changing the very nature of diffusion by decreasing the importance of physical distance between people. The fifth edition addresses the spread of the Internet, and how it has transformed the way human beings communicate and adopt new ideas.","ISBN":"978-0-7432-5823-4","language":"en","note":"Google-Books-ID: 9U1K5LjUOwEC","number-of-pages":"577","publisher":"Simon and Schuster","source":"Google Books","title":"Diffusion of Innovations, 5th Edition","author":[{"family":"Rogers","given":"Everett M."}],"issued":{"date-parts":[["2003",8,16]]}}}],"schema":"https://github.com/citation-style-language/schema/raw/master/csl-citation.json"} </w:instrText>
+      </w:r>
+      <w:r>
+        <w:rPr>
+          <w:lang w:val="en-FR"/>
+        </w:rPr>
+        <w:fldChar w:fldCharType="separate"/>
+      </w:r>
+      <w:r>
+        <w:rPr>
+          <w:noProof/>
+          <w:lang w:val="en-FR"/>
+        </w:rPr>
+        <w:t>Rogers (2003)</w:t>
+      </w:r>
+      <w:r>
+        <w:rPr>
+          <w:lang w:val="en-FR"/>
+        </w:rPr>
+        <w:fldChar w:fldCharType="end"/>
+      </w:r>
+      <w:r>
+        <w:rPr>
+          <w:lang w:val="en-FR"/>
+        </w:rPr>
+        <w:t xml:space="preserve"> </w:t>
+      </w:r>
+      <w:r>
+        <w:rPr>
+          <w:lang w:val="en-FR"/>
+        </w:rPr>
+        <w:t>montre</w:t>
+      </w:r>
+      <w:r>
+        <w:rPr>
+          <w:lang w:val="en-FR"/>
+        </w:rPr>
+        <w:t xml:space="preserve"> une autre approche avec la théorie sur la Diffusion des Innovations. </w:t>
+      </w:r>
+      <w:r>
+        <w:rPr>
+          <w:lang w:val="en-FR"/>
+        </w:rPr>
+        <w:t>Il</w:t>
+      </w:r>
+      <w:r>
+        <w:rPr>
+          <w:lang w:val="en-FR"/>
+        </w:rPr>
+        <w:t xml:space="preserve"> note cinq caractéristiques qui ont un impact sur l'adoption : l'avantage relatif, la compatibilité, la complexité, l'essaie possible et observabilité des résultats. Un professeur </w:t>
+      </w:r>
+      <w:r>
+        <w:rPr>
+          <w:lang w:val="en-FR"/>
+        </w:rPr>
+        <w:t>devrais</w:t>
+      </w:r>
+      <w:r>
+        <w:rPr>
+          <w:lang w:val="en-FR"/>
+        </w:rPr>
+        <w:t xml:space="preserve"> juger l'importance relative de gain de temps dans la préparation de cours offerts par l'IA générative par rapport à ses propres méthodes, et s'il s'agit de technologie qui est compatible avec la programmation française prescrite et personnelle philosophie pédagogique </w:t>
+      </w:r>
+      <w:r>
+        <w:rPr>
+          <w:lang w:val="en-FR"/>
+        </w:rPr>
+        <w:fldChar w:fldCharType="begin"/>
+      </w:r>
+      <w:r>
+        <w:rPr>
+          <w:lang w:val="en-FR"/>
+        </w:rPr>
+        <w:instrText xml:space="preserve"> ADDIN ZOTERO_ITEM CSL_CITATION {"citationID":"bg3rqsyA","properties":{"unsorted":false,"formattedCitation":"(Rogers, 2003)","plainCitation":"(Rogers, 2003)","noteIndex":0},"citationItems":[{"id":249,"uris":["http://zotero.org/users/18489330/items/L5NPF4LT"],"itemData":{"id":249,"type":"book","abstract":"Now in its fifth edition, Diffusion of Innovations is a classic work on the spread of new ideas.In this renowned book, Everett M. Rogers, professor and chair of the Department of Communication &amp; Journalism at the University of New Mexico, explains how new ideas spread via communication channels over time. Such innovations are initially perceived as uncertain and even risky. To overcome this uncertainty, most people seek out others like themselves who have already adopted the new idea. Thus the diffusion process consists of a few individuals who first adopt an innovation, then spread the word among their circle of acquaintances—a process which typically takes months or years. But there are exceptions: use of the Internet in the 1990s, for example, may have spread more rapidly than any other innovation in the history of humankind. Furthermore, the Internet is changing the very nature of diffusion by decreasing the importance of physical distance between people. The fifth edition addresses the spread of the Internet, and how it has transformed the way human beings communicate and adopt new ideas.","ISBN":"978-0-7432-5823-4","language":"en","note":"Google-Books-ID: 9U1K5LjUOwEC","number-of-pages":"577","publisher":"Simon and Schuster","source":"Google Books","title":"Diffusion of Innovations, 5th Edition","author":[{"family":"Rogers","given":"Everett M."}],"issued":{"date-parts":[["2003",8,16]]}}}],"schema":"https://github.com/citation-style-language/schema/raw/master/csl-citation.json"} </w:instrText>
+      </w:r>
+      <w:r>
+        <w:rPr>
+          <w:lang w:val="en-FR"/>
+        </w:rPr>
+        <w:fldChar w:fldCharType="separate"/>
+      </w:r>
+      <w:r>
+        <w:rPr>
+          <w:noProof/>
+          <w:lang w:val="en-FR"/>
+        </w:rPr>
+        <w:t>(Rogers, 2003)</w:t>
+      </w:r>
+      <w:r>
+        <w:rPr>
+          <w:lang w:val="en-FR"/>
+        </w:rPr>
+        <w:fldChar w:fldCharType="end"/>
+      </w:r>
+      <w:r>
+        <w:rPr>
+          <w:lang w:val="en-FR"/>
+        </w:rPr>
+        <w:t>.</w:t>
+      </w:r>
+    </w:p>
+    <w:p>
+      <w:pPr>
+        <w:rPr>
+          <w:lang w:val="en-FR"/>
+        </w:rPr>
+      </w:pPr>
+    </w:p>
+    <w:p>
+      <w:pPr>
+        <w:rPr>
+          <w:lang w:val="en-FR"/>
+        </w:rPr>
+      </w:pPr>
+      <w:r>
+        <w:rPr>
+          <w:lang w:val="en-FR"/>
+        </w:rPr>
+        <w:fldChar w:fldCharType="begin"/>
+      </w:r>
+      <w:r>
+        <w:rPr>
+          <w:lang w:val="en-FR"/>
+        </w:rPr>
+        <w:instrText xml:space="preserve"> ADDIN ZOTERO_ITEM CSL_CITATION {"citationID":"KiLKTC9D","properties":{"unsorted":false,"formattedCitation":"(Straub, 2009)","plainCitation":"(Straub, 2009)","dontUpdate":true,"noteIndex":0},"citationItems":[{"id":260,"uris":["http://zotero.org/users/18489330/items/YZ5WA6LS"],"itemData":{"id":260,"type":"webpage","DOI":"10.3102/0034654308325896","language":"en","note":"DOI: 10.3102/0034654308325896","title":"Understanding Technology Adoption: Theory and Future Directions for Informal Learning","title-short":"Understanding Technology Adoption","URL":"https://journals.sagepub.com/doi/epub/10.3102/0034654308325896","author":[{"family":"Straub","given":"Evan T."}],"accessed":{"date-parts":[["2026",6,6]]},"issued":{"date-parts":[["2009"]]}}}],"schema":"https://github.com/citation-style-language/schema/raw/master/csl-citation.json"} </w:instrText>
+      </w:r>
+      <w:r>
+        <w:rPr>
+          <w:lang w:val="en-FR"/>
+        </w:rPr>
+        <w:fldChar w:fldCharType="separate"/>
+      </w:r>
+      <w:r>
+        <w:rPr>
+          <w:noProof/>
+          <w:lang w:val="en-FR"/>
+        </w:rPr>
+        <w:t>Straub (2009)</w:t>
+      </w:r>
+      <w:r>
+        <w:rPr>
+          <w:lang w:val="en-FR"/>
+        </w:rPr>
+        <w:fldChar w:fldCharType="end"/>
+      </w:r>
+      <w:r>
+        <w:rPr>
+          <w:lang w:val="en-FR"/>
+        </w:rPr>
+        <w:t xml:space="preserve"> </w:t>
+      </w:r>
+      <w:r>
+        <w:rPr>
+          <w:lang w:val="en-FR"/>
+        </w:rPr>
+        <w:t>offre une analyse de ces cadres et affirme qu'une adoption technologique est plus compliquée qu'un simple choix linéaire. L'adoption implique une connaissance globale de l'environnement utilisateur : ses besoins, compétences et exigences institutionnelles. Pour un professeur, ces cadres aident à analyser l'évolution de la simple curiosité face aux technologies basées sur IA générative dans une approche complète et professionnelle de leur utilisation.</w:t>
+      </w:r>
+    </w:p>
+    <w:p>
+      <w:pPr>
+        <w:rPr>
+          <w:lang w:val="en-FR"/>
+        </w:rPr>
+      </w:pPr>
+    </w:p>
+    <w:p>
+      <w:pPr>
+        <w:rPr>
+          <w:lang w:val="en-FR"/>
+        </w:rPr>
+      </w:pPr>
+      <w:r>
+        <w:rPr>
+          <w:lang w:val="en-FR"/>
+        </w:rPr>
+        <w:t xml:space="preserve">Ces approches mettent en lumière la pertinence de la perçus </w:t>
+      </w:r>
+      <w:r>
+        <w:rPr>
+          <w:lang w:val="en-FR"/>
+        </w:rPr>
+        <w:t xml:space="preserve">« </w:t>
+      </w:r>
+      <w:r>
+        <w:rPr>
+          <w:lang w:val="en-FR"/>
+        </w:rPr>
+        <w:t>usefulness</w:t>
+      </w:r>
+      <w:r>
+        <w:rPr>
+          <w:lang w:val="en-FR"/>
+        </w:rPr>
+        <w:t xml:space="preserve"> » </w:t>
+      </w:r>
+      <w:r>
+        <w:rPr>
+          <w:lang w:val="en-FR"/>
+        </w:rPr>
+        <w:t xml:space="preserve">ainsi que la compatibilité. Toutefois, dans le contexte réel, </w:t>
+      </w:r>
+      <w:r>
+        <w:rPr>
+          <w:lang w:val="en-FR"/>
+        </w:rPr>
+        <w:t>une grande majorité</w:t>
+      </w:r>
+      <w:r>
+        <w:rPr>
+          <w:lang w:val="en-FR"/>
+        </w:rPr>
+        <w:t xml:space="preserve"> d’enseignants se montrent réticents à utiliser l’IA générative au vu de ses avantages malgré tout possibles. Il suffit de rappeler que ces approches ne prennent pas en compte tous les défis auxquels sont confrontés les enseignants.</w:t>
+      </w:r>
+    </w:p>
+    <w:p>
+      <w:pPr>
+        <w:rPr>
+          <w:lang w:val="en-FR"/>
+        </w:rPr>
+      </w:pPr>
+    </w:p>
+    <w:p>
+      <w:pPr>
+        <w:pStyle w:val="Heading3"/>
+      </w:pPr>
+      <w:bookmarkStart w:id="24" w:name="_Toc232455115"/>
+      <w:r>
+        <w:t>Barrières et facteurs influençant l'adoption</w:t>
+      </w:r>
+      <w:bookmarkEnd w:id="24"/>
+      <w:r>
+        <w:br/>
+      </w:r>
+    </w:p>
+    <w:p>
+      <w:r>
+        <w:t xml:space="preserve">Bien que plusieurs facteurs facilitant expliquent pourquoi cette formation peut être acceptée dans ce contexte, ils ne résolvent pas la question de savoir quelles sont les difficultés que ces enseignants ont. Effectivement, ces derniers sont confrontés à des obstacles qui empêchent et </w:t>
+      </w:r>
+      <w:r>
+        <w:lastRenderedPageBreak/>
+        <w:t>limitent l'utilisation de ce modèle malgré son adaptabilité. Selon</w:t>
+      </w:r>
+      <w:r>
+        <w:fldChar w:fldCharType="begin"/>
+      </w:r>
+      <w:r>
+        <w:instrText xml:space="preserve"> ADDIN ZOTERO_ITEM CSL_CITATION {"citationID":"lyLA4LZA","properties":{"unsorted":false,"formattedCitation":"(Ertmer, 1999)","plainCitation":"(Ertmer, 1999)","dontUpdate":true,"noteIndex":0},"citationItems":[{"id":251,"uris":["http://zotero.org/users/18489330/items/H327W8UN"],"itemData":{"id":251,"type":"article-journal","abstract":"Although teachers today recognize the importance of integrating technology into their curricula, efforts are often limited by both external (first-order) and internal (second-order) barriers. Traditionally, technology training, for both preservice and inservice teachers, has focused on helping teachers overcome first-order barriers (e.g., acquiring technical skills needed to operate a computer). More recently, training programs have incorporated pedagogical models of technology use as one means of addressing second-order barriers. However, little discussion has occurred that clarifies the relationship between these different types of barriers or that delineates effective strategies for addressing different barriers. If pre- and inservice teachers are to become effective users of technology, they will need practical strategies for dealing with the different types of barriers they will face. In this paper, I discuss the relationship between first- and second-order barriers and then describe specific strategies for circumventing, overcoming, and eliminating the changing barriers teachers face as they work to achieve technology integration.","container-title":"Educational Technology Research and Development","DOI":"10.1007/BF02299597","ISSN":"1556-6501","issue":"4","journalAbbreviation":"ETR&amp;D","language":"en","page":"47-61","source":"Springer Link","title":"Addressing first- and second-order barriers to change: Strategies for technology integration","title-short":"Addressing first- and second-order barriers to change","volume":"47","author":[{"family":"Ertmer","given":"Peggy A."}],"issued":{"date-parts":[["1999",12,1]]}}}],"schema":"https://github.com/citation-style-language/schema/raw/master/csl-citation.json"} </w:instrText>
+      </w:r>
+      <w:r>
+        <w:fldChar w:fldCharType="separate"/>
+      </w:r>
+      <w:r>
+        <w:rPr>
+          <w:noProof/>
+        </w:rPr>
+        <w:t xml:space="preserve"> Ertmer (1999)</w:t>
+      </w:r>
+      <w:r>
+        <w:fldChar w:fldCharType="end"/>
+      </w:r>
+      <w:r>
+        <w:t>, il existe deux sortes d'obstacles ; le premier est externe et concerne la personne qui est touchée tandis que le second est interne à la personne.</w:t>
+      </w:r>
+    </w:p>
     <w:p/>
+    <w:p>
+      <w:r>
+        <w:t>Il s'agit d'obstacles à l'égard desquels l'enseignant n'a rien du tout à faire étant donné qu'ils proviennent de l'extérieur et qu'ils sont imposés de façon irréductible. Nous trouvons notamment le manque de temps pour une formation, le manque de matériel adapté, la difficulté relative à la charge de travail de programmation et d'orientation institutionnelle. Cela est une grande difficulté surtout pour les enseignants de langues vivantes puisque leur charge de travail est déjà élevée.</w:t>
+      </w:r>
+    </w:p>
     <w:p/>
     <w:p>
-      <w:pPr>
-        <w:pStyle w:val="Heading3"/>
-        <w:rPr>
-          <w:lang w:val="en-FR"/>
-        </w:rPr>
-      </w:pPr>
-      <w:r>
-        <w:rPr>
-          <w:lang w:val="en-FR"/>
-        </w:rPr>
-        <w:t xml:space="preserve"> </w:t>
-      </w:r>
-      <w:bookmarkStart w:id="23" w:name="_Toc232455114"/>
-      <w:r>
-        <w:rPr>
-          <w:lang w:val="en-FR"/>
-        </w:rPr>
-        <w:t>Modèles théoriques de l'adoption technologique</w:t>
-      </w:r>
-      <w:bookmarkEnd w:id="23"/>
-      <w:r>
-        <w:rPr>
-          <w:lang w:val="en-FR"/>
-        </w:rPr>
-        <w:br/>
-      </w:r>
-    </w:p>
-    <w:p>
-      <w:pPr>
-        <w:rPr>
-          <w:lang w:val="en-FR"/>
-        </w:rPr>
-      </w:pPr>
-      <w:r>
-        <w:rPr>
-          <w:lang w:val="en-FR"/>
-        </w:rPr>
-        <w:t xml:space="preserve">Il existe plusieurs cadres théoriques qui expliquent les raisons et les moyens par lesquels les enseignants choisissent d'adopter ou de rejeter des technologies données. Ce sont des outils de pensée qui servent à analyser divers déterminants psychologiques, techniques et </w:t>
-      </w:r>
-      <w:r>
-        <w:rPr>
-          <w:lang w:val="en-FR"/>
-        </w:rPr>
-        <w:lastRenderedPageBreak/>
-        <w:t>environnementaux qui influencent la prise de décision concernant une innovation</w:t>
-      </w:r>
-      <w:r>
-        <w:rPr>
-          <w:lang w:val="en-FR"/>
-        </w:rPr>
-        <w:t xml:space="preserve"> </w:t>
-      </w:r>
-      <w:r>
-        <w:rPr>
-          <w:lang w:val="en-FR"/>
-        </w:rPr>
+      <w:r>
+        <w:t>Les o</w:t>
+      </w:r>
+      <w:r>
+        <w:t xml:space="preserve">bstacles internes de deuxième niveau, font référence aux obstacles internes, qui sont principalement basés sur des aspects psychologiques, culturels et professionnels </w:t>
+      </w:r>
+      <w:r>
         <w:fldChar w:fldCharType="begin"/>
       </w:r>
       <w:r>
-        <w:rPr>
-          <w:lang w:val="en-FR"/>
-        </w:rPr>
-        <w:instrText xml:space="preserve"> ADDIN ZOTERO_ITEM CSL_CITATION {"citationID":"d0lqfl2q","properties":{"unsorted":false,"formattedCitation":"(Straub, 2009)","plainCitation":"(Straub, 2009)","noteIndex":0},"citationItems":[{"id":260,"uris":["http://zotero.org/users/18489330/items/YZ5WA6LS"],"itemData":{"id":260,"type":"webpage","DOI":"10.3102/0034654308325896","language":"en","note":"DOI: 10.3102/0034654308325896","title":"Understanding Technology Adoption: Theory and Future Directions for Informal Learning","title-short":"Understanding Technology Adoption","URL":"https://journals.sagepub.com/doi/epub/10.3102/0034654308325896","author":[{"family":"Straub","given":"Evan T."}],"accessed":{"date-parts":[["2026",6,6]]},"issued":{"date-parts":[["2009"]]}}}],"schema":"https://github.com/citation-style-language/schema/raw/master/csl-citation.json"} </w:instrText>
-      </w:r>
-      <w:r>
-        <w:rPr>
-          <w:lang w:val="en-FR"/>
-        </w:rPr>
+        <w:instrText xml:space="preserve"> ADDIN ZOTERO_ITEM CSL_CITATION {"citationID":"NZMVVaTm","properties":{"unsorted":false,"formattedCitation":"(Ertmer &amp; Ottenbreit-Leftwich, 2010)","plainCitation":"(Ertmer &amp; Ottenbreit-Leftwich, 2010)","noteIndex":0},"citationItems":[{"id":263,"uris":["http://zotero.org/users/18489330/items/MCM2VCA9"],"itemData":{"id":263,"type":"article-journal","abstract":"Despite increases in computer access and technology training, technology is not being used to support the kinds of instruction believed to be most powerful. In this paper, we examine technology integration through the lens of the teacher as an agent of change: What are the necessary characteristics, or qualities, that enable teachers to leverage technology resources as meaningful pedagogical tools? To answer this question, we discuss the literature related to four variables of teacher change: knowledge, self-efficacy, pedagogical beliefs, and subject and school culture. Specifically, we propose that teachers’ mindsets must change to include the idea that “teaching is not effective without the appropriate use of information and communication technologies (ICT) resources to facilitate student learning.” Implications are discussed in terms of both teacher education and professional development programs.","container-title":"Journal of Research on Technology in Education","DOI":"10.1080/15391523.2010.10782551","ISSN":"1539-1523","issue":"3","note":"_eprint: https://doi.org/10.1080/15391523.2010.10782551","page":"255-284","publisher":"Routledge","source":"Taylor and Francis+NEJM","title":"Teacher Technology Change: How Knowledge, Confidence, Beliefs, and Culture Intersect","title-short":"Teacher Technology Change","volume":"42","author":[{"family":"Ertmer","given":"Peggy A."},{"family":"Ottenbreit-Leftwich","given":"Anne T."}],"issued":{"date-parts":[["2010",3,1]]}}}],"schema":"https://github.com/citation-style-language/schema/raw/master/csl-citation.json"} </w:instrText>
+      </w:r>
+      <w:r>
         <w:fldChar w:fldCharType="separate"/>
       </w:r>
       <w:r>
         <w:rPr>
           <w:noProof/>
-          <w:lang w:val="en-FR"/>
-        </w:rPr>
-        <w:t>(Straub, 2009)</w:t>
-      </w:r>
-      <w:r>
-        <w:rPr>
-          <w:lang w:val="en-FR"/>
-        </w:rPr>
+        </w:rPr>
+        <w:t>(Ertmer &amp; Ottenbreit-Leftwich, 2010)</w:t>
+      </w:r>
+      <w:r>
         <w:fldChar w:fldCharType="end"/>
       </w:r>
       <w:r>
-        <w:rPr>
-          <w:lang w:val="en-FR"/>
-        </w:rPr>
-        <w:t>.</w:t>
-      </w:r>
-      <w:r>
-        <w:rPr>
-          <w:lang w:val="en-FR"/>
-        </w:rPr>
-        <w:br/>
-      </w:r>
-    </w:p>
-    <w:p>
-      <w:pPr>
-        <w:rPr>
-          <w:lang w:val="en-FR"/>
-        </w:rPr>
-      </w:pPr>
-      <w:r>
-        <w:rPr>
-          <w:lang w:val="en-FR"/>
-        </w:rPr>
-        <w:t xml:space="preserve">Le Modèle d'Acceptation Technologique (TAM) de </w:t>
-      </w:r>
-      <w:r>
-        <w:rPr>
-          <w:lang w:val="en-FR"/>
-        </w:rPr>
-        <w:fldChar w:fldCharType="begin"/>
-      </w:r>
-      <w:r>
-        <w:rPr>
-          <w:lang w:val="en-FR"/>
-        </w:rPr>
-        <w:instrText xml:space="preserve"> ADDIN ZOTERO_ITEM CSL_CITATION {"citationID":"t01EDYTV","properties":{"unsorted":false,"formattedCitation":"(Davis, 1989)","plainCitation":"(Davis, 1989)","dontUpdate":true,"noteIndex":0},"citationItems":[{"id":247,"uris":["http://zotero.org/users/18489330/items/2MWF9GXV"],"itemData":{"id":247,"type":"article-journal","abstract":"Valid measurement scales for predicting user acceptance of computers are in short supply. Most subjective measures used in practice are unvalidated, and their relationship to system usage is unknown. The present research develops and validates new scales for two specific variables, perceived usefulness and perceived ease of use, which are hypothesized to be fundamental determinants of user acceptance. Definitions for these two variables were used to develop scale items that were pretested for content validity and then tested for reliability and construct validity in two studies involving a total of 152 users and four application programs. The measures were refined and stream-lined, resulting in two six-item scales with reliabilities of.98 for usefulness and.94 for ease of use. The scales exhibited high convergent, discriminant, and factorial validity. Perceived usefulness was significantly correlated with both self-reported current usage (r=.63, Study 1) and self-predicted future usage (r=.85, Study 2). Perceived ease of use was also significantly correlated with current usage (r=.45, Study 1) and future usage (r=.59, Study 2). In both studies, usefulness had a significantly greater correlation with usage behavior than did ease of use. Regression analyses suggest that perceived ease of use may actually be a causal antecedent to perceived usefulness, as opposed to a parallel, direct determinant of system usage. Implications are drawn for future research on user acceptance.","container-title":"MIS Quarterly","DOI":"10.2307/249008","ISSN":"0276-7783","issue":"3","page":"319-340","publisher":"Management Information Systems Research Center, University of Minnesota","source":"JSTOR","title":"Perceived Usefulness, Perceived Ease of Use, and User Acceptance of Information Technology","volume":"13","author":[{"family":"Davis","given":"Fred D."}],"issued":{"date-parts":[["1989"]]}}}],"schema":"https://github.com/citation-style-language/schema/raw/master/csl-citation.json"} </w:instrText>
-      </w:r>
-      <w:r>
-        <w:rPr>
-          <w:lang w:val="en-FR"/>
-        </w:rPr>
-        <w:fldChar w:fldCharType="separate"/>
-      </w:r>
-      <w:r>
-        <w:rPr>
-          <w:noProof/>
-          <w:lang w:val="en-FR"/>
-        </w:rPr>
-        <w:t>Davis (1989)</w:t>
-      </w:r>
-      <w:r>
-        <w:rPr>
-          <w:lang w:val="en-FR"/>
-        </w:rPr>
-        <w:fldChar w:fldCharType="end"/>
-      </w:r>
-      <w:r>
-        <w:rPr>
-          <w:lang w:val="en-FR"/>
-        </w:rPr>
-        <w:t xml:space="preserve"> </w:t>
-      </w:r>
-      <w:r>
-        <w:rPr>
-          <w:lang w:val="en-FR"/>
-        </w:rPr>
-        <w:t>indique qu'il y a deux variables principales déterminantes qui influencent l'acceptation technologique</w:t>
-      </w:r>
-      <w:r>
-        <w:rPr>
-          <w:lang w:val="en-FR"/>
-        </w:rPr>
-        <w:t xml:space="preserve"> : </w:t>
-      </w:r>
-      <w:r>
-        <w:rPr>
-          <w:lang w:val="en-FR"/>
-        </w:rPr>
-        <w:t>c'est la perception de l'utilité et la facilité d'utilisation</w:t>
-      </w:r>
-      <w:r>
-        <w:rPr>
-          <w:lang w:val="en-FR"/>
-        </w:rPr>
-        <w:t xml:space="preserve"> « Perceived </w:t>
-      </w:r>
-      <w:r>
-        <w:rPr>
-          <w:lang w:val="en-FR"/>
-        </w:rPr>
-        <w:t>usefulness</w:t>
-      </w:r>
-      <w:r>
-        <w:rPr>
-          <w:lang w:val="en-FR"/>
-        </w:rPr>
-        <w:t xml:space="preserve"> »</w:t>
-      </w:r>
-      <w:r>
-        <w:rPr>
-          <w:lang w:val="en-FR"/>
-        </w:rPr>
-        <w:t>. Par utilité perçue, nous entendons dans ce cas, la perception de l'enseignant sur la capacité de l'outil à aider à améliorer son efficacité et à soulager ses tâches. La facilité d'utilisation est le niveau à laquelle l'enseignant trouve cet outil facile à utiliser</w:t>
-      </w:r>
-      <w:r>
-        <w:rPr>
-          <w:lang w:val="en-FR"/>
-        </w:rPr>
-        <w:t xml:space="preserve"> « Perceived ease of use »</w:t>
-      </w:r>
-      <w:r>
-        <w:rPr>
-          <w:lang w:val="en-FR"/>
-        </w:rPr>
-        <w:t>.</w:t>
-      </w:r>
-    </w:p>
-    <w:p>
-      <w:pPr>
-        <w:rPr>
-          <w:lang w:val="en-FR"/>
-        </w:rPr>
-      </w:pPr>
-    </w:p>
-    <w:p>
-      <w:pPr>
-        <w:rPr>
-          <w:lang w:val="en-FR"/>
-        </w:rPr>
-      </w:pPr>
-      <w:r>
-        <w:rPr>
-          <w:lang w:val="en-FR"/>
-        </w:rPr>
-        <w:fldChar w:fldCharType="begin"/>
-      </w:r>
-      <w:r>
-        <w:rPr>
-          <w:lang w:val="en-FR"/>
-        </w:rPr>
-        <w:instrText xml:space="preserve"> ADDIN ZOTERO_ITEM CSL_CITATION {"citationID":"7cuADtxf","properties":{"unsorted":false,"formattedCitation":"(Rogers, 2003)","plainCitation":"(Rogers, 2003)","dontUpdate":true,"noteIndex":0},"citationItems":[{"id":249,"uris":["http://zotero.org/users/18489330/items/L5NPF4LT"],"itemData":{"id":249,"type":"book","abstract":"Now in its fifth edition, Diffusion of Innovations is a classic work on the spread of new ideas.In this renowned book, Everett M. Rogers, professor and chair of the Department of Communication &amp; Journalism at the University of New Mexico, explains how new ideas spread via communication channels over time. Such innovations are initially perceived as uncertain and even risky. To overcome this uncertainty, most people seek out others like themselves who have already adopted the new idea. Thus the diffusion process consists of a few individuals who first adopt an innovation, then spread the word among their circle of acquaintances—a process which typically takes months or years. But there are exceptions: use of the Internet in the 1990s, for example, may have spread more rapidly than any other innovation in the history of humankind. Furthermore, the Internet is changing the very nature of diffusion by decreasing the importance of physical distance between people. The fifth edition addresses the spread of the Internet, and how it has transformed the way human beings communicate and adopt new ideas.","ISBN":"978-0-7432-5823-4","language":"en","note":"Google-Books-ID: 9U1K5LjUOwEC","number-of-pages":"577","publisher":"Simon and Schuster","source":"Google Books","title":"Diffusion of Innovations, 5th Edition","author":[{"family":"Rogers","given":"Everett M."}],"issued":{"date-parts":[["2003",8,16]]}}}],"schema":"https://github.com/citation-style-language/schema/raw/master/csl-citation.json"} </w:instrText>
-      </w:r>
-      <w:r>
-        <w:rPr>
-          <w:lang w:val="en-FR"/>
-        </w:rPr>
-        <w:fldChar w:fldCharType="separate"/>
-      </w:r>
-      <w:r>
-        <w:rPr>
-          <w:noProof/>
-          <w:lang w:val="en-FR"/>
-        </w:rPr>
-        <w:t>Rogers (2003)</w:t>
-      </w:r>
-      <w:r>
-        <w:rPr>
-          <w:lang w:val="en-FR"/>
-        </w:rPr>
-        <w:fldChar w:fldCharType="end"/>
-      </w:r>
-      <w:r>
-        <w:rPr>
-          <w:lang w:val="en-FR"/>
-        </w:rPr>
-        <w:t xml:space="preserve"> </w:t>
-      </w:r>
-      <w:r>
-        <w:rPr>
-          <w:lang w:val="en-FR"/>
-        </w:rPr>
-        <w:t>montre</w:t>
-      </w:r>
-      <w:r>
-        <w:rPr>
-          <w:lang w:val="en-FR"/>
-        </w:rPr>
-        <w:t xml:space="preserve"> une autre approche avec la théorie sur la Diffusion des Innovations. </w:t>
-      </w:r>
-      <w:r>
-        <w:rPr>
-          <w:lang w:val="en-FR"/>
-        </w:rPr>
-        <w:t>Il</w:t>
-      </w:r>
-      <w:r>
-        <w:rPr>
-          <w:lang w:val="en-FR"/>
-        </w:rPr>
-        <w:t xml:space="preserve"> note cinq caractéristiques qui ont un impact sur l'adoption : l'avantage relatif, la compatibilité, la complexité, l'essaie possible et observabilité des résultats. Un professeur </w:t>
-      </w:r>
-      <w:r>
-        <w:rPr>
-          <w:lang w:val="en-FR"/>
-        </w:rPr>
-        <w:t>devrais</w:t>
-      </w:r>
-      <w:r>
-        <w:rPr>
-          <w:lang w:val="en-FR"/>
-        </w:rPr>
-        <w:t xml:space="preserve"> juger l'importance relative de gain de temps dans la préparation de cours offerts par l'IA générative par rapport à ses propres méthodes, et s'il s'agit de technologie qui est compatible avec la programmation française prescrite et personnelle philosophie pédagogique </w:t>
-      </w:r>
-      <w:r>
-        <w:rPr>
-          <w:lang w:val="en-FR"/>
-        </w:rPr>
-        <w:fldChar w:fldCharType="begin"/>
-      </w:r>
-      <w:r>
-        <w:rPr>
-          <w:lang w:val="en-FR"/>
-        </w:rPr>
-        <w:instrText xml:space="preserve"> ADDIN ZOTERO_ITEM CSL_CITATION {"citationID":"bg3rqsyA","properties":{"unsorted":false,"formattedCitation":"(Rogers, 2003)","plainCitation":"(Rogers, 2003)","noteIndex":0},"citationItems":[{"id":249,"uris":["http://zotero.org/users/18489330/items/L5NPF4LT"],"itemData":{"id":249,"type":"book","abstract":"Now in its fifth edition, Diffusion of Innovations is a classic work on the spread of new ideas.In this renowned book, Everett M. Rogers, professor and chair of the Department of Communication &amp; Journalism at the University of New Mexico, explains how new ideas spread via communication channels over time. Such innovations are initially perceived as uncertain and even risky. To overcome this uncertainty, most people seek out others like themselves who have already adopted the new idea. Thus the diffusion process consists of a few individuals who first adopt an innovation, then spread the word among their circle of acquaintances—a process which typically takes months or years. But there are exceptions: use of the Internet in the 1990s, for example, may have spread more rapidly than any other innovation in the history of humankind. Furthermore, the Internet is changing the very nature of diffusion by decreasing the importance of physical distance between people. The fifth edition addresses the spread of the Internet, and how it has transformed the way human beings communicate and adopt new ideas.","ISBN":"978-0-7432-5823-4","language":"en","note":"Google-Books-ID: 9U1K5LjUOwEC","number-of-pages":"577","publisher":"Simon and Schuster","source":"Google Books","title":"Diffusion of Innovations, 5th Edition","author":[{"family":"Rogers","given":"Everett M."}],"issued":{"date-parts":[["2003",8,16]]}}}],"schema":"https://github.com/citation-style-language/schema/raw/master/csl-citation.json"} </w:instrText>
-      </w:r>
-      <w:r>
-        <w:rPr>
-          <w:lang w:val="en-FR"/>
-        </w:rPr>
-        <w:fldChar w:fldCharType="separate"/>
-      </w:r>
-      <w:r>
-        <w:rPr>
-          <w:noProof/>
-          <w:lang w:val="en-FR"/>
-        </w:rPr>
-        <w:t>(Rogers, 2003)</w:t>
-      </w:r>
-      <w:r>
-        <w:rPr>
-          <w:lang w:val="en-FR"/>
-        </w:rPr>
-        <w:fldChar w:fldCharType="end"/>
-      </w:r>
-      <w:r>
-        <w:rPr>
-          <w:lang w:val="en-FR"/>
-        </w:rPr>
-        <w:t>.</w:t>
-      </w:r>
-    </w:p>
-    <w:p>
-      <w:pPr>
-        <w:rPr>
-          <w:lang w:val="en-FR"/>
-        </w:rPr>
-      </w:pPr>
-    </w:p>
-    <w:p>
-      <w:pPr>
-        <w:rPr>
-          <w:lang w:val="en-FR"/>
-        </w:rPr>
-      </w:pPr>
-      <w:r>
-        <w:rPr>
-          <w:lang w:val="en-FR"/>
-        </w:rPr>
-        <w:fldChar w:fldCharType="begin"/>
-      </w:r>
-      <w:r>
-        <w:rPr>
-          <w:lang w:val="en-FR"/>
-        </w:rPr>
-        <w:instrText xml:space="preserve"> ADDIN ZOTERO_ITEM CSL_CITATION {"citationID":"KiLKTC9D","properties":{"unsorted":false,"formattedCitation":"(Straub, 2009)","plainCitation":"(Straub, 2009)","dontUpdate":true,"noteIndex":0},"citationItems":[{"id":260,"uris":["http://zotero.org/users/18489330/items/YZ5WA6LS"],"itemData":{"id":260,"type":"webpage","DOI":"10.3102/0034654308325896","language":"en","note":"DOI: 10.3102/0034654308325896","title":"Understanding Technology Adoption: Theory and Future Directions for Informal Learning","title-short":"Understanding Technology Adoption","URL":"https://journals.sagepub.com/doi/epub/10.3102/0034654308325896","author":[{"family":"Straub","given":"Evan T."}],"accessed":{"date-parts":[["2026",6,6]]},"issued":{"date-parts":[["2009"]]}}}],"schema":"https://github.com/citation-style-language/schema/raw/master/csl-citation.json"} </w:instrText>
-      </w:r>
-      <w:r>
-        <w:rPr>
-          <w:lang w:val="en-FR"/>
-        </w:rPr>
-        <w:fldChar w:fldCharType="separate"/>
-      </w:r>
-      <w:r>
-        <w:rPr>
-          <w:noProof/>
-          <w:lang w:val="en-FR"/>
-        </w:rPr>
-        <w:t>Straub (2009)</w:t>
-      </w:r>
-      <w:r>
-        <w:rPr>
-          <w:lang w:val="en-FR"/>
-        </w:rPr>
-        <w:fldChar w:fldCharType="end"/>
-      </w:r>
-      <w:r>
-        <w:rPr>
-          <w:lang w:val="en-FR"/>
-        </w:rPr>
-        <w:t xml:space="preserve"> </w:t>
-      </w:r>
-      <w:r>
-        <w:rPr>
-          <w:lang w:val="en-FR"/>
-        </w:rPr>
-        <w:t>offre une analyse de ces cadres et affirme qu'une adoption technologique est plus compliquée qu'un simple choix linéaire. L'adoption implique une connaissance globale de l'environnement utilisateur : ses besoins, compétences et exigences institutionnelles. Pour un professeur, ces cadres aident à analyser l'évolution de la simple curiosité face aux technologies basées sur IA générative dans une approche complète et professionnelle de leur utilisation.</w:t>
-      </w:r>
-    </w:p>
-    <w:p>
-      <w:pPr>
-        <w:rPr>
-          <w:lang w:val="en-FR"/>
-        </w:rPr>
-      </w:pPr>
-    </w:p>
-    <w:p>
-      <w:pPr>
-        <w:rPr>
-          <w:lang w:val="en-FR"/>
-        </w:rPr>
-      </w:pPr>
-      <w:r>
-        <w:rPr>
-          <w:lang w:val="en-FR"/>
-        </w:rPr>
-        <w:t xml:space="preserve">Ces approches mettent en lumière la pertinence de la perçus </w:t>
-      </w:r>
-      <w:r>
-        <w:rPr>
-          <w:lang w:val="en-FR"/>
-        </w:rPr>
-        <w:t xml:space="preserve">« </w:t>
-      </w:r>
-      <w:r>
-        <w:rPr>
-          <w:lang w:val="en-FR"/>
-        </w:rPr>
-        <w:t>usefulness</w:t>
-      </w:r>
-      <w:r>
-        <w:rPr>
-          <w:lang w:val="en-FR"/>
-        </w:rPr>
-        <w:t xml:space="preserve"> » </w:t>
-      </w:r>
-      <w:r>
-        <w:rPr>
-          <w:lang w:val="en-FR"/>
-        </w:rPr>
-        <w:t xml:space="preserve">ainsi que la compatibilité. Toutefois, dans le contexte réel, </w:t>
-      </w:r>
-      <w:r>
-        <w:rPr>
-          <w:lang w:val="en-FR"/>
-        </w:rPr>
-        <w:t>une grande majorité</w:t>
-      </w:r>
-      <w:r>
-        <w:rPr>
-          <w:lang w:val="en-FR"/>
-        </w:rPr>
-        <w:t xml:space="preserve"> d’enseignants se montrent réticents à utiliser l’IA générative au vu de ses avantages malgré tout possibles. Il suffit de rappeler que ces approches ne prennent pas en compte tous les défis auxquels sont confrontés les enseignants.</w:t>
-      </w:r>
-    </w:p>
-    <w:p>
-      <w:pPr>
-        <w:rPr>
-          <w:lang w:val="en-FR"/>
-        </w:rPr>
-      </w:pPr>
-    </w:p>
-    <w:p>
-      <w:pPr>
-        <w:pStyle w:val="Heading3"/>
-      </w:pPr>
-      <w:bookmarkStart w:id="24" w:name="_Toc232455115"/>
-      <w:r>
-        <w:t>Barrières et facteurs influençant l'adoption</w:t>
-      </w:r>
-      <w:bookmarkEnd w:id="24"/>
-      <w:r>
-        <w:br/>
-      </w:r>
-    </w:p>
-    <w:p>
-      <w:r>
-        <w:t xml:space="preserve">Bien que plusieurs facteurs facilitant expliquent pourquoi cette formation peut être acceptée dans ce contexte, ils ne résolvent pas la question de savoir quelles sont les difficultés que ces </w:t>
-      </w:r>
-      <w:r>
-        <w:lastRenderedPageBreak/>
-        <w:t>enseignants ont. Effectivement, ces derniers sont confrontés à des obstacles qui empêchent et limitent l'utilisation de ce modèle malgré son adaptabilité. Selon</w:t>
-      </w:r>
-      <w:r>
-        <w:fldChar w:fldCharType="begin"/>
-      </w:r>
-      <w:r>
-        <w:instrText xml:space="preserve"> ADDIN ZOTERO_ITEM CSL_CITATION {"citationID":"lyLA4LZA","properties":{"unsorted":false,"formattedCitation":"(Ertmer, 1999)","plainCitation":"(Ertmer, 1999)","dontUpdate":true,"noteIndex":0},"citationItems":[{"id":251,"uris":["http://zotero.org/users/18489330/items/H327W8UN"],"itemData":{"id":251,"type":"article-journal","abstract":"Although teachers today recognize the importance of integrating technology into their curricula, efforts are often limited by both external (first-order) and internal (second-order) barriers. Traditionally, technology training, for both preservice and inservice teachers, has focused on helping teachers overcome first-order barriers (e.g., acquiring technical skills needed to operate a computer). More recently, training programs have incorporated pedagogical models of technology use as one means of addressing second-order barriers. However, little discussion has occurred that clarifies the relationship between these different types of barriers or that delineates effective strategies for addressing different barriers. If pre- and inservice teachers are to become effective users of technology, they will need practical strategies for dealing with the different types of barriers they will face. In this paper, I discuss the relationship between first- and second-order barriers and then describe specific strategies for circumventing, overcoming, and eliminating the changing barriers teachers face as they work to achieve technology integration.","container-title":"Educational Technology Research and Development","DOI":"10.1007/BF02299597","ISSN":"1556-6501","issue":"4","journalAbbreviation":"ETR&amp;D","language":"en","page":"47-61","source":"Springer Link","title":"Addressing first- and second-order barriers to change: Strategies for technology integration","title-short":"Addressing first- and second-order barriers to change","volume":"47","author":[{"family":"Ertmer","given":"Peggy A."}],"issued":{"date-parts":[["1999",12,1]]}}}],"schema":"https://github.com/citation-style-language/schema/raw/master/csl-citation.json"} </w:instrText>
-      </w:r>
-      <w:r>
-        <w:fldChar w:fldCharType="separate"/>
-      </w:r>
-      <w:r>
-        <w:rPr>
-          <w:noProof/>
-        </w:rPr>
-        <w:t xml:space="preserve"> Ertmer (1999)</w:t>
-      </w:r>
-      <w:r>
-        <w:fldChar w:fldCharType="end"/>
-      </w:r>
-      <w:r>
-        <w:t>, il existe deux sortes d'obstacles ; le premier est externe et concerne la personne qui est touchée tandis que le second est interne à la personne.</w:t>
-      </w:r>
-    </w:p>
-    <w:p/>
-    <w:p>
-      <w:r>
-        <w:t>Il s'agit d'obstacles à l'égard desquels l'enseignant n'a rien du tout à faire étant donné qu'ils proviennent de l'extérieur et qu'ils sont imposés de façon irréductible. Nous trouvons notamment le manque de temps pour une formation, le manque de matériel adapté, la difficulté relative à la charge de travail de programmation et d'orientation institutionnelle. Cela est une grande difficulté surtout pour les enseignants de langues vivantes puisque leur charge de travail est déjà élevée.</w:t>
-      </w:r>
-    </w:p>
-    <w:p/>
-    <w:p>
-      <w:r>
-        <w:t xml:space="preserve">Obstacles internes de deuxième niveau, font référence aux obstacles internes, qui sont principalement basés sur des aspects psychologiques, culturels et professionnels </w:t>
-      </w:r>
-      <w:r>
-        <w:fldChar w:fldCharType="begin"/>
-      </w:r>
-      <w:r>
-        <w:instrText xml:space="preserve"> ADDIN ZOTERO_ITEM CSL_CITATION {"citationID":"NZMVVaTm","properties":{"unsorted":false,"formattedCitation":"(Ertmer &amp; Ottenbreit-Leftwich, 2010)","plainCitation":"(Ertmer &amp; Ottenbreit-Leftwich, 2010)","noteIndex":0},"citationItems":[{"id":263,"uris":["http://zotero.org/users/18489330/items/MCM2VCA9"],"itemData":{"id":263,"type":"article-journal","abstract":"Despite increases in computer access and technology training, technology is not being used to support the kinds of instruction believed to be most powerful. In this paper, we examine technology integration through the lens of the teacher as an agent of change: What are the necessary characteristics, or qualities, that enable teachers to leverage technology resources as meaningful pedagogical tools? To answer this question, we discuss the literature related to four variables of teacher change: knowledge, self-efficacy, pedagogical beliefs, and subject and school culture. Specifically, we propose that teachers’ mindsets must change to include the idea that “teaching is not effective without the appropriate use of information and communication technologies (ICT) resources to facilitate student learning.” Implications are discussed in terms of both teacher education and professional development programs.","container-title":"Journal of Research on Technology in Education","DOI":"10.1080/15391523.2010.10782551","ISSN":"1539-1523","issue":"3","note":"_eprint: https://doi.org/10.1080/15391523.2010.10782551","page":"255-284","publisher":"Routledge","source":"Taylor and Francis+NEJM","title":"Teacher Technology Change: How Knowledge, Confidence, Beliefs, and Culture Intersect","title-short":"Teacher Technology Change","volume":"42","author":[{"family":"Ertmer","given":"Peggy A."},{"family":"Ottenbreit-Leftwich","given":"Anne T."}],"issued":{"date-parts":[["2010",3,1]]}}}],"schema":"https://github.com/citation-style-language/schema/raw/master/csl-citation.json"} </w:instrText>
-      </w:r>
-      <w:r>
-        <w:fldChar w:fldCharType="separate"/>
-      </w:r>
-      <w:r>
-        <w:rPr>
-          <w:noProof/>
-        </w:rPr>
-        <w:t>(Ertmer &amp; Ottenbreit-Leftwich, 2010)</w:t>
-      </w:r>
-      <w:r>
-        <w:fldChar w:fldCharType="end"/>
-      </w:r>
-      <w:r>
-        <w:t xml:space="preserve">. Parmi eux on peut citer conceptions pédagogiques individuelles, </w:t>
+        <w:t>. Parmi eux</w:t>
+      </w:r>
+      <w:r>
+        <w:t xml:space="preserve">, </w:t>
+      </w:r>
+      <w:r>
+        <w:t xml:space="preserve">on peut citer conceptions pédagogiques individuelles, </w:t>
       </w:r>
       <w:r>
         <w:t>nervosité liée</w:t>
@@ -8927,15 +9055,19 @@
         <w:fldChar w:fldCharType="end"/>
       </w:r>
       <w:r>
-        <w:t xml:space="preserve">. Pour l'enseignant d'anglais ou de français est nécessaire de vérifier la grammaticalité, l 'appropriabilité des registres de langue et la conformité culturelle. Cette tâche supplémentaire d’évaluation devient une barrière cognitive importante, car </w:t>
-      </w:r>
-      <w:proofErr w:type="gramStart"/>
-      <w:r>
-        <w:t>malgré</w:t>
-      </w:r>
-      <w:proofErr w:type="gramEnd"/>
-      <w:r>
-        <w:t xml:space="preserve"> que l'IA générative crée le contenu linguistique pendant quelques secondes, l'enseignant doit dépenser du temps pour l'évaluation critique.</w:t>
+        <w:t xml:space="preserve">. Pour l'enseignant </w:t>
+      </w:r>
+      <w:r>
+        <w:t>de langue</w:t>
+      </w:r>
+      <w:r>
+        <w:t xml:space="preserve"> est nécessaire de vérifier la grammaticalité, l 'appropriabilité des registres de langue et la conformité culturelle. Cette tâche supplémentaire d’évaluation devient une barrière cognitive importante, car </w:t>
+      </w:r>
+      <w:r>
+        <w:t>même si</w:t>
+      </w:r>
+      <w:r>
+        <w:t xml:space="preserve"> l'IA générative crée le contenu linguistique pendant quelques secondes, l'enseignant doit dépenser du temps pour l'évaluation critique.</w:t>
       </w:r>
     </w:p>
     <w:p/>
@@ -8992,7 +9124,13 @@
       </w:r>
       <w:proofErr w:type="spellEnd"/>
       <w:r>
-        <w:t>) dans lequel il est reconnu que, à part la maîtrise de la technologie, l'enseignant doit être capable de créer une interaction entre la machine et l'être humain pour promouvoir l'apprentissage. L'idée ici est que l'enseignant doit savoir comment formuler des invités (prompt engineering), comprendre les résultats générés par l'AI, et modifier le contenu afin qu'il soit conforme aux besoins des élèves</w:t>
+        <w:t>) dans lequel il est reconnu que, à part la maîtrise de la technologie, l'enseignant doit être capable de créer une interaction entre la machine et l'être humain pour promouvoir l'apprentissage. L'idée ici est que l'enseignant doit savoir comment formuler des invit</w:t>
+      </w:r>
+      <w:r>
+        <w:t>e</w:t>
+      </w:r>
+      <w:r>
+        <w:t>s (prompt engineering), comprendre les résultats générés par l'AI, et modifier le contenu afin qu'il soit conforme aux besoins des élèves</w:t>
       </w:r>
       <w:r>
         <w:t xml:space="preserve"> </w:t>
@@ -9218,7 +9356,19 @@
         <w:rPr>
           <w:noProof/>
         </w:rPr>
-        <w:t>(Devauchelle, 2025b)</w:t>
+        <w:t xml:space="preserve">Devauchelle </w:t>
+      </w:r>
+      <w:r>
+        <w:rPr>
+          <w:noProof/>
+        </w:rPr>
+        <w:t>(</w:t>
+      </w:r>
+      <w:r>
+        <w:rPr>
+          <w:noProof/>
+        </w:rPr>
+        <w:t>2025b)</w:t>
       </w:r>
       <w:r>
         <w:fldChar w:fldCharType="end"/>
@@ -9242,7 +9392,19 @@
         <w:rPr>
           <w:noProof/>
         </w:rPr>
-        <w:t>(Ollivier, 2018)</w:t>
+        <w:t>Ollivier</w:t>
+      </w:r>
+      <w:r>
+        <w:rPr>
+          <w:noProof/>
+        </w:rPr>
+        <w:t xml:space="preserve"> (</w:t>
+      </w:r>
+      <w:r>
+        <w:rPr>
+          <w:noProof/>
+        </w:rPr>
+        <w:t>2018)</w:t>
       </w:r>
       <w:r>
         <w:fldChar w:fldCharType="end"/>
@@ -9272,6 +9434,9 @@
       <w:bookmarkStart w:id="27" w:name="_Toc232455118"/>
       <w:r>
         <w:lastRenderedPageBreak/>
+        <w:t xml:space="preserve"> </w:t>
+      </w:r>
+      <w:r>
         <w:t>Applications et affordances de l'IA dans l'enseignement des langues</w:t>
       </w:r>
       <w:bookmarkEnd w:id="27"/>
@@ -9337,15 +9502,11 @@
     <w:p/>
     <w:p>
       <w:r>
-        <w:t xml:space="preserve">Les applications ont </w:t>
-      </w:r>
-      <w:proofErr w:type="spellStart"/>
-      <w:proofErr w:type="gramStart"/>
-      <w:r>
-        <w:t>fais</w:t>
-      </w:r>
-      <w:proofErr w:type="spellEnd"/>
-      <w:proofErr w:type="gramEnd"/>
+        <w:t>Les applications ont fai</w:t>
+      </w:r>
+      <w:r>
+        <w:t>t</w:t>
+      </w:r>
       <w:r>
         <w:t xml:space="preserve"> forte impression, mais la recherche empirique montre une réalité plus nuancée : un décalage entre les promesses technologiques et les contraintes de validation </w:t>
       </w:r>
@@ -9446,7 +9607,13 @@
     <w:p/>
     <w:p>
       <w:r>
-        <w:t>Cette littérature revêt donc dans ce chapitre une valeur théorique et empirique importante en ce qu'elle contribue à fonder un cadre de recherche qui tienne compte de toutes les composantes nécessaires pour analyser la question de l'adoption de l'IA générative par les enseignants de langues vivantes : celle-ci ne se résume pas à des facteurs technologiques mais est le fruit d'une complexe négociation entre les affordances pédagogiques de l'outil, les barrières institutionnelles et contextuelles, et la croyance professionnelle des enseignants eux-mêmes. Il faut néanmoins noter que ces recherches existent principalement au sein d'un corpus anglophone et universitaire et qu'il existe un manque flagrant de recherche à ce sujet dans le cadre scolaire et francophone en général et à l'école secondaire en particulier. C'est justement à combler cette lacune que cette recherche s'attèle dans le cadre d'un stage de Master 2 en collège de l'académie de Lyon. Le prochain chapitre est consacré au contexte dans lequel se réalise ce stage.</w:t>
+        <w:t xml:space="preserve">Cette littérature revêt donc dans ce chapitre une valeur théorique et empirique importante en ce qu'elle contribue à fonder un cadre de recherche qui tienne compte de toutes les composantes nécessaires pour analyser la question de l'adoption de l'IA générative par les enseignants de langues vivantes : celle-ci ne se résume pas à des facteurs technologiques mais est le fruit d'une complexe négociation entre les affordances pédagogiques de l'outil, les barrières institutionnelles et contextuelles, et la croyance professionnelle des enseignants eux-mêmes. Il faut néanmoins noter que ces recherches existent principalement au sein d'un corpus anglophone et universitaire et qu'il existe un manque flagrant de recherche à ce sujet dans le cadre scolaire et francophone en général et à l'école secondaire en particulier. </w:t>
+      </w:r>
+      <w:r>
+        <w:rPr>
+          <w:highlight w:val="yellow"/>
+        </w:rPr>
+        <w:t>C'est justement à combler cette lacune que cette recherche s'attèle dans le cadre d'un stage de Master 2 en collège de l'académie de Lyon. Le prochain chapitre est consacré au contexte dans lequel se réalise ce stage.</w:t>
       </w:r>
       <w:r>
         <w:t xml:space="preserve"> </w:t>
@@ -9537,7 +9704,10 @@
     <w:p/>
     <w:p>
       <w:r>
-        <w:t>Un questionnaire préliminaire</w:t>
+        <w:t>Ce</w:t>
+      </w:r>
+      <w:r>
+        <w:t xml:space="preserve"> questionnaire préliminaire</w:t>
       </w:r>
       <w:r>
         <w:t xml:space="preserve"> </w:t>
@@ -9585,7 +9755,13 @@
     <w:p/>
     <w:p>
       <w:r>
-        <w:t xml:space="preserve">Le questionnaire contenait 10 questions réparties en trois sections. La première section collectait des informations professionnelles des répondants tels que leur niveau d'enseignement de langue cible, les années d'expérience d’enseignement et le public enseigné. La deuxième section explorait ses expértise avec l'IA générative à travers cinq dimensions : le niveau de confort avec les outils d'IA (échelle d’aisance de 1 à 4), la fréquence d'utilisation (jamais à </w:t>
+        <w:t xml:space="preserve">Le questionnaire contenait </w:t>
+      </w:r>
+      <w:r>
+        <w:t>dix</w:t>
+      </w:r>
+      <w:r>
+        <w:t xml:space="preserve"> questions réparties en trois sections. La première section collectait des informations professionnelles des répondants tels que leur niveau d'enseignement de langue cible, les années d'expérience d’enseignement et le public enseigné. La deuxième section explorait ses expértise avec l'IA générative à travers cinq dimensions : le niveau de confort avec les outils d'IA (échelle d’aisance de 1 à 4), la fréquence d'utilisation (jamais à </w:t>
       </w:r>
       <w:r>
         <w:lastRenderedPageBreak/>
@@ -9683,7 +9859,13 @@
     <w:p/>
     <w:p>
       <w:r>
-        <w:t>Dans le cadre de stage obligatoire du projet de M2, j’ai eu l'occasion de travailler en tant qu’assistante d’anglais au collège Charles de Gaulle à Saint-Pierre-de-Chandieu. Cet établissement situé dans la commune située dans le département de l'Isère dans la région d’Auvergne-Rhône-Alpes, fait partie de l'académie de Lyon.</w:t>
+        <w:t xml:space="preserve">Dans le cadre de stage obligatoire du projet de M2, j’ai eu l'occasion de travailler en tant qu’assistante d’anglais au collège Charles de Gaulle à Saint-Pierre-de-Chandieu. Cet établissement situé dans la commune située dans le département de </w:t>
+      </w:r>
+      <w:r>
+        <w:t>Rhône</w:t>
+      </w:r>
+      <w:r>
+        <w:t xml:space="preserve"> dans la région d’Auvergne-Rhône-Alpes, fait partie de l'académie de Lyon.</w:t>
       </w:r>
     </w:p>
     <w:p>
@@ -9728,11 +9910,11 @@
     </w:p>
     <w:p>
       <w:r>
-        <w:t xml:space="preserve">L'école accueille environ 600 élèves divisés en quatre niveaux de 6e à 3e et leur offre un large choix de matières pour qu'ils puissent suivre leurs passions. Il est particulièrement reconnu </w:t>
+        <w:t xml:space="preserve">L'école accueille environ 600 élèves divisés en quatre niveaux de 6e à 3e et leur offre un large choix de matières. Il est particulièrement reconnu pour son offre en langues vivantes, qui </w:t>
       </w:r>
       <w:r>
         <w:lastRenderedPageBreak/>
-        <w:t>pour son offre en langues vivantes, qui comprend l’allemand, l’anglais, l’espagnol, l’italien, ainsi que les langues et cultures anciennes (LCA) et le latin. Les cours de langue sont dispensés par des professeurs pluridisciplinaires, ce qui en fait un cadre idéal pour une étude des nouvelles méthodes d'enseignement des langues.</w:t>
+        <w:t>comprend l’allemand, l’anglais, l’espagnol, l’italien, ainsi que les langues et cultures anciennes (LCA) latin. Les cours de langue sont dispensés par des professeurs pluridisciplinaires, ce qui en fait un cadre idéal pour une étude des nouvelles méthodes d'enseignement des langues.</w:t>
       </w:r>
     </w:p>
     <w:p/>
@@ -9811,6 +9993,9 @@
       </w:pPr>
       <w:bookmarkStart w:id="40" w:name="_Toc232455126"/>
       <w:r>
+        <w:t xml:space="preserve"> </w:t>
+      </w:r>
+      <w:r>
         <w:t>Le système scolaire en France et</w:t>
       </w:r>
       <w:r>
@@ -9931,7 +10116,7 @@
           <w:szCs w:val="24"/>
           <w14:ligatures w14:val="standardContextual"/>
         </w:rPr>
-        <w:t xml:space="preserve">(LOI N° </w:t>
+        <w:t xml:space="preserve">(LOI N° 2005-380 Du 23 Avril 2005 d’orientation et de Programme Pour l’avenir de l’école (1) - </w:t>
       </w:r>
       <w:r>
         <w:rPr>
@@ -9940,7 +10125,7 @@
           <w14:ligatures w14:val="standardContextual"/>
         </w:rPr>
         <w:lastRenderedPageBreak/>
-        <w:t>2005-380 Du 23 Avril 2005 d’orientation et de Programme Pour l’avenir de l’école (1) - Légifrance,)</w:t>
+        <w:t>Légifrance,)</w:t>
       </w:r>
       <w:r>
         <w:fldChar w:fldCharType="end"/>
@@ -10071,14 +10256,14 @@
         <w:rPr>
           <w:lang w:val="en-FR"/>
         </w:rPr>
-        <w:t xml:space="preserve">Les technologies numériques sont structurellement intégrées dans l'enseignement secondaire français, mais leur usage est strictement encadré par des directives institutionnelles </w:t>
+        <w:t xml:space="preserve">Les technologies numériques sont structurellement intégrées dans l'enseignement secondaire français, mais leur usage est strictement encadré par des directives institutionnelles centralisées. Cette vision est parfaitement illustrée par l'article L.413-4 de la loi n° 2018-698 </w:t>
       </w:r>
       <w:r>
         <w:rPr>
           <w:lang w:val="en-FR"/>
         </w:rPr>
         <w:lastRenderedPageBreak/>
-        <w:t xml:space="preserve">centralisées. Cette vision est parfaitement illustrée par l'article L.413-4 de la loi n° 2018-698 du 3 août 2018 </w:t>
+        <w:t xml:space="preserve">du 3 août 2018 </w:t>
       </w:r>
       <w:r>
         <w:rPr>
@@ -10202,7 +10387,7 @@
         <w:rPr>
           <w:lang w:val="en-FR"/>
         </w:rPr>
-        <w:t xml:space="preserve">, telle que par exemple la plateforme régionale Auvergne-Rhône-Alpes. De ce fait, bien que l'on puisse constater la place dominante des technologies numériques dans le travail quotidien de l'enseignant en France. </w:t>
+        <w:t xml:space="preserve">, telle que par exemple la plateforme régionale Auvergne-Rhône-Alpes. </w:t>
       </w:r>
     </w:p>
     <w:p>
@@ -10574,7 +10759,13 @@
         <w:rPr>
           <w:lang w:val="en-FR"/>
         </w:rPr>
-        <w:t>recommandent aux enseignants de ne pas introduire les informations identifiables des élèves dans des applications publis</w:t>
+        <w:t>recommandent aux enseignants de ne pas introduire les informations identifiables des élèves dans des applications publi</w:t>
+      </w:r>
+      <w:r>
+        <w:rPr>
+          <w:lang w:val="en-FR"/>
+        </w:rPr>
+        <w:t>ques</w:t>
       </w:r>
       <w:r>
         <w:rPr>
@@ -10606,6 +10797,12 @@
         <w:rPr>
           <w:lang w:val="en-FR"/>
         </w:rPr>
+        <w:t xml:space="preserve"> milieu scolaires</w:t>
+      </w:r>
+      <w:r>
+        <w:rPr>
+          <w:lang w:val="en-FR"/>
+        </w:rPr>
         <w:t xml:space="preserve"> </w:t>
       </w:r>
       <w:r>
@@ -10665,6 +10862,7 @@
         <w:rPr>
           <w:lang w:val="en-FR"/>
         </w:rPr>
+        <w:lastRenderedPageBreak/>
         <w:t>Le Public visé</w:t>
       </w:r>
       <w:bookmarkEnd w:id="44"/>
@@ -10854,7 +11052,16 @@
     </w:p>
     <w:p>
       <w:r>
-        <w:t>Cette expérience vise à mieux comprendre comment l'IA peut vraiment aider à préparer les cours de langues vivantes, et comment les profs adaptent ces outils à leurs propres besoins en classe.</w:t>
+        <w:t xml:space="preserve">Cette expérience vise à mieux comprendre comment l'IA peut vraiment aider à préparer les cours de langues vivantes, et comment les </w:t>
+      </w:r>
+      <w:r>
+        <w:t>prof</w:t>
+      </w:r>
+      <w:r>
+        <w:t xml:space="preserve">esseurs </w:t>
+      </w:r>
+      <w:r>
+        <w:t>adaptent ces outils à leurs propres besoins en classe.</w:t>
       </w:r>
     </w:p>
     <w:p/>
@@ -13818,19 +14025,7 @@
         <w:rPr>
           <w:lang w:val="en-FR"/>
         </w:rPr>
-        <w:t xml:space="preserve"> derière </w:t>
-      </w:r>
-      <w:r>
-        <w:rPr>
-          <w:lang w:val="en-FR"/>
-        </w:rPr>
-        <w:t xml:space="preserve">les </w:t>
-      </w:r>
-      <w:r>
-        <w:rPr>
-          <w:lang w:val="en-FR"/>
-        </w:rPr>
-        <w:t xml:space="preserve">productions par les </w:t>
+        <w:t xml:space="preserve"> derière les productions par les </w:t>
       </w:r>
       <w:r>
         <w:rPr>
@@ -13842,13 +14037,7 @@
         <w:rPr>
           <w:lang w:val="en-FR"/>
         </w:rPr>
-        <w:t xml:space="preserve"> </w:t>
-      </w:r>
-      <w:r>
-        <w:rPr>
-          <w:lang w:val="en-FR"/>
-        </w:rPr>
-        <w:t>les decisions de l’enseignants</w:t>
+        <w:t xml:space="preserve"> les decisions de l’enseignants</w:t>
       </w:r>
       <w:r>
         <w:rPr>
@@ -13863,26 +14052,6 @@
           <w:lang w:val="en-FR"/>
         </w:rPr>
       </w:pPr>
-    </w:p>
-    <w:p>
-      <w:pPr>
-        <w:rPr>
-          <w:lang w:val="en-FR"/>
-        </w:rPr>
-      </w:pPr>
-    </w:p>
-    <w:p>
-      <w:pPr>
-        <w:rPr>
-          <w:lang w:val="en-FR"/>
-        </w:rPr>
-      </w:pPr>
-      <w:r>
-        <w:rPr>
-          <w:lang w:val="en-FR"/>
-        </w:rPr>
-        <w:t xml:space="preserve"> </w:t>
-      </w:r>
     </w:p>
     <w:p>
       <w:pPr>
@@ -13971,27 +14140,7 @@
           <w:sz w:val="20"/>
           <w:lang w:val="en-GB"/>
         </w:rPr>
-        <w:t xml:space="preserve">Afdal, H. W., &amp; </w:t>
-      </w:r>
-      <w:proofErr w:type="spellStart"/>
-      <w:r>
-        <w:rPr>
-          <w:rFonts w:cs="Times New Roman"/>
-          <w:color w:val="000000" w:themeColor="text1"/>
-          <w:sz w:val="20"/>
-          <w:lang w:val="en-GB"/>
-        </w:rPr>
-        <w:t>Maaranen</w:t>
-      </w:r>
-      <w:proofErr w:type="spellEnd"/>
-      <w:r>
-        <w:rPr>
-          <w:rFonts w:cs="Times New Roman"/>
-          <w:color w:val="000000" w:themeColor="text1"/>
-          <w:sz w:val="20"/>
-          <w:lang w:val="en-GB"/>
-        </w:rPr>
-        <w:t xml:space="preserve">, K. (2023). </w:t>
+        <w:t xml:space="preserve">Afdal, H. W., &amp; Maaranen, K. (2023). </w:t>
       </w:r>
       <w:r>
         <w:rPr>
@@ -14092,7 +14241,6 @@
         </w:rPr>
         <w:t xml:space="preserve">Breen, M. P., Hird, B., Milton, M., Thwaite, A., &amp; Oliver, R. (2001). Making Sense of Language Teaching: Teachers’ Principles and Classroom Practices. </w:t>
       </w:r>
-      <w:proofErr w:type="spellStart"/>
       <w:r>
         <w:rPr>
           <w:rFonts w:cs="Times New Roman"/>
@@ -14101,9 +14249,16 @@
           <w:color w:val="000000" w:themeColor="text1"/>
           <w:sz w:val="20"/>
         </w:rPr>
-        <w:t>Applied</w:t>
-      </w:r>
-      <w:proofErr w:type="spellEnd"/>
+        <w:t>Applied Linguistics</w:t>
+      </w:r>
+      <w:r>
+        <w:rPr>
+          <w:rFonts w:cs="Times New Roman"/>
+          <w:color w:val="000000" w:themeColor="text1"/>
+          <w:sz w:val="20"/>
+        </w:rPr>
+        <w:t xml:space="preserve">, </w:t>
+      </w:r>
       <w:r>
         <w:rPr>
           <w:rFonts w:cs="Times New Roman"/>
@@ -14112,9 +14267,26 @@
           <w:color w:val="000000" w:themeColor="text1"/>
           <w:sz w:val="20"/>
         </w:rPr>
-        <w:t xml:space="preserve"> </w:t>
-      </w:r>
-      <w:proofErr w:type="spellStart"/>
+        <w:t>22</w:t>
+      </w:r>
+      <w:r>
+        <w:rPr>
+          <w:rFonts w:cs="Times New Roman"/>
+          <w:color w:val="000000" w:themeColor="text1"/>
+          <w:sz w:val="20"/>
+        </w:rPr>
+        <w:t>(4), 470–501. (EJ637407).</w:t>
+      </w:r>
+    </w:p>
+    <w:p>
+      <w:pPr>
+        <w:pStyle w:val="Bibliography"/>
+        <w:rPr>
+          <w:rFonts w:cs="Times New Roman"/>
+          <w:color w:val="000000" w:themeColor="text1"/>
+          <w:sz w:val="20"/>
+        </w:rPr>
+      </w:pPr>
       <w:r>
         <w:rPr>
           <w:rFonts w:cs="Times New Roman"/>
@@ -14123,80 +14295,15 @@
           <w:color w:val="000000" w:themeColor="text1"/>
           <w:sz w:val="20"/>
         </w:rPr>
-        <w:t>Linguistics</w:t>
-      </w:r>
-      <w:proofErr w:type="spellEnd"/>
+        <w:t>Cadre d’usage de l’IA en éducation</w:t>
+      </w:r>
       <w:r>
         <w:rPr>
           <w:rFonts w:cs="Times New Roman"/>
           <w:color w:val="000000" w:themeColor="text1"/>
           <w:sz w:val="20"/>
         </w:rPr>
-        <w:t xml:space="preserve">, </w:t>
-      </w:r>
-      <w:r>
-        <w:rPr>
-          <w:rFonts w:cs="Times New Roman"/>
-          <w:i/>
-          <w:iCs/>
-          <w:color w:val="000000" w:themeColor="text1"/>
-          <w:sz w:val="20"/>
-        </w:rPr>
-        <w:t>22</w:t>
-      </w:r>
-      <w:r>
-        <w:rPr>
-          <w:rFonts w:cs="Times New Roman"/>
-          <w:color w:val="000000" w:themeColor="text1"/>
-          <w:sz w:val="20"/>
-        </w:rPr>
-        <w:t>(4), 470–501. (EJ637407).</w:t>
-      </w:r>
-    </w:p>
-    <w:p>
-      <w:pPr>
-        <w:pStyle w:val="Bibliography"/>
-        <w:rPr>
-          <w:rFonts w:cs="Times New Roman"/>
-          <w:color w:val="000000" w:themeColor="text1"/>
-          <w:sz w:val="20"/>
-        </w:rPr>
-      </w:pPr>
-      <w:r>
-        <w:rPr>
-          <w:rFonts w:cs="Times New Roman"/>
-          <w:i/>
-          <w:iCs/>
-          <w:color w:val="000000" w:themeColor="text1"/>
-          <w:sz w:val="20"/>
-        </w:rPr>
-        <w:t>Cadre d’usage de l’IA en éducation</w:t>
-      </w:r>
-      <w:r>
-        <w:rPr>
-          <w:rFonts w:cs="Times New Roman"/>
-          <w:color w:val="000000" w:themeColor="text1"/>
-          <w:sz w:val="20"/>
-        </w:rPr>
-        <w:t>. (2025, June 13). Ministère de l’</w:t>
-      </w:r>
-      <w:proofErr w:type="spellStart"/>
-      <w:r>
-        <w:rPr>
-          <w:rFonts w:cs="Times New Roman"/>
-          <w:color w:val="000000" w:themeColor="text1"/>
-          <w:sz w:val="20"/>
-        </w:rPr>
-        <w:t>Education</w:t>
-      </w:r>
-      <w:proofErr w:type="spellEnd"/>
-      <w:r>
-        <w:rPr>
-          <w:rFonts w:cs="Times New Roman"/>
-          <w:color w:val="000000" w:themeColor="text1"/>
-          <w:sz w:val="20"/>
-        </w:rPr>
-        <w:t xml:space="preserve"> nationale. https://www.education.gouv.fr/cadre-d-usage-de-l-ia-en-education-450647</w:t>
+        <w:t>. (2025, June 13). Ministère de l’Education nationale. https://www.education.gouv.fr/cadre-d-usage-de-l-ia-en-education-450647</w:t>
       </w:r>
     </w:p>
     <w:p>
@@ -14227,9 +14334,17 @@
           <w:sz w:val="20"/>
           <w:lang w:val="en-GB"/>
         </w:rPr>
-        <w:t xml:space="preserve">Computers in Human </w:t>
-      </w:r>
-      <w:proofErr w:type="spellStart"/>
+        <w:t>Computers in Human Behavior</w:t>
+      </w:r>
+      <w:r>
+        <w:rPr>
+          <w:rFonts w:cs="Times New Roman"/>
+          <w:color w:val="000000" w:themeColor="text1"/>
+          <w:sz w:val="20"/>
+          <w:lang w:val="en-GB"/>
+        </w:rPr>
+        <w:t xml:space="preserve">, </w:t>
+      </w:r>
       <w:r>
         <w:rPr>
           <w:rFonts w:cs="Times New Roman"/>
@@ -14239,9 +14354,8 @@
           <w:sz w:val="20"/>
           <w:lang w:val="en-GB"/>
         </w:rPr>
-        <w:t>Behavior</w:t>
-      </w:r>
-      <w:proofErr w:type="spellEnd"/>
+        <w:t>138</w:t>
+      </w:r>
       <w:r>
         <w:rPr>
           <w:rFonts w:cs="Times New Roman"/>
@@ -14249,8 +14363,19 @@
           <w:sz w:val="20"/>
           <w:lang w:val="en-GB"/>
         </w:rPr>
-        <w:t xml:space="preserve">, </w:t>
-      </w:r>
+        <w:t>, 107468. https://doi.org/10.1016/j.chb.2022.107468</w:t>
+      </w:r>
+    </w:p>
+    <w:p>
+      <w:pPr>
+        <w:pStyle w:val="Bibliography"/>
+        <w:rPr>
+          <w:rFonts w:cs="Times New Roman"/>
+          <w:color w:val="000000" w:themeColor="text1"/>
+          <w:sz w:val="20"/>
+          <w:lang w:val="en-GB"/>
+        </w:rPr>
+      </w:pPr>
       <w:r>
         <w:rPr>
           <w:rFonts w:cs="Times New Roman"/>
@@ -14260,7 +14385,7 @@
           <w:sz w:val="20"/>
           <w:lang w:val="en-GB"/>
         </w:rPr>
-        <w:t>138</w:t>
+        <w:t>Circulaire de rentrée 2015</w:t>
       </w:r>
       <w:r>
         <w:rPr>
@@ -14269,20 +14394,45 @@
           <w:sz w:val="20"/>
           <w:lang w:val="en-GB"/>
         </w:rPr>
-        <w:t>, 107468. https://doi.org/10.1016/j.chb.2022.107468</w:t>
-      </w:r>
-    </w:p>
-    <w:p>
-      <w:pPr>
-        <w:pStyle w:val="Bibliography"/>
+        <w:t xml:space="preserve">. </w:t>
+      </w:r>
+      <w:r>
+        <w:rPr>
+          <w:rFonts w:cs="Times New Roman"/>
+          <w:color w:val="000000" w:themeColor="text1"/>
+          <w:sz w:val="20"/>
+        </w:rPr>
+        <w:t xml:space="preserve">(n.d.). Ministère de l’Education nationale. </w:t>
+      </w:r>
+      <w:r>
         <w:rPr>
           <w:rFonts w:cs="Times New Roman"/>
           <w:color w:val="000000" w:themeColor="text1"/>
           <w:sz w:val="20"/>
           <w:lang w:val="en-GB"/>
         </w:rPr>
-      </w:pPr>
-      <w:proofErr w:type="spellStart"/>
+        <w:t>Retrieved May 30, 2026, from https://www.education.gouv.fr/bo/15/Hebdo22/xxx.htm</w:t>
+      </w:r>
+    </w:p>
+    <w:p>
+      <w:pPr>
+        <w:pStyle w:val="Bibliography"/>
+        <w:rPr>
+          <w:rFonts w:cs="Times New Roman"/>
+          <w:color w:val="000000" w:themeColor="text1"/>
+          <w:sz w:val="20"/>
+          <w:lang w:val="en-GB"/>
+        </w:rPr>
+      </w:pPr>
+      <w:r>
+        <w:rPr>
+          <w:rFonts w:cs="Times New Roman"/>
+          <w:color w:val="000000" w:themeColor="text1"/>
+          <w:sz w:val="20"/>
+          <w:lang w:val="en-GB"/>
+        </w:rPr>
+        <w:t xml:space="preserve">Clark, C. M., &amp; Peterson, P. L. (1984). </w:t>
+      </w:r>
       <w:r>
         <w:rPr>
           <w:rFonts w:cs="Times New Roman"/>
@@ -14292,9 +14442,373 @@
           <w:sz w:val="20"/>
           <w:lang w:val="en-GB"/>
         </w:rPr>
-        <w:t>Circulaire</w:t>
-      </w:r>
-      <w:proofErr w:type="spellEnd"/>
+        <w:t>Teachers’ Thought Processes. Occasional Paper No. 72</w:t>
+      </w:r>
+      <w:r>
+        <w:rPr>
+          <w:rFonts w:cs="Times New Roman"/>
+          <w:color w:val="000000" w:themeColor="text1"/>
+          <w:sz w:val="20"/>
+          <w:lang w:val="en-GB"/>
+        </w:rPr>
+        <w:t>. Institute for Research on Teaching, College of Education, Michigan State University, 252 Erickson Hall, East Lansing, MI 48824, ($13. https://eric.ed.gov/?id=ED251449</w:t>
+      </w:r>
+    </w:p>
+    <w:p>
+      <w:pPr>
+        <w:pStyle w:val="Bibliography"/>
+        <w:rPr>
+          <w:rFonts w:cs="Times New Roman"/>
+          <w:color w:val="000000" w:themeColor="text1"/>
+          <w:sz w:val="20"/>
+        </w:rPr>
+      </w:pPr>
+      <w:r>
+        <w:rPr>
+          <w:rFonts w:cs="Times New Roman"/>
+          <w:i/>
+          <w:iCs/>
+          <w:color w:val="000000" w:themeColor="text1"/>
+          <w:sz w:val="20"/>
+        </w:rPr>
+        <w:t>Collège Charles de Gaulle</w:t>
+      </w:r>
+      <w:r>
+        <w:rPr>
+          <w:rFonts w:cs="Times New Roman"/>
+          <w:color w:val="000000" w:themeColor="text1"/>
+          <w:sz w:val="20"/>
+        </w:rPr>
+        <w:t>. (2006, November 30). https://charlesdegaulle-stpierredechandieu.ent.auvergnerhonealpes.fr/</w:t>
+      </w:r>
+    </w:p>
+    <w:p>
+      <w:pPr>
+        <w:pStyle w:val="Bibliography"/>
+        <w:rPr>
+          <w:rFonts w:cs="Times New Roman"/>
+          <w:color w:val="000000" w:themeColor="text1"/>
+          <w:sz w:val="20"/>
+          <w:lang w:val="en-GB"/>
+        </w:rPr>
+      </w:pPr>
+      <w:r>
+        <w:rPr>
+          <w:rFonts w:cs="Times New Roman"/>
+          <w:i/>
+          <w:iCs/>
+          <w:color w:val="000000" w:themeColor="text1"/>
+          <w:sz w:val="20"/>
+        </w:rPr>
+        <w:t>Collège Charles de Gaulle, Saint-Pierre-de-Chandieu (69), avis et classement, toutes les infos et les spécialités—L’Etudiant</w:t>
+      </w:r>
+      <w:r>
+        <w:rPr>
+          <w:rFonts w:cs="Times New Roman"/>
+          <w:color w:val="000000" w:themeColor="text1"/>
+          <w:sz w:val="20"/>
+        </w:rPr>
+        <w:t xml:space="preserve">. </w:t>
+      </w:r>
+      <w:r>
+        <w:rPr>
+          <w:rFonts w:cs="Times New Roman"/>
+          <w:color w:val="000000" w:themeColor="text1"/>
+          <w:sz w:val="20"/>
+          <w:lang w:val="en-GB"/>
+        </w:rPr>
+        <w:t>(n.d.). Retrieved May 30, 2026, from https://www.letudiant.fr/college/annuaire-des-colleges/fiche/college-charles-de-gaulle-69.html#presentation</w:t>
+      </w:r>
+    </w:p>
+    <w:p>
+      <w:pPr>
+        <w:pStyle w:val="Bibliography"/>
+        <w:rPr>
+          <w:rFonts w:cs="Times New Roman"/>
+          <w:color w:val="000000" w:themeColor="text1"/>
+          <w:sz w:val="20"/>
+        </w:rPr>
+      </w:pPr>
+      <w:r>
+        <w:rPr>
+          <w:rFonts w:cs="Times New Roman"/>
+          <w:color w:val="000000" w:themeColor="text1"/>
+          <w:sz w:val="20"/>
+          <w:lang w:val="en-GB"/>
+        </w:rPr>
+        <w:t xml:space="preserve">Davis, F. D. (1989). Perceived Usefulness, Perceived Ease of Use, and User Acceptance of Information Technology. </w:t>
+      </w:r>
+      <w:r>
+        <w:rPr>
+          <w:rFonts w:cs="Times New Roman"/>
+          <w:i/>
+          <w:iCs/>
+          <w:color w:val="000000" w:themeColor="text1"/>
+          <w:sz w:val="20"/>
+        </w:rPr>
+        <w:t>MIS Quarterly</w:t>
+      </w:r>
+      <w:r>
+        <w:rPr>
+          <w:rFonts w:cs="Times New Roman"/>
+          <w:color w:val="000000" w:themeColor="text1"/>
+          <w:sz w:val="20"/>
+        </w:rPr>
+        <w:t xml:space="preserve">, </w:t>
+      </w:r>
+      <w:r>
+        <w:rPr>
+          <w:rFonts w:cs="Times New Roman"/>
+          <w:i/>
+          <w:iCs/>
+          <w:color w:val="000000" w:themeColor="text1"/>
+          <w:sz w:val="20"/>
+        </w:rPr>
+        <w:t>13</w:t>
+      </w:r>
+      <w:r>
+        <w:rPr>
+          <w:rFonts w:cs="Times New Roman"/>
+          <w:color w:val="000000" w:themeColor="text1"/>
+          <w:sz w:val="20"/>
+        </w:rPr>
+        <w:t>(3), 319–340. https://doi.org/10.2307/249008</w:t>
+      </w:r>
+    </w:p>
+    <w:p>
+      <w:pPr>
+        <w:pStyle w:val="Bibliography"/>
+        <w:rPr>
+          <w:rFonts w:cs="Times New Roman"/>
+          <w:color w:val="000000" w:themeColor="text1"/>
+          <w:sz w:val="20"/>
+        </w:rPr>
+      </w:pPr>
+      <w:r>
+        <w:rPr>
+          <w:rFonts w:cs="Times New Roman"/>
+          <w:color w:val="000000" w:themeColor="text1"/>
+          <w:sz w:val="20"/>
+        </w:rPr>
+        <w:t xml:space="preserve">Devauchelle, B. (2025a). Les enseignants, les formateurs et les cadres éducatifs français face à l’intelligence artificielle. </w:t>
+      </w:r>
+      <w:r>
+        <w:rPr>
+          <w:rFonts w:cs="Times New Roman"/>
+          <w:i/>
+          <w:iCs/>
+          <w:color w:val="000000" w:themeColor="text1"/>
+          <w:sz w:val="20"/>
+        </w:rPr>
+        <w:t>Revue internationale d’éducation de Sèvres</w:t>
+      </w:r>
+      <w:r>
+        <w:rPr>
+          <w:rFonts w:cs="Times New Roman"/>
+          <w:color w:val="000000" w:themeColor="text1"/>
+          <w:sz w:val="20"/>
+        </w:rPr>
+        <w:t>, (HS-4). https://doi.org/10.4000/146vm</w:t>
+      </w:r>
+    </w:p>
+    <w:p>
+      <w:pPr>
+        <w:pStyle w:val="Bibliography"/>
+        <w:rPr>
+          <w:rFonts w:cs="Times New Roman"/>
+          <w:color w:val="000000" w:themeColor="text1"/>
+          <w:sz w:val="20"/>
+        </w:rPr>
+      </w:pPr>
+      <w:r>
+        <w:rPr>
+          <w:rFonts w:cs="Times New Roman"/>
+          <w:color w:val="000000" w:themeColor="text1"/>
+          <w:sz w:val="20"/>
+        </w:rPr>
+        <w:t xml:space="preserve">Devauchelle, B. (2025b, May 2). Enjeux économiques et politiques autour de l’IA à l’école. </w:t>
+      </w:r>
+      <w:r>
+        <w:rPr>
+          <w:rFonts w:cs="Times New Roman"/>
+          <w:i/>
+          <w:iCs/>
+          <w:color w:val="000000" w:themeColor="text1"/>
+          <w:sz w:val="20"/>
+        </w:rPr>
+        <w:t>Le Café pédagogique</w:t>
+      </w:r>
+      <w:r>
+        <w:rPr>
+          <w:rFonts w:cs="Times New Roman"/>
+          <w:color w:val="000000" w:themeColor="text1"/>
+          <w:sz w:val="20"/>
+        </w:rPr>
+        <w:t>. https://www.cafepedagogique.net/2025/05/02/enjeux-economiques-et-politiques-autour-de-lia-a-lecole/</w:t>
+      </w:r>
+    </w:p>
+    <w:p>
+      <w:pPr>
+        <w:pStyle w:val="Bibliography"/>
+        <w:rPr>
+          <w:rFonts w:cs="Times New Roman"/>
+          <w:color w:val="000000" w:themeColor="text1"/>
+          <w:sz w:val="20"/>
+          <w:lang w:val="en-GB"/>
+        </w:rPr>
+      </w:pPr>
+      <w:r>
+        <w:rPr>
+          <w:rFonts w:cs="Times New Roman"/>
+          <w:i/>
+          <w:iCs/>
+          <w:color w:val="000000" w:themeColor="text1"/>
+          <w:sz w:val="20"/>
+        </w:rPr>
+        <w:t>Devenir assistant de langue en France | France Education international</w:t>
+      </w:r>
+      <w:r>
+        <w:rPr>
+          <w:rFonts w:cs="Times New Roman"/>
+          <w:color w:val="000000" w:themeColor="text1"/>
+          <w:sz w:val="20"/>
+        </w:rPr>
+        <w:t xml:space="preserve">. </w:t>
+      </w:r>
+      <w:r>
+        <w:rPr>
+          <w:rFonts w:cs="Times New Roman"/>
+          <w:color w:val="000000" w:themeColor="text1"/>
+          <w:sz w:val="20"/>
+          <w:lang w:val="en-GB"/>
+        </w:rPr>
+        <w:t>(2021, May 10). https://www.france-education-international.fr/venir-en-france/devenir-assistant-de-langue-en-france</w:t>
+      </w:r>
+    </w:p>
+    <w:p>
+      <w:pPr>
+        <w:pStyle w:val="Bibliography"/>
+        <w:rPr>
+          <w:rFonts w:cs="Times New Roman"/>
+          <w:color w:val="000000" w:themeColor="text1"/>
+          <w:sz w:val="20"/>
+          <w:lang w:val="en-GB"/>
+        </w:rPr>
+      </w:pPr>
+      <w:r>
+        <w:rPr>
+          <w:rFonts w:cs="Times New Roman"/>
+          <w:i/>
+          <w:iCs/>
+          <w:color w:val="000000" w:themeColor="text1"/>
+          <w:sz w:val="20"/>
+        </w:rPr>
+        <w:lastRenderedPageBreak/>
+        <w:t>Droit national en vigueur—Jurisprudence—Jurisprudence administrative—Légifrance</w:t>
+      </w:r>
+      <w:r>
+        <w:rPr>
+          <w:rFonts w:cs="Times New Roman"/>
+          <w:color w:val="000000" w:themeColor="text1"/>
+          <w:sz w:val="20"/>
+        </w:rPr>
+        <w:t xml:space="preserve">. </w:t>
+      </w:r>
+      <w:r>
+        <w:rPr>
+          <w:rFonts w:cs="Times New Roman"/>
+          <w:color w:val="000000" w:themeColor="text1"/>
+          <w:sz w:val="20"/>
+          <w:lang w:val="en-GB"/>
+        </w:rPr>
+        <w:t>(2018, August 5). https://www.legifrance.gouv.fr/download/pdf?id=HFLUpbWxIOq4I6R3ktU6f-Z-PkK9A6thiDb3sgQcNsM=</w:t>
+      </w:r>
+    </w:p>
+    <w:p>
+      <w:pPr>
+        <w:pStyle w:val="Bibliography"/>
+        <w:rPr>
+          <w:rFonts w:cs="Times New Roman"/>
+          <w:color w:val="000000" w:themeColor="text1"/>
+          <w:sz w:val="20"/>
+        </w:rPr>
+      </w:pPr>
+      <w:r>
+        <w:rPr>
+          <w:rFonts w:cs="Times New Roman"/>
+          <w:i/>
+          <w:iCs/>
+          <w:color w:val="000000" w:themeColor="text1"/>
+          <w:sz w:val="20"/>
+        </w:rPr>
+        <w:t>Enseignant: Comment utiliser un système d’IA dans le cadre de vos missions ?</w:t>
+      </w:r>
+      <w:r>
+        <w:rPr>
+          <w:rFonts w:cs="Times New Roman"/>
+          <w:color w:val="000000" w:themeColor="text1"/>
+          <w:sz w:val="20"/>
+        </w:rPr>
+        <w:t xml:space="preserve"> (2025, June 20). https://www.cnil.fr/fr/enseignant-usage-systeme-ia</w:t>
+      </w:r>
+    </w:p>
+    <w:p>
+      <w:pPr>
+        <w:pStyle w:val="Bibliography"/>
+        <w:rPr>
+          <w:rFonts w:cs="Times New Roman"/>
+          <w:color w:val="000000" w:themeColor="text1"/>
+          <w:sz w:val="20"/>
+          <w:lang w:val="en-GB"/>
+        </w:rPr>
+      </w:pPr>
+      <w:r>
+        <w:rPr>
+          <w:rFonts w:cs="Times New Roman"/>
+          <w:i/>
+          <w:iCs/>
+          <w:color w:val="000000" w:themeColor="text1"/>
+          <w:sz w:val="20"/>
+        </w:rPr>
+        <w:t>Enseigner au cycle 3 | éduscol | Ministère de l’Éducation nationale | Direction générale de l’enseignement scolaire</w:t>
+      </w:r>
+      <w:r>
+        <w:rPr>
+          <w:rFonts w:cs="Times New Roman"/>
+          <w:color w:val="000000" w:themeColor="text1"/>
+          <w:sz w:val="20"/>
+        </w:rPr>
+        <w:t xml:space="preserve">. </w:t>
+      </w:r>
+      <w:r>
+        <w:rPr>
+          <w:rFonts w:cs="Times New Roman"/>
+          <w:color w:val="000000" w:themeColor="text1"/>
+          <w:sz w:val="20"/>
+          <w:lang w:val="en-GB"/>
+        </w:rPr>
+        <w:t>(n.d.). Retrieved May 30, 2026, from https://eduscol.education.gouv.fr/4356/enseigner-au-cycle-3</w:t>
+      </w:r>
+    </w:p>
+    <w:p>
+      <w:pPr>
+        <w:pStyle w:val="Bibliography"/>
+        <w:rPr>
+          <w:rFonts w:cs="Times New Roman"/>
+          <w:color w:val="000000" w:themeColor="text1"/>
+          <w:sz w:val="20"/>
+          <w:lang w:val="en-GB"/>
+        </w:rPr>
+      </w:pPr>
+      <w:r>
+        <w:rPr>
+          <w:rFonts w:cs="Times New Roman"/>
+          <w:color w:val="000000" w:themeColor="text1"/>
+          <w:sz w:val="20"/>
+          <w:lang w:val="en-GB"/>
+        </w:rPr>
+        <w:t xml:space="preserve">Ertmer, P. A. (1999). Addressing first- and second-order barriers to change: Strategies for technology integration. </w:t>
+      </w:r>
       <w:r>
         <w:rPr>
           <w:rFonts w:cs="Times New Roman"/>
@@ -14304,9 +14818,17 @@
           <w:sz w:val="20"/>
           <w:lang w:val="en-GB"/>
         </w:rPr>
-        <w:t xml:space="preserve"> de </w:t>
-      </w:r>
-      <w:proofErr w:type="spellStart"/>
+        <w:t>Educational Technology Research and Development</w:t>
+      </w:r>
+      <w:r>
+        <w:rPr>
+          <w:rFonts w:cs="Times New Roman"/>
+          <w:color w:val="000000" w:themeColor="text1"/>
+          <w:sz w:val="20"/>
+          <w:lang w:val="en-GB"/>
+        </w:rPr>
+        <w:t xml:space="preserve">, </w:t>
+      </w:r>
       <w:r>
         <w:rPr>
           <w:rFonts w:cs="Times New Roman"/>
@@ -14316,9 +14838,37 @@
           <w:sz w:val="20"/>
           <w:lang w:val="en-GB"/>
         </w:rPr>
-        <w:t>rentrée</w:t>
-      </w:r>
-      <w:proofErr w:type="spellEnd"/>
+        <w:t>47</w:t>
+      </w:r>
+      <w:r>
+        <w:rPr>
+          <w:rFonts w:cs="Times New Roman"/>
+          <w:color w:val="000000" w:themeColor="text1"/>
+          <w:sz w:val="20"/>
+          <w:lang w:val="en-GB"/>
+        </w:rPr>
+        <w:t>(4), 47–61. https://doi.org/10.1007/BF02299597</w:t>
+      </w:r>
+    </w:p>
+    <w:p>
+      <w:pPr>
+        <w:pStyle w:val="Bibliography"/>
+        <w:rPr>
+          <w:rFonts w:cs="Times New Roman"/>
+          <w:color w:val="000000" w:themeColor="text1"/>
+          <w:sz w:val="20"/>
+          <w:lang w:val="en-GB"/>
+        </w:rPr>
+      </w:pPr>
+      <w:r>
+        <w:rPr>
+          <w:rFonts w:cs="Times New Roman"/>
+          <w:color w:val="000000" w:themeColor="text1"/>
+          <w:sz w:val="20"/>
+          <w:lang w:val="en-GB"/>
+        </w:rPr>
+        <w:t xml:space="preserve">Ertmer, P. A., &amp; Ottenbreit-Leftwich, A. T. (2010). Teacher Technology Change: How Knowledge, Confidence, Beliefs, and Culture Intersect. </w:t>
+      </w:r>
       <w:r>
         <w:rPr>
           <w:rFonts w:cs="Times New Roman"/>
@@ -14328,7 +14878,7 @@
           <w:sz w:val="20"/>
           <w:lang w:val="en-GB"/>
         </w:rPr>
-        <w:t xml:space="preserve"> 2015</w:t>
+        <w:t>Journal of Research on Technology in Education</w:t>
       </w:r>
       <w:r>
         <w:rPr>
@@ -14337,90 +14887,7 @@
           <w:sz w:val="20"/>
           <w:lang w:val="en-GB"/>
         </w:rPr>
-        <w:t xml:space="preserve">. </w:t>
-      </w:r>
-      <w:r>
-        <w:rPr>
-          <w:rFonts w:cs="Times New Roman"/>
-          <w:color w:val="000000" w:themeColor="text1"/>
-          <w:sz w:val="20"/>
-        </w:rPr>
-        <w:t>(</w:t>
-      </w:r>
-      <w:proofErr w:type="spellStart"/>
-      <w:proofErr w:type="gramStart"/>
-      <w:r>
-        <w:rPr>
-          <w:rFonts w:cs="Times New Roman"/>
-          <w:color w:val="000000" w:themeColor="text1"/>
-          <w:sz w:val="20"/>
-        </w:rPr>
-        <w:t>n.d</w:t>
-      </w:r>
-      <w:proofErr w:type="spellEnd"/>
-      <w:r>
-        <w:rPr>
-          <w:rFonts w:cs="Times New Roman"/>
-          <w:color w:val="000000" w:themeColor="text1"/>
-          <w:sz w:val="20"/>
-        </w:rPr>
-        <w:t>.</w:t>
-      </w:r>
-      <w:proofErr w:type="gramEnd"/>
-      <w:r>
-        <w:rPr>
-          <w:rFonts w:cs="Times New Roman"/>
-          <w:color w:val="000000" w:themeColor="text1"/>
-          <w:sz w:val="20"/>
-        </w:rPr>
-        <w:t>). Ministère de l’</w:t>
-      </w:r>
-      <w:proofErr w:type="spellStart"/>
-      <w:r>
-        <w:rPr>
-          <w:rFonts w:cs="Times New Roman"/>
-          <w:color w:val="000000" w:themeColor="text1"/>
-          <w:sz w:val="20"/>
-        </w:rPr>
-        <w:t>Education</w:t>
-      </w:r>
-      <w:proofErr w:type="spellEnd"/>
-      <w:r>
-        <w:rPr>
-          <w:rFonts w:cs="Times New Roman"/>
-          <w:color w:val="000000" w:themeColor="text1"/>
-          <w:sz w:val="20"/>
-        </w:rPr>
-        <w:t xml:space="preserve"> nationale. </w:t>
-      </w:r>
-      <w:r>
-        <w:rPr>
-          <w:rFonts w:cs="Times New Roman"/>
-          <w:color w:val="000000" w:themeColor="text1"/>
-          <w:sz w:val="20"/>
-          <w:lang w:val="en-GB"/>
-        </w:rPr>
-        <w:t>Retrieved May 30, 2026, from https://www.education.gouv.fr/bo/15/Hebdo22/xxx.htm</w:t>
-      </w:r>
-    </w:p>
-    <w:p>
-      <w:pPr>
-        <w:pStyle w:val="Bibliography"/>
-        <w:rPr>
-          <w:rFonts w:cs="Times New Roman"/>
-          <w:color w:val="000000" w:themeColor="text1"/>
-          <w:sz w:val="20"/>
-          <w:lang w:val="en-GB"/>
-        </w:rPr>
-      </w:pPr>
-      <w:r>
-        <w:rPr>
-          <w:rFonts w:cs="Times New Roman"/>
-          <w:color w:val="000000" w:themeColor="text1"/>
-          <w:sz w:val="20"/>
-          <w:lang w:val="en-GB"/>
-        </w:rPr>
-        <w:t xml:space="preserve">Clark, C. M., &amp; Peterson, P. L. (1984). </w:t>
+        <w:t xml:space="preserve">, </w:t>
       </w:r>
       <w:r>
         <w:rPr>
@@ -14431,7 +14898,7 @@
           <w:sz w:val="20"/>
           <w:lang w:val="en-GB"/>
         </w:rPr>
-        <w:t>Teachers’ Thought Processes. Occasional Paper No. 72</w:t>
+        <w:t>42</w:t>
       </w:r>
       <w:r>
         <w:rPr>
@@ -14440,53 +14907,7 @@
           <w:sz w:val="20"/>
           <w:lang w:val="en-GB"/>
         </w:rPr>
-        <w:t>. Institute for Research on Teaching, College of Education, Michigan State University, 252 Erickson Hall, East Lansing, MI 48824, ($13. https://eric.ed.gov/?id=ED251449</w:t>
-      </w:r>
-    </w:p>
-    <w:p>
-      <w:pPr>
-        <w:pStyle w:val="Bibliography"/>
-        <w:rPr>
-          <w:rFonts w:cs="Times New Roman"/>
-          <w:color w:val="000000" w:themeColor="text1"/>
-          <w:sz w:val="20"/>
-        </w:rPr>
-      </w:pPr>
-      <w:r>
-        <w:rPr>
-          <w:rFonts w:cs="Times New Roman"/>
-          <w:i/>
-          <w:iCs/>
-          <w:color w:val="000000" w:themeColor="text1"/>
-          <w:sz w:val="20"/>
-        </w:rPr>
-        <w:t>Collège Charles de Gaulle</w:t>
-      </w:r>
-      <w:r>
-        <w:rPr>
-          <w:rFonts w:cs="Times New Roman"/>
-          <w:color w:val="000000" w:themeColor="text1"/>
-          <w:sz w:val="20"/>
-        </w:rPr>
-        <w:t xml:space="preserve">. (2006, </w:t>
-      </w:r>
-      <w:proofErr w:type="spellStart"/>
-      <w:r>
-        <w:rPr>
-          <w:rFonts w:cs="Times New Roman"/>
-          <w:color w:val="000000" w:themeColor="text1"/>
-          <w:sz w:val="20"/>
-        </w:rPr>
-        <w:t>November</w:t>
-      </w:r>
-      <w:proofErr w:type="spellEnd"/>
-      <w:r>
-        <w:rPr>
-          <w:rFonts w:cs="Times New Roman"/>
-          <w:color w:val="000000" w:themeColor="text1"/>
-          <w:sz w:val="20"/>
-        </w:rPr>
-        <w:t xml:space="preserve"> 30). https://charlesdegaulle-stpierredechandieu.ent.auvergnerhonealpes.fr/</w:t>
+        <w:t>(3), 255–284. https://doi.org/10.1080/15391523.2010.10782551</w:t>
       </w:r>
     </w:p>
     <w:p>
@@ -14502,32 +14923,10 @@
       <w:r>
         <w:rPr>
           <w:rFonts w:cs="Times New Roman"/>
-          <w:i/>
-          <w:iCs/>
           <w:color w:val="000000" w:themeColor="text1"/>
           <w:sz w:val="20"/>
         </w:rPr>
-        <w:t>Collège Charles de Gaulle, Saint-Pierre-de-Chandieu (69), avis et classement, toutes les infos et les spécialités—L’</w:t>
-      </w:r>
-      <w:proofErr w:type="spellStart"/>
-      <w:r>
-        <w:rPr>
-          <w:rFonts w:cs="Times New Roman"/>
-          <w:i/>
-          <w:iCs/>
-          <w:color w:val="000000" w:themeColor="text1"/>
-          <w:sz w:val="20"/>
-        </w:rPr>
-        <w:t>Etudiant</w:t>
-      </w:r>
-      <w:proofErr w:type="spellEnd"/>
-      <w:r>
-        <w:rPr>
-          <w:rFonts w:cs="Times New Roman"/>
-          <w:color w:val="000000" w:themeColor="text1"/>
-          <w:sz w:val="20"/>
-        </w:rPr>
-        <w:t xml:space="preserve">. </w:t>
+        <w:t xml:space="preserve">Feng, H., Li, K., &amp; Zhang, L. J. (2025). </w:t>
       </w:r>
       <w:r>
         <w:rPr>
@@ -14536,387 +14935,7 @@
           <w:sz w:val="20"/>
           <w:lang w:val="en-GB"/>
         </w:rPr>
-        <w:t>(n.d.). Retrieved May 30, 2026, from https://www.letudiant.fr/college/annuaire-des-colleges/fiche/college-charles-de-gaulle-69.html#presentation</w:t>
-      </w:r>
-    </w:p>
-    <w:p>
-      <w:pPr>
-        <w:pStyle w:val="Bibliography"/>
-        <w:rPr>
-          <w:rFonts w:cs="Times New Roman"/>
-          <w:color w:val="000000" w:themeColor="text1"/>
-          <w:sz w:val="20"/>
-        </w:rPr>
-      </w:pPr>
-      <w:r>
-        <w:rPr>
-          <w:rFonts w:cs="Times New Roman"/>
-          <w:color w:val="000000" w:themeColor="text1"/>
-          <w:sz w:val="20"/>
-          <w:lang w:val="en-GB"/>
-        </w:rPr>
-        <w:t xml:space="preserve">Davis, F. D. (1989). Perceived Usefulness, Perceived Ease of Use, and User Acceptance of Information Technology. </w:t>
-      </w:r>
-      <w:r>
-        <w:rPr>
-          <w:rFonts w:cs="Times New Roman"/>
-          <w:i/>
-          <w:iCs/>
-          <w:color w:val="000000" w:themeColor="text1"/>
-          <w:sz w:val="20"/>
-        </w:rPr>
-        <w:t xml:space="preserve">MIS </w:t>
-      </w:r>
-      <w:proofErr w:type="spellStart"/>
-      <w:r>
-        <w:rPr>
-          <w:rFonts w:cs="Times New Roman"/>
-          <w:i/>
-          <w:iCs/>
-          <w:color w:val="000000" w:themeColor="text1"/>
-          <w:sz w:val="20"/>
-        </w:rPr>
-        <w:t>Quarterly</w:t>
-      </w:r>
-      <w:proofErr w:type="spellEnd"/>
-      <w:r>
-        <w:rPr>
-          <w:rFonts w:cs="Times New Roman"/>
-          <w:color w:val="000000" w:themeColor="text1"/>
-          <w:sz w:val="20"/>
-        </w:rPr>
-        <w:t xml:space="preserve">, </w:t>
-      </w:r>
-      <w:r>
-        <w:rPr>
-          <w:rFonts w:cs="Times New Roman"/>
-          <w:i/>
-          <w:iCs/>
-          <w:color w:val="000000" w:themeColor="text1"/>
-          <w:sz w:val="20"/>
-        </w:rPr>
-        <w:t>13</w:t>
-      </w:r>
-      <w:r>
-        <w:rPr>
-          <w:rFonts w:cs="Times New Roman"/>
-          <w:color w:val="000000" w:themeColor="text1"/>
-          <w:sz w:val="20"/>
-        </w:rPr>
-        <w:t>(3), 319–340. https://doi.org/10.2307/249008</w:t>
-      </w:r>
-    </w:p>
-    <w:p>
-      <w:pPr>
-        <w:pStyle w:val="Bibliography"/>
-        <w:rPr>
-          <w:rFonts w:cs="Times New Roman"/>
-          <w:color w:val="000000" w:themeColor="text1"/>
-          <w:sz w:val="20"/>
-        </w:rPr>
-      </w:pPr>
-      <w:r>
-        <w:rPr>
-          <w:rFonts w:cs="Times New Roman"/>
-          <w:color w:val="000000" w:themeColor="text1"/>
-          <w:sz w:val="20"/>
-        </w:rPr>
-        <w:t xml:space="preserve">Devauchelle, B. (2025a). Les enseignants, les formateurs et les cadres éducatifs français face à l’intelligence artificielle. </w:t>
-      </w:r>
-      <w:r>
-        <w:rPr>
-          <w:rFonts w:cs="Times New Roman"/>
-          <w:i/>
-          <w:iCs/>
-          <w:color w:val="000000" w:themeColor="text1"/>
-          <w:sz w:val="20"/>
-        </w:rPr>
-        <w:t>Revue internationale d’éducation de Sèvres</w:t>
-      </w:r>
-      <w:r>
-        <w:rPr>
-          <w:rFonts w:cs="Times New Roman"/>
-          <w:color w:val="000000" w:themeColor="text1"/>
-          <w:sz w:val="20"/>
-        </w:rPr>
-        <w:t>, (HS-4). https://doi.org/10.4000/146vm</w:t>
-      </w:r>
-    </w:p>
-    <w:p>
-      <w:pPr>
-        <w:pStyle w:val="Bibliography"/>
-        <w:rPr>
-          <w:rFonts w:cs="Times New Roman"/>
-          <w:color w:val="000000" w:themeColor="text1"/>
-          <w:sz w:val="20"/>
-        </w:rPr>
-      </w:pPr>
-      <w:r>
-        <w:rPr>
-          <w:rFonts w:cs="Times New Roman"/>
-          <w:color w:val="000000" w:themeColor="text1"/>
-          <w:sz w:val="20"/>
-        </w:rPr>
-        <w:t xml:space="preserve">Devauchelle, B. (2025b, May 2). Enjeux économiques et politiques autour de l’IA à l’école. </w:t>
-      </w:r>
-      <w:r>
-        <w:rPr>
-          <w:rFonts w:cs="Times New Roman"/>
-          <w:i/>
-          <w:iCs/>
-          <w:color w:val="000000" w:themeColor="text1"/>
-          <w:sz w:val="20"/>
-        </w:rPr>
-        <w:t>Le Café pédagogique</w:t>
-      </w:r>
-      <w:r>
-        <w:rPr>
-          <w:rFonts w:cs="Times New Roman"/>
-          <w:color w:val="000000" w:themeColor="text1"/>
-          <w:sz w:val="20"/>
-        </w:rPr>
-        <w:t>. https://www.cafepedagogique.net/2025/05/02/enjeux-economiques-et-politiques-autour-de-lia-a-lecole/</w:t>
-      </w:r>
-    </w:p>
-    <w:p>
-      <w:pPr>
-        <w:pStyle w:val="Bibliography"/>
-        <w:rPr>
-          <w:rFonts w:cs="Times New Roman"/>
-          <w:color w:val="000000" w:themeColor="text1"/>
-          <w:sz w:val="20"/>
-          <w:lang w:val="en-GB"/>
-        </w:rPr>
-      </w:pPr>
-      <w:r>
-        <w:rPr>
-          <w:rFonts w:cs="Times New Roman"/>
-          <w:i/>
-          <w:iCs/>
-          <w:color w:val="000000" w:themeColor="text1"/>
-          <w:sz w:val="20"/>
-        </w:rPr>
-        <w:t xml:space="preserve">Devenir assistant de langue en France | France </w:t>
-      </w:r>
-      <w:proofErr w:type="spellStart"/>
-      <w:r>
-        <w:rPr>
-          <w:rFonts w:cs="Times New Roman"/>
-          <w:i/>
-          <w:iCs/>
-          <w:color w:val="000000" w:themeColor="text1"/>
-          <w:sz w:val="20"/>
-        </w:rPr>
-        <w:t>Education</w:t>
-      </w:r>
-      <w:proofErr w:type="spellEnd"/>
-      <w:r>
-        <w:rPr>
-          <w:rFonts w:cs="Times New Roman"/>
-          <w:i/>
-          <w:iCs/>
-          <w:color w:val="000000" w:themeColor="text1"/>
-          <w:sz w:val="20"/>
-        </w:rPr>
-        <w:t xml:space="preserve"> international</w:t>
-      </w:r>
-      <w:r>
-        <w:rPr>
-          <w:rFonts w:cs="Times New Roman"/>
-          <w:color w:val="000000" w:themeColor="text1"/>
-          <w:sz w:val="20"/>
-        </w:rPr>
-        <w:t xml:space="preserve">. </w:t>
-      </w:r>
-      <w:r>
-        <w:rPr>
-          <w:rFonts w:cs="Times New Roman"/>
-          <w:color w:val="000000" w:themeColor="text1"/>
-          <w:sz w:val="20"/>
-          <w:lang w:val="en-GB"/>
-        </w:rPr>
-        <w:t>(2021, May 10). https://www.france-education-international.fr/venir-en-france/devenir-assistant-de-langue-en-france</w:t>
-      </w:r>
-    </w:p>
-    <w:p>
-      <w:pPr>
-        <w:pStyle w:val="Bibliography"/>
-        <w:rPr>
-          <w:rFonts w:cs="Times New Roman"/>
-          <w:color w:val="000000" w:themeColor="text1"/>
-          <w:sz w:val="20"/>
-          <w:lang w:val="en-GB"/>
-        </w:rPr>
-      </w:pPr>
-      <w:r>
-        <w:rPr>
-          <w:rFonts w:cs="Times New Roman"/>
-          <w:i/>
-          <w:iCs/>
-          <w:color w:val="000000" w:themeColor="text1"/>
-          <w:sz w:val="20"/>
-        </w:rPr>
-        <w:lastRenderedPageBreak/>
-        <w:t>Droit national en vigueur—Jurisprudence—Jurisprudence administrative—Légifrance</w:t>
-      </w:r>
-      <w:r>
-        <w:rPr>
-          <w:rFonts w:cs="Times New Roman"/>
-          <w:color w:val="000000" w:themeColor="text1"/>
-          <w:sz w:val="20"/>
-        </w:rPr>
-        <w:t xml:space="preserve">. </w:t>
-      </w:r>
-      <w:r>
-        <w:rPr>
-          <w:rFonts w:cs="Times New Roman"/>
-          <w:color w:val="000000" w:themeColor="text1"/>
-          <w:sz w:val="20"/>
-          <w:lang w:val="en-GB"/>
-        </w:rPr>
-        <w:t>(2018, August 5). https://www.legifrance.gouv.fr/download/pdf?id=HFLUpbWxIOq4I6R3ktU6f-Z-PkK9A6thiDb3sgQcNsM=</w:t>
-      </w:r>
-    </w:p>
-    <w:p>
-      <w:pPr>
-        <w:pStyle w:val="Bibliography"/>
-        <w:rPr>
-          <w:rFonts w:cs="Times New Roman"/>
-          <w:color w:val="000000" w:themeColor="text1"/>
-          <w:sz w:val="20"/>
-        </w:rPr>
-      </w:pPr>
-      <w:proofErr w:type="gramStart"/>
-      <w:r>
-        <w:rPr>
-          <w:rFonts w:cs="Times New Roman"/>
-          <w:i/>
-          <w:iCs/>
-          <w:color w:val="000000" w:themeColor="text1"/>
-          <w:sz w:val="20"/>
-        </w:rPr>
-        <w:t>Enseignant:</w:t>
-      </w:r>
-      <w:proofErr w:type="gramEnd"/>
-      <w:r>
-        <w:rPr>
-          <w:rFonts w:cs="Times New Roman"/>
-          <w:i/>
-          <w:iCs/>
-          <w:color w:val="000000" w:themeColor="text1"/>
-          <w:sz w:val="20"/>
-        </w:rPr>
-        <w:t xml:space="preserve"> Comment utiliser un système d’IA dans le cadre de vos missions ?</w:t>
-      </w:r>
-      <w:r>
-        <w:rPr>
-          <w:rFonts w:cs="Times New Roman"/>
-          <w:color w:val="000000" w:themeColor="text1"/>
-          <w:sz w:val="20"/>
-        </w:rPr>
-        <w:t xml:space="preserve"> (2025, June 20). https://www.cnil.fr/fr/enseignant-usage-systeme-ia</w:t>
-      </w:r>
-    </w:p>
-    <w:p>
-      <w:pPr>
-        <w:pStyle w:val="Bibliography"/>
-        <w:rPr>
-          <w:rFonts w:cs="Times New Roman"/>
-          <w:color w:val="000000" w:themeColor="text1"/>
-          <w:sz w:val="20"/>
-          <w:lang w:val="en-GB"/>
-        </w:rPr>
-      </w:pPr>
-      <w:r>
-        <w:rPr>
-          <w:rFonts w:cs="Times New Roman"/>
-          <w:i/>
-          <w:iCs/>
-          <w:color w:val="000000" w:themeColor="text1"/>
-          <w:sz w:val="20"/>
-        </w:rPr>
-        <w:t xml:space="preserve">Enseigner au cycle 3 | </w:t>
-      </w:r>
-      <w:proofErr w:type="spellStart"/>
-      <w:r>
-        <w:rPr>
-          <w:rFonts w:cs="Times New Roman"/>
-          <w:i/>
-          <w:iCs/>
-          <w:color w:val="000000" w:themeColor="text1"/>
-          <w:sz w:val="20"/>
-        </w:rPr>
-        <w:t>éduscol</w:t>
-      </w:r>
-      <w:proofErr w:type="spellEnd"/>
-      <w:r>
-        <w:rPr>
-          <w:rFonts w:cs="Times New Roman"/>
-          <w:i/>
-          <w:iCs/>
-          <w:color w:val="000000" w:themeColor="text1"/>
-          <w:sz w:val="20"/>
-        </w:rPr>
-        <w:t xml:space="preserve"> | </w:t>
-      </w:r>
-      <w:proofErr w:type="gramStart"/>
-      <w:r>
-        <w:rPr>
-          <w:rFonts w:cs="Times New Roman"/>
-          <w:i/>
-          <w:iCs/>
-          <w:color w:val="000000" w:themeColor="text1"/>
-          <w:sz w:val="20"/>
-        </w:rPr>
-        <w:t>Ministère de l’Éducation</w:t>
-      </w:r>
-      <w:proofErr w:type="gramEnd"/>
-      <w:r>
-        <w:rPr>
-          <w:rFonts w:cs="Times New Roman"/>
-          <w:i/>
-          <w:iCs/>
-          <w:color w:val="000000" w:themeColor="text1"/>
-          <w:sz w:val="20"/>
-        </w:rPr>
-        <w:t xml:space="preserve"> nationale | Direction générale de l’enseignement scolaire</w:t>
-      </w:r>
-      <w:r>
-        <w:rPr>
-          <w:rFonts w:cs="Times New Roman"/>
-          <w:color w:val="000000" w:themeColor="text1"/>
-          <w:sz w:val="20"/>
-        </w:rPr>
-        <w:t xml:space="preserve">. </w:t>
-      </w:r>
-      <w:r>
-        <w:rPr>
-          <w:rFonts w:cs="Times New Roman"/>
-          <w:color w:val="000000" w:themeColor="text1"/>
-          <w:sz w:val="20"/>
-          <w:lang w:val="en-GB"/>
-        </w:rPr>
-        <w:t>(n.d.). Retrieved May 30, 2026, from https://eduscol.education.gouv.fr/4356/enseigner-au-cycle-3</w:t>
-      </w:r>
-    </w:p>
-    <w:p>
-      <w:pPr>
-        <w:pStyle w:val="Bibliography"/>
-        <w:rPr>
-          <w:rFonts w:cs="Times New Roman"/>
-          <w:color w:val="000000" w:themeColor="text1"/>
-          <w:sz w:val="20"/>
-          <w:lang w:val="en-GB"/>
-        </w:rPr>
-      </w:pPr>
-      <w:r>
-        <w:rPr>
-          <w:rFonts w:cs="Times New Roman"/>
-          <w:color w:val="000000" w:themeColor="text1"/>
-          <w:sz w:val="20"/>
-          <w:lang w:val="en-GB"/>
-        </w:rPr>
-        <w:t xml:space="preserve">Ertmer, P. A. (1999). Addressing first- and second-order barriers to change: Strategies for technology integration. </w:t>
+        <w:t xml:space="preserve">What does AI bring to second language writing? A systematic review (2014-2024). </w:t>
       </w:r>
       <w:r>
         <w:rPr>
@@ -14927,7 +14946,7 @@
           <w:sz w:val="20"/>
           <w:lang w:val="en-GB"/>
         </w:rPr>
-        <w:t>Educational Technology Research and Development</w:t>
+        <w:t>Language, Learning and Technology</w:t>
       </w:r>
       <w:r>
         <w:rPr>
@@ -14947,7 +14966,7 @@
           <w:sz w:val="20"/>
           <w:lang w:val="en-GB"/>
         </w:rPr>
-        <w:t>47</w:t>
+        <w:t>29</w:t>
       </w:r>
       <w:r>
         <w:rPr>
@@ -14956,7 +14975,7 @@
           <w:sz w:val="20"/>
           <w:lang w:val="en-GB"/>
         </w:rPr>
-        <w:t>(4), 47–61. https://doi.org/10.1007/BF02299597</w:t>
+        <w:t>, 1–27. https://doi.org/10.64152/10125/73629</w:t>
       </w:r>
     </w:p>
     <w:p>
@@ -14976,7 +14995,7 @@
           <w:sz w:val="20"/>
           <w:lang w:val="en-GB"/>
         </w:rPr>
-        <w:t xml:space="preserve">Ertmer, P. A., &amp; Ottenbreit-Leftwich, A. T. (2010). Teacher Technology Change: How Knowledge, Confidence, Beliefs, and Culture Intersect. </w:t>
+        <w:t xml:space="preserve">Godwin-Jones, R. (2023). </w:t>
       </w:r>
       <w:r>
         <w:rPr>
@@ -14987,7 +15006,7 @@
           <w:sz w:val="20"/>
           <w:lang w:val="en-GB"/>
         </w:rPr>
-        <w:t>Journal of Research on Technology in Education</w:t>
+        <w:t>Emerging spaces for language learning: AI bots, ambient intelligence, and the metaverse</w:t>
       </w:r>
       <w:r>
         <w:rPr>
@@ -14996,7 +15015,62 @@
           <w:sz w:val="20"/>
           <w:lang w:val="en-GB"/>
         </w:rPr>
-        <w:t xml:space="preserve">, </w:t>
+        <w:t>. https://www.lltjournal.org/item/10125-73501/</w:t>
+      </w:r>
+    </w:p>
+    <w:p>
+      <w:pPr>
+        <w:pStyle w:val="Bibliography"/>
+        <w:rPr>
+          <w:rFonts w:cs="Times New Roman"/>
+          <w:color w:val="000000" w:themeColor="text1"/>
+          <w:sz w:val="20"/>
+        </w:rPr>
+      </w:pPr>
+      <w:r>
+        <w:rPr>
+          <w:rFonts w:cs="Times New Roman"/>
+          <w:color w:val="000000" w:themeColor="text1"/>
+          <w:sz w:val="20"/>
+        </w:rPr>
+        <w:t xml:space="preserve">Goigoux, R. (2007). Un modèle d’analyse de l’activité des enseignants. </w:t>
+      </w:r>
+      <w:r>
+        <w:rPr>
+          <w:rFonts w:cs="Times New Roman"/>
+          <w:i/>
+          <w:iCs/>
+          <w:color w:val="000000" w:themeColor="text1"/>
+          <w:sz w:val="20"/>
+        </w:rPr>
+        <w:t>Éducation et didactique</w:t>
+      </w:r>
+      <w:r>
+        <w:rPr>
+          <w:rFonts w:cs="Times New Roman"/>
+          <w:color w:val="000000" w:themeColor="text1"/>
+          <w:sz w:val="20"/>
+        </w:rPr>
+        <w:t>, (1–3), Article 1–3. https://doi.org/10.4000/educationdidactique.232</w:t>
+      </w:r>
+    </w:p>
+    <w:p>
+      <w:pPr>
+        <w:pStyle w:val="Bibliography"/>
+        <w:rPr>
+          <w:rFonts w:cs="Times New Roman"/>
+          <w:color w:val="000000" w:themeColor="text1"/>
+          <w:sz w:val="20"/>
+          <w:lang w:val="en-GB"/>
+        </w:rPr>
+      </w:pPr>
+      <w:r>
+        <w:rPr>
+          <w:rFonts w:cs="Times New Roman"/>
+          <w:color w:val="000000" w:themeColor="text1"/>
+          <w:sz w:val="20"/>
+        </w:rPr>
+        <w:t xml:space="preserve">Hockly, N. (2023, April). </w:t>
       </w:r>
       <w:r>
         <w:rPr>
@@ -15007,7 +15081,7 @@
           <w:sz w:val="20"/>
           <w:lang w:val="en-GB"/>
         </w:rPr>
-        <w:t>42</w:t>
+        <w:t>Artificial Intelligence in English Language Teaching: The Good, the Bad and the Ugly</w:t>
       </w:r>
       <w:r>
         <w:rPr>
@@ -15016,7 +15090,7 @@
           <w:sz w:val="20"/>
           <w:lang w:val="en-GB"/>
         </w:rPr>
-        <w:t>(3), 255–284. https://doi.org/10.1080/15391523.2010.10782551</w:t>
+        <w:t>. https://doi.org/10.1177/00336882231168504</w:t>
       </w:r>
     </w:p>
     <w:p>
@@ -15034,17 +15108,9 @@
           <w:rFonts w:cs="Times New Roman"/>
           <w:color w:val="000000" w:themeColor="text1"/>
           <w:sz w:val="20"/>
-        </w:rPr>
-        <w:t xml:space="preserve">Feng, H., Li, K., &amp; Zhang, L. J. (2025). </w:t>
-      </w:r>
-      <w:r>
-        <w:rPr>
-          <w:rFonts w:cs="Times New Roman"/>
-          <w:color w:val="000000" w:themeColor="text1"/>
-          <w:sz w:val="20"/>
           <w:lang w:val="en-GB"/>
         </w:rPr>
-        <w:t xml:space="preserve">What does AI bring to second language writing? A systematic review (2014-2024). </w:t>
+        <w:t xml:space="preserve">Hollingsworth, S. (1989). </w:t>
       </w:r>
       <w:r>
         <w:rPr>
@@ -15055,7 +15121,7 @@
           <w:sz w:val="20"/>
           <w:lang w:val="en-GB"/>
         </w:rPr>
-        <w:t>Language, Learning and Technology</w:t>
+        <w:t>Prior Beliefs and Cognitive Change in Learning to Teach</w:t>
       </w:r>
       <w:r>
         <w:rPr>
@@ -15064,7 +15130,147 @@
           <w:sz w:val="20"/>
           <w:lang w:val="en-GB"/>
         </w:rPr>
+        <w:t>. https://doi.org/10.3102/00028312026002160</w:t>
+      </w:r>
+    </w:p>
+    <w:p>
+      <w:pPr>
+        <w:pStyle w:val="Bibliography"/>
+        <w:rPr>
+          <w:rFonts w:cs="Times New Roman"/>
+          <w:color w:val="000000" w:themeColor="text1"/>
+          <w:sz w:val="20"/>
+        </w:rPr>
+      </w:pPr>
+      <w:r>
+        <w:rPr>
+          <w:rFonts w:cs="Times New Roman"/>
+          <w:color w:val="000000" w:themeColor="text1"/>
+          <w:sz w:val="20"/>
+          <w:lang w:val="en-GB"/>
+        </w:rPr>
+        <w:t xml:space="preserve">Kohnke, L., Moorhouse, B., &amp; Zou, D. (2023). ChatGPT for Language Teaching and Learning. </w:t>
+      </w:r>
+      <w:r>
+        <w:rPr>
+          <w:rFonts w:cs="Times New Roman"/>
+          <w:i/>
+          <w:iCs/>
+          <w:color w:val="000000" w:themeColor="text1"/>
+          <w:sz w:val="20"/>
+        </w:rPr>
+        <w:t>RELC Journal</w:t>
+      </w:r>
+      <w:r>
+        <w:rPr>
+          <w:rFonts w:cs="Times New Roman"/>
+          <w:color w:val="000000" w:themeColor="text1"/>
+          <w:sz w:val="20"/>
+        </w:rPr>
         <w:t xml:space="preserve">, </w:t>
+      </w:r>
+      <w:r>
+        <w:rPr>
+          <w:rFonts w:cs="Times New Roman"/>
+          <w:i/>
+          <w:iCs/>
+          <w:color w:val="000000" w:themeColor="text1"/>
+          <w:sz w:val="20"/>
+        </w:rPr>
+        <w:t>54</w:t>
+      </w:r>
+      <w:r>
+        <w:rPr>
+          <w:rFonts w:cs="Times New Roman"/>
+          <w:color w:val="000000" w:themeColor="text1"/>
+          <w:sz w:val="20"/>
+        </w:rPr>
+        <w:t>. https://doi.org/10.1177/00336882231162868</w:t>
+      </w:r>
+    </w:p>
+    <w:p>
+      <w:pPr>
+        <w:pStyle w:val="Bibliography"/>
+        <w:rPr>
+          <w:rFonts w:cs="Times New Roman"/>
+          <w:color w:val="000000" w:themeColor="text1"/>
+          <w:sz w:val="20"/>
+        </w:rPr>
+      </w:pPr>
+      <w:r>
+        <w:rPr>
+          <w:rFonts w:cs="Times New Roman"/>
+          <w:color w:val="000000" w:themeColor="text1"/>
+          <w:sz w:val="20"/>
+        </w:rPr>
+        <w:t xml:space="preserve">l’Europe, C. de. (2022). </w:t>
+      </w:r>
+      <w:r>
+        <w:rPr>
+          <w:rFonts w:cs="Times New Roman"/>
+          <w:i/>
+          <w:iCs/>
+          <w:color w:val="000000" w:themeColor="text1"/>
+          <w:sz w:val="20"/>
+        </w:rPr>
+        <w:t>Cadre européen commun de référence pour les langues: Apprendre, enseigner, évaluer: Volume complémentaire</w:t>
+      </w:r>
+      <w:r>
+        <w:rPr>
+          <w:rFonts w:cs="Times New Roman"/>
+          <w:color w:val="000000" w:themeColor="text1"/>
+          <w:sz w:val="20"/>
+        </w:rPr>
+        <w:t>. Council of Europe.</w:t>
+      </w:r>
+    </w:p>
+    <w:p>
+      <w:pPr>
+        <w:pStyle w:val="Bibliography"/>
+        <w:rPr>
+          <w:rFonts w:cs="Times New Roman"/>
+          <w:color w:val="000000" w:themeColor="text1"/>
+          <w:sz w:val="20"/>
+        </w:rPr>
+      </w:pPr>
+      <w:r>
+        <w:rPr>
+          <w:rFonts w:cs="Times New Roman"/>
+          <w:i/>
+          <w:iCs/>
+          <w:color w:val="000000" w:themeColor="text1"/>
+          <w:sz w:val="20"/>
+        </w:rPr>
+        <w:t>La protection des élèves et de leurs données sur Internet</w:t>
+      </w:r>
+      <w:r>
+        <w:rPr>
+          <w:rFonts w:cs="Times New Roman"/>
+          <w:color w:val="000000" w:themeColor="text1"/>
+          <w:sz w:val="20"/>
+        </w:rPr>
+        <w:t>. (2019, November 7). Ministère de l’Education nationale. https://www.education.gouv.fr/la-protection-des-eleves-et-de-leurs-donnees-sur-internet-7073</w:t>
+      </w:r>
+    </w:p>
+    <w:p>
+      <w:pPr>
+        <w:pStyle w:val="Bibliography"/>
+        <w:rPr>
+          <w:rFonts w:cs="Times New Roman"/>
+          <w:color w:val="000000" w:themeColor="text1"/>
+          <w:sz w:val="20"/>
+          <w:lang w:val="en-GB"/>
+        </w:rPr>
+      </w:pPr>
+      <w:r>
+        <w:rPr>
+          <w:rFonts w:cs="Times New Roman"/>
+          <w:color w:val="000000" w:themeColor="text1"/>
+          <w:sz w:val="20"/>
+          <w:lang w:val="en-GB"/>
+        </w:rPr>
+        <w:lastRenderedPageBreak/>
+        <w:t xml:space="preserve">Lee, S. (2024). </w:t>
       </w:r>
       <w:r>
         <w:rPr>
@@ -15075,7 +15281,7 @@
           <w:sz w:val="20"/>
           <w:lang w:val="en-GB"/>
         </w:rPr>
-        <w:t>29</w:t>
+        <w:t>Enhancing pre-service EFL teachers’ TPACK through chatbot-integrated lesson planning projects</w:t>
       </w:r>
       <w:r>
         <w:rPr>
@@ -15084,27 +15290,26 @@
           <w:sz w:val="20"/>
           <w:lang w:val="en-GB"/>
         </w:rPr>
-        <w:t>, 1–27. https://doi.org/10.64152/10125/73629</w:t>
+        <w:t>.</w:t>
       </w:r>
     </w:p>
     <w:p>
       <w:pPr>
         <w:pStyle w:val="Bibliography"/>
+        <w:rPr>
+          <w:rFonts w:cs="Times New Roman"/>
+          <w:color w:val="000000" w:themeColor="text1"/>
+          <w:sz w:val="20"/>
+        </w:rPr>
+      </w:pPr>
+      <w:r>
         <w:rPr>
           <w:rFonts w:cs="Times New Roman"/>
           <w:color w:val="000000" w:themeColor="text1"/>
           <w:sz w:val="20"/>
           <w:lang w:val="en-GB"/>
         </w:rPr>
-      </w:pPr>
-      <w:r>
-        <w:rPr>
-          <w:rFonts w:cs="Times New Roman"/>
-          <w:color w:val="000000" w:themeColor="text1"/>
-          <w:sz w:val="20"/>
-          <w:lang w:val="en-GB"/>
-        </w:rPr>
-        <w:t xml:space="preserve">Godwin-Jones, R. (2023). </w:t>
+        <w:t xml:space="preserve">Liu, Y., &amp; Wang, H. (2024). </w:t>
       </w:r>
       <w:r>
         <w:rPr>
@@ -15115,7 +15320,7 @@
           <w:sz w:val="20"/>
           <w:lang w:val="en-GB"/>
         </w:rPr>
-        <w:t>Emerging spaces for language learning: AI bots, ambient intelligence, and the metaverse</w:t>
+        <w:t>Who on Earth Is Using Generative AI ?</w:t>
       </w:r>
       <w:r>
         <w:rPr>
@@ -15124,26 +15329,54 @@
           <w:sz w:val="20"/>
           <w:lang w:val="en-GB"/>
         </w:rPr>
-        <w:t>. https://www.lltjournal.org/item/10125-73501/</w:t>
-      </w:r>
-    </w:p>
-    <w:p>
-      <w:pPr>
-        <w:pStyle w:val="Bibliography"/>
+        <w:t xml:space="preserve"> </w:t>
+      </w:r>
+      <w:r>
         <w:rPr>
           <w:rFonts w:cs="Times New Roman"/>
           <w:color w:val="000000" w:themeColor="text1"/>
           <w:sz w:val="20"/>
         </w:rPr>
-      </w:pPr>
-      <w:r>
+        <w:t>Washington, DC: World Bank. https://doi.org/10.1596/1813-9450-10870</w:t>
+      </w:r>
+    </w:p>
+    <w:p>
+      <w:pPr>
+        <w:pStyle w:val="Bibliography"/>
         <w:rPr>
           <w:rFonts w:cs="Times New Roman"/>
           <w:color w:val="000000" w:themeColor="text1"/>
           <w:sz w:val="20"/>
-        </w:rPr>
-        <w:t xml:space="preserve">Goigoux, R. (2007). Un modèle d’analyse de l’activité des enseignants. </w:t>
-      </w:r>
+          <w:lang w:val="en-GB"/>
+        </w:rPr>
+      </w:pPr>
+      <w:r>
+        <w:rPr>
+          <w:rFonts w:cs="Times New Roman"/>
+          <w:color w:val="000000" w:themeColor="text1"/>
+          <w:sz w:val="20"/>
+        </w:rPr>
+        <w:t xml:space="preserve">LOI N° 2005-380 Du 23 Avril 2005 d’orientation et de Programme Pour l’avenir de l’école (1) - Légifrance, LOI n° 2005-380. </w:t>
+      </w:r>
+      <w:r>
+        <w:rPr>
+          <w:rFonts w:cs="Times New Roman"/>
+          <w:color w:val="000000" w:themeColor="text1"/>
+          <w:sz w:val="20"/>
+          <w:lang w:val="en-GB"/>
+        </w:rPr>
+        <w:t>Retrieved May 30, 2026, from https://www.legifrance.gouv.fr/jorf/id/JORFTEXT000000259787/</w:t>
+      </w:r>
+    </w:p>
+    <w:p>
+      <w:pPr>
+        <w:pStyle w:val="Bibliography"/>
+        <w:rPr>
+          <w:rFonts w:cs="Times New Roman"/>
+          <w:color w:val="000000" w:themeColor="text1"/>
+          <w:sz w:val="20"/>
+        </w:rPr>
+      </w:pPr>
       <w:r>
         <w:rPr>
           <w:rFonts w:cs="Times New Roman"/>
@@ -15152,7 +15385,7 @@
           <w:color w:val="000000" w:themeColor="text1"/>
           <w:sz w:val="20"/>
         </w:rPr>
-        <w:t>Éducation et didactique</w:t>
+        <w:t>Ministère de l’Education nationale 2025a</w:t>
       </w:r>
       <w:r>
         <w:rPr>
@@ -15160,7 +15393,7 @@
           <w:color w:val="000000" w:themeColor="text1"/>
           <w:sz w:val="20"/>
         </w:rPr>
-        <w:t>, (1–3), Article 1–3. https://doi.org/10.4000/educationdidactique.232</w:t>
+        <w:t>. (2025, June 13). Ministère de l’Education nationale. https://www.education.gouv.fr/cadre-d-usage-de-l-ia-en-education-450647</w:t>
       </w:r>
     </w:p>
     <w:p>
@@ -15173,23 +15406,14 @@
           <w:lang w:val="en-GB"/>
         </w:rPr>
       </w:pPr>
-      <w:proofErr w:type="spellStart"/>
       <w:r>
         <w:rPr>
           <w:rFonts w:cs="Times New Roman"/>
           <w:color w:val="000000" w:themeColor="text1"/>
           <w:sz w:val="20"/>
-        </w:rPr>
-        <w:t>Hockly</w:t>
-      </w:r>
-      <w:proofErr w:type="spellEnd"/>
-      <w:r>
-        <w:rPr>
-          <w:rFonts w:cs="Times New Roman"/>
-          <w:color w:val="000000" w:themeColor="text1"/>
-          <w:sz w:val="20"/>
-        </w:rPr>
-        <w:t xml:space="preserve">, N. (2023, April). </w:t>
+          <w:lang w:val="en-GB"/>
+        </w:rPr>
+        <w:t xml:space="preserve">Mishra, P., Henriksen, D., Woo, L. J., &amp; Oster, N. (2025). Control vs. Agency: Exploring the History of AI in Education. </w:t>
       </w:r>
       <w:r>
         <w:rPr>
@@ -15200,7 +15424,7 @@
           <w:sz w:val="20"/>
           <w:lang w:val="en-GB"/>
         </w:rPr>
-        <w:t>Artificial Intelligence in English Language Teaching: The Good, the Bad and the Ugly</w:t>
+        <w:t>TechTrends</w:t>
       </w:r>
       <w:r>
         <w:rPr>
@@ -15209,27 +15433,7 @@
           <w:sz w:val="20"/>
           <w:lang w:val="en-GB"/>
         </w:rPr>
-        <w:t>. https://doi.org/10.1177/00336882231168504</w:t>
-      </w:r>
-    </w:p>
-    <w:p>
-      <w:pPr>
-        <w:pStyle w:val="Bibliography"/>
-        <w:rPr>
-          <w:rFonts w:cs="Times New Roman"/>
-          <w:color w:val="000000" w:themeColor="text1"/>
-          <w:sz w:val="20"/>
-          <w:lang w:val="en-GB"/>
-        </w:rPr>
-      </w:pPr>
-      <w:r>
-        <w:rPr>
-          <w:rFonts w:cs="Times New Roman"/>
-          <w:color w:val="000000" w:themeColor="text1"/>
-          <w:sz w:val="20"/>
-          <w:lang w:val="en-GB"/>
-        </w:rPr>
-        <w:t xml:space="preserve">Hollingsworth, S. (1989). </w:t>
+        <w:t xml:space="preserve">, </w:t>
       </w:r>
       <w:r>
         <w:rPr>
@@ -15240,7 +15444,7 @@
           <w:sz w:val="20"/>
           <w:lang w:val="en-GB"/>
         </w:rPr>
-        <w:t>Prior Beliefs and Cognitive Change in Learning to Teach</w:t>
+        <w:t>69</w:t>
       </w:r>
       <w:r>
         <w:rPr>
@@ -15249,237 +15453,27 @@
           <w:sz w:val="20"/>
           <w:lang w:val="en-GB"/>
         </w:rPr>
-        <w:t>. https://doi.org/10.3102/00028312026002160</w:t>
+        <w:t>(2), 247–253. https://doi.org/10.1007/s11528-025-01064-2</w:t>
       </w:r>
     </w:p>
     <w:p>
       <w:pPr>
         <w:pStyle w:val="Bibliography"/>
-        <w:rPr>
-          <w:rFonts w:cs="Times New Roman"/>
-          <w:color w:val="000000" w:themeColor="text1"/>
-          <w:sz w:val="20"/>
-        </w:rPr>
-      </w:pPr>
-      <w:r>
         <w:rPr>
           <w:rFonts w:cs="Times New Roman"/>
           <w:color w:val="000000" w:themeColor="text1"/>
           <w:sz w:val="20"/>
           <w:lang w:val="en-GB"/>
         </w:rPr>
-        <w:t xml:space="preserve">Kohnke, L., Moorhouse, B., &amp; Zou, D. (2023). ChatGPT for Language Teaching and Learning. </w:t>
-      </w:r>
-      <w:r>
-        <w:rPr>
-          <w:rFonts w:cs="Times New Roman"/>
-          <w:i/>
-          <w:iCs/>
-          <w:color w:val="000000" w:themeColor="text1"/>
-          <w:sz w:val="20"/>
-        </w:rPr>
-        <w:t>RELC Journal</w:t>
-      </w:r>
-      <w:r>
-        <w:rPr>
-          <w:rFonts w:cs="Times New Roman"/>
-          <w:color w:val="000000" w:themeColor="text1"/>
-          <w:sz w:val="20"/>
-        </w:rPr>
-        <w:t xml:space="preserve">, </w:t>
-      </w:r>
-      <w:r>
-        <w:rPr>
-          <w:rFonts w:cs="Times New Roman"/>
-          <w:i/>
-          <w:iCs/>
-          <w:color w:val="000000" w:themeColor="text1"/>
-          <w:sz w:val="20"/>
-        </w:rPr>
-        <w:t>54</w:t>
-      </w:r>
-      <w:r>
-        <w:rPr>
-          <w:rFonts w:cs="Times New Roman"/>
-          <w:color w:val="000000" w:themeColor="text1"/>
-          <w:sz w:val="20"/>
-        </w:rPr>
-        <w:t>. https://doi.org/10.1177/00336882231162868</w:t>
-      </w:r>
-    </w:p>
-    <w:p>
-      <w:pPr>
-        <w:pStyle w:val="Bibliography"/>
-        <w:rPr>
-          <w:rFonts w:cs="Times New Roman"/>
-          <w:color w:val="000000" w:themeColor="text1"/>
-          <w:sz w:val="20"/>
-        </w:rPr>
-      </w:pPr>
-      <w:proofErr w:type="gramStart"/>
-      <w:r>
-        <w:rPr>
-          <w:rFonts w:cs="Times New Roman"/>
-          <w:color w:val="000000" w:themeColor="text1"/>
-          <w:sz w:val="20"/>
-        </w:rPr>
-        <w:t>l’Europe</w:t>
-      </w:r>
-      <w:proofErr w:type="gramEnd"/>
-      <w:r>
-        <w:rPr>
-          <w:rFonts w:cs="Times New Roman"/>
-          <w:color w:val="000000" w:themeColor="text1"/>
-          <w:sz w:val="20"/>
-        </w:rPr>
-        <w:t xml:space="preserve">, C. de. (2022). </w:t>
-      </w:r>
-      <w:r>
-        <w:rPr>
-          <w:rFonts w:cs="Times New Roman"/>
-          <w:i/>
-          <w:iCs/>
-          <w:color w:val="000000" w:themeColor="text1"/>
-          <w:sz w:val="20"/>
-        </w:rPr>
-        <w:t xml:space="preserve">Cadre européen commun de référence pour les </w:t>
-      </w:r>
-      <w:proofErr w:type="gramStart"/>
-      <w:r>
-        <w:rPr>
-          <w:rFonts w:cs="Times New Roman"/>
-          <w:i/>
-          <w:iCs/>
-          <w:color w:val="000000" w:themeColor="text1"/>
-          <w:sz w:val="20"/>
-        </w:rPr>
-        <w:t>langues:</w:t>
-      </w:r>
-      <w:proofErr w:type="gramEnd"/>
-      <w:r>
-        <w:rPr>
-          <w:rFonts w:cs="Times New Roman"/>
-          <w:i/>
-          <w:iCs/>
-          <w:color w:val="000000" w:themeColor="text1"/>
-          <w:sz w:val="20"/>
-        </w:rPr>
-        <w:t xml:space="preserve"> Apprendre, enseigner, </w:t>
-      </w:r>
-      <w:proofErr w:type="gramStart"/>
-      <w:r>
-        <w:rPr>
-          <w:rFonts w:cs="Times New Roman"/>
-          <w:i/>
-          <w:iCs/>
-          <w:color w:val="000000" w:themeColor="text1"/>
-          <w:sz w:val="20"/>
-        </w:rPr>
-        <w:t>évaluer:</w:t>
-      </w:r>
-      <w:proofErr w:type="gramEnd"/>
-      <w:r>
-        <w:rPr>
-          <w:rFonts w:cs="Times New Roman"/>
-          <w:i/>
-          <w:iCs/>
-          <w:color w:val="000000" w:themeColor="text1"/>
-          <w:sz w:val="20"/>
-        </w:rPr>
-        <w:t xml:space="preserve"> Volume complémentaire</w:t>
-      </w:r>
-      <w:r>
-        <w:rPr>
-          <w:rFonts w:cs="Times New Roman"/>
-          <w:color w:val="000000" w:themeColor="text1"/>
-          <w:sz w:val="20"/>
-        </w:rPr>
-        <w:t>. Council of Europe.</w:t>
-      </w:r>
-    </w:p>
-    <w:p>
-      <w:pPr>
-        <w:pStyle w:val="Bibliography"/>
-        <w:rPr>
-          <w:rFonts w:cs="Times New Roman"/>
-          <w:color w:val="000000" w:themeColor="text1"/>
-          <w:sz w:val="20"/>
-        </w:rPr>
-      </w:pPr>
-      <w:r>
-        <w:rPr>
-          <w:rFonts w:cs="Times New Roman"/>
-          <w:i/>
-          <w:iCs/>
-          <w:color w:val="000000" w:themeColor="text1"/>
-          <w:sz w:val="20"/>
-        </w:rPr>
-        <w:t>La protection des élèves et de leurs données sur Internet</w:t>
-      </w:r>
-      <w:r>
-        <w:rPr>
-          <w:rFonts w:cs="Times New Roman"/>
-          <w:color w:val="000000" w:themeColor="text1"/>
-          <w:sz w:val="20"/>
-        </w:rPr>
-        <w:t xml:space="preserve">. (2019, </w:t>
-      </w:r>
-      <w:proofErr w:type="spellStart"/>
-      <w:r>
-        <w:rPr>
-          <w:rFonts w:cs="Times New Roman"/>
-          <w:color w:val="000000" w:themeColor="text1"/>
-          <w:sz w:val="20"/>
-        </w:rPr>
-        <w:t>November</w:t>
-      </w:r>
-      <w:proofErr w:type="spellEnd"/>
-      <w:r>
-        <w:rPr>
-          <w:rFonts w:cs="Times New Roman"/>
-          <w:color w:val="000000" w:themeColor="text1"/>
-          <w:sz w:val="20"/>
-        </w:rPr>
-        <w:t xml:space="preserve"> 7). Ministère de l’</w:t>
-      </w:r>
-      <w:proofErr w:type="spellStart"/>
-      <w:r>
-        <w:rPr>
-          <w:rFonts w:cs="Times New Roman"/>
-          <w:color w:val="000000" w:themeColor="text1"/>
-          <w:sz w:val="20"/>
-        </w:rPr>
-        <w:t>Education</w:t>
-      </w:r>
-      <w:proofErr w:type="spellEnd"/>
-      <w:r>
-        <w:rPr>
-          <w:rFonts w:cs="Times New Roman"/>
-          <w:color w:val="000000" w:themeColor="text1"/>
-          <w:sz w:val="20"/>
-        </w:rPr>
-        <w:t xml:space="preserve"> nationale. https://www.education.gouv.fr/la-protection-des-eleves-et-de-leurs-donnees-sur-internet-7073</w:t>
-      </w:r>
-    </w:p>
-    <w:p>
-      <w:pPr>
-        <w:pStyle w:val="Bibliography"/>
+      </w:pPr>
+      <w:r>
         <w:rPr>
           <w:rFonts w:cs="Times New Roman"/>
           <w:color w:val="000000" w:themeColor="text1"/>
           <w:sz w:val="20"/>
           <w:lang w:val="en-GB"/>
         </w:rPr>
-      </w:pPr>
-      <w:r>
-        <w:rPr>
-          <w:rFonts w:cs="Times New Roman"/>
-          <w:color w:val="000000" w:themeColor="text1"/>
-          <w:sz w:val="20"/>
-          <w:lang w:val="en-GB"/>
-        </w:rPr>
-        <w:lastRenderedPageBreak/>
-        <w:t xml:space="preserve">Lee, S. (2024). </w:t>
+        <w:t xml:space="preserve">Morgan, K. L. K. (2025). Phonemic Awareness and AI: Evaluating ChatGPT Plus for Structured Lesson Development. </w:t>
       </w:r>
       <w:r>
         <w:rPr>
@@ -15490,7 +15484,7 @@
           <w:sz w:val="20"/>
           <w:lang w:val="en-GB"/>
         </w:rPr>
-        <w:t>Enhancing pre-service EFL teachers’ TPACK through chatbot-integrated lesson planning projects</w:t>
+        <w:t>Texas Journal of Literacy Education</w:t>
       </w:r>
       <w:r>
         <w:rPr>
@@ -15499,26 +15493,7 @@
           <w:sz w:val="20"/>
           <w:lang w:val="en-GB"/>
         </w:rPr>
-        <w:t>.</w:t>
-      </w:r>
-    </w:p>
-    <w:p>
-      <w:pPr>
-        <w:pStyle w:val="Bibliography"/>
-        <w:rPr>
-          <w:rFonts w:cs="Times New Roman"/>
-          <w:color w:val="000000" w:themeColor="text1"/>
-          <w:sz w:val="20"/>
-        </w:rPr>
-      </w:pPr>
-      <w:r>
-        <w:rPr>
-          <w:rFonts w:cs="Times New Roman"/>
-          <w:color w:val="000000" w:themeColor="text1"/>
-          <w:sz w:val="20"/>
-          <w:lang w:val="en-GB"/>
-        </w:rPr>
-        <w:t xml:space="preserve">Liu, Y., &amp; Wang, H. (2024). </w:t>
+        <w:t xml:space="preserve">, </w:t>
       </w:r>
       <w:r>
         <w:rPr>
@@ -15529,9 +15504,73 @@
           <w:sz w:val="20"/>
           <w:lang w:val="en-GB"/>
         </w:rPr>
-        <w:t xml:space="preserve">Who on Earth Is Using Generative </w:t>
-      </w:r>
-      <w:proofErr w:type="gramStart"/>
+        <w:t>12</w:t>
+      </w:r>
+      <w:r>
+        <w:rPr>
+          <w:rFonts w:cs="Times New Roman"/>
+          <w:color w:val="000000" w:themeColor="text1"/>
+          <w:sz w:val="20"/>
+          <w:lang w:val="en-GB"/>
+        </w:rPr>
+        <w:t>(1). https://www.talejournal.com/index.php/TJLE/article/view/175</w:t>
+      </w:r>
+    </w:p>
+    <w:p>
+      <w:pPr>
+        <w:pStyle w:val="Bibliography"/>
+        <w:rPr>
+          <w:rFonts w:cs="Times New Roman"/>
+          <w:color w:val="000000" w:themeColor="text1"/>
+          <w:sz w:val="20"/>
+        </w:rPr>
+      </w:pPr>
+      <w:r>
+        <w:rPr>
+          <w:rFonts w:cs="Times New Roman"/>
+          <w:color w:val="000000" w:themeColor="text1"/>
+          <w:sz w:val="20"/>
+        </w:rPr>
+        <w:t xml:space="preserve">Ollivier, C. (2018). </w:t>
+      </w:r>
+      <w:r>
+        <w:rPr>
+          <w:rFonts w:cs="Times New Roman"/>
+          <w:i/>
+          <w:iCs/>
+          <w:color w:val="000000" w:themeColor="text1"/>
+          <w:sz w:val="20"/>
+        </w:rPr>
+        <w:t>Littératie numérique et approche socio-interactionnelle pour l’enseignement-apprentissage des langues</w:t>
+      </w:r>
+      <w:r>
+        <w:rPr>
+          <w:rFonts w:cs="Times New Roman"/>
+          <w:color w:val="000000" w:themeColor="text1"/>
+          <w:sz w:val="20"/>
+        </w:rPr>
+        <w:t>.</w:t>
+      </w:r>
+    </w:p>
+    <w:p>
+      <w:pPr>
+        <w:pStyle w:val="Bibliography"/>
+        <w:rPr>
+          <w:rFonts w:cs="Times New Roman"/>
+          <w:color w:val="000000" w:themeColor="text1"/>
+          <w:sz w:val="20"/>
+          <w:lang w:val="en-GB"/>
+        </w:rPr>
+      </w:pPr>
+      <w:r>
+        <w:rPr>
+          <w:rFonts w:cs="Times New Roman"/>
+          <w:color w:val="000000" w:themeColor="text1"/>
+          <w:sz w:val="20"/>
+          <w:lang w:val="en-GB"/>
+        </w:rPr>
+        <w:t xml:space="preserve">Richards, J. C. (1998). </w:t>
+      </w:r>
       <w:r>
         <w:rPr>
           <w:rFonts w:cs="Times New Roman"/>
@@ -15541,9 +15580,8 @@
           <w:sz w:val="20"/>
           <w:lang w:val="en-GB"/>
         </w:rPr>
-        <w:t>AI ?</w:t>
-      </w:r>
-      <w:proofErr w:type="gramEnd"/>
+        <w:t>Beyond Training: Perspectives on Language Teacher Education</w:t>
+      </w:r>
       <w:r>
         <w:rPr>
           <w:rFonts w:cs="Times New Roman"/>
@@ -15551,33 +15589,7 @@
           <w:sz w:val="20"/>
           <w:lang w:val="en-GB"/>
         </w:rPr>
-        <w:t xml:space="preserve"> </w:t>
-      </w:r>
-      <w:r>
-        <w:rPr>
-          <w:rFonts w:cs="Times New Roman"/>
-          <w:color w:val="000000" w:themeColor="text1"/>
-          <w:sz w:val="20"/>
-        </w:rPr>
-        <w:t xml:space="preserve">Washington, </w:t>
-      </w:r>
-      <w:proofErr w:type="gramStart"/>
-      <w:r>
-        <w:rPr>
-          <w:rFonts w:cs="Times New Roman"/>
-          <w:color w:val="000000" w:themeColor="text1"/>
-          <w:sz w:val="20"/>
-        </w:rPr>
-        <w:t>DC:</w:t>
-      </w:r>
-      <w:proofErr w:type="gramEnd"/>
-      <w:r>
-        <w:rPr>
-          <w:rFonts w:cs="Times New Roman"/>
-          <w:color w:val="000000" w:themeColor="text1"/>
-          <w:sz w:val="20"/>
-        </w:rPr>
-        <w:t xml:space="preserve"> World Bank. https://doi.org/10.1596/1813-9450-10870</w:t>
+        <w:t>. Cambridge University Press.</w:t>
       </w:r>
     </w:p>
     <w:p>
@@ -15595,107 +15607,10 @@
           <w:rFonts w:cs="Times New Roman"/>
           <w:color w:val="000000" w:themeColor="text1"/>
           <w:sz w:val="20"/>
-        </w:rPr>
-        <w:t xml:space="preserve">LOI N° 2005-380 Du 23 Avril 2005 d’orientation et de Programme Pour l’avenir de l’école (1) - Légifrance, LOI n° 2005-380. </w:t>
-      </w:r>
-      <w:r>
-        <w:rPr>
-          <w:rFonts w:cs="Times New Roman"/>
-          <w:color w:val="000000" w:themeColor="text1"/>
-          <w:sz w:val="20"/>
           <w:lang w:val="en-GB"/>
         </w:rPr>
-        <w:t>Retrieved May 30, 2026, from https://www.legifrance.gouv.fr/jorf/id/JORFTEXT000000259787/</w:t>
-      </w:r>
-    </w:p>
-    <w:p>
-      <w:pPr>
-        <w:pStyle w:val="Bibliography"/>
-        <w:rPr>
-          <w:rFonts w:cs="Times New Roman"/>
-          <w:color w:val="000000" w:themeColor="text1"/>
-          <w:sz w:val="20"/>
-        </w:rPr>
-      </w:pPr>
-      <w:r>
-        <w:rPr>
-          <w:rFonts w:cs="Times New Roman"/>
-          <w:i/>
-          <w:iCs/>
-          <w:color w:val="000000" w:themeColor="text1"/>
-          <w:sz w:val="20"/>
-        </w:rPr>
-        <w:t>Ministère de l’</w:t>
-      </w:r>
-      <w:proofErr w:type="spellStart"/>
-      <w:r>
-        <w:rPr>
-          <w:rFonts w:cs="Times New Roman"/>
-          <w:i/>
-          <w:iCs/>
-          <w:color w:val="000000" w:themeColor="text1"/>
-          <w:sz w:val="20"/>
-        </w:rPr>
-        <w:t>Education</w:t>
-      </w:r>
-      <w:proofErr w:type="spellEnd"/>
-      <w:r>
-        <w:rPr>
-          <w:rFonts w:cs="Times New Roman"/>
-          <w:i/>
-          <w:iCs/>
-          <w:color w:val="000000" w:themeColor="text1"/>
-          <w:sz w:val="20"/>
-        </w:rPr>
-        <w:t xml:space="preserve"> nationale 2025a</w:t>
-      </w:r>
-      <w:r>
-        <w:rPr>
-          <w:rFonts w:cs="Times New Roman"/>
-          <w:color w:val="000000" w:themeColor="text1"/>
-          <w:sz w:val="20"/>
-        </w:rPr>
-        <w:t>. (2025, June 13). Ministère de l’</w:t>
-      </w:r>
-      <w:proofErr w:type="spellStart"/>
-      <w:r>
-        <w:rPr>
-          <w:rFonts w:cs="Times New Roman"/>
-          <w:color w:val="000000" w:themeColor="text1"/>
-          <w:sz w:val="20"/>
-        </w:rPr>
-        <w:t>Education</w:t>
-      </w:r>
-      <w:proofErr w:type="spellEnd"/>
-      <w:r>
-        <w:rPr>
-          <w:rFonts w:cs="Times New Roman"/>
-          <w:color w:val="000000" w:themeColor="text1"/>
-          <w:sz w:val="20"/>
-        </w:rPr>
-        <w:t xml:space="preserve"> nationale. https://www.education.gouv.fr/cadre-d-usage-de-l-ia-en-education-450647</w:t>
-      </w:r>
-    </w:p>
-    <w:p>
-      <w:pPr>
-        <w:pStyle w:val="Bibliography"/>
-        <w:rPr>
-          <w:rFonts w:cs="Times New Roman"/>
-          <w:color w:val="000000" w:themeColor="text1"/>
-          <w:sz w:val="20"/>
-          <w:lang w:val="en-GB"/>
-        </w:rPr>
-      </w:pPr>
-      <w:r>
-        <w:rPr>
-          <w:rFonts w:cs="Times New Roman"/>
-          <w:color w:val="000000" w:themeColor="text1"/>
-          <w:sz w:val="20"/>
-          <w:lang w:val="en-GB"/>
-        </w:rPr>
-        <w:t xml:space="preserve">Mishra, P., Henriksen, D., Woo, L. J., &amp; Oster, N. (2025). Control vs. Agency: Exploring the History of AI in Education. </w:t>
-      </w:r>
-      <w:proofErr w:type="spellStart"/>
+        <w:t xml:space="preserve">Richards, J. C., &amp; Rodgers, T. S. (2014). </w:t>
+      </w:r>
       <w:r>
         <w:rPr>
           <w:rFonts w:cs="Times New Roman"/>
@@ -15705,9 +15620,8 @@
           <w:sz w:val="20"/>
           <w:lang w:val="en-GB"/>
         </w:rPr>
-        <w:t>TechTrends</w:t>
-      </w:r>
-      <w:proofErr w:type="spellEnd"/>
+        <w:t>Approaches and Methods in Language Teaching</w:t>
+      </w:r>
       <w:r>
         <w:rPr>
           <w:rFonts w:cs="Times New Roman"/>
@@ -15715,7 +15629,27 @@
           <w:sz w:val="20"/>
           <w:lang w:val="en-GB"/>
         </w:rPr>
-        <w:t xml:space="preserve">, </w:t>
+        <w:t>. Cambridge University Press.</w:t>
+      </w:r>
+    </w:p>
+    <w:p>
+      <w:pPr>
+        <w:pStyle w:val="Bibliography"/>
+        <w:rPr>
+          <w:rFonts w:cs="Times New Roman"/>
+          <w:color w:val="000000" w:themeColor="text1"/>
+          <w:sz w:val="20"/>
+          <w:lang w:val="en-GB"/>
+        </w:rPr>
+      </w:pPr>
+      <w:r>
+        <w:rPr>
+          <w:rFonts w:cs="Times New Roman"/>
+          <w:color w:val="000000" w:themeColor="text1"/>
+          <w:sz w:val="20"/>
+          <w:lang w:val="en-GB"/>
+        </w:rPr>
+        <w:t xml:space="preserve">Rogers, E. M. (2003). </w:t>
       </w:r>
       <w:r>
         <w:rPr>
@@ -15726,7 +15660,7 @@
           <w:sz w:val="20"/>
           <w:lang w:val="en-GB"/>
         </w:rPr>
-        <w:t>69</w:t>
+        <w:t>Diffusion of Innovations, 5th Edition</w:t>
       </w:r>
       <w:r>
         <w:rPr>
@@ -15735,7 +15669,7 @@
           <w:sz w:val="20"/>
           <w:lang w:val="en-GB"/>
         </w:rPr>
-        <w:t>(2), 247–253. https://doi.org/10.1007/s11528-025-01064-2</w:t>
+        <w:t>. Simon and Schuster.</w:t>
       </w:r>
     </w:p>
     <w:p>
@@ -15755,245 +15689,7 @@
           <w:sz w:val="20"/>
           <w:lang w:val="en-GB"/>
         </w:rPr>
-        <w:t xml:space="preserve">Morgan, K. L. K. (2025). Phonemic Awareness and AI: Evaluating ChatGPT Plus for Structured Lesson Development. </w:t>
-      </w:r>
-      <w:r>
-        <w:rPr>
-          <w:rFonts w:cs="Times New Roman"/>
-          <w:i/>
-          <w:iCs/>
-          <w:color w:val="000000" w:themeColor="text1"/>
-          <w:sz w:val="20"/>
-          <w:lang w:val="en-GB"/>
-        </w:rPr>
-        <w:t>Texas Journal of Literacy Education</w:t>
-      </w:r>
-      <w:r>
-        <w:rPr>
-          <w:rFonts w:cs="Times New Roman"/>
-          <w:color w:val="000000" w:themeColor="text1"/>
-          <w:sz w:val="20"/>
-          <w:lang w:val="en-GB"/>
-        </w:rPr>
-        <w:t xml:space="preserve">, </w:t>
-      </w:r>
-      <w:r>
-        <w:rPr>
-          <w:rFonts w:cs="Times New Roman"/>
-          <w:i/>
-          <w:iCs/>
-          <w:color w:val="000000" w:themeColor="text1"/>
-          <w:sz w:val="20"/>
-          <w:lang w:val="en-GB"/>
-        </w:rPr>
-        <w:t>12</w:t>
-      </w:r>
-      <w:r>
-        <w:rPr>
-          <w:rFonts w:cs="Times New Roman"/>
-          <w:color w:val="000000" w:themeColor="text1"/>
-          <w:sz w:val="20"/>
-          <w:lang w:val="en-GB"/>
-        </w:rPr>
-        <w:t>(1). https://www.talejournal.com/index.php/TJLE/article/view/175</w:t>
-      </w:r>
-    </w:p>
-    <w:p>
-      <w:pPr>
-        <w:pStyle w:val="Bibliography"/>
-        <w:rPr>
-          <w:rFonts w:cs="Times New Roman"/>
-          <w:color w:val="000000" w:themeColor="text1"/>
-          <w:sz w:val="20"/>
-        </w:rPr>
-      </w:pPr>
-      <w:r>
-        <w:rPr>
-          <w:rFonts w:cs="Times New Roman"/>
-          <w:color w:val="000000" w:themeColor="text1"/>
-          <w:sz w:val="20"/>
-        </w:rPr>
-        <w:t xml:space="preserve">Ollivier, C. (2018). </w:t>
-      </w:r>
-      <w:r>
-        <w:rPr>
-          <w:rFonts w:cs="Times New Roman"/>
-          <w:i/>
-          <w:iCs/>
-          <w:color w:val="000000" w:themeColor="text1"/>
-          <w:sz w:val="20"/>
-        </w:rPr>
-        <w:t>Littératie numérique et approche socio-interactionnelle pour l’enseignement-apprentissage des langues</w:t>
-      </w:r>
-      <w:r>
-        <w:rPr>
-          <w:rFonts w:cs="Times New Roman"/>
-          <w:color w:val="000000" w:themeColor="text1"/>
-          <w:sz w:val="20"/>
-        </w:rPr>
-        <w:t>.</w:t>
-      </w:r>
-    </w:p>
-    <w:p>
-      <w:pPr>
-        <w:pStyle w:val="Bibliography"/>
-        <w:rPr>
-          <w:rFonts w:cs="Times New Roman"/>
-          <w:color w:val="000000" w:themeColor="text1"/>
-          <w:sz w:val="20"/>
-          <w:lang w:val="en-GB"/>
-        </w:rPr>
-      </w:pPr>
-      <w:r>
-        <w:rPr>
-          <w:rFonts w:cs="Times New Roman"/>
-          <w:color w:val="000000" w:themeColor="text1"/>
-          <w:sz w:val="20"/>
-          <w:lang w:val="en-GB"/>
-        </w:rPr>
-        <w:t xml:space="preserve">Richards, J. C. (1998). </w:t>
-      </w:r>
-      <w:r>
-        <w:rPr>
-          <w:rFonts w:cs="Times New Roman"/>
-          <w:i/>
-          <w:iCs/>
-          <w:color w:val="000000" w:themeColor="text1"/>
-          <w:sz w:val="20"/>
-          <w:lang w:val="en-GB"/>
-        </w:rPr>
-        <w:t>Beyond Training: Perspectives on Language Teacher Education</w:t>
-      </w:r>
-      <w:r>
-        <w:rPr>
-          <w:rFonts w:cs="Times New Roman"/>
-          <w:color w:val="000000" w:themeColor="text1"/>
-          <w:sz w:val="20"/>
-          <w:lang w:val="en-GB"/>
-        </w:rPr>
-        <w:t>. Cambridge University Press.</w:t>
-      </w:r>
-    </w:p>
-    <w:p>
-      <w:pPr>
-        <w:pStyle w:val="Bibliography"/>
-        <w:rPr>
-          <w:rFonts w:cs="Times New Roman"/>
-          <w:color w:val="000000" w:themeColor="text1"/>
-          <w:sz w:val="20"/>
-          <w:lang w:val="en-GB"/>
-        </w:rPr>
-      </w:pPr>
-      <w:r>
-        <w:rPr>
-          <w:rFonts w:cs="Times New Roman"/>
-          <w:color w:val="000000" w:themeColor="text1"/>
-          <w:sz w:val="20"/>
-          <w:lang w:val="en-GB"/>
-        </w:rPr>
-        <w:t xml:space="preserve">Richards, J. C., &amp; Rodgers, T. S. (2014). </w:t>
-      </w:r>
-      <w:r>
-        <w:rPr>
-          <w:rFonts w:cs="Times New Roman"/>
-          <w:i/>
-          <w:iCs/>
-          <w:color w:val="000000" w:themeColor="text1"/>
-          <w:sz w:val="20"/>
-          <w:lang w:val="en-GB"/>
-        </w:rPr>
-        <w:t>Approaches and Methods in Language Teaching</w:t>
-      </w:r>
-      <w:r>
-        <w:rPr>
-          <w:rFonts w:cs="Times New Roman"/>
-          <w:color w:val="000000" w:themeColor="text1"/>
-          <w:sz w:val="20"/>
-          <w:lang w:val="en-GB"/>
-        </w:rPr>
-        <w:t>. Cambridge University Press.</w:t>
-      </w:r>
-    </w:p>
-    <w:p>
-      <w:pPr>
-        <w:pStyle w:val="Bibliography"/>
-        <w:rPr>
-          <w:rFonts w:cs="Times New Roman"/>
-          <w:color w:val="000000" w:themeColor="text1"/>
-          <w:sz w:val="20"/>
-          <w:lang w:val="en-GB"/>
-        </w:rPr>
-      </w:pPr>
-      <w:r>
-        <w:rPr>
-          <w:rFonts w:cs="Times New Roman"/>
-          <w:color w:val="000000" w:themeColor="text1"/>
-          <w:sz w:val="20"/>
-          <w:lang w:val="en-GB"/>
-        </w:rPr>
-        <w:t xml:space="preserve">Rogers, E. M. (2003). </w:t>
-      </w:r>
-      <w:r>
-        <w:rPr>
-          <w:rFonts w:cs="Times New Roman"/>
-          <w:i/>
-          <w:iCs/>
-          <w:color w:val="000000" w:themeColor="text1"/>
-          <w:sz w:val="20"/>
-          <w:lang w:val="en-GB"/>
-        </w:rPr>
-        <w:t>Diffusion of Innovations, 5th Edition</w:t>
-      </w:r>
-      <w:r>
-        <w:rPr>
-          <w:rFonts w:cs="Times New Roman"/>
-          <w:color w:val="000000" w:themeColor="text1"/>
-          <w:sz w:val="20"/>
-          <w:lang w:val="en-GB"/>
-        </w:rPr>
-        <w:t>. Simon and Schuster.</w:t>
-      </w:r>
-    </w:p>
-    <w:p>
-      <w:pPr>
-        <w:pStyle w:val="Bibliography"/>
-        <w:rPr>
-          <w:rFonts w:cs="Times New Roman"/>
-          <w:color w:val="000000" w:themeColor="text1"/>
-          <w:sz w:val="20"/>
-          <w:lang w:val="en-GB"/>
-        </w:rPr>
-      </w:pPr>
-      <w:r>
-        <w:rPr>
-          <w:rFonts w:cs="Times New Roman"/>
-          <w:color w:val="000000" w:themeColor="text1"/>
-          <w:sz w:val="20"/>
-          <w:lang w:val="en-GB"/>
-        </w:rPr>
-        <w:t xml:space="preserve">Shulman, L. (1987). Knowledge and </w:t>
-      </w:r>
-      <w:proofErr w:type="spellStart"/>
-      <w:proofErr w:type="gramStart"/>
-      <w:r>
-        <w:rPr>
-          <w:rFonts w:cs="Times New Roman"/>
-          <w:color w:val="000000" w:themeColor="text1"/>
-          <w:sz w:val="20"/>
-          <w:lang w:val="en-GB"/>
-        </w:rPr>
-        <w:t>Teaching:Foundations</w:t>
-      </w:r>
-      <w:proofErr w:type="spellEnd"/>
-      <w:proofErr w:type="gramEnd"/>
-      <w:r>
-        <w:rPr>
-          <w:rFonts w:cs="Times New Roman"/>
-          <w:color w:val="000000" w:themeColor="text1"/>
-          <w:sz w:val="20"/>
-          <w:lang w:val="en-GB"/>
-        </w:rPr>
-        <w:t xml:space="preserve"> of the New Reform. </w:t>
+        <w:t xml:space="preserve">Shulman, L. (1987). Knowledge and Teaching:Foundations of the New Reform. </w:t>
       </w:r>
       <w:r>
         <w:rPr>
@@ -16389,7 +16085,7 @@
         <w:rPr>
           <w:noProof/>
         </w:rPr>
-        <w:object w:dxaOrig="1440" w:dyaOrig="1440" w14:anchorId="67B32057">
+        <w:object w:dxaOrig="1440" w:dyaOrig="1440" w14:anchorId="331E26B5">
           <v:shapetype id="_x0000_t75" coordsize="21600,21600" o:spt="75" o:preferrelative="t" path="m@4@5l@4@11@9@11@9@5xe" filled="f" stroked="f">
             <v:stroke joinstyle="miter"/>
             <v:formulas>
@@ -16410,9 +16106,9 @@
             <o:lock v:ext="edit" aspectratio="t"/>
           </v:shapetype>
           <v:shape id="_x0000_s2050" type="#_x0000_t75" alt="" style="position:absolute;left:0;text-align:left;margin-left:-14.55pt;margin-top:28.7pt;width:6in;height:658.95pt;z-index:251663360;mso-wrap-edited:f;mso-width-percent:0;mso-height-percent:0;mso-position-horizontal-relative:text;mso-position-vertical-relative:text;mso-width-percent:0;mso-height-percent:0">
-            <v:imagedata r:id="rId18" o:title=""/>
+            <v:imagedata r:id="rId19" o:title=""/>
           </v:shape>
-          <o:OLEObject Type="Embed" ProgID="Word.Document.12" ShapeID="_x0000_s2050" DrawAspect="Content" ObjectID="_1843112253" r:id="rId19">
+          <o:OLEObject Type="Embed" ProgID="Word.Document.12" ShapeID="_x0000_s2050" DrawAspect="Content" ObjectID="_1843151264" r:id="rId20">
             <o:FieldCodes>\s</o:FieldCodes>
           </o:OLEObject>
         </w:object>
@@ -27598,7 +27294,7 @@
                     </pic:cNvPicPr>
                   </pic:nvPicPr>
                   <pic:blipFill>
-                    <a:blip r:embed="rId20">
+                    <a:blip r:embed="rId21">
                       <a:extLst>
                         <a:ext uri="{28A0092B-C50C-407E-A947-70E740481C1C}">
                           <a14:useLocalDpi xmlns:a14="http://schemas.microsoft.com/office/drawing/2010/main" val="0"/>

</xml_diff>

<commit_message>
please add the new changes plssss
</commit_message>
<xml_diff>
--- a/my_report/Thesis_FR.docx
+++ b/my_report/Thesis_FR.docx
@@ -677,23 +677,7 @@
         <w:jc w:val="right"/>
       </w:pPr>
       <w:r>
-        <w:t xml:space="preserve">- </w:t>
-      </w:r>
-      <w:proofErr w:type="spellStart"/>
-      <w:r>
-        <w:t>ChatGPT</w:t>
-      </w:r>
-      <w:proofErr w:type="spellEnd"/>
-      <w:r>
-        <w:t xml:space="preserve"> (</w:t>
-      </w:r>
-      <w:proofErr w:type="spellStart"/>
-      <w:r>
-        <w:t>OpenAI</w:t>
-      </w:r>
-      <w:proofErr w:type="spellEnd"/>
-      <w:r>
-        <w:t>, GPT-5.3-mini)</w:t>
+        <w:t>- ChatGPT (OpenAI, GPT-5.3-mini)</w:t>
       </w:r>
     </w:p>
     <w:p/>
@@ -713,7 +697,7 @@
       <w:pPr>
         <w:pStyle w:val="Heading1"/>
       </w:pPr>
-      <w:bookmarkStart w:id="0" w:name="_Toc232455094"/>
+      <w:bookmarkStart w:id="0" w:name="_Toc232585767"/>
       <w:r>
         <w:lastRenderedPageBreak/>
         <w:t>Résumé</w:t>
@@ -748,7 +732,7 @@
       <w:pPr>
         <w:pStyle w:val="Heading1"/>
       </w:pPr>
-      <w:bookmarkStart w:id="1" w:name="_Toc232455095"/>
+      <w:bookmarkStart w:id="1" w:name="_Toc232585768"/>
       <w:r>
         <w:lastRenderedPageBreak/>
         <w:t>M</w:t>
@@ -775,7 +759,7 @@
       <w:pPr>
         <w:pStyle w:val="Heading1"/>
       </w:pPr>
-      <w:bookmarkStart w:id="2" w:name="_Toc232455096"/>
+      <w:bookmarkStart w:id="2" w:name="_Toc232585769"/>
       <w:r>
         <w:lastRenderedPageBreak/>
         <w:t>Glossaire</w:t>
@@ -795,7 +779,7 @@
       <w:pPr>
         <w:pStyle w:val="Heading1"/>
       </w:pPr>
-      <w:bookmarkStart w:id="3" w:name="_Toc232455097"/>
+      <w:bookmarkStart w:id="3" w:name="_Toc232585770"/>
       <w:r>
         <w:lastRenderedPageBreak/>
         <w:t>Liste des Abréviations</w:t>
@@ -819,7 +803,7 @@
       <w:pPr>
         <w:pStyle w:val="Heading1"/>
       </w:pPr>
-      <w:bookmarkStart w:id="4" w:name="_Toc232455098"/>
+      <w:bookmarkStart w:id="4" w:name="_Toc232585771"/>
       <w:r>
         <w:lastRenderedPageBreak/>
         <w:t>Remerciements</w:t>
@@ -840,7 +824,7 @@
       <w:pPr>
         <w:pStyle w:val="Heading1"/>
       </w:pPr>
-      <w:bookmarkStart w:id="5" w:name="_Toc232455099"/>
+      <w:bookmarkStart w:id="5" w:name="_Toc232585772"/>
       <w:r>
         <w:lastRenderedPageBreak/>
         <w:t>Avertissement</w:t>
@@ -867,7 +851,7 @@
           <w:lang w:val="en-IN"/>
         </w:rPr>
       </w:pPr>
-      <w:bookmarkStart w:id="6" w:name="_Toc232455100"/>
+      <w:bookmarkStart w:id="6" w:name="_Toc232585773"/>
       <w:r>
         <w:lastRenderedPageBreak/>
         <w:t>Sommaire</w:t>
@@ -913,7 +897,7 @@
         </w:rPr>
         <w:fldChar w:fldCharType="separate"/>
       </w:r>
-      <w:hyperlink w:anchor="_Toc232455094" w:history="1">
+      <w:hyperlink w:anchor="_Toc232585767" w:history="1">
         <w:r>
           <w:rPr>
             <w:rStyle w:val="Hyperlink"/>
@@ -940,7 +924,7 @@
             <w:noProof/>
             <w:webHidden/>
           </w:rPr>
-          <w:instrText xml:space="preserve"> PAGEREF _Toc232455094 \h </w:instrText>
+          <w:instrText xml:space="preserve"> PAGEREF _Toc232585767 \h </w:instrText>
         </w:r>
         <w:r>
           <w:rPr>
@@ -988,7 +972,7 @@
           <w14:ligatures w14:val="standardContextual"/>
         </w:rPr>
       </w:pPr>
-      <w:hyperlink w:anchor="_Toc232455095" w:history="1">
+      <w:hyperlink w:anchor="_Toc232585768" w:history="1">
         <w:r>
           <w:rPr>
             <w:rStyle w:val="Hyperlink"/>
@@ -1015,7 +999,7 @@
             <w:noProof/>
             <w:webHidden/>
           </w:rPr>
-          <w:instrText xml:space="preserve"> PAGEREF _Toc232455095 \h </w:instrText>
+          <w:instrText xml:space="preserve"> PAGEREF _Toc232585768 \h </w:instrText>
         </w:r>
         <w:r>
           <w:rPr>
@@ -1063,7 +1047,7 @@
           <w14:ligatures w14:val="standardContextual"/>
         </w:rPr>
       </w:pPr>
-      <w:hyperlink w:anchor="_Toc232455096" w:history="1">
+      <w:hyperlink w:anchor="_Toc232585769" w:history="1">
         <w:r>
           <w:rPr>
             <w:rStyle w:val="Hyperlink"/>
@@ -1090,7 +1074,7 @@
             <w:noProof/>
             <w:webHidden/>
           </w:rPr>
-          <w:instrText xml:space="preserve"> PAGEREF _Toc232455096 \h </w:instrText>
+          <w:instrText xml:space="preserve"> PAGEREF _Toc232585769 \h </w:instrText>
         </w:r>
         <w:r>
           <w:rPr>
@@ -1138,7 +1122,7 @@
           <w14:ligatures w14:val="standardContextual"/>
         </w:rPr>
       </w:pPr>
-      <w:hyperlink w:anchor="_Toc232455097" w:history="1">
+      <w:hyperlink w:anchor="_Toc232585770" w:history="1">
         <w:r>
           <w:rPr>
             <w:rStyle w:val="Hyperlink"/>
@@ -1165,7 +1149,7 @@
             <w:noProof/>
             <w:webHidden/>
           </w:rPr>
-          <w:instrText xml:space="preserve"> PAGEREF _Toc232455097 \h </w:instrText>
+          <w:instrText xml:space="preserve"> PAGEREF _Toc232585770 \h </w:instrText>
         </w:r>
         <w:r>
           <w:rPr>
@@ -1213,7 +1197,7 @@
           <w14:ligatures w14:val="standardContextual"/>
         </w:rPr>
       </w:pPr>
-      <w:hyperlink w:anchor="_Toc232455098" w:history="1">
+      <w:hyperlink w:anchor="_Toc232585771" w:history="1">
         <w:r>
           <w:rPr>
             <w:rStyle w:val="Hyperlink"/>
@@ -1240,7 +1224,7 @@
             <w:noProof/>
             <w:webHidden/>
           </w:rPr>
-          <w:instrText xml:space="preserve"> PAGEREF _Toc232455098 \h </w:instrText>
+          <w:instrText xml:space="preserve"> PAGEREF _Toc232585771 \h </w:instrText>
         </w:r>
         <w:r>
           <w:rPr>
@@ -1288,7 +1272,7 @@
           <w14:ligatures w14:val="standardContextual"/>
         </w:rPr>
       </w:pPr>
-      <w:hyperlink w:anchor="_Toc232455099" w:history="1">
+      <w:hyperlink w:anchor="_Toc232585772" w:history="1">
         <w:r>
           <w:rPr>
             <w:rStyle w:val="Hyperlink"/>
@@ -1315,7 +1299,7 @@
             <w:noProof/>
             <w:webHidden/>
           </w:rPr>
-          <w:instrText xml:space="preserve"> PAGEREF _Toc232455099 \h </w:instrText>
+          <w:instrText xml:space="preserve"> PAGEREF _Toc232585772 \h </w:instrText>
         </w:r>
         <w:r>
           <w:rPr>
@@ -1363,7 +1347,7 @@
           <w14:ligatures w14:val="standardContextual"/>
         </w:rPr>
       </w:pPr>
-      <w:hyperlink w:anchor="_Toc232455100" w:history="1">
+      <w:hyperlink w:anchor="_Toc232585773" w:history="1">
         <w:r>
           <w:rPr>
             <w:rStyle w:val="Hyperlink"/>
@@ -1390,7 +1374,7 @@
             <w:noProof/>
             <w:webHidden/>
           </w:rPr>
-          <w:instrText xml:space="preserve"> PAGEREF _Toc232455100 \h </w:instrText>
+          <w:instrText xml:space="preserve"> PAGEREF _Toc232585773 \h </w:instrText>
         </w:r>
         <w:r>
           <w:rPr>
@@ -1438,7 +1422,7 @@
           <w14:ligatures w14:val="standardContextual"/>
         </w:rPr>
       </w:pPr>
-      <w:hyperlink w:anchor="_Toc232455101" w:history="1">
+      <w:hyperlink w:anchor="_Toc232585774" w:history="1">
         <w:r>
           <w:rPr>
             <w:rStyle w:val="Hyperlink"/>
@@ -1465,7 +1449,7 @@
             <w:noProof/>
             <w:webHidden/>
           </w:rPr>
-          <w:instrText xml:space="preserve"> PAGEREF _Toc232455101 \h </w:instrText>
+          <w:instrText xml:space="preserve"> PAGEREF _Toc232585774 \h </w:instrText>
         </w:r>
         <w:r>
           <w:rPr>
@@ -1513,7 +1497,7 @@
           <w14:ligatures w14:val="standardContextual"/>
         </w:rPr>
       </w:pPr>
-      <w:hyperlink w:anchor="_Toc232455102" w:history="1">
+      <w:hyperlink w:anchor="_Toc232585775" w:history="1">
         <w:r>
           <w:rPr>
             <w:rStyle w:val="Hyperlink"/>
@@ -1540,7 +1524,7 @@
             <w:noProof/>
             <w:webHidden/>
           </w:rPr>
-          <w:instrText xml:space="preserve"> PAGEREF _Toc232455102 \h </w:instrText>
+          <w:instrText xml:space="preserve"> PAGEREF _Toc232585775 \h </w:instrText>
         </w:r>
         <w:r>
           <w:rPr>
@@ -1587,7 +1571,7 @@
           <w14:ligatures w14:val="standardContextual"/>
         </w:rPr>
       </w:pPr>
-      <w:hyperlink w:anchor="_Toc232455103" w:history="1">
+      <w:hyperlink w:anchor="_Toc232585776" w:history="1">
         <w:r>
           <w:rPr>
             <w:rStyle w:val="Hyperlink"/>
@@ -1632,7 +1616,7 @@
             <w:noProof/>
             <w:webHidden/>
           </w:rPr>
-          <w:instrText xml:space="preserve"> PAGEREF _Toc232455103 \h </w:instrText>
+          <w:instrText xml:space="preserve"> PAGEREF _Toc232585776 \h </w:instrText>
         </w:r>
         <w:r>
           <w:rPr>
@@ -1679,7 +1663,7 @@
           <w14:ligatures w14:val="standardContextual"/>
         </w:rPr>
       </w:pPr>
-      <w:hyperlink w:anchor="_Toc232455104" w:history="1">
+      <w:hyperlink w:anchor="_Toc232585777" w:history="1">
         <w:r>
           <w:rPr>
             <w:rStyle w:val="Hyperlink"/>
@@ -1724,7 +1708,7 @@
             <w:noProof/>
             <w:webHidden/>
           </w:rPr>
-          <w:instrText xml:space="preserve"> PAGEREF _Toc232455104 \h </w:instrText>
+          <w:instrText xml:space="preserve"> PAGEREF _Toc232585777 \h </w:instrText>
         </w:r>
         <w:r>
           <w:rPr>
@@ -1771,7 +1755,7 @@
           <w14:ligatures w14:val="standardContextual"/>
         </w:rPr>
       </w:pPr>
-      <w:hyperlink w:anchor="_Toc232455105" w:history="1">
+      <w:hyperlink w:anchor="_Toc232585778" w:history="1">
         <w:r>
           <w:rPr>
             <w:rStyle w:val="Hyperlink"/>
@@ -1820,7 +1804,7 @@
             <w:noProof/>
             <w:webHidden/>
           </w:rPr>
-          <w:instrText xml:space="preserve"> PAGEREF _Toc232455105 \h </w:instrText>
+          <w:instrText xml:space="preserve"> PAGEREF _Toc232585778 \h </w:instrText>
         </w:r>
         <w:r>
           <w:rPr>
@@ -1867,7 +1851,7 @@
           <w14:ligatures w14:val="standardContextual"/>
         </w:rPr>
       </w:pPr>
-      <w:hyperlink w:anchor="_Toc232455106" w:history="1">
+      <w:hyperlink w:anchor="_Toc232585779" w:history="1">
         <w:r>
           <w:rPr>
             <w:rStyle w:val="Hyperlink"/>
@@ -1916,7 +1900,7 @@
             <w:noProof/>
             <w:webHidden/>
           </w:rPr>
-          <w:instrText xml:space="preserve"> PAGEREF _Toc232455106 \h </w:instrText>
+          <w:instrText xml:space="preserve"> PAGEREF _Toc232585779 \h </w:instrText>
         </w:r>
         <w:r>
           <w:rPr>
@@ -1963,7 +1947,7 @@
           <w14:ligatures w14:val="standardContextual"/>
         </w:rPr>
       </w:pPr>
-      <w:hyperlink w:anchor="_Toc232455107" w:history="1">
+      <w:hyperlink w:anchor="_Toc232585780" w:history="1">
         <w:r>
           <w:rPr>
             <w:rStyle w:val="Hyperlink"/>
@@ -2008,7 +1992,7 @@
             <w:noProof/>
             <w:webHidden/>
           </w:rPr>
-          <w:instrText xml:space="preserve"> PAGEREF _Toc232455107 \h </w:instrText>
+          <w:instrText xml:space="preserve"> PAGEREF _Toc232585780 \h </w:instrText>
         </w:r>
         <w:r>
           <w:rPr>
@@ -2028,7 +2012,7 @@
             <w:noProof/>
             <w:webHidden/>
           </w:rPr>
-          <w:t>17</w:t>
+          <w:t>18</w:t>
         </w:r>
         <w:r>
           <w:rPr>
@@ -2055,7 +2039,7 @@
           <w14:ligatures w14:val="standardContextual"/>
         </w:rPr>
       </w:pPr>
-      <w:hyperlink w:anchor="_Toc232455108" w:history="1">
+      <w:hyperlink w:anchor="_Toc232585781" w:history="1">
         <w:r>
           <w:rPr>
             <w:rStyle w:val="Hyperlink"/>
@@ -2100,7 +2084,7 @@
             <w:noProof/>
             <w:webHidden/>
           </w:rPr>
-          <w:instrText xml:space="preserve"> PAGEREF _Toc232455108 \h </w:instrText>
+          <w:instrText xml:space="preserve"> PAGEREF _Toc232585781 \h </w:instrText>
         </w:r>
         <w:r>
           <w:rPr>
@@ -2147,7 +2131,7 @@
           <w14:ligatures w14:val="standardContextual"/>
         </w:rPr>
       </w:pPr>
-      <w:hyperlink w:anchor="_Toc232455109" w:history="1">
+      <w:hyperlink w:anchor="_Toc232585782" w:history="1">
         <w:r>
           <w:rPr>
             <w:rStyle w:val="Hyperlink"/>
@@ -2196,7 +2180,7 @@
             <w:noProof/>
             <w:webHidden/>
           </w:rPr>
-          <w:instrText xml:space="preserve"> PAGEREF _Toc232455109 \h </w:instrText>
+          <w:instrText xml:space="preserve"> PAGEREF _Toc232585782 \h </w:instrText>
         </w:r>
         <w:r>
           <w:rPr>
@@ -2216,7 +2200,7 @@
             <w:noProof/>
             <w:webHidden/>
           </w:rPr>
-          <w:t>18</w:t>
+          <w:t>19</w:t>
         </w:r>
         <w:r>
           <w:rPr>
@@ -2243,7 +2227,7 @@
           <w14:ligatures w14:val="standardContextual"/>
         </w:rPr>
       </w:pPr>
-      <w:hyperlink w:anchor="_Toc232455110" w:history="1">
+      <w:hyperlink w:anchor="_Toc232585783" w:history="1">
         <w:r>
           <w:rPr>
             <w:rStyle w:val="Hyperlink"/>
@@ -2290,7 +2274,7 @@
             <w:noProof/>
             <w:webHidden/>
           </w:rPr>
-          <w:instrText xml:space="preserve"> PAGEREF _Toc232455110 \h </w:instrText>
+          <w:instrText xml:space="preserve"> PAGEREF _Toc232585783 \h </w:instrText>
         </w:r>
         <w:r>
           <w:rPr>
@@ -2337,7 +2321,7 @@
           <w14:ligatures w14:val="standardContextual"/>
         </w:rPr>
       </w:pPr>
-      <w:hyperlink w:anchor="_Toc232455111" w:history="1">
+      <w:hyperlink w:anchor="_Toc232585784" w:history="1">
         <w:r>
           <w:rPr>
             <w:rStyle w:val="Hyperlink"/>
@@ -2384,7 +2368,7 @@
             <w:noProof/>
             <w:webHidden/>
           </w:rPr>
-          <w:instrText xml:space="preserve"> PAGEREF _Toc232455111 \h </w:instrText>
+          <w:instrText xml:space="preserve"> PAGEREF _Toc232585784 \h </w:instrText>
         </w:r>
         <w:r>
           <w:rPr>
@@ -2431,7 +2415,7 @@
           <w14:ligatures w14:val="standardContextual"/>
         </w:rPr>
       </w:pPr>
-      <w:hyperlink w:anchor="_Toc232455112" w:history="1">
+      <w:hyperlink w:anchor="_Toc232585785" w:history="1">
         <w:r>
           <w:rPr>
             <w:rStyle w:val="Hyperlink"/>
@@ -2476,7 +2460,7 @@
             <w:noProof/>
             <w:webHidden/>
           </w:rPr>
-          <w:instrText xml:space="preserve"> PAGEREF _Toc232455112 \h </w:instrText>
+          <w:instrText xml:space="preserve"> PAGEREF _Toc232585785 \h </w:instrText>
         </w:r>
         <w:r>
           <w:rPr>
@@ -2523,7 +2507,7 @@
           <w14:ligatures w14:val="standardContextual"/>
         </w:rPr>
       </w:pPr>
-      <w:hyperlink w:anchor="_Toc232455113" w:history="1">
+      <w:hyperlink w:anchor="_Toc232585786" w:history="1">
         <w:r>
           <w:rPr>
             <w:rStyle w:val="Hyperlink"/>
@@ -2568,7 +2552,7 @@
             <w:noProof/>
             <w:webHidden/>
           </w:rPr>
-          <w:instrText xml:space="preserve"> PAGEREF _Toc232455113 \h </w:instrText>
+          <w:instrText xml:space="preserve"> PAGEREF _Toc232585786 \h </w:instrText>
         </w:r>
         <w:r>
           <w:rPr>
@@ -2615,7 +2599,7 @@
           <w14:ligatures w14:val="standardContextual"/>
         </w:rPr>
       </w:pPr>
-      <w:hyperlink w:anchor="_Toc232455114" w:history="1">
+      <w:hyperlink w:anchor="_Toc232585787" w:history="1">
         <w:r>
           <w:rPr>
             <w:rStyle w:val="Hyperlink"/>
@@ -2662,7 +2646,7 @@
             <w:noProof/>
             <w:webHidden/>
           </w:rPr>
-          <w:instrText xml:space="preserve"> PAGEREF _Toc232455114 \h </w:instrText>
+          <w:instrText xml:space="preserve"> PAGEREF _Toc232585787 \h </w:instrText>
         </w:r>
         <w:r>
           <w:rPr>
@@ -2709,7 +2693,7 @@
           <w14:ligatures w14:val="standardContextual"/>
         </w:rPr>
       </w:pPr>
-      <w:hyperlink w:anchor="_Toc232455115" w:history="1">
+      <w:hyperlink w:anchor="_Toc232585788" w:history="1">
         <w:r>
           <w:rPr>
             <w:rStyle w:val="Hyperlink"/>
@@ -2754,7 +2738,7 @@
             <w:noProof/>
             <w:webHidden/>
           </w:rPr>
-          <w:instrText xml:space="preserve"> PAGEREF _Toc232455115 \h </w:instrText>
+          <w:instrText xml:space="preserve"> PAGEREF _Toc232585788 \h </w:instrText>
         </w:r>
         <w:r>
           <w:rPr>
@@ -2801,7 +2785,7 @@
           <w14:ligatures w14:val="standardContextual"/>
         </w:rPr>
       </w:pPr>
-      <w:hyperlink w:anchor="_Toc232455116" w:history="1">
+      <w:hyperlink w:anchor="_Toc232585789" w:history="1">
         <w:r>
           <w:rPr>
             <w:rStyle w:val="Hyperlink"/>
@@ -2846,7 +2830,7 @@
             <w:noProof/>
             <w:webHidden/>
           </w:rPr>
-          <w:instrText xml:space="preserve"> PAGEREF _Toc232455116 \h </w:instrText>
+          <w:instrText xml:space="preserve"> PAGEREF _Toc232585789 \h </w:instrText>
         </w:r>
         <w:r>
           <w:rPr>
@@ -2893,7 +2877,7 @@
           <w14:ligatures w14:val="standardContextual"/>
         </w:rPr>
       </w:pPr>
-      <w:hyperlink w:anchor="_Toc232455117" w:history="1">
+      <w:hyperlink w:anchor="_Toc232585790" w:history="1">
         <w:r>
           <w:rPr>
             <w:rStyle w:val="Hyperlink"/>
@@ -2938,7 +2922,7 @@
             <w:noProof/>
             <w:webHidden/>
           </w:rPr>
-          <w:instrText xml:space="preserve"> PAGEREF _Toc232455117 \h </w:instrText>
+          <w:instrText xml:space="preserve"> PAGEREF _Toc232585790 \h </w:instrText>
         </w:r>
         <w:r>
           <w:rPr>
@@ -2985,7 +2969,7 @@
           <w14:ligatures w14:val="standardContextual"/>
         </w:rPr>
       </w:pPr>
-      <w:hyperlink w:anchor="_Toc232455118" w:history="1">
+      <w:hyperlink w:anchor="_Toc232585791" w:history="1">
         <w:r>
           <w:rPr>
             <w:rStyle w:val="Hyperlink"/>
@@ -3030,7 +3014,7 @@
             <w:noProof/>
             <w:webHidden/>
           </w:rPr>
-          <w:instrText xml:space="preserve"> PAGEREF _Toc232455118 \h </w:instrText>
+          <w:instrText xml:space="preserve"> PAGEREF _Toc232585791 \h </w:instrText>
         </w:r>
         <w:r>
           <w:rPr>
@@ -3077,7 +3061,7 @@
           <w14:ligatures w14:val="standardContextual"/>
         </w:rPr>
       </w:pPr>
-      <w:hyperlink w:anchor="_Toc232455119" w:history="1">
+      <w:hyperlink w:anchor="_Toc232585792" w:history="1">
         <w:r>
           <w:rPr>
             <w:rStyle w:val="Hyperlink"/>
@@ -3122,7 +3106,7 @@
             <w:noProof/>
             <w:webHidden/>
           </w:rPr>
-          <w:instrText xml:space="preserve"> PAGEREF _Toc232455119 \h </w:instrText>
+          <w:instrText xml:space="preserve"> PAGEREF _Toc232585792 \h </w:instrText>
         </w:r>
         <w:r>
           <w:rPr>
@@ -3169,7 +3153,7 @@
           <w14:ligatures w14:val="standardContextual"/>
         </w:rPr>
       </w:pPr>
-      <w:hyperlink w:anchor="_Toc232455120" w:history="1">
+      <w:hyperlink w:anchor="_Toc232585793" w:history="1">
         <w:r>
           <w:rPr>
             <w:rStyle w:val="Hyperlink"/>
@@ -3214,7 +3198,7 @@
             <w:noProof/>
             <w:webHidden/>
           </w:rPr>
-          <w:instrText xml:space="preserve"> PAGEREF _Toc232455120 \h </w:instrText>
+          <w:instrText xml:space="preserve"> PAGEREF _Toc232585793 \h </w:instrText>
         </w:r>
         <w:r>
           <w:rPr>
@@ -3261,7 +3245,7 @@
           <w14:ligatures w14:val="standardContextual"/>
         </w:rPr>
       </w:pPr>
-      <w:hyperlink w:anchor="_Toc232455121" w:history="1">
+      <w:hyperlink w:anchor="_Toc232585794" w:history="1">
         <w:r>
           <w:rPr>
             <w:rStyle w:val="Hyperlink"/>
@@ -3306,7 +3290,7 @@
             <w:noProof/>
             <w:webHidden/>
           </w:rPr>
-          <w:instrText xml:space="preserve"> PAGEREF _Toc232455121 \h </w:instrText>
+          <w:instrText xml:space="preserve"> PAGEREF _Toc232585794 \h </w:instrText>
         </w:r>
         <w:r>
           <w:rPr>
@@ -3354,7 +3338,7 @@
           <w14:ligatures w14:val="standardContextual"/>
         </w:rPr>
       </w:pPr>
-      <w:hyperlink w:anchor="_Toc232455122" w:history="1">
+      <w:hyperlink w:anchor="_Toc232585795" w:history="1">
         <w:r>
           <w:rPr>
             <w:rStyle w:val="Hyperlink"/>
@@ -3381,7 +3365,7 @@
             <w:noProof/>
             <w:webHidden/>
           </w:rPr>
-          <w:instrText xml:space="preserve"> PAGEREF _Toc232455122 \h </w:instrText>
+          <w:instrText xml:space="preserve"> PAGEREF _Toc232585795 \h </w:instrText>
         </w:r>
         <w:r>
           <w:rPr>
@@ -3428,7 +3412,7 @@
           <w14:ligatures w14:val="standardContextual"/>
         </w:rPr>
       </w:pPr>
-      <w:hyperlink w:anchor="_Toc232455123" w:history="1">
+      <w:hyperlink w:anchor="_Toc232585796" w:history="1">
         <w:r>
           <w:rPr>
             <w:rStyle w:val="Hyperlink"/>
@@ -3473,7 +3457,7 @@
             <w:noProof/>
             <w:webHidden/>
           </w:rPr>
-          <w:instrText xml:space="preserve"> PAGEREF _Toc232455123 \h </w:instrText>
+          <w:instrText xml:space="preserve"> PAGEREF _Toc232585796 \h </w:instrText>
         </w:r>
         <w:r>
           <w:rPr>
@@ -3520,7 +3504,7 @@
           <w14:ligatures w14:val="standardContextual"/>
         </w:rPr>
       </w:pPr>
-      <w:hyperlink w:anchor="_Toc232455124" w:history="1">
+      <w:hyperlink w:anchor="_Toc232585797" w:history="1">
         <w:r>
           <w:rPr>
             <w:rStyle w:val="Hyperlink"/>
@@ -3565,7 +3549,7 @@
             <w:noProof/>
             <w:webHidden/>
           </w:rPr>
-          <w:instrText xml:space="preserve"> PAGEREF _Toc232455124 \h </w:instrText>
+          <w:instrText xml:space="preserve"> PAGEREF _Toc232585797 \h </w:instrText>
         </w:r>
         <w:r>
           <w:rPr>
@@ -3612,7 +3596,7 @@
           <w14:ligatures w14:val="standardContextual"/>
         </w:rPr>
       </w:pPr>
-      <w:hyperlink w:anchor="_Toc232455125" w:history="1">
+      <w:hyperlink w:anchor="_Toc232585798" w:history="1">
         <w:r>
           <w:rPr>
             <w:rStyle w:val="Hyperlink"/>
@@ -3657,7 +3641,7 @@
             <w:noProof/>
             <w:webHidden/>
           </w:rPr>
-          <w:instrText xml:space="preserve"> PAGEREF _Toc232455125 \h </w:instrText>
+          <w:instrText xml:space="preserve"> PAGEREF _Toc232585798 \h </w:instrText>
         </w:r>
         <w:r>
           <w:rPr>
@@ -3704,7 +3688,7 @@
           <w14:ligatures w14:val="standardContextual"/>
         </w:rPr>
       </w:pPr>
-      <w:hyperlink w:anchor="_Toc232455126" w:history="1">
+      <w:hyperlink w:anchor="_Toc232585799" w:history="1">
         <w:r>
           <w:rPr>
             <w:rStyle w:val="Hyperlink"/>
@@ -3749,7 +3733,7 @@
             <w:noProof/>
             <w:webHidden/>
           </w:rPr>
-          <w:instrText xml:space="preserve"> PAGEREF _Toc232455126 \h </w:instrText>
+          <w:instrText xml:space="preserve"> PAGEREF _Toc232585799 \h </w:instrText>
         </w:r>
         <w:r>
           <w:rPr>
@@ -3796,7 +3780,7 @@
           <w14:ligatures w14:val="standardContextual"/>
         </w:rPr>
       </w:pPr>
-      <w:hyperlink w:anchor="_Toc232455127" w:history="1">
+      <w:hyperlink w:anchor="_Toc232585800" w:history="1">
         <w:r>
           <w:rPr>
             <w:rStyle w:val="Hyperlink"/>
@@ -3841,7 +3825,7 @@
             <w:noProof/>
             <w:webHidden/>
           </w:rPr>
-          <w:instrText xml:space="preserve"> PAGEREF _Toc232455127 \h </w:instrText>
+          <w:instrText xml:space="preserve"> PAGEREF _Toc232585800 \h </w:instrText>
         </w:r>
         <w:r>
           <w:rPr>
@@ -3888,7 +3872,7 @@
           <w14:ligatures w14:val="standardContextual"/>
         </w:rPr>
       </w:pPr>
-      <w:hyperlink w:anchor="_Toc232455128" w:history="1">
+      <w:hyperlink w:anchor="_Toc232585801" w:history="1">
         <w:r>
           <w:rPr>
             <w:rStyle w:val="Hyperlink"/>
@@ -3935,7 +3919,7 @@
             <w:noProof/>
             <w:webHidden/>
           </w:rPr>
-          <w:instrText xml:space="preserve"> PAGEREF _Toc232455128 \h </w:instrText>
+          <w:instrText xml:space="preserve"> PAGEREF _Toc232585801 \h </w:instrText>
         </w:r>
         <w:r>
           <w:rPr>
@@ -3982,7 +3966,7 @@
           <w14:ligatures w14:val="standardContextual"/>
         </w:rPr>
       </w:pPr>
-      <w:hyperlink w:anchor="_Toc232455129" w:history="1">
+      <w:hyperlink w:anchor="_Toc232585802" w:history="1">
         <w:r>
           <w:rPr>
             <w:rStyle w:val="Hyperlink"/>
@@ -4027,7 +4011,7 @@
             <w:noProof/>
             <w:webHidden/>
           </w:rPr>
-          <w:instrText xml:space="preserve"> PAGEREF _Toc232455129 \h </w:instrText>
+          <w:instrText xml:space="preserve"> PAGEREF _Toc232585802 \h </w:instrText>
         </w:r>
         <w:r>
           <w:rPr>
@@ -4074,7 +4058,7 @@
           <w14:ligatures w14:val="standardContextual"/>
         </w:rPr>
       </w:pPr>
-      <w:hyperlink w:anchor="_Toc232455130" w:history="1">
+      <w:hyperlink w:anchor="_Toc232585803" w:history="1">
         <w:r>
           <w:rPr>
             <w:rStyle w:val="Hyperlink"/>
@@ -4119,7 +4103,7 @@
             <w:noProof/>
             <w:webHidden/>
           </w:rPr>
-          <w:instrText xml:space="preserve"> PAGEREF _Toc232455130 \h </w:instrText>
+          <w:instrText xml:space="preserve"> PAGEREF _Toc232585803 \h </w:instrText>
         </w:r>
         <w:r>
           <w:rPr>
@@ -4166,7 +4150,7 @@
           <w14:ligatures w14:val="standardContextual"/>
         </w:rPr>
       </w:pPr>
-      <w:hyperlink w:anchor="_Toc232455131" w:history="1">
+      <w:hyperlink w:anchor="_Toc232585804" w:history="1">
         <w:r>
           <w:rPr>
             <w:rStyle w:val="Hyperlink"/>
@@ -4211,7 +4195,7 @@
             <w:noProof/>
             <w:webHidden/>
           </w:rPr>
-          <w:instrText xml:space="preserve"> PAGEREF _Toc232455131 \h </w:instrText>
+          <w:instrText xml:space="preserve"> PAGEREF _Toc232585804 \h </w:instrText>
         </w:r>
         <w:r>
           <w:rPr>
@@ -4258,7 +4242,7 @@
           <w14:ligatures w14:val="standardContextual"/>
         </w:rPr>
       </w:pPr>
-      <w:hyperlink w:anchor="_Toc232455132" w:history="1">
+      <w:hyperlink w:anchor="_Toc232585805" w:history="1">
         <w:r>
           <w:rPr>
             <w:rStyle w:val="Hyperlink"/>
@@ -4305,7 +4289,7 @@
             <w:noProof/>
             <w:webHidden/>
           </w:rPr>
-          <w:instrText xml:space="preserve"> PAGEREF _Toc232455132 \h </w:instrText>
+          <w:instrText xml:space="preserve"> PAGEREF _Toc232585805 \h </w:instrText>
         </w:r>
         <w:r>
           <w:rPr>
@@ -4352,7 +4336,7 @@
           <w14:ligatures w14:val="standardContextual"/>
         </w:rPr>
       </w:pPr>
-      <w:hyperlink w:anchor="_Toc232455133" w:history="1">
+      <w:hyperlink w:anchor="_Toc232585806" w:history="1">
         <w:r>
           <w:rPr>
             <w:rStyle w:val="Hyperlink"/>
@@ -4397,7 +4381,7 @@
             <w:noProof/>
             <w:webHidden/>
           </w:rPr>
-          <w:instrText xml:space="preserve"> PAGEREF _Toc232455133 \h </w:instrText>
+          <w:instrText xml:space="preserve"> PAGEREF _Toc232585806 \h </w:instrText>
         </w:r>
         <w:r>
           <w:rPr>
@@ -4444,7 +4428,7 @@
           <w14:ligatures w14:val="standardContextual"/>
         </w:rPr>
       </w:pPr>
-      <w:hyperlink w:anchor="_Toc232455134" w:history="1">
+      <w:hyperlink w:anchor="_Toc232585807" w:history="1">
         <w:r>
           <w:rPr>
             <w:rStyle w:val="Hyperlink"/>
@@ -4489,7 +4473,7 @@
             <w:noProof/>
             <w:webHidden/>
           </w:rPr>
-          <w:instrText xml:space="preserve"> PAGEREF _Toc232455134 \h </w:instrText>
+          <w:instrText xml:space="preserve"> PAGEREF _Toc232585807 \h </w:instrText>
         </w:r>
         <w:r>
           <w:rPr>
@@ -4536,7 +4520,7 @@
           <w14:ligatures w14:val="standardContextual"/>
         </w:rPr>
       </w:pPr>
-      <w:hyperlink w:anchor="_Toc232455135" w:history="1">
+      <w:hyperlink w:anchor="_Toc232585808" w:history="1">
         <w:r>
           <w:rPr>
             <w:rStyle w:val="Hyperlink"/>
@@ -4581,7 +4565,7 @@
             <w:noProof/>
             <w:webHidden/>
           </w:rPr>
-          <w:instrText xml:space="preserve"> PAGEREF _Toc232455135 \h </w:instrText>
+          <w:instrText xml:space="preserve"> PAGEREF _Toc232585808 \h </w:instrText>
         </w:r>
         <w:r>
           <w:rPr>
@@ -4628,7 +4612,7 @@
           <w14:ligatures w14:val="standardContextual"/>
         </w:rPr>
       </w:pPr>
-      <w:hyperlink w:anchor="_Toc232455136" w:history="1">
+      <w:hyperlink w:anchor="_Toc232585809" w:history="1">
         <w:r>
           <w:rPr>
             <w:rStyle w:val="Hyperlink"/>
@@ -4673,7 +4657,7 @@
             <w:noProof/>
             <w:webHidden/>
           </w:rPr>
-          <w:instrText xml:space="preserve"> PAGEREF _Toc232455136 \h </w:instrText>
+          <w:instrText xml:space="preserve"> PAGEREF _Toc232585809 \h </w:instrText>
         </w:r>
         <w:r>
           <w:rPr>
@@ -4720,7 +4704,7 @@
           <w14:ligatures w14:val="standardContextual"/>
         </w:rPr>
       </w:pPr>
-      <w:hyperlink w:anchor="_Toc232455137" w:history="1">
+      <w:hyperlink w:anchor="_Toc232585810" w:history="1">
         <w:r>
           <w:rPr>
             <w:rStyle w:val="Hyperlink"/>
@@ -4765,7 +4749,7 @@
             <w:noProof/>
             <w:webHidden/>
           </w:rPr>
-          <w:instrText xml:space="preserve"> PAGEREF _Toc232455137 \h </w:instrText>
+          <w:instrText xml:space="preserve"> PAGEREF _Toc232585810 \h </w:instrText>
         </w:r>
         <w:r>
           <w:rPr>
@@ -4812,7 +4796,7 @@
           <w14:ligatures w14:val="standardContextual"/>
         </w:rPr>
       </w:pPr>
-      <w:hyperlink w:anchor="_Toc232455138" w:history="1">
+      <w:hyperlink w:anchor="_Toc232585811" w:history="1">
         <w:r>
           <w:rPr>
             <w:rStyle w:val="Hyperlink"/>
@@ -4857,7 +4841,7 @@
             <w:noProof/>
             <w:webHidden/>
           </w:rPr>
-          <w:instrText xml:space="preserve"> PAGEREF _Toc232455138 \h </w:instrText>
+          <w:instrText xml:space="preserve"> PAGEREF _Toc232585811 \h </w:instrText>
         </w:r>
         <w:r>
           <w:rPr>
@@ -4904,7 +4888,7 @@
           <w14:ligatures w14:val="standardContextual"/>
         </w:rPr>
       </w:pPr>
-      <w:hyperlink w:anchor="_Toc232455139" w:history="1">
+      <w:hyperlink w:anchor="_Toc232585812" w:history="1">
         <w:r>
           <w:rPr>
             <w:rStyle w:val="Hyperlink"/>
@@ -4949,7 +4933,7 @@
             <w:noProof/>
             <w:webHidden/>
           </w:rPr>
-          <w:instrText xml:space="preserve"> PAGEREF _Toc232455139 \h </w:instrText>
+          <w:instrText xml:space="preserve"> PAGEREF _Toc232585812 \h </w:instrText>
         </w:r>
         <w:r>
           <w:rPr>
@@ -4970,6 +4954,378 @@
             <w:webHidden/>
           </w:rPr>
           <w:t>40</w:t>
+        </w:r>
+        <w:r>
+          <w:rPr>
+            <w:noProof/>
+            <w:webHidden/>
+          </w:rPr>
+          <w:fldChar w:fldCharType="end"/>
+        </w:r>
+      </w:hyperlink>
+    </w:p>
+    <w:p>
+      <w:pPr>
+        <w:pStyle w:val="TOC3"/>
+        <w:tabs>
+          <w:tab w:val="left" w:pos="1200"/>
+          <w:tab w:val="right" w:leader="dot" w:pos="9016"/>
+        </w:tabs>
+        <w:rPr>
+          <w:rFonts w:asciiTheme="minorHAnsi" w:eastAsiaTheme="minorEastAsia" w:hAnsiTheme="minorHAnsi"/>
+          <w:noProof/>
+          <w:kern w:val="2"/>
+          <w:szCs w:val="24"/>
+          <w:lang w:val="en-FR" w:eastAsia="en-GB"/>
+          <w14:ligatures w14:val="standardContextual"/>
+        </w:rPr>
+      </w:pPr>
+      <w:hyperlink w:anchor="_Toc232585813" w:history="1">
+        <w:r>
+          <w:rPr>
+            <w:rStyle w:val="Hyperlink"/>
+            <w:noProof/>
+          </w:rPr>
+          <w:t>(a)</w:t>
+        </w:r>
+        <w:r>
+          <w:rPr>
+            <w:rFonts w:asciiTheme="minorHAnsi" w:eastAsiaTheme="minorEastAsia" w:hAnsiTheme="minorHAnsi"/>
+            <w:noProof/>
+            <w:kern w:val="2"/>
+            <w:szCs w:val="24"/>
+            <w:lang w:val="en-FR" w:eastAsia="en-GB"/>
+            <w14:ligatures w14:val="standardContextual"/>
+          </w:rPr>
+          <w:tab/>
+        </w:r>
+        <w:r>
+          <w:rPr>
+            <w:rStyle w:val="Hyperlink"/>
+            <w:noProof/>
+          </w:rPr>
+          <w:t>Profil démographique, professionnel et technologique des participants</w:t>
+        </w:r>
+        <w:r>
+          <w:rPr>
+            <w:noProof/>
+            <w:webHidden/>
+          </w:rPr>
+          <w:tab/>
+        </w:r>
+        <w:r>
+          <w:rPr>
+            <w:noProof/>
+            <w:webHidden/>
+          </w:rPr>
+          <w:fldChar w:fldCharType="begin"/>
+        </w:r>
+        <w:r>
+          <w:rPr>
+            <w:noProof/>
+            <w:webHidden/>
+          </w:rPr>
+          <w:instrText xml:space="preserve"> PAGEREF _Toc232585813 \h </w:instrText>
+        </w:r>
+        <w:r>
+          <w:rPr>
+            <w:noProof/>
+            <w:webHidden/>
+          </w:rPr>
+        </w:r>
+        <w:r>
+          <w:rPr>
+            <w:noProof/>
+            <w:webHidden/>
+          </w:rPr>
+          <w:fldChar w:fldCharType="separate"/>
+        </w:r>
+        <w:r>
+          <w:rPr>
+            <w:noProof/>
+            <w:webHidden/>
+          </w:rPr>
+          <w:t>41</w:t>
+        </w:r>
+        <w:r>
+          <w:rPr>
+            <w:noProof/>
+            <w:webHidden/>
+          </w:rPr>
+          <w:fldChar w:fldCharType="end"/>
+        </w:r>
+      </w:hyperlink>
+    </w:p>
+    <w:p>
+      <w:pPr>
+        <w:pStyle w:val="TOC3"/>
+        <w:tabs>
+          <w:tab w:val="left" w:pos="1200"/>
+          <w:tab w:val="right" w:leader="dot" w:pos="9016"/>
+        </w:tabs>
+        <w:rPr>
+          <w:rFonts w:asciiTheme="minorHAnsi" w:eastAsiaTheme="minorEastAsia" w:hAnsiTheme="minorHAnsi"/>
+          <w:noProof/>
+          <w:kern w:val="2"/>
+          <w:szCs w:val="24"/>
+          <w:lang w:val="en-FR" w:eastAsia="en-GB"/>
+          <w14:ligatures w14:val="standardContextual"/>
+        </w:rPr>
+      </w:pPr>
+      <w:hyperlink w:anchor="_Toc232585814" w:history="1">
+        <w:r>
+          <w:rPr>
+            <w:rStyle w:val="Hyperlink"/>
+            <w:noProof/>
+          </w:rPr>
+          <w:t>(b)</w:t>
+        </w:r>
+        <w:r>
+          <w:rPr>
+            <w:rFonts w:asciiTheme="minorHAnsi" w:eastAsiaTheme="minorEastAsia" w:hAnsiTheme="minorHAnsi"/>
+            <w:noProof/>
+            <w:kern w:val="2"/>
+            <w:szCs w:val="24"/>
+            <w:lang w:val="en-FR" w:eastAsia="en-GB"/>
+            <w14:ligatures w14:val="standardContextual"/>
+          </w:rPr>
+          <w:tab/>
+        </w:r>
+        <w:r>
+          <w:rPr>
+            <w:rStyle w:val="Hyperlink"/>
+            <w:noProof/>
+          </w:rPr>
+          <w:t>Phase I</w:t>
+        </w:r>
+        <w:r>
+          <w:rPr>
+            <w:noProof/>
+            <w:webHidden/>
+          </w:rPr>
+          <w:tab/>
+        </w:r>
+        <w:r>
+          <w:rPr>
+            <w:noProof/>
+            <w:webHidden/>
+          </w:rPr>
+          <w:fldChar w:fldCharType="begin"/>
+        </w:r>
+        <w:r>
+          <w:rPr>
+            <w:noProof/>
+            <w:webHidden/>
+          </w:rPr>
+          <w:instrText xml:space="preserve"> PAGEREF _Toc232585814 \h </w:instrText>
+        </w:r>
+        <w:r>
+          <w:rPr>
+            <w:noProof/>
+            <w:webHidden/>
+          </w:rPr>
+        </w:r>
+        <w:r>
+          <w:rPr>
+            <w:noProof/>
+            <w:webHidden/>
+          </w:rPr>
+          <w:fldChar w:fldCharType="separate"/>
+        </w:r>
+        <w:r>
+          <w:rPr>
+            <w:noProof/>
+            <w:webHidden/>
+          </w:rPr>
+          <w:t>42</w:t>
+        </w:r>
+        <w:r>
+          <w:rPr>
+            <w:noProof/>
+            <w:webHidden/>
+          </w:rPr>
+          <w:fldChar w:fldCharType="end"/>
+        </w:r>
+      </w:hyperlink>
+    </w:p>
+    <w:p>
+      <w:pPr>
+        <w:pStyle w:val="TOC3"/>
+        <w:tabs>
+          <w:tab w:val="left" w:pos="1200"/>
+          <w:tab w:val="right" w:leader="dot" w:pos="9016"/>
+        </w:tabs>
+        <w:rPr>
+          <w:rFonts w:asciiTheme="minorHAnsi" w:eastAsiaTheme="minorEastAsia" w:hAnsiTheme="minorHAnsi"/>
+          <w:noProof/>
+          <w:kern w:val="2"/>
+          <w:szCs w:val="24"/>
+          <w:lang w:val="en-FR" w:eastAsia="en-GB"/>
+          <w14:ligatures w14:val="standardContextual"/>
+        </w:rPr>
+      </w:pPr>
+      <w:hyperlink w:anchor="_Toc232585815" w:history="1">
+        <w:r>
+          <w:rPr>
+            <w:rStyle w:val="Hyperlink"/>
+            <w:noProof/>
+            <w:lang w:val="en-FR"/>
+          </w:rPr>
+          <w:t>(c)</w:t>
+        </w:r>
+        <w:r>
+          <w:rPr>
+            <w:rFonts w:asciiTheme="minorHAnsi" w:eastAsiaTheme="minorEastAsia" w:hAnsiTheme="minorHAnsi"/>
+            <w:noProof/>
+            <w:kern w:val="2"/>
+            <w:szCs w:val="24"/>
+            <w:lang w:val="en-FR" w:eastAsia="en-GB"/>
+            <w14:ligatures w14:val="standardContextual"/>
+          </w:rPr>
+          <w:tab/>
+        </w:r>
+        <w:r>
+          <w:rPr>
+            <w:rStyle w:val="Hyperlink"/>
+            <w:noProof/>
+            <w:lang w:val="en-FR"/>
+          </w:rPr>
+          <w:t>Phase 2</w:t>
+        </w:r>
+        <w:r>
+          <w:rPr>
+            <w:noProof/>
+            <w:webHidden/>
+          </w:rPr>
+          <w:tab/>
+        </w:r>
+        <w:r>
+          <w:rPr>
+            <w:noProof/>
+            <w:webHidden/>
+          </w:rPr>
+          <w:fldChar w:fldCharType="begin"/>
+        </w:r>
+        <w:r>
+          <w:rPr>
+            <w:noProof/>
+            <w:webHidden/>
+          </w:rPr>
+          <w:instrText xml:space="preserve"> PAGEREF _Toc232585815 \h </w:instrText>
+        </w:r>
+        <w:r>
+          <w:rPr>
+            <w:noProof/>
+            <w:webHidden/>
+          </w:rPr>
+        </w:r>
+        <w:r>
+          <w:rPr>
+            <w:noProof/>
+            <w:webHidden/>
+          </w:rPr>
+          <w:fldChar w:fldCharType="separate"/>
+        </w:r>
+        <w:r>
+          <w:rPr>
+            <w:noProof/>
+            <w:webHidden/>
+          </w:rPr>
+          <w:t>43</w:t>
+        </w:r>
+        <w:r>
+          <w:rPr>
+            <w:noProof/>
+            <w:webHidden/>
+          </w:rPr>
+          <w:fldChar w:fldCharType="end"/>
+        </w:r>
+      </w:hyperlink>
+    </w:p>
+    <w:p>
+      <w:pPr>
+        <w:pStyle w:val="TOC3"/>
+        <w:tabs>
+          <w:tab w:val="left" w:pos="1200"/>
+          <w:tab w:val="right" w:leader="dot" w:pos="9016"/>
+        </w:tabs>
+        <w:rPr>
+          <w:rFonts w:asciiTheme="minorHAnsi" w:eastAsiaTheme="minorEastAsia" w:hAnsiTheme="minorHAnsi"/>
+          <w:noProof/>
+          <w:kern w:val="2"/>
+          <w:szCs w:val="24"/>
+          <w:lang w:val="en-FR" w:eastAsia="en-GB"/>
+          <w14:ligatures w14:val="standardContextual"/>
+        </w:rPr>
+      </w:pPr>
+      <w:hyperlink w:anchor="_Toc232585816" w:history="1">
+        <w:r>
+          <w:rPr>
+            <w:rStyle w:val="Hyperlink"/>
+            <w:noProof/>
+            <w:lang w:val="en-FR"/>
+          </w:rPr>
+          <w:t>(d)</w:t>
+        </w:r>
+        <w:r>
+          <w:rPr>
+            <w:rFonts w:asciiTheme="minorHAnsi" w:eastAsiaTheme="minorEastAsia" w:hAnsiTheme="minorHAnsi"/>
+            <w:noProof/>
+            <w:kern w:val="2"/>
+            <w:szCs w:val="24"/>
+            <w:lang w:val="en-FR" w:eastAsia="en-GB"/>
+            <w14:ligatures w14:val="standardContextual"/>
+          </w:rPr>
+          <w:tab/>
+        </w:r>
+        <w:r>
+          <w:rPr>
+            <w:rStyle w:val="Hyperlink"/>
+            <w:noProof/>
+            <w:lang w:val="en-FR"/>
+          </w:rPr>
+          <w:t>Formulaire de commentaires post-expérience</w:t>
+        </w:r>
+        <w:r>
+          <w:rPr>
+            <w:noProof/>
+            <w:webHidden/>
+          </w:rPr>
+          <w:tab/>
+        </w:r>
+        <w:r>
+          <w:rPr>
+            <w:noProof/>
+            <w:webHidden/>
+          </w:rPr>
+          <w:fldChar w:fldCharType="begin"/>
+        </w:r>
+        <w:r>
+          <w:rPr>
+            <w:noProof/>
+            <w:webHidden/>
+          </w:rPr>
+          <w:instrText xml:space="preserve"> PAGEREF _Toc232585816 \h </w:instrText>
+        </w:r>
+        <w:r>
+          <w:rPr>
+            <w:noProof/>
+            <w:webHidden/>
+          </w:rPr>
+        </w:r>
+        <w:r>
+          <w:rPr>
+            <w:noProof/>
+            <w:webHidden/>
+          </w:rPr>
+          <w:fldChar w:fldCharType="separate"/>
+        </w:r>
+        <w:r>
+          <w:rPr>
+            <w:noProof/>
+            <w:webHidden/>
+          </w:rPr>
+          <w:t>44</w:t>
         </w:r>
         <w:r>
           <w:rPr>
@@ -4997,7 +5353,7 @@
           <w14:ligatures w14:val="standardContextual"/>
         </w:rPr>
       </w:pPr>
-      <w:hyperlink w:anchor="_Toc232455140" w:history="1">
+      <w:hyperlink w:anchor="_Toc232585817" w:history="1">
         <w:r>
           <w:rPr>
             <w:rStyle w:val="Hyperlink"/>
@@ -5024,7 +5380,7 @@
             <w:noProof/>
             <w:webHidden/>
           </w:rPr>
-          <w:instrText xml:space="preserve"> PAGEREF _Toc232455140 \h </w:instrText>
+          <w:instrText xml:space="preserve"> PAGEREF _Toc232585817 \h </w:instrText>
         </w:r>
         <w:r>
           <w:rPr>
@@ -5044,7 +5400,7 @@
             <w:noProof/>
             <w:webHidden/>
           </w:rPr>
-          <w:t>42</w:t>
+          <w:t>45</w:t>
         </w:r>
         <w:r>
           <w:rPr>
@@ -5072,7 +5428,7 @@
           <w14:ligatures w14:val="standardContextual"/>
         </w:rPr>
       </w:pPr>
-      <w:hyperlink w:anchor="_Toc232455141" w:history="1">
+      <w:hyperlink w:anchor="_Toc232585818" w:history="1">
         <w:r>
           <w:rPr>
             <w:rStyle w:val="Hyperlink"/>
@@ -5099,7 +5455,7 @@
             <w:noProof/>
             <w:webHidden/>
           </w:rPr>
-          <w:instrText xml:space="preserve"> PAGEREF _Toc232455141 \h </w:instrText>
+          <w:instrText xml:space="preserve"> PAGEREF _Toc232585818 \h </w:instrText>
         </w:r>
         <w:r>
           <w:rPr>
@@ -5119,7 +5475,7 @@
             <w:noProof/>
             <w:webHidden/>
           </w:rPr>
-          <w:t>43</w:t>
+          <w:t>46</w:t>
         </w:r>
         <w:r>
           <w:rPr>
@@ -5147,7 +5503,7 @@
           <w14:ligatures w14:val="standardContextual"/>
         </w:rPr>
       </w:pPr>
-      <w:hyperlink w:anchor="_Toc232455142" w:history="1">
+      <w:hyperlink w:anchor="_Toc232585819" w:history="1">
         <w:r>
           <w:rPr>
             <w:rStyle w:val="Hyperlink"/>
@@ -5174,7 +5530,7 @@
             <w:noProof/>
             <w:webHidden/>
           </w:rPr>
-          <w:instrText xml:space="preserve"> PAGEREF _Toc232455142 \h </w:instrText>
+          <w:instrText xml:space="preserve"> PAGEREF _Toc232585819 \h </w:instrText>
         </w:r>
         <w:r>
           <w:rPr>
@@ -5194,7 +5550,7 @@
             <w:noProof/>
             <w:webHidden/>
           </w:rPr>
-          <w:t>46</w:t>
+          <w:t>49</w:t>
         </w:r>
         <w:r>
           <w:rPr>
@@ -5222,7 +5578,7 @@
           <w14:ligatures w14:val="standardContextual"/>
         </w:rPr>
       </w:pPr>
-      <w:hyperlink w:anchor="_Toc232455143" w:history="1">
+      <w:hyperlink w:anchor="_Toc232585820" w:history="1">
         <w:r>
           <w:rPr>
             <w:rStyle w:val="Hyperlink"/>
@@ -5249,7 +5605,7 @@
             <w:noProof/>
             <w:webHidden/>
           </w:rPr>
-          <w:instrText xml:space="preserve"> PAGEREF _Toc232455143 \h </w:instrText>
+          <w:instrText xml:space="preserve"> PAGEREF _Toc232585820 \h </w:instrText>
         </w:r>
         <w:r>
           <w:rPr>
@@ -5269,7 +5625,7 @@
             <w:noProof/>
             <w:webHidden/>
           </w:rPr>
-          <w:t>47</w:t>
+          <w:t>50</w:t>
         </w:r>
         <w:r>
           <w:rPr>
@@ -5297,7 +5653,7 @@
           <w14:ligatures w14:val="standardContextual"/>
         </w:rPr>
       </w:pPr>
-      <w:hyperlink w:anchor="_Toc232455144" w:history="1">
+      <w:hyperlink w:anchor="_Toc232585821" w:history="1">
         <w:r>
           <w:rPr>
             <w:rStyle w:val="Hyperlink"/>
@@ -5324,7 +5680,7 @@
             <w:noProof/>
             <w:webHidden/>
           </w:rPr>
-          <w:instrText xml:space="preserve"> PAGEREF _Toc232455144 \h </w:instrText>
+          <w:instrText xml:space="preserve"> PAGEREF _Toc232585821 \h </w:instrText>
         </w:r>
         <w:r>
           <w:rPr>
@@ -5344,7 +5700,7 @@
             <w:noProof/>
             <w:webHidden/>
           </w:rPr>
-          <w:t>48</w:t>
+          <w:t>51</w:t>
         </w:r>
         <w:r>
           <w:rPr>
@@ -5372,7 +5728,7 @@
           <w14:ligatures w14:val="standardContextual"/>
         </w:rPr>
       </w:pPr>
-      <w:hyperlink w:anchor="_Toc232455145" w:history="1">
+      <w:hyperlink w:anchor="_Toc232585822" w:history="1">
         <w:r>
           <w:rPr>
             <w:rStyle w:val="Hyperlink"/>
@@ -5399,7 +5755,7 @@
             <w:noProof/>
             <w:webHidden/>
           </w:rPr>
-          <w:instrText xml:space="preserve"> PAGEREF _Toc232455145 \h </w:instrText>
+          <w:instrText xml:space="preserve"> PAGEREF _Toc232585822 \h </w:instrText>
         </w:r>
         <w:r>
           <w:rPr>
@@ -5446,7 +5802,7 @@
           <w14:ligatures w14:val="standardContextual"/>
         </w:rPr>
       </w:pPr>
-      <w:hyperlink w:anchor="_Toc232455146" w:history="1">
+      <w:hyperlink w:anchor="_Toc232585823" w:history="1">
         <w:r>
           <w:rPr>
             <w:rStyle w:val="Hyperlink"/>
@@ -5491,7 +5847,7 @@
             <w:noProof/>
             <w:webHidden/>
           </w:rPr>
-          <w:instrText xml:space="preserve"> PAGEREF _Toc232455146 \h </w:instrText>
+          <w:instrText xml:space="preserve"> PAGEREF _Toc232585823 \h </w:instrText>
         </w:r>
         <w:r>
           <w:rPr>
@@ -5538,7 +5894,7 @@
           <w14:ligatures w14:val="standardContextual"/>
         </w:rPr>
       </w:pPr>
-      <w:hyperlink w:anchor="_Toc232455147" w:history="1">
+      <w:hyperlink w:anchor="_Toc232585824" w:history="1">
         <w:r>
           <w:rPr>
             <w:rStyle w:val="Hyperlink"/>
@@ -5562,7 +5918,7 @@
             <w:rStyle w:val="Hyperlink"/>
             <w:noProof/>
           </w:rPr>
-          <w:t>Annexe – Formulaire de consentement, Anglais.</w:t>
+          <w:t>Annexe – Formulaire de consentement, Anglaise</w:t>
         </w:r>
         <w:r>
           <w:rPr>
@@ -5583,7 +5939,7 @@
             <w:noProof/>
             <w:webHidden/>
           </w:rPr>
-          <w:instrText xml:space="preserve"> PAGEREF _Toc232455147 \h </w:instrText>
+          <w:instrText xml:space="preserve"> PAGEREF _Toc232585824 \h </w:instrText>
         </w:r>
         <w:r>
           <w:rPr>
@@ -5630,7 +5986,7 @@
           <w14:ligatures w14:val="standardContextual"/>
         </w:rPr>
       </w:pPr>
-      <w:hyperlink w:anchor="_Toc232455148" w:history="1">
+      <w:hyperlink w:anchor="_Toc232585825" w:history="1">
         <w:r>
           <w:rPr>
             <w:rStyle w:val="Hyperlink"/>
@@ -5675,7 +6031,7 @@
             <w:noProof/>
             <w:webHidden/>
           </w:rPr>
-          <w:instrText xml:space="preserve"> PAGEREF _Toc232455148 \h </w:instrText>
+          <w:instrText xml:space="preserve"> PAGEREF _Toc232585825 \h </w:instrText>
         </w:r>
         <w:r>
           <w:rPr>
@@ -5722,7 +6078,7 @@
           <w14:ligatures w14:val="standardContextual"/>
         </w:rPr>
       </w:pPr>
-      <w:hyperlink w:anchor="_Toc232455149" w:history="1">
+      <w:hyperlink w:anchor="_Toc232585826" w:history="1">
         <w:r>
           <w:rPr>
             <w:rStyle w:val="Hyperlink"/>
@@ -5746,7 +6102,7 @@
             <w:rStyle w:val="Hyperlink"/>
             <w:noProof/>
           </w:rPr>
-          <w:t>Annexe - Formulaire de consentement, Anglais</w:t>
+          <w:t>Annexe - Formulaire de consentement, française</w:t>
         </w:r>
         <w:r>
           <w:rPr>
@@ -5767,7 +6123,7 @@
             <w:noProof/>
             <w:webHidden/>
           </w:rPr>
-          <w:instrText xml:space="preserve"> PAGEREF _Toc232455149 \h </w:instrText>
+          <w:instrText xml:space="preserve"> PAGEREF _Toc232585826 \h </w:instrText>
         </w:r>
         <w:r>
           <w:rPr>
@@ -5814,7 +6170,7 @@
           <w14:ligatures w14:val="standardContextual"/>
         </w:rPr>
       </w:pPr>
-      <w:hyperlink w:anchor="_Toc232455150" w:history="1">
+      <w:hyperlink w:anchor="_Toc232585827" w:history="1">
         <w:r>
           <w:rPr>
             <w:rStyle w:val="Hyperlink"/>
@@ -5859,7 +6215,7 @@
             <w:noProof/>
             <w:webHidden/>
           </w:rPr>
-          <w:instrText xml:space="preserve"> PAGEREF _Toc232455150 \h </w:instrText>
+          <w:instrText xml:space="preserve"> PAGEREF _Toc232585827 \h </w:instrText>
         </w:r>
         <w:r>
           <w:rPr>
@@ -5906,7 +6262,7 @@
           <w14:ligatures w14:val="standardContextual"/>
         </w:rPr>
       </w:pPr>
-      <w:hyperlink w:anchor="_Toc232455151" w:history="1">
+      <w:hyperlink w:anchor="_Toc232585828" w:history="1">
         <w:r>
           <w:rPr>
             <w:rStyle w:val="Hyperlink"/>
@@ -5934,7 +6290,7 @@
             <w:noProof/>
             <w:lang w:eastAsia="en-GB"/>
           </w:rPr>
-          <w:t>Annexe 6 – Fiche d’évaluation du stage</w:t>
+          <w:t>Annexe  – Fiche d’évaluation du stage</w:t>
         </w:r>
         <w:r>
           <w:rPr>
@@ -5955,7 +6311,7 @@
             <w:noProof/>
             <w:webHidden/>
           </w:rPr>
-          <w:instrText xml:space="preserve"> PAGEREF _Toc232455151 \h </w:instrText>
+          <w:instrText xml:space="preserve"> PAGEREF _Toc232585828 \h </w:instrText>
         </w:r>
         <w:r>
           <w:rPr>
@@ -6016,7 +6372,7 @@
       <w:pPr>
         <w:pStyle w:val="Heading1"/>
       </w:pPr>
-      <w:bookmarkStart w:id="7" w:name="_Toc232455101"/>
+      <w:bookmarkStart w:id="7" w:name="_Toc232585774"/>
       <w:r>
         <w:lastRenderedPageBreak/>
         <w:t>Introduction</w:t>
@@ -6088,21 +6444,7 @@
         <w:rPr>
           <w:rFonts w:cs="Times New Roman"/>
         </w:rPr>
-        <w:t xml:space="preserve">L’intelligence artificielle générative s’impose de plus en plus dans les classes, avec des outils comme </w:t>
-      </w:r>
-      <w:proofErr w:type="spellStart"/>
-      <w:r>
-        <w:rPr>
-          <w:rFonts w:cs="Times New Roman"/>
-        </w:rPr>
-        <w:t>ChatGPT</w:t>
-      </w:r>
-      <w:proofErr w:type="spellEnd"/>
-      <w:r>
-        <w:rPr>
-          <w:rFonts w:cs="Times New Roman"/>
-        </w:rPr>
-        <w:t>, Claude.ai ou Duck.ai qui font désormais partie du quotidien de nombreux enseignants</w:t>
+        <w:t>L’intelligence artificielle générative s’impose de plus en plus dans les classes, avec des outils comme ChatGPT, Claude.ai ou Duck.ai qui font désormais partie du quotidien de nombreux enseignants</w:t>
       </w:r>
       <w:r>
         <w:rPr>
@@ -6435,7 +6777,7 @@
       <w:pPr>
         <w:pStyle w:val="Heading1"/>
       </w:pPr>
-      <w:bookmarkStart w:id="8" w:name="_Toc232455102"/>
+      <w:bookmarkStart w:id="8" w:name="_Toc232585775"/>
       <w:r>
         <w:lastRenderedPageBreak/>
         <w:t>Cadre théorique</w:t>
@@ -6483,7 +6825,7 @@
       <w:pPr>
         <w:pStyle w:val="Heading2"/>
       </w:pPr>
-      <w:bookmarkStart w:id="10" w:name="_Toc232455103"/>
+      <w:bookmarkStart w:id="10" w:name="_Toc232585776"/>
       <w:r>
         <w:t>L'évolution technologique et la planification des cours en enseignement des langues</w:t>
       </w:r>
@@ -6582,15 +6924,7 @@
     <w:p/>
     <w:p>
       <w:r>
-        <w:t xml:space="preserve">Aujourd’hui, l’IA générative change la donne. Avec des interfaces comme </w:t>
-      </w:r>
-      <w:proofErr w:type="spellStart"/>
-      <w:r>
-        <w:t>ChatGPT</w:t>
-      </w:r>
-      <w:proofErr w:type="spellEnd"/>
-      <w:r>
-        <w:t>, il suffit de rédiger une consigne pour générer instantanément un plan de cours, des exercices ou des explications</w:t>
+        <w:t>Aujourd’hui, l’IA générative change la donne. Avec des interfaces comme ChatGPT, il suffit de rédiger une consigne pour générer instantanément un plan de cours, des exercices ou des explications</w:t>
       </w:r>
       <w:r>
         <w:t xml:space="preserve"> </w:t>
@@ -6679,7 +7013,7 @@
       <w:pPr>
         <w:pStyle w:val="Heading3"/>
       </w:pPr>
-      <w:bookmarkStart w:id="11" w:name="_Toc232455104"/>
+      <w:bookmarkStart w:id="11" w:name="_Toc232585777"/>
       <w:r>
         <w:t>La planification des cours dans l'enseignement des langues avant l'IA</w:t>
       </w:r>
@@ -6708,7 +7042,6 @@
           <w:lang w:val="en-FR" w:eastAsia="en-GB"/>
         </w:rPr>
       </w:pPr>
-      <w:bookmarkStart w:id="12" w:name="_Toc232455105"/>
       <w:r>
         <w:rPr>
           <w:rFonts w:eastAsia="Times New Roman"/>
@@ -6716,6 +7049,7 @@
         </w:rPr>
         <w:t xml:space="preserve"> </w:t>
       </w:r>
+      <w:bookmarkStart w:id="12" w:name="_Toc232585778"/>
       <w:r>
         <w:rPr>
           <w:rFonts w:eastAsia="Times New Roman"/>
@@ -6748,35 +7082,7 @@
         <w:rPr>
           <w:lang w:eastAsia="en-GB"/>
         </w:rPr>
-        <w:t>« Computer-</w:t>
-      </w:r>
-      <w:proofErr w:type="spellStart"/>
-      <w:r>
-        <w:rPr>
-          <w:lang w:eastAsia="en-GB"/>
-        </w:rPr>
-        <w:t>Assisted</w:t>
-      </w:r>
-      <w:proofErr w:type="spellEnd"/>
-      <w:r>
-        <w:rPr>
-          <w:lang w:eastAsia="en-GB"/>
-        </w:rPr>
-        <w:t xml:space="preserve"> </w:t>
-      </w:r>
-      <w:proofErr w:type="spellStart"/>
-      <w:r>
-        <w:rPr>
-          <w:lang w:eastAsia="en-GB"/>
-        </w:rPr>
-        <w:t>Language</w:t>
-      </w:r>
-      <w:proofErr w:type="spellEnd"/>
-      <w:r>
-        <w:rPr>
-          <w:lang w:eastAsia="en-GB"/>
-        </w:rPr>
-        <w:t xml:space="preserve"> Learning (CALL) »</w:t>
+        <w:t>« Computer-Assisted Language Learning (CALL) »</w:t>
       </w:r>
       <w:r>
         <w:rPr>
@@ -6915,7 +7221,6 @@
           <w:lang w:eastAsia="en-GB"/>
         </w:rPr>
       </w:pPr>
-      <w:bookmarkStart w:id="13" w:name="_Toc232455106"/>
       <w:r>
         <w:rPr>
           <w:rFonts w:eastAsia="Times New Roman"/>
@@ -6923,6 +7228,7 @@
         </w:rPr>
         <w:t xml:space="preserve"> </w:t>
       </w:r>
+      <w:bookmarkStart w:id="13" w:name="_Toc232585779"/>
       <w:r>
         <w:rPr>
           <w:rFonts w:eastAsia="Times New Roman"/>
@@ -7011,7 +7317,7 @@
       <w:pPr>
         <w:pStyle w:val="Heading2"/>
       </w:pPr>
-      <w:bookmarkStart w:id="14" w:name="_Toc232455107"/>
+      <w:bookmarkStart w:id="14" w:name="_Toc232585780"/>
       <w:r>
         <w:lastRenderedPageBreak/>
         <w:t>La cognition enseignante et la planification des cours</w:t>
@@ -7064,7 +7370,7 @@
       <w:r>
         <w:t xml:space="preserve"> </w:t>
       </w:r>
-      <w:bookmarkStart w:id="15" w:name="_Toc232455108"/>
+      <w:bookmarkStart w:id="15" w:name="_Toc232585781"/>
       <w:r>
         <w:t>L'alignement entre croyances et pratiques des enseignants</w:t>
       </w:r>
@@ -7166,7 +7472,7 @@
           <w:lang w:eastAsia="en-GB"/>
         </w:rPr>
       </w:pPr>
-      <w:bookmarkStart w:id="16" w:name="_Toc232455109"/>
+      <w:bookmarkStart w:id="16" w:name="_Toc232585782"/>
       <w:r>
         <w:rPr>
           <w:rFonts w:eastAsia="Times New Roman"/>
@@ -7267,35 +7573,7 @@
         <w:rPr>
           <w:lang w:eastAsia="en-GB"/>
         </w:rPr>
-        <w:t xml:space="preserve">. Ces pressions contribuent à définir « </w:t>
-      </w:r>
-      <w:proofErr w:type="spellStart"/>
-      <w:r>
-        <w:rPr>
-          <w:lang w:eastAsia="en-GB"/>
-        </w:rPr>
-        <w:t>Personal</w:t>
-      </w:r>
-      <w:proofErr w:type="spellEnd"/>
-      <w:r>
-        <w:rPr>
-          <w:lang w:eastAsia="en-GB"/>
-        </w:rPr>
-        <w:t xml:space="preserve"> </w:t>
-      </w:r>
-      <w:proofErr w:type="spellStart"/>
-      <w:r>
-        <w:rPr>
-          <w:lang w:eastAsia="en-GB"/>
-        </w:rPr>
-        <w:t>space</w:t>
-      </w:r>
-      <w:proofErr w:type="spellEnd"/>
-      <w:r>
-        <w:rPr>
-          <w:lang w:eastAsia="en-GB"/>
-        </w:rPr>
-        <w:t xml:space="preserve"> » </w:t>
+        <w:t xml:space="preserve">. Ces pressions contribuent à définir « Personal space » </w:t>
       </w:r>
       <w:r>
         <w:rPr>
@@ -7443,7 +7721,7 @@
           <w:lang w:eastAsia="en-GB"/>
         </w:rPr>
       </w:pPr>
-      <w:bookmarkStart w:id="17" w:name="_Toc232455110"/>
+      <w:bookmarkStart w:id="17" w:name="_Toc232585783"/>
       <w:r>
         <w:rPr>
           <w:lang w:eastAsia="en-GB"/>
@@ -7676,7 +7954,7 @@
           <w:lang w:eastAsia="en-GB"/>
         </w:rPr>
       </w:pPr>
-      <w:bookmarkStart w:id="18" w:name="_Toc232455111"/>
+      <w:bookmarkStart w:id="18" w:name="_Toc232585784"/>
       <w:r>
         <w:rPr>
           <w:lang w:val="en-FR" w:eastAsia="en-GB"/>
@@ -7986,7 +8264,7 @@
       <w:pPr>
         <w:pStyle w:val="Heading2"/>
       </w:pPr>
-      <w:bookmarkStart w:id="21" w:name="_Toc232455112"/>
+      <w:bookmarkStart w:id="21" w:name="_Toc232585785"/>
       <w:r>
         <w:t>L'adoption technologique en éducation : Théories et obstacles</w:t>
       </w:r>
@@ -8309,7 +8587,7 @@
       <w:r>
         <w:t xml:space="preserve"> </w:t>
       </w:r>
-      <w:bookmarkStart w:id="22" w:name="_Toc232455113"/>
+      <w:bookmarkStart w:id="22" w:name="_Toc232585786"/>
       <w:r>
         <w:t>Qu'est-ce que l'adoption technologique ?</w:t>
       </w:r>
@@ -8357,15 +8635,7 @@
     <w:p/>
     <w:p>
       <w:r>
-        <w:t xml:space="preserve">Cet aspect est essentiel pour les enseignants en raison du fait qu'il met en évidence leur agentivité face aux changements numériques. Bien qu'un enseignant puisse disposer d'un accès complet et gratuit à </w:t>
-      </w:r>
-      <w:proofErr w:type="spellStart"/>
-      <w:r>
-        <w:t>ChatGPT</w:t>
-      </w:r>
-      <w:proofErr w:type="spellEnd"/>
-      <w:r>
-        <w:t xml:space="preserve">, il reste libre de décider de ne pas l'utiliser dans son activité quotidiennement. En effet, l'adoption n'est pas déterminée par le fait que l'outil soit disponible techniquement ; au contraire, elle est influencée par un ensemble de facteurs psychologiques, pédagogiques et contextuels. </w:t>
+        <w:t xml:space="preserve">Cet aspect est essentiel pour les enseignants en raison du fait qu'il met en évidence leur agentivité face aux changements numériques. Bien qu'un enseignant puisse disposer d'un accès complet et gratuit à ChatGPT, il reste libre de décider de ne pas l'utiliser dans son activité quotidiennement. En effet, l'adoption n'est pas déterminée par le fait que l'outil soit disponible techniquement ; au contraire, elle est influencée par un ensemble de facteurs psychologiques, pédagogiques et contextuels. </w:t>
       </w:r>
     </w:p>
     <w:p/>
@@ -8388,7 +8658,7 @@
         </w:rPr>
         <w:t xml:space="preserve"> </w:t>
       </w:r>
-      <w:bookmarkStart w:id="23" w:name="_Toc232455114"/>
+      <w:bookmarkStart w:id="23" w:name="_Toc232585787"/>
       <w:r>
         <w:rPr>
           <w:lang w:val="en-FR"/>
@@ -8825,7 +9095,7 @@
       <w:pPr>
         <w:pStyle w:val="Heading3"/>
       </w:pPr>
-      <w:bookmarkStart w:id="24" w:name="_Toc232455115"/>
+      <w:bookmarkStart w:id="24" w:name="_Toc232585788"/>
       <w:r>
         <w:t>Barrières et facteurs influençant l'adoption</w:t>
       </w:r>
@@ -8920,21 +9190,8 @@
     </w:p>
     <w:p/>
     <w:p>
-      <w:proofErr w:type="spellStart"/>
-      <w:r>
-        <w:t>Kohnke</w:t>
-      </w:r>
-      <w:proofErr w:type="spellEnd"/>
-      <w:r>
-        <w:t xml:space="preserve">, </w:t>
-      </w:r>
-      <w:proofErr w:type="spellStart"/>
-      <w:r>
-        <w:t>Moorhouse</w:t>
-      </w:r>
-      <w:proofErr w:type="spellEnd"/>
-      <w:r>
-        <w:t xml:space="preserve"> et Zou</w:t>
+      <w:r>
+        <w:t>Kohnke, Moorhouse et Zou</w:t>
       </w:r>
       <w:r>
         <w:t xml:space="preserve"> </w:t>
@@ -9019,7 +9276,7 @@
         <w:pStyle w:val="Heading3"/>
         <w:jc w:val="center"/>
       </w:pPr>
-      <w:bookmarkStart w:id="25" w:name="_Toc232455116"/>
+      <w:bookmarkStart w:id="25" w:name="_Toc232585789"/>
       <w:r>
         <w:lastRenderedPageBreak/>
         <w:t>E</w:t>
@@ -9097,34 +9354,19 @@
         <w:t xml:space="preserve">. </w:t>
       </w:r>
       <w:r>
-        <w:t>Ce terme est une évolution du cadre de littératie pédagogique TPACK (</w:t>
-      </w:r>
-      <w:proofErr w:type="spellStart"/>
-      <w:r>
-        <w:t>Technological</w:t>
-      </w:r>
-      <w:proofErr w:type="spellEnd"/>
+        <w:t>Ce terme est une évolution du cadre de littératie pédagogique TPACK (Technological</w:t>
+      </w:r>
       <w:r>
         <w:t xml:space="preserve">, </w:t>
       </w:r>
-      <w:proofErr w:type="spellStart"/>
       <w:r>
         <w:t>Pedagogical</w:t>
       </w:r>
-      <w:proofErr w:type="spellEnd"/>
       <w:r>
         <w:t xml:space="preserve"> and </w:t>
       </w:r>
       <w:r>
-        <w:t xml:space="preserve">Content </w:t>
-      </w:r>
-      <w:proofErr w:type="spellStart"/>
-      <w:r>
-        <w:t>Knowledge</w:t>
-      </w:r>
-      <w:proofErr w:type="spellEnd"/>
-      <w:r>
-        <w:t>) dans lequel il est reconnu que, à part la maîtrise de la technologie, l'enseignant doit être capable de créer une interaction entre la machine et l'être humain pour promouvoir l'apprentissage. L'idée ici est que l'enseignant doit savoir comment formuler des invit</w:t>
+        <w:t>Content Knowledge) dans lequel il est reconnu que, à part la maîtrise de la technologie, l'enseignant doit être capable de créer une interaction entre la machine et l'être humain pour promouvoir l'apprentissage. L'idée ici est que l'enseignant doit savoir comment formuler des invit</w:t>
       </w:r>
       <w:r>
         <w:t>e</w:t>
@@ -9240,7 +9482,7 @@
       <w:pPr>
         <w:pStyle w:val="Heading2"/>
       </w:pPr>
-      <w:bookmarkStart w:id="26" w:name="_Toc232455117"/>
+      <w:bookmarkStart w:id="26" w:name="_Toc232585790"/>
       <w:r>
         <w:t>L'intelligence artificielle dans</w:t>
       </w:r>
@@ -9431,11 +9673,11 @@
           <w:numId w:val="23"/>
         </w:numPr>
       </w:pPr>
-      <w:bookmarkStart w:id="27" w:name="_Toc232455118"/>
       <w:r>
         <w:lastRenderedPageBreak/>
         <w:t xml:space="preserve"> </w:t>
       </w:r>
+      <w:bookmarkStart w:id="27" w:name="_Toc232585791"/>
       <w:r>
         <w:t>Applications et affordances de l'IA dans l'enseignement des langues</w:t>
       </w:r>
@@ -9450,42 +9692,13 @@
     <w:p/>
     <w:p>
       <w:r>
-        <w:t xml:space="preserve">Godwin-Jones (2023) fait le point sur l’évolution technologique des premiers </w:t>
-      </w:r>
-      <w:proofErr w:type="spellStart"/>
-      <w:r>
-        <w:t>chatbots</w:t>
-      </w:r>
-      <w:proofErr w:type="spellEnd"/>
-      <w:r>
-        <w:t xml:space="preserve"> fondés sur des règles rigides vers les modèles de langage de grande taille actuels. L’auteur montre que les LLM réalisent un saut qualitatif majeur dans la production de texte fluide, qui se caractérise par une plasticité morphosyntaxique et une adaptabilité sociolinguistique face aux requêtes de l’utilisateur. Pour les enseignants, cela signifie que l’accès aux supports ciblés ne dépend plus d’une recherche documentaire chronophage ; l’outil agit comme un système dynamique, capable de générer à la demande des dialogues réalistes, des textes de fiction ou des documents authentiques adaptés aux besoins linguistiques et cognitifs immédiats de la classe.</w:t>
+        <w:t>Godwin-Jones (2023) fait le point sur l’évolution technologique des premiers chatbots fondés sur des règles rigides vers les modèles de langage de grande taille actuels. L’auteur montre que les LLM réalisent un saut qualitatif majeur dans la production de texte fluide, qui se caractérise par une plasticité morphosyntaxique et une adaptabilité sociolinguistique face aux requêtes de l’utilisateur. Pour les enseignants, cela signifie que l’accès aux supports ciblés ne dépend plus d’une recherche documentaire chronophage ; l’outil agit comme un système dynamique, capable de générer à la demande des dialogues réalistes, des textes de fiction ou des documents authentiques adaptés aux besoins linguistiques et cognitifs immédiats de la classe.</w:t>
       </w:r>
     </w:p>
     <w:p/>
     <w:p>
-      <w:proofErr w:type="spellStart"/>
-      <w:r>
-        <w:t>Moorhouse</w:t>
-      </w:r>
-      <w:proofErr w:type="spellEnd"/>
-      <w:r>
-        <w:t xml:space="preserve"> &amp; </w:t>
-      </w:r>
-      <w:proofErr w:type="spellStart"/>
-      <w:r>
-        <w:t>Kohnke</w:t>
-      </w:r>
-      <w:proofErr w:type="spellEnd"/>
-      <w:r>
-        <w:t xml:space="preserve"> (2024) examinent la façon dont les enseignants emploient l'ingénierie des invites dans leur préparation. Ils montrent que cette compétence fait de l’IA un « copilote » cognitif, qui optimise le travail invisible en produisant instantanément des grilles d’évaluation, des planifications de séquences ou des activités de systématisation lexicale. Selon </w:t>
-      </w:r>
-      <w:proofErr w:type="spellStart"/>
-      <w:r>
-        <w:t>Hockly</w:t>
-      </w:r>
-      <w:proofErr w:type="spellEnd"/>
-      <w:r>
-        <w:t xml:space="preserve"> (2023), l’IA générative est particulièrement douée pour l’échafaudage textuel, la simplification morphosyntaxique contrôlée et la déclinaison d’un support en plusieurs niveaux de complexité linguistique. Cela permet de concrétiser la différenciation pédagogique en adaptant un document source aux profils hétérogènes des élèves (A1-B2 du CECRL), atténuant ainsi la surcharge de travail associée à l'hétérogénéité.</w:t>
+      <w:r>
+        <w:t>Moorhouse &amp; Kohnke (2024) examinent la façon dont les enseignants emploient l'ingénierie des invites dans leur préparation. Ils montrent que cette compétence fait de l’IA un « copilote » cognitif, qui optimise le travail invisible en produisant instantanément des grilles d’évaluation, des planifications de séquences ou des activités de systématisation lexicale. Selon Hockly (2023), l’IA générative est particulièrement douée pour l’échafaudage textuel, la simplification morphosyntaxique contrôlée et la déclinaison d’un support en plusieurs niveaux de complexité linguistique. Cela permet de concrétiser la différenciation pédagogique en adaptant un document source aux profils hétérogènes des élèves (A1-B2 du CECRL), atténuant ainsi la surcharge de travail associée à l'hétérogénéité.</w:t>
       </w:r>
     </w:p>
     <w:p/>
@@ -9493,7 +9706,7 @@
       <w:pPr>
         <w:pStyle w:val="Heading3"/>
       </w:pPr>
-      <w:bookmarkStart w:id="28" w:name="_Toc232455119"/>
+      <w:bookmarkStart w:id="28" w:name="_Toc232585792"/>
       <w:r>
         <w:t>Efficacité et limites de l'IA pour l'enseignement des langues</w:t>
       </w:r>
@@ -9523,15 +9736,7 @@
     <w:p/>
     <w:p>
       <w:r>
-        <w:t xml:space="preserve">Cependant, les mêmes chercheurs identifient des limitations : l'IA générative échoue à évaluer la cohérence macro-discursive, à décoder l'implicite textuel, à interpréter les nuances pragmatiques ou à manifester une sensibilité aux variations interculturelles. Le traitement didactique requiert une réévaluation par l'enseignant, seul garant de la validation du sens et de l'accompagnement stylistique. </w:t>
-      </w:r>
-      <w:proofErr w:type="spellStart"/>
-      <w:r>
-        <w:t>Hockly</w:t>
-      </w:r>
-      <w:proofErr w:type="spellEnd"/>
-      <w:r>
-        <w:t xml:space="preserve"> (2023) avertit aussi que l'usage non encadré comporte le risque d'induire une uniformisation stylistique, de masquer les véritables processus d'acquisition et de propager des biais de genre, d'ethnocentrisme ou des stéréotypes culturels sédimentés dans les données d'entraînement.</w:t>
+        <w:t>Cependant, les mêmes chercheurs identifient des limitations : l'IA générative échoue à évaluer la cohérence macro-discursive, à décoder l'implicite textuel, à interpréter les nuances pragmatiques ou à manifester une sensibilité aux variations interculturelles. Le traitement didactique requiert une réévaluation par l'enseignant, seul garant de la validation du sens et de l'accompagnement stylistique. Hockly (2023) avertit aussi que l'usage non encadré comporte le risque d'induire une uniformisation stylistique, de masquer les véritables processus d'acquisition et de propager des biais de genre, d'ethnocentrisme ou des stéréotypes culturels sédimentés dans les données d'entraînement.</w:t>
       </w:r>
     </w:p>
     <w:p>
@@ -9547,7 +9752,7 @@
       <w:pPr>
         <w:pStyle w:val="Heading3"/>
       </w:pPr>
-      <w:bookmarkStart w:id="29" w:name="_Toc232455120"/>
+      <w:bookmarkStart w:id="29" w:name="_Toc232585793"/>
       <w:r>
         <w:t>Perspectives critiques et contexte français</w:t>
       </w:r>
@@ -9555,27 +9760,14 @@
     </w:p>
     <w:p/>
     <w:p>
-      <w:proofErr w:type="spellStart"/>
-      <w:r>
-        <w:t>Devauçelle</w:t>
-      </w:r>
-      <w:proofErr w:type="spellEnd"/>
-      <w:r>
-        <w:t xml:space="preserve"> (2023) est l'autorité qui donne la vision critique nécessaire pour alerter sur le déterminisme technologique et l'illusion technique qui postule que la nouvelle innovation logicielle peut prendre la place des relations de l'enseignement. En fait, l'utilisation de l'IA n'a d'avantage que s'il est placé sous un projet de formation éthique et réglementé défini par le praticien dans le contexte particulier.</w:t>
+      <w:r>
+        <w:t>Devauçelle (2023) est l'autorité qui donne la vision critique nécessaire pour alerter sur le déterminisme technologique et l'illusion technique qui postule que la nouvelle innovation logicielle peut prendre la place des relations de l'enseignement. En fait, l'utilisation de l'IA n'a d'avantage que s'il est placé sous un projet de formation éthique et réglementé défini par le praticien dans le contexte particulier.</w:t>
       </w:r>
     </w:p>
     <w:p/>
     <w:p>
       <w:r>
-        <w:t xml:space="preserve">En complément, Ollivier (2023) s'attaque à la littératie numérique critique nécessaire à chaque enseignant des langues. En effet, l'usage de modèles de langages impliquent des hégémonies linguistiques, stéréotypes et </w:t>
-      </w:r>
-      <w:proofErr w:type="spellStart"/>
-      <w:r>
-        <w:t>occidentalo</w:t>
-      </w:r>
-      <w:proofErr w:type="spellEnd"/>
-      <w:r>
-        <w:t>-centristes. Pour cet effet, les enseignants ont à développer une conscience critique et des compétences en matière de déconstruction pour permettre à leurs élèves d'analyser les outils de communication sur un plan politique, idéologique et culturel.</w:t>
+        <w:t>En complément, Ollivier (2023) s'attaque à la littératie numérique critique nécessaire à chaque enseignant des langues. En effet, l'usage de modèles de langages impliquent des hégémonies linguistiques, stéréotypes et occidentalo-centristes. Pour cet effet, les enseignants ont à développer une conscience critique et des compétences en matière de déconstruction pour permettre à leurs élèves d'analyser les outils de communication sur un plan politique, idéologique et culturel.</w:t>
       </w:r>
     </w:p>
     <w:p/>
@@ -9586,7 +9778,7 @@
       <w:r>
         <w:t xml:space="preserve"> </w:t>
       </w:r>
-      <w:bookmarkStart w:id="30" w:name="_Toc232455121"/>
+      <w:bookmarkStart w:id="30" w:name="_Toc232585794"/>
       <w:r>
         <w:t>Synthèse et lacune de recherche</w:t>
       </w:r>
@@ -9625,7 +9817,7 @@
       <w:pPr>
         <w:pStyle w:val="Heading1"/>
       </w:pPr>
-      <w:bookmarkStart w:id="31" w:name="_Toc232455122"/>
+      <w:bookmarkStart w:id="31" w:name="_Toc232585795"/>
       <w:r>
         <w:lastRenderedPageBreak/>
         <w:t>Méthodologie</w:t>
@@ -9692,7 +9884,7 @@
           <w:numId w:val="26"/>
         </w:numPr>
       </w:pPr>
-      <w:bookmarkStart w:id="32" w:name="_Toc232455123"/>
+      <w:bookmarkStart w:id="32" w:name="_Toc232585796"/>
       <w:r>
         <w:t>Questionnaire Préliminaire</w:t>
       </w:r>
@@ -9765,15 +9957,7 @@
       </w:r>
       <w:r>
         <w:lastRenderedPageBreak/>
-        <w:t>quotidien, échelle 1-4), les outils spécifiques utilisés (</w:t>
-      </w:r>
-      <w:proofErr w:type="spellStart"/>
-      <w:r>
-        <w:t>ChatGPT</w:t>
-      </w:r>
-      <w:proofErr w:type="spellEnd"/>
-      <w:r>
-        <w:t xml:space="preserve">, Claude.ai ou autre), les raisons motivant leur utilisation, et finalement la perception que l'IA générative aide à bien dirigé le temps </w:t>
+        <w:t xml:space="preserve">quotidien, échelle 1-4), les outils spécifiques utilisés (ChatGPT, Claude.ai ou autre), les raisons motivant leur utilisation, et finalement la perception que l'IA générative aide à bien dirigé le temps </w:t>
       </w:r>
       <w:r>
         <w:t xml:space="preserve">de </w:t>
@@ -9847,7 +10031,7 @@
           <w:numId w:val="24"/>
         </w:numPr>
       </w:pPr>
-      <w:bookmarkStart w:id="34" w:name="_Toc232455124"/>
+      <w:bookmarkStart w:id="34" w:name="_Toc232585797"/>
       <w:r>
         <w:t>Contexte</w:t>
       </w:r>
@@ -9889,7 +10073,7 @@
       <w:bookmarkStart w:id="36" w:name="_Ref231073419"/>
       <w:bookmarkStart w:id="37" w:name="_Ref231073420"/>
       <w:bookmarkStart w:id="38" w:name="_Ref231073422"/>
-      <w:bookmarkStart w:id="39" w:name="_Toc232455125"/>
+      <w:bookmarkStart w:id="39" w:name="_Toc232585798"/>
       <w:r>
         <w:t xml:space="preserve">Le </w:t>
       </w:r>
@@ -9991,10 +10175,10 @@
       <w:pPr>
         <w:pStyle w:val="Heading3"/>
       </w:pPr>
-      <w:bookmarkStart w:id="40" w:name="_Toc232455126"/>
       <w:r>
         <w:t xml:space="preserve"> </w:t>
       </w:r>
+      <w:bookmarkStart w:id="40" w:name="_Toc232585799"/>
       <w:r>
         <w:t>Le système scolaire en France et</w:t>
       </w:r>
@@ -10233,7 +10417,7 @@
       <w:pPr>
         <w:pStyle w:val="Heading3"/>
       </w:pPr>
-      <w:bookmarkStart w:id="42" w:name="_Toc232455127"/>
+      <w:bookmarkStart w:id="42" w:name="_Toc232585800"/>
       <w:r>
         <w:t>Le cadre réglementaire relatif aux outils TICE et IA dans les écoles Françaises</w:t>
       </w:r>
@@ -10857,7 +11041,7 @@
           <w:lang w:val="en-FR"/>
         </w:rPr>
       </w:pPr>
-      <w:bookmarkStart w:id="44" w:name="_Toc232455128"/>
+      <w:bookmarkStart w:id="44" w:name="_Toc232585801"/>
       <w:r>
         <w:rPr>
           <w:lang w:val="en-FR"/>
@@ -10938,7 +11122,7 @@
         <w:rPr>
           <w:lang w:val="en-FR"/>
         </w:rPr>
-        <w:t>1)</w:t>
+        <w:t>(a)</w:t>
       </w:r>
       <w:r>
         <w:rPr>
@@ -11040,7 +11224,7 @@
       <w:pPr>
         <w:pStyle w:val="Heading2"/>
       </w:pPr>
-      <w:bookmarkStart w:id="45" w:name="_Toc232455129"/>
+      <w:bookmarkStart w:id="45" w:name="_Toc232585802"/>
       <w:r>
         <w:lastRenderedPageBreak/>
         <w:t>Design de Recherche</w:t>
@@ -11076,7 +11260,7 @@
       <w:r>
         <w:t xml:space="preserve"> </w:t>
       </w:r>
-      <w:bookmarkStart w:id="46" w:name="_Toc232455130"/>
+      <w:bookmarkStart w:id="46" w:name="_Toc232585803"/>
       <w:r>
         <w:t>Structure générale</w:t>
       </w:r>
@@ -11104,7 +11288,7 @@
       <w:r>
         <w:t xml:space="preserve"> </w:t>
       </w:r>
-      <w:bookmarkStart w:id="47" w:name="_Toc232455131"/>
+      <w:bookmarkStart w:id="47" w:name="_Toc232585804"/>
       <w:r>
         <w:t>Sur quoi porte les deux phases ?</w:t>
       </w:r>
@@ -11376,7 +11560,7 @@
           <w:lang w:val="en-FR"/>
         </w:rPr>
       </w:pPr>
-      <w:bookmarkStart w:id="48" w:name="_Toc232455132"/>
+      <w:bookmarkStart w:id="48" w:name="_Toc232585805"/>
       <w:r>
         <w:rPr>
           <w:lang w:val="en-FR"/>
@@ -11429,7 +11613,7 @@
       <w:r>
         <w:t xml:space="preserve"> </w:t>
       </w:r>
-      <w:bookmarkStart w:id="49" w:name="_Toc232455133"/>
+      <w:bookmarkStart w:id="49" w:name="_Toc232585806"/>
       <w:r>
         <w:t>Plans de cours</w:t>
       </w:r>
@@ -11463,7 +11647,7 @@
       <w:r>
         <w:t xml:space="preserve"> </w:t>
       </w:r>
-      <w:bookmarkStart w:id="50" w:name="_Toc232455134"/>
+      <w:bookmarkStart w:id="50" w:name="_Toc232585807"/>
       <w:r>
         <w:t>Chronomètre</w:t>
       </w:r>
@@ -11518,7 +11702,7 @@
       <w:pPr>
         <w:pStyle w:val="Heading3"/>
       </w:pPr>
-      <w:bookmarkStart w:id="51" w:name="_Toc232455135"/>
+      <w:bookmarkStart w:id="51" w:name="_Toc232585808"/>
       <w:r>
         <w:t>Enregistrement de vidéo (Phase I et Phase II)</w:t>
       </w:r>
@@ -11545,7 +11729,7 @@
       <w:pPr>
         <w:pStyle w:val="Heading3"/>
       </w:pPr>
-      <w:bookmarkStart w:id="52" w:name="_Toc232455136"/>
+      <w:bookmarkStart w:id="52" w:name="_Toc232585809"/>
       <w:r>
         <w:t>Enregistrement d'écran (Phase II uniquement)</w:t>
       </w:r>
@@ -11564,7 +11748,7 @@
       <w:pPr>
         <w:pStyle w:val="Heading3"/>
       </w:pPr>
-      <w:bookmarkStart w:id="53" w:name="_Toc232455137"/>
+      <w:bookmarkStart w:id="53" w:name="_Toc232585810"/>
       <w:r>
         <w:t>Interactions IA exportées (PDF)</w:t>
       </w:r>
@@ -11595,7 +11779,7 @@
       <w:pPr>
         <w:pStyle w:val="Heading3"/>
       </w:pPr>
-      <w:bookmarkStart w:id="54" w:name="_Toc232455138"/>
+      <w:bookmarkStart w:id="54" w:name="_Toc232585811"/>
       <w:r>
         <w:t>Formulaire de feedback post-test</w:t>
       </w:r>
@@ -11855,7 +12039,7 @@
       <w:pPr>
         <w:pStyle w:val="Heading2"/>
       </w:pPr>
-      <w:bookmarkStart w:id="55" w:name="_Toc232455139"/>
+      <w:bookmarkStart w:id="55" w:name="_Toc232585812"/>
       <w:r>
         <w:t>L’étude</w:t>
       </w:r>
@@ -11914,10 +12098,18 @@
       </w:pPr>
       <w:r>
         <w:lastRenderedPageBreak/>
+        <w:t xml:space="preserve"> </w:t>
+      </w:r>
+      <w:bookmarkStart w:id="56" w:name="_Toc232585813"/>
+      <w:r>
         <w:t xml:space="preserve">Profil démographique, professionnel et technologique </w:t>
       </w:r>
       <w:r>
-        <w:t xml:space="preserve">des participants </w:t>
+        <w:t>des participants</w:t>
+      </w:r>
+      <w:bookmarkEnd w:id="56"/>
+      <w:r>
+        <w:t xml:space="preserve"> </w:t>
       </w:r>
       <w:r>
         <w:br/>
@@ -12019,27 +12211,7 @@
                 <w:bCs/>
                 <w:szCs w:val="24"/>
               </w:rPr>
-              <w:t>Années d’</w:t>
-            </w:r>
-            <w:proofErr w:type="spellStart"/>
-            <w:r>
-              <w:rPr>
-                <w:rFonts w:cs="Times New Roman"/>
-                <w:b/>
-                <w:bCs/>
-                <w:szCs w:val="24"/>
-              </w:rPr>
-              <w:t>experience</w:t>
-            </w:r>
-            <w:proofErr w:type="spellEnd"/>
-            <w:r>
-              <w:rPr>
-                <w:rFonts w:cs="Times New Roman"/>
-                <w:b/>
-                <w:bCs/>
-                <w:szCs w:val="24"/>
-              </w:rPr>
-              <w:t xml:space="preserve"> d’enseignement</w:t>
+              <w:t>Années d’experience d’enseignement</w:t>
             </w:r>
           </w:p>
         </w:tc>
@@ -13168,8 +13340,13 @@
         </w:numPr>
       </w:pPr>
       <w:r>
+        <w:t xml:space="preserve"> </w:t>
+      </w:r>
+      <w:bookmarkStart w:id="57" w:name="_Toc232585814"/>
+      <w:r>
         <w:t>Phase I</w:t>
       </w:r>
+      <w:bookmarkEnd w:id="57"/>
     </w:p>
     <w:p/>
     <w:p>
@@ -13620,11 +13797,19 @@
           <w:lang w:val="en-FR"/>
         </w:rPr>
       </w:pPr>
-      <w:r>
-        <w:rPr>
-          <w:lang w:val="en-FR"/>
-        </w:rPr>
-        <w:t xml:space="preserve">Phase 2 </w:t>
+      <w:bookmarkStart w:id="58" w:name="_Toc232585815"/>
+      <w:r>
+        <w:rPr>
+          <w:lang w:val="en-FR"/>
+        </w:rPr>
+        <w:t>Phase 2</w:t>
+      </w:r>
+      <w:bookmarkEnd w:id="58"/>
+      <w:r>
+        <w:rPr>
+          <w:lang w:val="en-FR"/>
+        </w:rPr>
+        <w:t xml:space="preserve"> </w:t>
       </w:r>
     </w:p>
     <w:p>
@@ -14055,21 +14240,153 @@
     </w:p>
     <w:p>
       <w:pPr>
-        <w:rPr>
-          <w:lang w:val="en-FR"/>
-        </w:rPr>
-      </w:pPr>
+        <w:pStyle w:val="Heading3"/>
+        <w:rPr>
+          <w:lang w:val="en-FR"/>
+        </w:rPr>
+      </w:pPr>
+      <w:bookmarkStart w:id="59" w:name="_Toc232585816"/>
+      <w:r>
+        <w:rPr>
+          <w:lang w:val="en-FR"/>
+        </w:rPr>
+        <w:t>Formulaire de commentaires post-expérience</w:t>
+      </w:r>
+      <w:bookmarkEnd w:id="59"/>
+    </w:p>
+    <w:p>
+      <w:pPr>
+        <w:rPr>
+          <w:lang w:val="en-FR"/>
+        </w:rPr>
+      </w:pPr>
+    </w:p>
+    <w:p>
+      <w:pPr>
+        <w:rPr>
+          <w:lang w:val="en-FR"/>
+        </w:rPr>
+      </w:pPr>
+      <w:r>
+        <w:rPr>
+          <w:lang w:val="en-FR"/>
+        </w:rPr>
+        <w:t xml:space="preserve">La dernière partie de cet étude cosntistait d’un formulaire pour completé les données observationnelles pour prendre la distance et réfléchir, sur les  deux phases d’exercises.  En plus ce formalaire permette à capturer la perception et l’évaluation d’enseignant sur les suggestion donnés </w:t>
+      </w:r>
+      <w:r>
+        <w:rPr>
+          <w:lang w:val="en-FR"/>
+        </w:rPr>
+        <w:t>par l’IA générative. L</w:t>
+      </w:r>
+      <w:r>
+        <w:rPr>
+          <w:lang w:val="en-FR"/>
+        </w:rPr>
+        <w:t>e formulaire révèle pourquoi il/elle a fait ces choix : comment il/elle évalue l'utilité de l'outil, quels obstacles il/elle a identifiés, et s'il/elle envisage une adoption future. Ces données sont essentielles pour répondre à la question de recherche sur les facteurs influençant les décisions d'adoption</w:t>
+      </w:r>
+      <w:r>
+        <w:rPr>
+          <w:lang w:val="en-FR"/>
+        </w:rPr>
+        <w:t xml:space="preserve"> (</w:t>
+      </w:r>
+      <w:r>
+        <w:rPr>
+          <w:lang w:val="en-FR"/>
+        </w:rPr>
+        <w:fldChar w:fldCharType="begin"/>
+      </w:r>
+      <w:r>
+        <w:rPr>
+          <w:lang w:val="en-FR"/>
+        </w:rPr>
+        <w:instrText xml:space="preserve"> REF _Ref232585925 \h </w:instrText>
+      </w:r>
+      <w:r>
+        <w:rPr>
+          <w:lang w:val="en-FR"/>
+        </w:rPr>
+      </w:r>
+      <w:r>
+        <w:rPr>
+          <w:lang w:val="en-FR"/>
+        </w:rPr>
+        <w:fldChar w:fldCharType="separate"/>
+      </w:r>
+      <w:r>
+        <w:t xml:space="preserve">Annexe </w:t>
+      </w:r>
+      <w:r>
+        <w:t xml:space="preserve">- </w:t>
+      </w:r>
+      <w:r>
+        <w:t>Formulaire de commentaires post-expérience</w:t>
+      </w:r>
+      <w:r>
+        <w:t>, Français</w:t>
+      </w:r>
+      <w:r>
+        <w:rPr>
+          <w:lang w:val="en-FR"/>
+        </w:rPr>
+        <w:fldChar w:fldCharType="end"/>
+      </w:r>
+      <w:r>
+        <w:rPr>
+          <w:lang w:val="en-FR"/>
+        </w:rPr>
+        <w:t>)</w:t>
+      </w:r>
+      <w:r>
+        <w:rPr>
+          <w:lang w:val="en-FR"/>
+        </w:rPr>
+        <w:t>.</w:t>
+      </w:r>
+      <w:r>
+        <w:rPr>
+          <w:lang w:val="en-FR"/>
+        </w:rPr>
+        <w:t xml:space="preserve"> </w:t>
+      </w:r>
+      <w:r>
+        <w:rPr>
+          <w:lang w:val="en-FR"/>
+        </w:rPr>
+        <w:t xml:space="preserve">Pendant ce partie, il y avait des moment de partage verbale entre l’examinatrice et le participant, lui permettant de faire qqchose. </w:t>
+      </w:r>
+    </w:p>
+    <w:p>
+      <w:pPr>
+        <w:rPr>
+          <w:lang w:val="en-FR"/>
+        </w:rPr>
+      </w:pPr>
+    </w:p>
+    <w:p>
+      <w:pPr>
+        <w:rPr>
+          <w:lang w:val="en-FR"/>
+        </w:rPr>
+      </w:pPr>
+      <w:r>
+        <w:rPr>
+          <w:lang w:val="en-FR"/>
+        </w:rPr>
+        <w:t xml:space="preserve"> </w:t>
+      </w:r>
     </w:p>
     <w:p>
       <w:pPr>
         <w:pStyle w:val="Heading1"/>
       </w:pPr>
-      <w:bookmarkStart w:id="56" w:name="_Toc232455140"/>
+      <w:bookmarkStart w:id="60" w:name="_Toc232585817"/>
       <w:r>
         <w:lastRenderedPageBreak/>
         <w:t>Discussions</w:t>
       </w:r>
-      <w:bookmarkEnd w:id="56"/>
+      <w:bookmarkEnd w:id="60"/>
       <w:r>
         <w:t xml:space="preserve"> </w:t>
       </w:r>
@@ -14082,12 +14399,12 @@
       <w:pPr>
         <w:pStyle w:val="Heading1"/>
       </w:pPr>
-      <w:bookmarkStart w:id="57" w:name="_Toc232455141"/>
+      <w:bookmarkStart w:id="61" w:name="_Toc232585818"/>
       <w:r>
         <w:lastRenderedPageBreak/>
         <w:t>Références</w:t>
       </w:r>
-      <w:bookmarkEnd w:id="57"/>
+      <w:bookmarkEnd w:id="61"/>
       <w:r>
         <w:t xml:space="preserve"> </w:t>
       </w:r>
@@ -15896,12 +16213,12 @@
       <w:pPr>
         <w:pStyle w:val="Heading1"/>
       </w:pPr>
-      <w:bookmarkStart w:id="58" w:name="_Toc232455142"/>
+      <w:bookmarkStart w:id="62" w:name="_Toc232585819"/>
       <w:r>
         <w:lastRenderedPageBreak/>
         <w:t>Conclusions</w:t>
       </w:r>
-      <w:bookmarkEnd w:id="58"/>
+      <w:bookmarkEnd w:id="62"/>
       <w:r>
         <w:t xml:space="preserve"> </w:t>
       </w:r>
@@ -15917,12 +16234,12 @@
       <w:pPr>
         <w:pStyle w:val="Heading1"/>
       </w:pPr>
-      <w:bookmarkStart w:id="59" w:name="_Toc232455143"/>
+      <w:bookmarkStart w:id="63" w:name="_Toc232585820"/>
       <w:r>
         <w:lastRenderedPageBreak/>
         <w:t>Index</w:t>
       </w:r>
-      <w:bookmarkEnd w:id="59"/>
+      <w:bookmarkEnd w:id="63"/>
       <w:r>
         <w:t xml:space="preserve"> </w:t>
       </w:r>
@@ -15932,12 +16249,12 @@
       <w:pPr>
         <w:pStyle w:val="Heading1"/>
       </w:pPr>
-      <w:bookmarkStart w:id="60" w:name="_Toc232455144"/>
+      <w:bookmarkStart w:id="64" w:name="_Toc232585821"/>
       <w:r>
         <w:lastRenderedPageBreak/>
         <w:t>Tables des Illustrations</w:t>
       </w:r>
-      <w:bookmarkEnd w:id="60"/>
+      <w:bookmarkEnd w:id="64"/>
       <w:r>
         <w:t xml:space="preserve"> </w:t>
       </w:r>
@@ -16014,7 +16331,7 @@
             <w:noProof/>
             <w:webHidden/>
           </w:rPr>
-          <w:t>24</w:t>
+          <w:t>21</w:t>
         </w:r>
         <w:r>
           <w:rPr>
@@ -16058,12 +16375,12 @@
       <w:pPr>
         <w:pStyle w:val="Heading1"/>
       </w:pPr>
-      <w:bookmarkStart w:id="61" w:name="_Toc232455145"/>
+      <w:bookmarkStart w:id="65" w:name="_Toc232585822"/>
       <w:r>
         <w:lastRenderedPageBreak/>
         <w:t>Annexes</w:t>
       </w:r>
-      <w:bookmarkEnd w:id="61"/>
+      <w:bookmarkEnd w:id="65"/>
       <w:r>
         <w:t xml:space="preserve"> </w:t>
       </w:r>
@@ -16076,16 +16393,16 @@
           <w:numId w:val="14"/>
         </w:numPr>
       </w:pPr>
-      <w:bookmarkStart w:id="62" w:name="_Ref231413552"/>
-      <w:bookmarkStart w:id="63" w:name="_Ref232407341"/>
-      <w:bookmarkStart w:id="64" w:name="_Ref232407368"/>
-      <w:bookmarkStart w:id="65" w:name="_Ref232454738"/>
-      <w:bookmarkStart w:id="66" w:name="_Toc232455146"/>
+      <w:bookmarkStart w:id="66" w:name="_Ref231413552"/>
+      <w:bookmarkStart w:id="67" w:name="_Ref232407341"/>
+      <w:bookmarkStart w:id="68" w:name="_Ref232407368"/>
+      <w:bookmarkStart w:id="69" w:name="_Ref232454738"/>
+      <w:bookmarkStart w:id="70" w:name="_Toc232585823"/>
       <w:r>
         <w:rPr>
           <w:noProof/>
         </w:rPr>
-        <w:object w:dxaOrig="1440" w:dyaOrig="1440" w14:anchorId="331E26B5">
+        <w:object w:dxaOrig="1440" w:dyaOrig="1440" w14:anchorId="7F0AC7AB">
           <v:shapetype id="_x0000_t75" coordsize="21600,21600" o:spt="75" o:preferrelative="t" path="m@4@5l@4@11@9@11@9@5xe" filled="f" stroked="f">
             <v:stroke joinstyle="miter"/>
             <v:formulas>
@@ -16108,7 +16425,7 @@
           <v:shape id="_x0000_s2050" type="#_x0000_t75" alt="" style="position:absolute;left:0;text-align:left;margin-left:-14.55pt;margin-top:28.7pt;width:6in;height:658.95pt;z-index:251663360;mso-wrap-edited:f;mso-width-percent:0;mso-height-percent:0;mso-position-horizontal-relative:text;mso-position-vertical-relative:text;mso-width-percent:0;mso-height-percent:0">
             <v:imagedata r:id="rId19" o:title=""/>
           </v:shape>
-          <o:OLEObject Type="Embed" ProgID="Word.Document.12" ShapeID="_x0000_s2050" DrawAspect="Content" ObjectID="_1843151264" r:id="rId20">
+          <o:OLEObject Type="Embed" ProgID="Word.Document.12" ShapeID="_x0000_s2050" DrawAspect="Content" ObjectID="_1843279717" r:id="rId20">
             <o:FieldCodes>\s</o:FieldCodes>
           </o:OLEObject>
         </w:object>
@@ -16119,14 +16436,14 @@
       <w:r>
         <w:t>Annexe</w:t>
       </w:r>
-      <w:bookmarkEnd w:id="62"/>
+      <w:bookmarkEnd w:id="66"/>
       <w:r>
         <w:t> – Questionnaire 1</w:t>
       </w:r>
-      <w:bookmarkEnd w:id="63"/>
-      <w:bookmarkEnd w:id="64"/>
-      <w:bookmarkEnd w:id="65"/>
-      <w:bookmarkEnd w:id="66"/>
+      <w:bookmarkEnd w:id="67"/>
+      <w:bookmarkEnd w:id="68"/>
+      <w:bookmarkEnd w:id="69"/>
+      <w:bookmarkEnd w:id="70"/>
     </w:p>
     <w:p>
       <w:pPr>
@@ -16175,8 +16492,8 @@
         <w:lastRenderedPageBreak/>
         <w:t xml:space="preserve"> </w:t>
       </w:r>
-      <w:bookmarkStart w:id="67" w:name="_Toc232455147"/>
-      <w:bookmarkStart w:id="68" w:name="_Ref232494101"/>
+      <w:bookmarkStart w:id="71" w:name="_Ref232494101"/>
+      <w:bookmarkStart w:id="72" w:name="_Toc232585824"/>
       <w:r>
         <w:t>Annexe</w:t>
       </w:r>
@@ -16189,8 +16506,8 @@
       <w:r>
         <w:t>e</w:t>
       </w:r>
-      <w:bookmarkEnd w:id="67"/>
-      <w:bookmarkEnd w:id="68"/>
+      <w:bookmarkEnd w:id="71"/>
+      <w:bookmarkEnd w:id="72"/>
       <w:r>
         <w:t xml:space="preserve"> </w:t>
       </w:r>
@@ -17372,7 +17689,7 @@
       <w:pPr>
         <w:pStyle w:val="Heading3"/>
       </w:pPr>
-      <w:bookmarkStart w:id="69" w:name="_Toc232455148"/>
+      <w:bookmarkStart w:id="73" w:name="_Toc232585825"/>
       <w:r>
         <w:lastRenderedPageBreak/>
         <w:t>Annexe –</w:t>
@@ -17383,7 +17700,7 @@
       <w:r>
         <w:t>, Anglais</w:t>
       </w:r>
-      <w:bookmarkEnd w:id="69"/>
+      <w:bookmarkEnd w:id="73"/>
       <w:r>
         <w:t xml:space="preserve"> </w:t>
       </w:r>
@@ -17520,27 +17837,7 @@
                 <w:szCs w:val="16"/>
                 <w:lang w:val="en-US" w:eastAsia="en-GB"/>
               </w:rPr>
-              <w:t xml:space="preserve">. Data will be stored securely and </w:t>
-            </w:r>
-            <w:proofErr w:type="spellStart"/>
-            <w:r>
-              <w:rPr>
-                <w:rFonts w:eastAsia="Arial" w:cs="Times New Roman"/>
-                <w:sz w:val="16"/>
-                <w:szCs w:val="16"/>
-                <w:lang w:val="en-US" w:eastAsia="en-GB"/>
-              </w:rPr>
-              <w:t>anonymised</w:t>
-            </w:r>
-            <w:proofErr w:type="spellEnd"/>
-            <w:r>
-              <w:rPr>
-                <w:rFonts w:eastAsia="Arial" w:cs="Times New Roman"/>
-                <w:sz w:val="16"/>
-                <w:szCs w:val="16"/>
-                <w:lang w:val="en-US" w:eastAsia="en-GB"/>
-              </w:rPr>
-              <w:t xml:space="preserve"> before analysis.</w:t>
+              <w:t>. Data will be stored securely and anonymised before analysis.</w:t>
             </w:r>
             <w:r>
               <w:rPr>
@@ -17657,7 +17954,6 @@
               </w:rPr>
               <w:t xml:space="preserve">Participant </w:t>
             </w:r>
-            <w:proofErr w:type="gramStart"/>
             <w:r>
               <w:rPr>
                 <w:rFonts w:eastAsia="Arial" w:cs="Times New Roman"/>
@@ -17667,7 +17963,6 @@
               </w:rPr>
               <w:t>Name:</w:t>
             </w:r>
-            <w:proofErr w:type="gramEnd"/>
           </w:p>
           <w:p>
             <w:pPr>
@@ -17747,7 +18042,6 @@
                 <w:lang w:eastAsia="en-GB"/>
               </w:rPr>
             </w:pPr>
-            <w:proofErr w:type="gramStart"/>
             <w:r>
               <w:rPr>
                 <w:rFonts w:eastAsia="Arial" w:cs="Times New Roman"/>
@@ -17757,7 +18051,6 @@
               </w:rPr>
               <w:t>Date:</w:t>
             </w:r>
-            <w:proofErr w:type="gramEnd"/>
           </w:p>
           <w:p>
             <w:pPr>
@@ -17821,7 +18114,6 @@
           <w:lang w:eastAsia="en-GB"/>
         </w:rPr>
       </w:pPr>
-      <w:proofErr w:type="spellStart"/>
       <w:r>
         <w:rPr>
           <w:rFonts w:eastAsia="Arial" w:cs="Times New Roman"/>
@@ -17830,53 +18122,8 @@
           <w:sz w:val="22"/>
           <w:lang w:eastAsia="en-GB"/>
         </w:rPr>
-        <w:t>Overall</w:t>
-      </w:r>
-      <w:proofErr w:type="spellEnd"/>
-      <w:r>
-        <w:rPr>
-          <w:rFonts w:eastAsia="Arial" w:cs="Times New Roman"/>
-          <w:b/>
-          <w:bCs/>
-          <w:sz w:val="22"/>
-          <w:lang w:eastAsia="en-GB"/>
-        </w:rPr>
-        <w:t xml:space="preserve"> </w:t>
-      </w:r>
-      <w:proofErr w:type="spellStart"/>
-      <w:r>
-        <w:rPr>
-          <w:rFonts w:eastAsia="Arial" w:cs="Times New Roman"/>
-          <w:b/>
-          <w:bCs/>
-          <w:sz w:val="22"/>
-          <w:lang w:eastAsia="en-GB"/>
-        </w:rPr>
-        <w:t>Experiment</w:t>
-      </w:r>
-      <w:proofErr w:type="spellEnd"/>
-      <w:r>
-        <w:rPr>
-          <w:rFonts w:eastAsia="Arial" w:cs="Times New Roman"/>
-          <w:b/>
-          <w:bCs/>
-          <w:sz w:val="22"/>
-          <w:lang w:eastAsia="en-GB"/>
-        </w:rPr>
-        <w:t xml:space="preserve"> </w:t>
-      </w:r>
-      <w:proofErr w:type="spellStart"/>
-      <w:r>
-        <w:rPr>
-          <w:rFonts w:eastAsia="Arial" w:cs="Times New Roman"/>
-          <w:b/>
-          <w:bCs/>
-          <w:sz w:val="22"/>
-          <w:lang w:eastAsia="en-GB"/>
-        </w:rPr>
-        <w:t>Experience</w:t>
-      </w:r>
-      <w:proofErr w:type="spellEnd"/>
+        <w:t>Overall Experiment Experience</w:t>
+      </w:r>
     </w:p>
     <w:p>
       <w:pPr>
@@ -18055,18 +18302,8 @@
                 <w:szCs w:val="20"/>
                 <w:lang w:eastAsia="en-GB"/>
               </w:rPr>
-              <w:t xml:space="preserve"> </w:t>
-            </w:r>
-            <w:proofErr w:type="spellStart"/>
-            <w:r>
-              <w:rPr>
-                <w:rFonts w:eastAsia="Arial" w:cs="Times New Roman"/>
-                <w:szCs w:val="20"/>
-                <w:lang w:eastAsia="en-GB"/>
-              </w:rPr>
-              <w:t>Negative</w:t>
-            </w:r>
-            <w:proofErr w:type="spellEnd"/>
+              <w:t xml:space="preserve"> Negative</w:t>
+            </w:r>
           </w:p>
         </w:tc>
       </w:tr>
@@ -18161,18 +18398,8 @@
                 <w:szCs w:val="20"/>
                 <w:lang w:eastAsia="en-GB"/>
               </w:rPr>
-              <w:t xml:space="preserve"> Yes, </w:t>
-            </w:r>
-            <w:proofErr w:type="spellStart"/>
-            <w:r>
-              <w:rPr>
-                <w:rFonts w:eastAsia="Arial" w:cs="Times New Roman"/>
-                <w:szCs w:val="20"/>
-                <w:lang w:eastAsia="en-GB"/>
-              </w:rPr>
-              <w:t>entirely</w:t>
-            </w:r>
-            <w:proofErr w:type="spellEnd"/>
+              <w:t xml:space="preserve"> Yes, entirely</w:t>
+            </w:r>
           </w:p>
         </w:tc>
         <w:tc>
@@ -18204,18 +18431,8 @@
                 <w:szCs w:val="20"/>
                 <w:lang w:eastAsia="en-GB"/>
               </w:rPr>
-              <w:t xml:space="preserve"> </w:t>
-            </w:r>
-            <w:proofErr w:type="spellStart"/>
-            <w:r>
-              <w:rPr>
-                <w:rFonts w:eastAsia="Arial" w:cs="Times New Roman"/>
-                <w:szCs w:val="20"/>
-                <w:lang w:eastAsia="en-GB"/>
-              </w:rPr>
-              <w:t>Partially</w:t>
-            </w:r>
-            <w:proofErr w:type="spellEnd"/>
+              <w:t xml:space="preserve"> Partially</w:t>
+            </w:r>
           </w:p>
         </w:tc>
         <w:tc>
@@ -18373,20 +18590,8 @@
           <w:sz w:val="22"/>
           <w:lang w:eastAsia="en-GB"/>
         </w:rPr>
-        <w:t xml:space="preserve">Section B - Phase </w:t>
-      </w:r>
-      <w:proofErr w:type="spellStart"/>
-      <w:r>
-        <w:rPr>
-          <w:rFonts w:eastAsia="Arial" w:cs="Times New Roman"/>
-          <w:b/>
-          <w:bCs/>
-          <w:sz w:val="22"/>
-          <w:lang w:eastAsia="en-GB"/>
-        </w:rPr>
-        <w:t>Comparison</w:t>
-      </w:r>
-      <w:proofErr w:type="spellEnd"/>
+        <w:t>Section B - Phase Comparison</w:t>
+      </w:r>
     </w:p>
     <w:p>
       <w:pPr>
@@ -18465,25 +18670,7 @@
                 <w:szCs w:val="20"/>
                 <w:lang w:eastAsia="en-GB"/>
               </w:rPr>
-              <w:t xml:space="preserve"> Phase I (</w:t>
-            </w:r>
-            <w:proofErr w:type="spellStart"/>
-            <w:r>
-              <w:rPr>
-                <w:rFonts w:eastAsia="Arial" w:cs="Times New Roman"/>
-                <w:szCs w:val="20"/>
-                <w:lang w:eastAsia="en-GB"/>
-              </w:rPr>
-              <w:t>without</w:t>
-            </w:r>
-            <w:proofErr w:type="spellEnd"/>
-            <w:r>
-              <w:rPr>
-                <w:rFonts w:eastAsia="Arial" w:cs="Times New Roman"/>
-                <w:szCs w:val="20"/>
-                <w:lang w:eastAsia="en-GB"/>
-              </w:rPr>
-              <w:t xml:space="preserve"> AI)</w:t>
+              <w:t xml:space="preserve"> Phase I (without AI)</w:t>
             </w:r>
           </w:p>
         </w:tc>
@@ -18516,25 +18703,7 @@
                 <w:szCs w:val="20"/>
                 <w:lang w:eastAsia="en-GB"/>
               </w:rPr>
-              <w:t xml:space="preserve"> Phase II (</w:t>
-            </w:r>
-            <w:proofErr w:type="spellStart"/>
-            <w:r>
-              <w:rPr>
-                <w:rFonts w:eastAsia="Arial" w:cs="Times New Roman"/>
-                <w:szCs w:val="20"/>
-                <w:lang w:eastAsia="en-GB"/>
-              </w:rPr>
-              <w:t>with</w:t>
-            </w:r>
-            <w:proofErr w:type="spellEnd"/>
-            <w:r>
-              <w:rPr>
-                <w:rFonts w:eastAsia="Arial" w:cs="Times New Roman"/>
-                <w:szCs w:val="20"/>
-                <w:lang w:eastAsia="en-GB"/>
-              </w:rPr>
-              <w:t xml:space="preserve"> AI)</w:t>
+              <w:t xml:space="preserve"> Phase II (with AI)</w:t>
             </w:r>
           </w:p>
         </w:tc>
@@ -18567,54 +18736,8 @@
                 <w:szCs w:val="20"/>
                 <w:lang w:eastAsia="en-GB"/>
               </w:rPr>
-              <w:t xml:space="preserve"> </w:t>
-            </w:r>
-            <w:proofErr w:type="spellStart"/>
-            <w:r>
-              <w:rPr>
-                <w:rFonts w:eastAsia="Arial" w:cs="Times New Roman"/>
-                <w:szCs w:val="20"/>
-                <w:lang w:eastAsia="en-GB"/>
-              </w:rPr>
-              <w:t>Both</w:t>
-            </w:r>
-            <w:proofErr w:type="spellEnd"/>
-            <w:r>
-              <w:rPr>
-                <w:rFonts w:eastAsia="Arial" w:cs="Times New Roman"/>
-                <w:szCs w:val="20"/>
-                <w:lang w:eastAsia="en-GB"/>
-              </w:rPr>
-              <w:t xml:space="preserve"> </w:t>
-            </w:r>
-            <w:proofErr w:type="spellStart"/>
-            <w:r>
-              <w:rPr>
-                <w:rFonts w:eastAsia="Arial" w:cs="Times New Roman"/>
-                <w:szCs w:val="20"/>
-                <w:lang w:eastAsia="en-GB"/>
-              </w:rPr>
-              <w:t>equally</w:t>
-            </w:r>
-            <w:proofErr w:type="spellEnd"/>
-            <w:r>
-              <w:rPr>
-                <w:rFonts w:eastAsia="Arial" w:cs="Times New Roman"/>
-                <w:szCs w:val="20"/>
-                <w:lang w:eastAsia="en-GB"/>
-              </w:rPr>
-              <w:t xml:space="preserve"> </w:t>
-            </w:r>
-            <w:proofErr w:type="spellStart"/>
-            <w:r>
-              <w:rPr>
-                <w:rFonts w:eastAsia="Arial" w:cs="Times New Roman"/>
-                <w:szCs w:val="20"/>
-                <w:lang w:eastAsia="en-GB"/>
-              </w:rPr>
-              <w:t>demanding</w:t>
-            </w:r>
-            <w:proofErr w:type="spellEnd"/>
+              <w:t xml:space="preserve"> Both equally demanding</w:t>
+            </w:r>
           </w:p>
         </w:tc>
       </w:tr>
@@ -18710,25 +18833,7 @@
                 <w:szCs w:val="20"/>
                 <w:lang w:eastAsia="en-GB"/>
               </w:rPr>
-              <w:t xml:space="preserve"> Phase I </w:t>
-            </w:r>
-            <w:proofErr w:type="spellStart"/>
-            <w:r>
-              <w:rPr>
-                <w:rFonts w:eastAsia="Arial" w:cs="Times New Roman"/>
-                <w:szCs w:val="20"/>
-                <w:lang w:eastAsia="en-GB"/>
-              </w:rPr>
-              <w:t>lesson</w:t>
-            </w:r>
-            <w:proofErr w:type="spellEnd"/>
-            <w:r>
-              <w:rPr>
-                <w:rFonts w:eastAsia="Arial" w:cs="Times New Roman"/>
-                <w:szCs w:val="20"/>
-                <w:lang w:eastAsia="en-GB"/>
-              </w:rPr>
-              <w:t xml:space="preserve"> plan</w:t>
+              <w:t xml:space="preserve"> Phase I lesson plan</w:t>
             </w:r>
           </w:p>
         </w:tc>
@@ -18761,25 +18866,7 @@
                 <w:szCs w:val="20"/>
                 <w:lang w:eastAsia="en-GB"/>
               </w:rPr>
-              <w:t xml:space="preserve"> Phase II </w:t>
-            </w:r>
-            <w:proofErr w:type="spellStart"/>
-            <w:r>
-              <w:rPr>
-                <w:rFonts w:eastAsia="Arial" w:cs="Times New Roman"/>
-                <w:szCs w:val="20"/>
-                <w:lang w:eastAsia="en-GB"/>
-              </w:rPr>
-              <w:t>lesson</w:t>
-            </w:r>
-            <w:proofErr w:type="spellEnd"/>
-            <w:r>
-              <w:rPr>
-                <w:rFonts w:eastAsia="Arial" w:cs="Times New Roman"/>
-                <w:szCs w:val="20"/>
-                <w:lang w:eastAsia="en-GB"/>
-              </w:rPr>
-              <w:t xml:space="preserve"> plan</w:t>
+              <w:t xml:space="preserve"> Phase II lesson plan</w:t>
             </w:r>
           </w:p>
         </w:tc>
@@ -18812,36 +18899,8 @@
                 <w:szCs w:val="20"/>
                 <w:lang w:eastAsia="en-GB"/>
               </w:rPr>
-              <w:t xml:space="preserve"> </w:t>
-            </w:r>
-            <w:proofErr w:type="spellStart"/>
-            <w:r>
-              <w:rPr>
-                <w:rFonts w:eastAsia="Arial" w:cs="Times New Roman"/>
-                <w:szCs w:val="20"/>
-                <w:lang w:eastAsia="en-GB"/>
-              </w:rPr>
-              <w:t>Both</w:t>
-            </w:r>
-            <w:proofErr w:type="spellEnd"/>
-            <w:r>
-              <w:rPr>
-                <w:rFonts w:eastAsia="Arial" w:cs="Times New Roman"/>
-                <w:szCs w:val="20"/>
-                <w:lang w:eastAsia="en-GB"/>
-              </w:rPr>
-              <w:t xml:space="preserve"> </w:t>
-            </w:r>
-            <w:proofErr w:type="spellStart"/>
-            <w:r>
-              <w:rPr>
-                <w:rFonts w:eastAsia="Arial" w:cs="Times New Roman"/>
-                <w:szCs w:val="20"/>
-                <w:lang w:eastAsia="en-GB"/>
-              </w:rPr>
-              <w:t>equally</w:t>
-            </w:r>
-            <w:proofErr w:type="spellEnd"/>
+              <w:t xml:space="preserve"> Both equally</w:t>
+            </w:r>
           </w:p>
         </w:tc>
       </w:tr>
@@ -18888,43 +18947,123 @@
           <w:szCs w:val="20"/>
           <w:lang w:eastAsia="en-GB"/>
         </w:rPr>
-        <w:t xml:space="preserve">(Select all </w:t>
-      </w:r>
-      <w:proofErr w:type="spellStart"/>
+        <w:t>(Select all that apply)</w:t>
+      </w:r>
+    </w:p>
+    <w:p>
+      <w:pPr>
+        <w:spacing w:before="40" w:after="60"/>
+        <w:jc w:val="left"/>
+        <w:rPr>
+          <w:rFonts w:eastAsia="Arial" w:cs="Times New Roman"/>
+          <w:szCs w:val="20"/>
+          <w:lang w:val="en-IN" w:eastAsia="en-GB"/>
+        </w:rPr>
+      </w:pPr>
+      <w:r>
+        <w:rPr>
+          <w:rFonts w:ascii="Segoe UI Symbol" w:eastAsia="Arial" w:hAnsi="Segoe UI Symbol" w:cs="Segoe UI Symbol"/>
+          <w:szCs w:val="20"/>
+          <w:lang w:eastAsia="en-GB"/>
+        </w:rPr>
+        <w:t>☐</w:t>
+      </w:r>
+      <w:r>
+        <w:rPr>
+          <w:rFonts w:eastAsia="Arial" w:cs="Times New Roman"/>
+          <w:szCs w:val="20"/>
+          <w:lang w:val="en-IN" w:eastAsia="en-GB"/>
+        </w:rPr>
+        <w:t xml:space="preserve"> </w:t>
+      </w:r>
       <w:r>
         <w:rPr>
           <w:rFonts w:eastAsia="Arial" w:cs="Times New Roman"/>
           <w:szCs w:val="20"/>
           <w:lang w:eastAsia="en-GB"/>
         </w:rPr>
-        <w:t>that</w:t>
-      </w:r>
-      <w:proofErr w:type="spellEnd"/>
+        <w:t>Quality of content</w:t>
+      </w:r>
+    </w:p>
+    <w:p>
+      <w:pPr>
+        <w:spacing w:before="40" w:after="60"/>
+        <w:jc w:val="left"/>
+        <w:rPr>
+          <w:rFonts w:eastAsia="Arial" w:cs="Times New Roman"/>
+          <w:szCs w:val="20"/>
+          <w:lang w:val="en-IN" w:eastAsia="en-GB"/>
+        </w:rPr>
+      </w:pPr>
+      <w:r>
+        <w:rPr>
+          <w:rFonts w:ascii="Segoe UI Symbol" w:eastAsia="Arial" w:hAnsi="Segoe UI Symbol" w:cs="Segoe UI Symbol"/>
+          <w:szCs w:val="20"/>
+          <w:lang w:eastAsia="en-GB"/>
+        </w:rPr>
+        <w:t>☐</w:t>
+      </w:r>
       <w:r>
         <w:rPr>
           <w:rFonts w:eastAsia="Arial" w:cs="Times New Roman"/>
           <w:szCs w:val="20"/>
           <w:lang w:eastAsia="en-GB"/>
         </w:rPr>
-        <w:t xml:space="preserve"> </w:t>
-      </w:r>
-      <w:proofErr w:type="spellStart"/>
+        <w:t xml:space="preserve"> Alignment with curriculum</w:t>
+      </w:r>
+    </w:p>
+    <w:p>
+      <w:pPr>
+        <w:spacing w:before="40" w:after="60"/>
+        <w:jc w:val="left"/>
+        <w:rPr>
+          <w:rFonts w:eastAsia="Arial" w:cs="Times New Roman"/>
+          <w:szCs w:val="20"/>
+          <w:lang w:val="en-IN" w:eastAsia="en-GB"/>
+        </w:rPr>
+      </w:pPr>
+      <w:r>
+        <w:rPr>
+          <w:rFonts w:ascii="Segoe UI Symbol" w:eastAsia="Arial" w:hAnsi="Segoe UI Symbol" w:cs="Segoe UI Symbol"/>
+          <w:szCs w:val="20"/>
+          <w:lang w:eastAsia="en-GB"/>
+        </w:rPr>
+        <w:t>☐</w:t>
+      </w:r>
       <w:r>
         <w:rPr>
           <w:rFonts w:eastAsia="Arial" w:cs="Times New Roman"/>
           <w:szCs w:val="20"/>
           <w:lang w:eastAsia="en-GB"/>
         </w:rPr>
-        <w:t>apply</w:t>
-      </w:r>
-      <w:proofErr w:type="spellEnd"/>
+        <w:t xml:space="preserve"> Ease of adaptation for class</w:t>
+      </w:r>
+    </w:p>
+    <w:p>
+      <w:pPr>
+        <w:spacing w:before="40" w:after="60"/>
+        <w:jc w:val="left"/>
+        <w:rPr>
+          <w:rFonts w:eastAsia="Arial" w:cs="Times New Roman"/>
+          <w:szCs w:val="20"/>
+          <w:lang w:val="en-IN" w:eastAsia="en-GB"/>
+        </w:rPr>
+      </w:pPr>
+      <w:r>
+        <w:rPr>
+          <w:rFonts w:ascii="Segoe UI Symbol" w:eastAsia="Arial" w:hAnsi="Segoe UI Symbol" w:cs="Segoe UI Symbol"/>
+          <w:szCs w:val="20"/>
+          <w:lang w:eastAsia="en-GB"/>
+        </w:rPr>
+        <w:t>☐</w:t>
+      </w:r>
       <w:r>
         <w:rPr>
           <w:rFonts w:eastAsia="Arial" w:cs="Times New Roman"/>
           <w:szCs w:val="20"/>
           <w:lang w:eastAsia="en-GB"/>
         </w:rPr>
-        <w:t>)</w:t>
+        <w:t xml:space="preserve"> Personal investment in the plan</w:t>
       </w:r>
     </w:p>
     <w:p>
@@ -18949,236 +19088,10 @@
         <w:rPr>
           <w:rFonts w:eastAsia="Arial" w:cs="Times New Roman"/>
           <w:szCs w:val="20"/>
-          <w:lang w:val="en-IN" w:eastAsia="en-GB"/>
-        </w:rPr>
-        <w:t xml:space="preserve"> </w:t>
-      </w:r>
-      <w:proofErr w:type="spellStart"/>
-      <w:r>
-        <w:rPr>
-          <w:rFonts w:eastAsia="Arial" w:cs="Times New Roman"/>
-          <w:szCs w:val="20"/>
           <w:lang w:eastAsia="en-GB"/>
         </w:rPr>
-        <w:t>Quality</w:t>
-      </w:r>
-      <w:proofErr w:type="spellEnd"/>
-      <w:r>
-        <w:rPr>
-          <w:rFonts w:eastAsia="Arial" w:cs="Times New Roman"/>
-          <w:szCs w:val="20"/>
-          <w:lang w:eastAsia="en-GB"/>
-        </w:rPr>
-        <w:t xml:space="preserve"> of content</w:t>
-      </w:r>
-    </w:p>
-    <w:p>
-      <w:pPr>
-        <w:spacing w:before="40" w:after="60"/>
-        <w:jc w:val="left"/>
-        <w:rPr>
-          <w:rFonts w:eastAsia="Arial" w:cs="Times New Roman"/>
-          <w:szCs w:val="20"/>
-          <w:lang w:val="en-IN" w:eastAsia="en-GB"/>
-        </w:rPr>
-      </w:pPr>
-      <w:r>
-        <w:rPr>
-          <w:rFonts w:ascii="Segoe UI Symbol" w:eastAsia="Arial" w:hAnsi="Segoe UI Symbol" w:cs="Segoe UI Symbol"/>
-          <w:szCs w:val="20"/>
-          <w:lang w:eastAsia="en-GB"/>
-        </w:rPr>
-        <w:t>☐</w:t>
-      </w:r>
-      <w:r>
-        <w:rPr>
-          <w:rFonts w:eastAsia="Arial" w:cs="Times New Roman"/>
-          <w:szCs w:val="20"/>
-          <w:lang w:eastAsia="en-GB"/>
-        </w:rPr>
-        <w:t xml:space="preserve"> </w:t>
-      </w:r>
-      <w:proofErr w:type="spellStart"/>
-      <w:r>
-        <w:rPr>
-          <w:rFonts w:eastAsia="Arial" w:cs="Times New Roman"/>
-          <w:szCs w:val="20"/>
-          <w:lang w:eastAsia="en-GB"/>
-        </w:rPr>
-        <w:t>Alignment</w:t>
-      </w:r>
-      <w:proofErr w:type="spellEnd"/>
-      <w:r>
-        <w:rPr>
-          <w:rFonts w:eastAsia="Arial" w:cs="Times New Roman"/>
-          <w:szCs w:val="20"/>
-          <w:lang w:eastAsia="en-GB"/>
-        </w:rPr>
-        <w:t xml:space="preserve"> </w:t>
-      </w:r>
-      <w:proofErr w:type="spellStart"/>
-      <w:r>
-        <w:rPr>
-          <w:rFonts w:eastAsia="Arial" w:cs="Times New Roman"/>
-          <w:szCs w:val="20"/>
-          <w:lang w:eastAsia="en-GB"/>
-        </w:rPr>
-        <w:t>with</w:t>
-      </w:r>
-      <w:proofErr w:type="spellEnd"/>
-      <w:r>
-        <w:rPr>
-          <w:rFonts w:eastAsia="Arial" w:cs="Times New Roman"/>
-          <w:szCs w:val="20"/>
-          <w:lang w:eastAsia="en-GB"/>
-        </w:rPr>
-        <w:t xml:space="preserve"> curriculum</w:t>
-      </w:r>
-    </w:p>
-    <w:p>
-      <w:pPr>
-        <w:spacing w:before="40" w:after="60"/>
-        <w:jc w:val="left"/>
-        <w:rPr>
-          <w:rFonts w:eastAsia="Arial" w:cs="Times New Roman"/>
-          <w:szCs w:val="20"/>
-          <w:lang w:val="en-IN" w:eastAsia="en-GB"/>
-        </w:rPr>
-      </w:pPr>
-      <w:r>
-        <w:rPr>
-          <w:rFonts w:ascii="Segoe UI Symbol" w:eastAsia="Arial" w:hAnsi="Segoe UI Symbol" w:cs="Segoe UI Symbol"/>
-          <w:szCs w:val="20"/>
-          <w:lang w:eastAsia="en-GB"/>
-        </w:rPr>
-        <w:t>☐</w:t>
-      </w:r>
-      <w:r>
-        <w:rPr>
-          <w:rFonts w:eastAsia="Arial" w:cs="Times New Roman"/>
-          <w:szCs w:val="20"/>
-          <w:lang w:eastAsia="en-GB"/>
-        </w:rPr>
-        <w:t xml:space="preserve"> </w:t>
-      </w:r>
-      <w:proofErr w:type="spellStart"/>
-      <w:r>
-        <w:rPr>
-          <w:rFonts w:eastAsia="Arial" w:cs="Times New Roman"/>
-          <w:szCs w:val="20"/>
-          <w:lang w:eastAsia="en-GB"/>
-        </w:rPr>
-        <w:t>Ease</w:t>
-      </w:r>
-      <w:proofErr w:type="spellEnd"/>
-      <w:r>
-        <w:rPr>
-          <w:rFonts w:eastAsia="Arial" w:cs="Times New Roman"/>
-          <w:szCs w:val="20"/>
-          <w:lang w:eastAsia="en-GB"/>
-        </w:rPr>
-        <w:t xml:space="preserve"> of adaptation for class</w:t>
-      </w:r>
-    </w:p>
-    <w:p>
-      <w:pPr>
-        <w:spacing w:before="40" w:after="60"/>
-        <w:jc w:val="left"/>
-        <w:rPr>
-          <w:rFonts w:eastAsia="Arial" w:cs="Times New Roman"/>
-          <w:szCs w:val="20"/>
-          <w:lang w:val="en-IN" w:eastAsia="en-GB"/>
-        </w:rPr>
-      </w:pPr>
-      <w:r>
-        <w:rPr>
-          <w:rFonts w:ascii="Segoe UI Symbol" w:eastAsia="Arial" w:hAnsi="Segoe UI Symbol" w:cs="Segoe UI Symbol"/>
-          <w:szCs w:val="20"/>
-          <w:lang w:eastAsia="en-GB"/>
-        </w:rPr>
-        <w:t>☐</w:t>
-      </w:r>
-      <w:r>
-        <w:rPr>
-          <w:rFonts w:eastAsia="Arial" w:cs="Times New Roman"/>
-          <w:szCs w:val="20"/>
-          <w:lang w:eastAsia="en-GB"/>
-        </w:rPr>
-        <w:t xml:space="preserve"> </w:t>
-      </w:r>
-      <w:proofErr w:type="spellStart"/>
-      <w:r>
-        <w:rPr>
-          <w:rFonts w:eastAsia="Arial" w:cs="Times New Roman"/>
-          <w:szCs w:val="20"/>
-          <w:lang w:eastAsia="en-GB"/>
-        </w:rPr>
-        <w:t>Personal</w:t>
-      </w:r>
-      <w:proofErr w:type="spellEnd"/>
-      <w:r>
-        <w:rPr>
-          <w:rFonts w:eastAsia="Arial" w:cs="Times New Roman"/>
-          <w:szCs w:val="20"/>
-          <w:lang w:eastAsia="en-GB"/>
-        </w:rPr>
-        <w:t xml:space="preserve"> </w:t>
-      </w:r>
-      <w:proofErr w:type="spellStart"/>
-      <w:r>
-        <w:rPr>
-          <w:rFonts w:eastAsia="Arial" w:cs="Times New Roman"/>
-          <w:szCs w:val="20"/>
-          <w:lang w:eastAsia="en-GB"/>
-        </w:rPr>
-        <w:t>investment</w:t>
-      </w:r>
-      <w:proofErr w:type="spellEnd"/>
-      <w:r>
-        <w:rPr>
-          <w:rFonts w:eastAsia="Arial" w:cs="Times New Roman"/>
-          <w:szCs w:val="20"/>
-          <w:lang w:eastAsia="en-GB"/>
-        </w:rPr>
-        <w:t xml:space="preserve"> in the plan</w:t>
-      </w:r>
-    </w:p>
-    <w:p>
-      <w:pPr>
-        <w:spacing w:before="40" w:after="60"/>
-        <w:jc w:val="left"/>
-        <w:rPr>
-          <w:rFonts w:eastAsia="Arial" w:cs="Times New Roman"/>
-          <w:szCs w:val="20"/>
-          <w:lang w:val="en-IN" w:eastAsia="en-GB"/>
-        </w:rPr>
-      </w:pPr>
-      <w:r>
-        <w:rPr>
-          <w:rFonts w:ascii="Segoe UI Symbol" w:eastAsia="Arial" w:hAnsi="Segoe UI Symbol" w:cs="Segoe UI Symbol"/>
-          <w:szCs w:val="20"/>
-          <w:lang w:eastAsia="en-GB"/>
-        </w:rPr>
-        <w:t>☐</w:t>
-      </w:r>
-      <w:r>
-        <w:rPr>
-          <w:rFonts w:eastAsia="Arial" w:cs="Times New Roman"/>
-          <w:szCs w:val="20"/>
-          <w:lang w:eastAsia="en-GB"/>
-        </w:rPr>
-        <w:t xml:space="preserve"> </w:t>
-      </w:r>
-      <w:proofErr w:type="spellStart"/>
-      <w:r>
-        <w:rPr>
-          <w:rFonts w:eastAsia="Arial" w:cs="Times New Roman"/>
-          <w:szCs w:val="20"/>
-          <w:lang w:eastAsia="en-GB"/>
-        </w:rPr>
-        <w:t>Other</w:t>
-      </w:r>
-      <w:proofErr w:type="spellEnd"/>
+        <w:t xml:space="preserve"> Other</w:t>
+      </w:r>
     </w:p>
     <w:p>
       <w:pPr>
@@ -19385,7 +19298,6 @@
                 <w:lang w:eastAsia="en-GB"/>
               </w:rPr>
             </w:pPr>
-            <w:proofErr w:type="spellStart"/>
             <w:r>
               <w:rPr>
                 <w:rFonts w:eastAsia="Arial" w:cs="Times New Roman"/>
@@ -19396,7 +19308,6 @@
               </w:rPr>
               <w:t>Statement</w:t>
             </w:r>
-            <w:proofErr w:type="spellEnd"/>
           </w:p>
         </w:tc>
         <w:tc>
@@ -19414,7 +19325,6 @@
                 <w:lang w:eastAsia="en-GB"/>
               </w:rPr>
             </w:pPr>
-            <w:proofErr w:type="spellStart"/>
             <w:r>
               <w:rPr>
                 <w:rFonts w:eastAsia="Arial" w:cs="Times New Roman"/>
@@ -19423,31 +19333,8 @@
                 <w:sz w:val="22"/>
                 <w:lang w:eastAsia="en-GB"/>
               </w:rPr>
-              <w:t>Strongly</w:t>
-            </w:r>
-            <w:proofErr w:type="spellEnd"/>
-            <w:r>
-              <w:rPr>
-                <w:rFonts w:eastAsia="Arial" w:cs="Times New Roman"/>
-                <w:b/>
-                <w:bCs/>
-                <w:sz w:val="22"/>
-                <w:lang w:eastAsia="en-GB"/>
-              </w:rPr>
-              <w:t xml:space="preserve"> </w:t>
-            </w:r>
-            <w:proofErr w:type="spellStart"/>
-            <w:r>
-              <w:rPr>
-                <w:rFonts w:eastAsia="Arial" w:cs="Times New Roman"/>
-                <w:b/>
-                <w:bCs/>
-                <w:sz w:val="22"/>
-                <w:lang w:eastAsia="en-GB"/>
-              </w:rPr>
-              <w:t>Agree</w:t>
-            </w:r>
-            <w:proofErr w:type="spellEnd"/>
+              <w:t>Strongly Agree</w:t>
+            </w:r>
           </w:p>
         </w:tc>
         <w:tc>
@@ -19465,7 +19352,6 @@
                 <w:lang w:eastAsia="en-GB"/>
               </w:rPr>
             </w:pPr>
-            <w:proofErr w:type="spellStart"/>
             <w:r>
               <w:rPr>
                 <w:rFonts w:eastAsia="Arial" w:cs="Times New Roman"/>
@@ -19476,7 +19362,6 @@
               </w:rPr>
               <w:t>Agree</w:t>
             </w:r>
-            <w:proofErr w:type="spellEnd"/>
           </w:p>
         </w:tc>
         <w:tc>
@@ -19521,7 +19406,6 @@
                 <w:lang w:eastAsia="en-GB"/>
               </w:rPr>
             </w:pPr>
-            <w:proofErr w:type="spellStart"/>
             <w:r>
               <w:rPr>
                 <w:rFonts w:eastAsia="Arial" w:cs="Times New Roman"/>
@@ -19532,7 +19416,6 @@
               </w:rPr>
               <w:t>Disagree</w:t>
             </w:r>
-            <w:proofErr w:type="spellEnd"/>
           </w:p>
         </w:tc>
         <w:tc>
@@ -19550,7 +19433,6 @@
                 <w:lang w:eastAsia="en-GB"/>
               </w:rPr>
             </w:pPr>
-            <w:proofErr w:type="spellStart"/>
             <w:r>
               <w:rPr>
                 <w:rFonts w:eastAsia="Arial" w:cs="Times New Roman"/>
@@ -19559,31 +19441,8 @@
                 <w:sz w:val="22"/>
                 <w:lang w:eastAsia="en-GB"/>
               </w:rPr>
-              <w:t>Strongly</w:t>
-            </w:r>
-            <w:proofErr w:type="spellEnd"/>
-            <w:r>
-              <w:rPr>
-                <w:rFonts w:eastAsia="Arial" w:cs="Times New Roman"/>
-                <w:b/>
-                <w:bCs/>
-                <w:sz w:val="22"/>
-                <w:lang w:eastAsia="en-GB"/>
-              </w:rPr>
-              <w:t xml:space="preserve"> </w:t>
-            </w:r>
-            <w:proofErr w:type="spellStart"/>
-            <w:r>
-              <w:rPr>
-                <w:rFonts w:eastAsia="Arial" w:cs="Times New Roman"/>
-                <w:b/>
-                <w:bCs/>
-                <w:sz w:val="22"/>
-                <w:lang w:eastAsia="en-GB"/>
-              </w:rPr>
-              <w:t>Disagree</w:t>
-            </w:r>
-            <w:proofErr w:type="spellEnd"/>
+              <w:t>Strongly Disagree</w:t>
+            </w:r>
           </w:p>
         </w:tc>
       </w:tr>
@@ -20495,42 +20354,8 @@
           <w:sz w:val="22"/>
           <w:lang w:eastAsia="en-GB"/>
         </w:rPr>
-        <w:t xml:space="preserve">Future Use and </w:t>
-      </w:r>
-      <w:proofErr w:type="spellStart"/>
-      <w:r>
-        <w:rPr>
-          <w:rFonts w:eastAsia="Arial" w:cs="Times New Roman"/>
-          <w:b/>
-          <w:bCs/>
-          <w:sz w:val="22"/>
-          <w:lang w:eastAsia="en-GB"/>
-        </w:rPr>
-        <w:t>Perceived</w:t>
-      </w:r>
-      <w:proofErr w:type="spellEnd"/>
-      <w:r>
-        <w:rPr>
-          <w:rFonts w:eastAsia="Arial" w:cs="Times New Roman"/>
-          <w:b/>
-          <w:bCs/>
-          <w:sz w:val="22"/>
-          <w:lang w:eastAsia="en-GB"/>
-        </w:rPr>
-        <w:t xml:space="preserve"> </w:t>
-      </w:r>
-      <w:proofErr w:type="spellStart"/>
-      <w:r>
-        <w:rPr>
-          <w:rFonts w:eastAsia="Arial" w:cs="Times New Roman"/>
-          <w:b/>
-          <w:bCs/>
-          <w:sz w:val="22"/>
-          <w:lang w:eastAsia="en-GB"/>
-        </w:rPr>
-        <w:t>Barriers</w:t>
-      </w:r>
-      <w:proofErr w:type="spellEnd"/>
+        <w:t>Future Use and Perceived Barriers</w:t>
+      </w:r>
     </w:p>
     <w:p>
       <w:pPr>
@@ -20615,18 +20440,8 @@
                 <w:szCs w:val="20"/>
                 <w:lang w:eastAsia="en-GB"/>
               </w:rPr>
-              <w:t xml:space="preserve">Yes, </w:t>
-            </w:r>
-            <w:proofErr w:type="spellStart"/>
-            <w:r>
-              <w:rPr>
-                <w:rFonts w:eastAsia="Arial" w:cs="Times New Roman"/>
-                <w:szCs w:val="20"/>
-                <w:lang w:eastAsia="en-GB"/>
-              </w:rPr>
-              <w:t>definitely</w:t>
-            </w:r>
-            <w:proofErr w:type="spellEnd"/>
+              <w:t>Yes, definitely</w:t>
+            </w:r>
           </w:p>
         </w:tc>
         <w:tc>
@@ -20660,23 +20475,13 @@
               </w:rPr>
               <w:t xml:space="preserve"> </w:t>
             </w:r>
-            <w:proofErr w:type="spellStart"/>
             <w:r>
               <w:rPr>
                 <w:rFonts w:eastAsia="Arial" w:cs="Times New Roman"/>
                 <w:szCs w:val="20"/>
                 <w:lang w:eastAsia="en-GB"/>
               </w:rPr>
-              <w:t>Probably</w:t>
-            </w:r>
-            <w:proofErr w:type="spellEnd"/>
-            <w:r>
-              <w:rPr>
-                <w:rFonts w:eastAsia="Arial" w:cs="Times New Roman"/>
-                <w:szCs w:val="20"/>
-                <w:lang w:eastAsia="en-GB"/>
-              </w:rPr>
-              <w:t xml:space="preserve"> yes</w:t>
+              <w:t>Probably yes</w:t>
             </w:r>
           </w:p>
         </w:tc>
@@ -20711,7 +20516,6 @@
               </w:rPr>
               <w:t xml:space="preserve"> </w:t>
             </w:r>
-            <w:proofErr w:type="spellStart"/>
             <w:r>
               <w:rPr>
                 <w:rFonts w:eastAsia="Arial" w:cs="Times New Roman"/>
@@ -20720,7 +20524,6 @@
               </w:rPr>
               <w:t>Unsure</w:t>
             </w:r>
-            <w:proofErr w:type="spellEnd"/>
           </w:p>
         </w:tc>
         <w:tc>
@@ -20754,23 +20557,13 @@
               </w:rPr>
               <w:t xml:space="preserve"> </w:t>
             </w:r>
-            <w:proofErr w:type="spellStart"/>
             <w:r>
               <w:rPr>
                 <w:rFonts w:eastAsia="Arial" w:cs="Times New Roman"/>
                 <w:szCs w:val="20"/>
                 <w:lang w:eastAsia="en-GB"/>
               </w:rPr>
-              <w:t>Probably</w:t>
-            </w:r>
-            <w:proofErr w:type="spellEnd"/>
-            <w:r>
-              <w:rPr>
-                <w:rFonts w:eastAsia="Arial" w:cs="Times New Roman"/>
-                <w:szCs w:val="20"/>
-                <w:lang w:eastAsia="en-GB"/>
-              </w:rPr>
-              <w:t xml:space="preserve"> not</w:t>
+              <w:t>Probably not</w:t>
             </w:r>
           </w:p>
         </w:tc>
@@ -20866,7 +20659,6 @@
                 <w:lang w:eastAsia="en-GB"/>
               </w:rPr>
             </w:pPr>
-            <w:proofErr w:type="spellStart"/>
             <w:r>
               <w:rPr>
                 <w:rFonts w:eastAsia="Arial" w:cs="Times New Roman"/>
@@ -20875,31 +20667,8 @@
                 <w:sz w:val="22"/>
                 <w:lang w:eastAsia="en-GB"/>
               </w:rPr>
-              <w:t>Potential</w:t>
-            </w:r>
-            <w:proofErr w:type="spellEnd"/>
-            <w:r>
-              <w:rPr>
-                <w:rFonts w:eastAsia="Arial" w:cs="Times New Roman"/>
-                <w:b/>
-                <w:bCs/>
-                <w:sz w:val="22"/>
-                <w:lang w:eastAsia="en-GB"/>
-              </w:rPr>
-              <w:t xml:space="preserve"> </w:t>
-            </w:r>
-            <w:proofErr w:type="spellStart"/>
-            <w:r>
-              <w:rPr>
-                <w:rFonts w:eastAsia="Arial" w:cs="Times New Roman"/>
-                <w:b/>
-                <w:bCs/>
-                <w:sz w:val="22"/>
-                <w:lang w:eastAsia="en-GB"/>
-              </w:rPr>
-              <w:t>Barrier</w:t>
-            </w:r>
-            <w:proofErr w:type="spellEnd"/>
+              <w:t>Potential Barrier</w:t>
+            </w:r>
           </w:p>
         </w:tc>
         <w:tc>
@@ -20968,7 +20737,6 @@
                 <w:lang w:eastAsia="en-GB"/>
               </w:rPr>
             </w:pPr>
-            <w:proofErr w:type="spellStart"/>
             <w:r>
               <w:rPr>
                 <w:rFonts w:eastAsia="Arial" w:cs="Times New Roman"/>
@@ -20979,7 +20747,6 @@
               </w:rPr>
               <w:t>Unsure</w:t>
             </w:r>
-            <w:proofErr w:type="spellEnd"/>
           </w:p>
         </w:tc>
       </w:tr>
@@ -21701,7 +21468,6 @@
           <w:lang w:eastAsia="en-GB"/>
         </w:rPr>
       </w:pPr>
-      <w:proofErr w:type="spellStart"/>
       <w:r>
         <w:rPr>
           <w:rFonts w:eastAsia="Arial" w:cs="Times New Roman"/>
@@ -21710,31 +21476,8 @@
           <w:sz w:val="22"/>
           <w:lang w:eastAsia="en-GB"/>
         </w:rPr>
-        <w:t>Additional</w:t>
-      </w:r>
-      <w:proofErr w:type="spellEnd"/>
-      <w:r>
-        <w:rPr>
-          <w:rFonts w:eastAsia="Arial" w:cs="Times New Roman"/>
-          <w:b/>
-          <w:bCs/>
-          <w:sz w:val="22"/>
-          <w:lang w:eastAsia="en-GB"/>
-        </w:rPr>
-        <w:t xml:space="preserve"> </w:t>
-      </w:r>
-      <w:proofErr w:type="spellStart"/>
-      <w:r>
-        <w:rPr>
-          <w:rFonts w:eastAsia="Arial" w:cs="Times New Roman"/>
-          <w:b/>
-          <w:bCs/>
-          <w:sz w:val="22"/>
-          <w:lang w:eastAsia="en-GB"/>
-        </w:rPr>
-        <w:t>Comments</w:t>
-      </w:r>
-      <w:proofErr w:type="spellEnd"/>
+        <w:t>Additional Comments</w:t>
+      </w:r>
     </w:p>
     <w:p>
       <w:pPr>
@@ -21910,8 +21653,8 @@
       <w:pPr>
         <w:pStyle w:val="Heading3"/>
       </w:pPr>
-      <w:bookmarkStart w:id="70" w:name="_Toc232455149"/>
-      <w:bookmarkStart w:id="71" w:name="_Ref232494106"/>
+      <w:bookmarkStart w:id="74" w:name="_Ref232494106"/>
+      <w:bookmarkStart w:id="75" w:name="_Toc232585826"/>
       <w:r>
         <w:lastRenderedPageBreak/>
         <w:t xml:space="preserve">Annexe </w:t>
@@ -21919,11 +21662,11 @@
       <w:r>
         <w:t xml:space="preserve">- Formulaire de consentement, </w:t>
       </w:r>
-      <w:bookmarkEnd w:id="70"/>
       <w:r>
         <w:t>française</w:t>
       </w:r>
-      <w:bookmarkEnd w:id="71"/>
+      <w:bookmarkEnd w:id="74"/>
+      <w:bookmarkEnd w:id="75"/>
     </w:p>
     <w:tbl>
       <w:tblPr>
@@ -22026,19 +21769,8 @@
                 <w:szCs w:val="21"/>
                 <w:lang w:val="en-IN"/>
               </w:rPr>
-              <w:t xml:space="preserve">Nom </w:t>
-            </w:r>
-            <w:proofErr w:type="spellStart"/>
-            <w:r>
-              <w:rPr>
-                <w:rFonts w:ascii="Georgia Pro" w:hAnsi="Georgia Pro"/>
-                <w:sz w:val="18"/>
-                <w:szCs w:val="21"/>
-                <w:lang w:val="en-IN"/>
-              </w:rPr>
-              <w:t>Prénom</w:t>
-            </w:r>
-            <w:proofErr w:type="spellEnd"/>
+              <w:t>Nom Prénom</w:t>
+            </w:r>
           </w:p>
         </w:tc>
         <w:tc>
@@ -22084,7 +21816,6 @@
                 <w:lang w:val="en-IN"/>
               </w:rPr>
             </w:pPr>
-            <w:proofErr w:type="spellStart"/>
             <w:r>
               <w:rPr>
                 <w:rFonts w:ascii="Georgia Pro" w:hAnsi="Georgia Pro"/>
@@ -22092,17 +21823,7 @@
                 <w:szCs w:val="21"/>
                 <w:lang w:val="en-IN"/>
               </w:rPr>
-              <w:t>Âge</w:t>
-            </w:r>
-            <w:proofErr w:type="spellEnd"/>
-            <w:r>
-              <w:rPr>
-                <w:rFonts w:ascii="Georgia Pro" w:hAnsi="Georgia Pro"/>
-                <w:sz w:val="18"/>
-                <w:szCs w:val="21"/>
-                <w:lang w:val="en-IN"/>
-              </w:rPr>
-              <w:t>*</w:t>
+              <w:t>Âge*</w:t>
             </w:r>
           </w:p>
         </w:tc>
@@ -22206,18 +21927,8 @@
                 <w:sz w:val="18"/>
                 <w:szCs w:val="21"/>
               </w:rPr>
-              <w:t xml:space="preserve">Établissement d'origine (et ville, </w:t>
-            </w:r>
-            <w:proofErr w:type="gramStart"/>
-            <w:r>
-              <w:rPr>
-                <w:rFonts w:ascii="Georgia Pro" w:hAnsi="Georgia Pro"/>
-                <w:sz w:val="18"/>
-                <w:szCs w:val="21"/>
-              </w:rPr>
-              <w:t>pays)*</w:t>
-            </w:r>
-            <w:proofErr w:type="gramEnd"/>
+              <w:t>Établissement d'origine (et ville, pays)*</w:t>
+            </w:r>
           </w:p>
         </w:tc>
         <w:tc>
@@ -22269,47 +21980,7 @@
                 <w:szCs w:val="21"/>
                 <w:lang w:val="en-IN"/>
               </w:rPr>
-              <w:t xml:space="preserve">Langue </w:t>
-            </w:r>
-            <w:proofErr w:type="spellStart"/>
-            <w:r>
-              <w:rPr>
-                <w:rFonts w:ascii="Georgia Pro" w:hAnsi="Georgia Pro"/>
-                <w:sz w:val="18"/>
-                <w:szCs w:val="21"/>
-                <w:lang w:val="en-IN"/>
-              </w:rPr>
-              <w:t>actuellement</w:t>
-            </w:r>
-            <w:proofErr w:type="spellEnd"/>
-            <w:r>
-              <w:rPr>
-                <w:rFonts w:ascii="Georgia Pro" w:hAnsi="Georgia Pro"/>
-                <w:sz w:val="18"/>
-                <w:szCs w:val="21"/>
-                <w:lang w:val="en-IN"/>
-              </w:rPr>
-              <w:t xml:space="preserve"> </w:t>
-            </w:r>
-            <w:proofErr w:type="spellStart"/>
-            <w:r>
-              <w:rPr>
-                <w:rFonts w:ascii="Georgia Pro" w:hAnsi="Georgia Pro"/>
-                <w:sz w:val="18"/>
-                <w:szCs w:val="21"/>
-                <w:lang w:val="en-IN"/>
-              </w:rPr>
-              <w:t>enseignée</w:t>
-            </w:r>
-            <w:proofErr w:type="spellEnd"/>
-            <w:r>
-              <w:rPr>
-                <w:rFonts w:ascii="Georgia Pro" w:hAnsi="Georgia Pro"/>
-                <w:sz w:val="18"/>
-                <w:szCs w:val="21"/>
-                <w:lang w:val="en-IN"/>
-              </w:rPr>
-              <w:t>*</w:t>
+              <w:t>Langue actuellement enseignée*</w:t>
             </w:r>
           </w:p>
         </w:tc>
@@ -22585,7 +22256,6 @@
                 <w:lang w:val="en-IN"/>
               </w:rPr>
             </w:pPr>
-            <w:proofErr w:type="spellStart"/>
             <w:r>
               <w:rPr>
                 <w:rFonts w:ascii="Georgia Pro" w:hAnsi="Georgia Pro"/>
@@ -22593,49 +22263,8 @@
                 <w:bCs/>
                 <w:lang w:val="en-IN"/>
               </w:rPr>
-              <w:t>Consentement</w:t>
-            </w:r>
-            <w:proofErr w:type="spellEnd"/>
-            <w:r>
-              <w:rPr>
-                <w:rFonts w:ascii="Georgia Pro" w:hAnsi="Georgia Pro"/>
-                <w:b/>
-                <w:bCs/>
-                <w:lang w:val="en-IN"/>
-              </w:rPr>
-              <w:t xml:space="preserve"> à </w:t>
-            </w:r>
-            <w:proofErr w:type="spellStart"/>
-            <w:r>
-              <w:rPr>
-                <w:rFonts w:ascii="Georgia Pro" w:hAnsi="Georgia Pro"/>
-                <w:b/>
-                <w:bCs/>
-                <w:lang w:val="en-IN"/>
-              </w:rPr>
-              <w:t>l'enregistrement</w:t>
-            </w:r>
-            <w:proofErr w:type="spellEnd"/>
-            <w:r>
-              <w:rPr>
-                <w:rFonts w:ascii="Georgia Pro" w:hAnsi="Georgia Pro"/>
-                <w:b/>
-                <w:bCs/>
-                <w:lang w:val="en-IN"/>
-              </w:rPr>
-              <w:t xml:space="preserve"> </w:t>
-            </w:r>
-            <w:proofErr w:type="spellStart"/>
-            <w:r>
-              <w:rPr>
-                <w:rFonts w:ascii="Georgia Pro" w:hAnsi="Georgia Pro"/>
-                <w:b/>
-                <w:bCs/>
-                <w:lang w:val="en-IN"/>
-              </w:rPr>
-              <w:t>vidéo</w:t>
-            </w:r>
-            <w:proofErr w:type="spellEnd"/>
+              <w:t>Consentement à l'enregistrement vidéo</w:t>
+            </w:r>
           </w:p>
         </w:tc>
       </w:tr>
@@ -23052,9 +22681,16 @@
       <w:pPr>
         <w:pStyle w:val="Heading3"/>
       </w:pPr>
-      <w:bookmarkStart w:id="72" w:name="_Toc232455150"/>
+      <w:bookmarkStart w:id="76" w:name="_Ref232585704"/>
       <w:r>
         <w:lastRenderedPageBreak/>
+        <w:t xml:space="preserve"> </w:t>
+      </w:r>
+      <w:bookmarkStart w:id="77" w:name="_Toc232585827"/>
+      <w:bookmarkStart w:id="78" w:name="_Ref232585829"/>
+      <w:bookmarkStart w:id="79" w:name="_Ref232585900"/>
+      <w:bookmarkStart w:id="80" w:name="_Ref232585925"/>
+      <w:r>
         <w:t xml:space="preserve">Annexe </w:t>
       </w:r>
       <w:r>
@@ -23066,7 +22702,11 @@
       <w:r>
         <w:t>, Français</w:t>
       </w:r>
-      <w:bookmarkEnd w:id="72"/>
+      <w:bookmarkEnd w:id="76"/>
+      <w:bookmarkEnd w:id="77"/>
+      <w:bookmarkEnd w:id="78"/>
+      <w:bookmarkEnd w:id="79"/>
+      <w:bookmarkEnd w:id="80"/>
     </w:p>
     <w:p>
       <w:pPr>
@@ -23379,7 +23019,6 @@
                 <w:lang w:eastAsia="en-GB"/>
               </w:rPr>
             </w:pPr>
-            <w:proofErr w:type="gramStart"/>
             <w:r>
               <w:rPr>
                 <w:rFonts w:eastAsia="Arial" w:cs="Times New Roman"/>
@@ -23389,7 +23028,6 @@
               </w:rPr>
               <w:t>Date:</w:t>
             </w:r>
-            <w:proofErr w:type="gramEnd"/>
           </w:p>
           <w:p>
             <w:pPr>
@@ -23673,26 +23311,16 @@
                 <w:szCs w:val="20"/>
                 <w:lang w:eastAsia="en-GB"/>
               </w:rPr>
-              <w:t xml:space="preserve"> </w:t>
-            </w:r>
-            <w:proofErr w:type="spellStart"/>
+              <w:t xml:space="preserve"> Negati</w:t>
+            </w:r>
             <w:r>
               <w:rPr>
                 <w:rFonts w:eastAsia="Arial" w:cs="Times New Roman"/>
                 <w:szCs w:val="20"/>
                 <w:lang w:eastAsia="en-GB"/>
               </w:rPr>
-              <w:t>Negati</w:t>
-            </w:r>
-            <w:r>
-              <w:rPr>
-                <w:rFonts w:eastAsia="Arial" w:cs="Times New Roman"/>
-                <w:szCs w:val="20"/>
-                <w:lang w:eastAsia="en-GB"/>
-              </w:rPr>
               <w:t>f</w:t>
             </w:r>
-            <w:proofErr w:type="spellEnd"/>
           </w:p>
         </w:tc>
       </w:tr>
@@ -26078,7 +25706,6 @@
               </w:rPr>
               <w:t>I</w:t>
             </w:r>
-            <w:proofErr w:type="spellStart"/>
             <w:r>
               <w:rPr>
                 <w:rFonts w:eastAsia="Arial" w:cs="Times New Roman"/>
@@ -26087,7 +25714,6 @@
               </w:rPr>
               <w:t>ncertain</w:t>
             </w:r>
-            <w:proofErr w:type="spellEnd"/>
           </w:p>
         </w:tc>
         <w:tc>
@@ -26213,9 +25839,8 @@
           <w:szCs w:val="18"/>
           <w:lang w:eastAsia="en-GB"/>
         </w:rPr>
-        <w:t xml:space="preserve">Veuillez indiquer parmi les éléments suivants ceux que vous considérez comme des obstacles à l'utilisation de l'IA dans votre </w:t>
-      </w:r>
-      <w:proofErr w:type="gramStart"/>
+        <w:t>Veuillez indiquer parmi les éléments suivants ceux que vous considérez comme des obstacles à l'utilisation de l'IA dans votre enseignement</w:t>
+      </w:r>
       <w:r>
         <w:rPr>
           <w:rFonts w:eastAsia="Arial" w:cs="Times New Roman"/>
@@ -26225,20 +25850,8 @@
           <w:szCs w:val="18"/>
           <w:lang w:eastAsia="en-GB"/>
         </w:rPr>
-        <w:t>enseignement</w:t>
-      </w:r>
-      <w:r>
-        <w:rPr>
-          <w:rFonts w:eastAsia="Arial" w:cs="Times New Roman"/>
-          <w:i/>
-          <w:iCs/>
-          <w:sz w:val="18"/>
-          <w:szCs w:val="18"/>
-          <w:lang w:eastAsia="en-GB"/>
-        </w:rPr>
         <w:t>:</w:t>
       </w:r>
-      <w:proofErr w:type="gramEnd"/>
     </w:p>
     <w:tbl>
       <w:tblPr>
@@ -27239,14 +26852,14 @@
           <w:lang w:eastAsia="en-GB"/>
         </w:rPr>
       </w:pPr>
-      <w:bookmarkStart w:id="73" w:name="_Toc232455151"/>
+      <w:bookmarkStart w:id="81" w:name="_Toc232585828"/>
       <w:r>
         <w:rPr>
           <w:rFonts w:eastAsia="Arial"/>
           <w:lang w:eastAsia="en-GB"/>
         </w:rPr>
         <w:lastRenderedPageBreak/>
-        <w:t>Annexe 6</w:t>
+        <w:t xml:space="preserve">Annexe </w:t>
       </w:r>
       <w:r>
         <w:rPr>
@@ -27255,7 +26868,7 @@
         </w:rPr>
         <w:t xml:space="preserve"> – Fiche d’évaluation du stage</w:t>
       </w:r>
-      <w:bookmarkEnd w:id="73"/>
+      <w:bookmarkEnd w:id="81"/>
     </w:p>
     <w:p>
       <w:pPr>

</xml_diff>

<commit_message>
Discussion added_needs to be edited
</commit_message>
<xml_diff>
--- a/my_report/Thesis_FR.docx
+++ b/my_report/Thesis_FR.docx
@@ -174,7 +174,7 @@
                                     <pic:cNvPicPr/>
                                   </pic:nvPicPr>
                                   <pic:blipFill>
-                                    <a:blip r:embed="rId8">
+                                    <a:blip r:embed="rId9">
                                       <a:extLst>
                                         <a:ext uri="{28A0092B-C50C-407E-A947-70E740481C1C}">
                                           <a14:useLocalDpi xmlns:a14="http://schemas.microsoft.com/office/drawing/2010/main" val="0"/>
@@ -238,7 +238,7 @@
                     <pic:cNvPicPr/>
                   </pic:nvPicPr>
                   <pic:blipFill>
-                    <a:blip r:embed="rId9" cstate="print">
+                    <a:blip r:embed="rId10" cstate="print">
                       <a:extLst>
                         <a:ext uri="{28A0092B-C50C-407E-A947-70E740481C1C}">
                           <a14:useLocalDpi xmlns:a14="http://schemas.microsoft.com/office/drawing/2010/main" val="0"/>
@@ -6298,9 +6298,9 @@
     <w:p>
       <w:pPr>
         <w:sectPr>
-          <w:headerReference w:type="default" r:id="rId10"/>
-          <w:footerReference w:type="even" r:id="rId11"/>
-          <w:footerReference w:type="default" r:id="rId12"/>
+          <w:headerReference w:type="default" r:id="rId11"/>
+          <w:footerReference w:type="even" r:id="rId12"/>
+          <w:footerReference w:type="default" r:id="rId13"/>
           <w:pgSz w:w="11906" w:h="16838"/>
           <w:pgMar w:top="1440" w:right="1440" w:bottom="1440" w:left="1440" w:header="708" w:footer="708" w:gutter="0"/>
           <w:pgNumType w:chapStyle="1" w:chapSep="emDash"/>
@@ -8066,7 +8066,7 @@
                     <pic:cNvPicPr/>
                   </pic:nvPicPr>
                   <pic:blipFill>
-                    <a:blip r:embed="rId13" cstate="print">
+                    <a:blip r:embed="rId14" cstate="print">
                       <a:extLst>
                         <a:ext uri="{28A0092B-C50C-407E-A947-70E740481C1C}">
                           <a14:useLocalDpi xmlns:a14="http://schemas.microsoft.com/office/drawing/2010/main" val="0"/>
@@ -10370,25 +10370,7 @@
           <w:szCs w:val="24"/>
           <w14:ligatures w14:val="standardContextual"/>
         </w:rPr>
-        <w:t xml:space="preserve">, </w:t>
-      </w:r>
-      <w:proofErr w:type="spellStart"/>
-      <w:r>
-        <w:rPr>
-          <w:rFonts w:cs="Times New Roman"/>
-          <w:szCs w:val="24"/>
-          <w14:ligatures w14:val="standardContextual"/>
-        </w:rPr>
-        <w:t>n.d</w:t>
-      </w:r>
-      <w:proofErr w:type="spellEnd"/>
-      <w:r>
-        <w:rPr>
-          <w:rFonts w:cs="Times New Roman"/>
-          <w:szCs w:val="24"/>
-          <w14:ligatures w14:val="standardContextual"/>
-        </w:rPr>
-        <w:t>.)</w:t>
+        <w:t>, n.d.)</w:t>
       </w:r>
       <w:r>
         <w:fldChar w:fldCharType="end"/>
@@ -10503,25 +10485,7 @@
           <w:szCs w:val="24"/>
           <w14:ligatures w14:val="standardContextual"/>
         </w:rPr>
-        <w:t xml:space="preserve">, </w:t>
-      </w:r>
-      <w:proofErr w:type="spellStart"/>
-      <w:r>
-        <w:rPr>
-          <w:rFonts w:cs="Times New Roman"/>
-          <w:szCs w:val="24"/>
-          <w14:ligatures w14:val="standardContextual"/>
-        </w:rPr>
-        <w:t>n.d</w:t>
-      </w:r>
-      <w:proofErr w:type="spellEnd"/>
-      <w:r>
-        <w:rPr>
-          <w:rFonts w:cs="Times New Roman"/>
-          <w:szCs w:val="24"/>
-          <w14:ligatures w14:val="standardContextual"/>
-        </w:rPr>
-        <w:t>.)</w:t>
+        <w:t>, n.d.)</w:t>
       </w:r>
       <w:r>
         <w:fldChar w:fldCharType="end"/>
@@ -15371,13 +15335,7 @@
               </w:rPr>
             </w:pPr>
             <w:r>
-              <w:t xml:space="preserve">Fautes </w:t>
-            </w:r>
-            <w:r>
-              <w:t>grammaticales ;</w:t>
-            </w:r>
-            <w:r>
-              <w:t xml:space="preserve"> contenu non-adapté aux niveaux CECRL français</w:t>
+              <w:t>Fautes grammaticales ; contenu non-adapté aux niveaux CECRL français</w:t>
             </w:r>
           </w:p>
         </w:tc>
@@ -16282,15 +16240,7 @@
           <w:bCs/>
           <w:lang w:val="en-FR"/>
         </w:rPr>
-        <w:t xml:space="preserve">Acceptation des suggestion (Phase II) V. </w:t>
-      </w:r>
-      <w:r>
-        <w:rPr>
-          <w:b/>
-          <w:bCs/>
-          <w:lang w:val="en-FR"/>
-        </w:rPr>
-        <w:t>l’intention d’adoption future</w:t>
+        <w:t>Acceptation des suggestion (Phase II) V. l’intention d’adoption future</w:t>
       </w:r>
     </w:p>
     <w:p>
@@ -16520,13 +16470,7 @@
               </w:rPr>
             </w:pPr>
             <w:r>
-              <w:t xml:space="preserve">0% </w:t>
-            </w:r>
-            <w:r>
-              <w:t>adoptera ;</w:t>
-            </w:r>
-            <w:r>
-              <w:t xml:space="preserve"> 25% explorera</w:t>
+              <w:t>0% adoptera ; 25% explorera</w:t>
             </w:r>
           </w:p>
         </w:tc>
@@ -17262,11 +17206,319 @@
     </w:p>
     <w:p/>
     <w:p>
-      <w:pPr>
-        <w:pStyle w:val="Bibliography"/>
+      <w:r>
+        <w:t xml:space="preserve">En relisant les résultats de cette étude, il apparaît clairement que l'adoption de l'IA générative par les enseignants de langues vivantes n'est pas une question simple de reconnaissance d'utilité. </w:t>
+      </w:r>
+    </w:p>
+    <w:p>
+      <w:r>
+        <w:rPr>
+          <w:highlight w:val="yellow"/>
+        </w:rPr>
+        <w:t>En travaillant sur les résultats de cette étude, nous avons une idée claire que l'adoption de l’IA générative</w:t>
+      </w:r>
+      <w:r>
+        <w:t xml:space="preserve"> </w:t>
+      </w:r>
+    </w:p>
+    <w:p>
+      <w:r>
+        <w:t>Les données révèlent plutôt un processus complexe de négociation entre utilité perçue et coût réel d'implémentation, processus qui varie considérablement selon l'expertise antérieure et le contexte disciplinaire.</w:t>
+      </w:r>
+    </w:p>
+    <w:p>
+      <w:r>
+        <w:t xml:space="preserve">Le modèle TAM de Davis prédisait que si les enseignants trouvent un outil utile, ils l'adoptent. Or, quatre enseignants ont reconnu que l'IA générait "certains bons éléments"—conformément à la prédiction du TAM—tout en rejetant fermement l'adoption future. Cela suggère une limite théorique importante : l'utilité perçue seule ne suffit pas. Les enseignants posent une question supplémentaire qui ne figure pas dans le TAM : "Est-ce que le temps que j'économise à générer des idées compense-t-il le temps que je devrai passer à adapter, corriger et vérifier le </w:t>
+      </w:r>
+      <w:proofErr w:type="gramStart"/>
+      <w:r>
+        <w:t>contenu?</w:t>
+      </w:r>
+      <w:proofErr w:type="gramEnd"/>
+      <w:r>
+        <w:t xml:space="preserve">" PE02 (intermédiaire) l'a explicité avec clarté : "Si je dois corriger les erreurs, adapter le contenu, et vérifier la pédagogie, je fais finalement le même travail qu'avant." Pour cette enseignante, l'équation était négative. L'IA était utile sur le papier, mais inefficace en pratique. C'est un calcul que les modèles existants ne capturent pas bien—la distinction entre utilité perçue (générer des idées) et efficacité réelle (gain net après </w:t>
+      </w:r>
+      <w:proofErr w:type="gramStart"/>
+      <w:r>
+        <w:t>adaptation)—</w:t>
+      </w:r>
+      <w:proofErr w:type="gramEnd"/>
+      <w:r>
+        <w:t>mais qui semble déterminant pour l'adoption durable.</w:t>
+      </w:r>
+    </w:p>
+    <w:p>
+      <w:r>
+        <w:t>En même temps, les données confirment avec clarté la théorie d'</w:t>
+      </w:r>
+      <w:proofErr w:type="spellStart"/>
+      <w:r>
+        <w:t>Ertmer</w:t>
+      </w:r>
+      <w:proofErr w:type="spellEnd"/>
+      <w:r>
+        <w:t xml:space="preserve"> sur les barrières de second </w:t>
+      </w:r>
+      <w:proofErr w:type="spellStart"/>
+      <w:r>
+        <w:t>order</w:t>
+      </w:r>
+      <w:proofErr w:type="spellEnd"/>
+      <w:r>
+        <w:t xml:space="preserve">, tout en révélant une complexité que la théorie n'anticipait pas pleinement. Les obstacles rencontrés n'étaient pas techniques—tous les enseignants pouvaient utiliser </w:t>
+      </w:r>
+      <w:proofErr w:type="spellStart"/>
+      <w:r>
+        <w:t>ChatGPT</w:t>
+      </w:r>
+      <w:proofErr w:type="spellEnd"/>
+      <w:r>
+        <w:t xml:space="preserve"> sans problème. Ils étaient pédagogiques et disciplinaires, exactement comme </w:t>
+      </w:r>
+      <w:proofErr w:type="spellStart"/>
+      <w:r>
+        <w:t>Ertmer</w:t>
+      </w:r>
+      <w:proofErr w:type="spellEnd"/>
+      <w:r>
+        <w:t xml:space="preserve"> l'aurait prédit. Cependant, ce qui était frappant, c'est que ces barrières de second </w:t>
+      </w:r>
+      <w:proofErr w:type="spellStart"/>
+      <w:r>
+        <w:t>order</w:t>
+      </w:r>
+      <w:proofErr w:type="spellEnd"/>
+      <w:r>
+        <w:t xml:space="preserve"> semblent structurellement inscrites dans les modèles IA eux-mêmes. Les enseignants de français rencontraient des erreurs grammaticales persistantes non parce qu'ils ne savaient pas filtrer les suggestions, mais parce que les modèles, entraînés majoritairement sur l'anglais, ne maîtrisent pas les subtilités du français. De la même façon, les enseignants d'anglais se heurtaient à un manque systématique de différenciation dans les exercices—non pas une erreur isolée, mais une limitation du modèle à générer du contenu non-générique. Un enseignant de français expert </w:t>
+      </w:r>
+      <w:r>
+        <w:lastRenderedPageBreak/>
+        <w:t>en didactique ne peut pas corriger une barrière qui vient de la structure des données d'entraînement. Cela soulève une question plus large : la formation peut-elle surmonter une limitation qui réside dans l'outil lui-</w:t>
+      </w:r>
+      <w:proofErr w:type="gramStart"/>
+      <w:r>
+        <w:t>même?</w:t>
+      </w:r>
+      <w:proofErr w:type="gramEnd"/>
+      <w:r>
+        <w:t xml:space="preserve"> Probablement pas. Cela suggère que les approches de formation générale à l'IA, bien intentionnées, peuvent être insuffisantes si les outils eux-mêmes ne répondent pas aux besoins disciplinaires spécifiques.</w:t>
+      </w:r>
+    </w:p>
+    <w:p>
+      <w:r>
+        <w:t xml:space="preserve">Les données révèlent aussi comment la théorie de Borg sur la cognition enseignante s'opérationnalise différemment selon le niveau d'expertise. Borg prédit que les enseignants filtrent les innovations à travers leurs croyances pédagogiques, et cela s'est </w:t>
+      </w:r>
+      <w:proofErr w:type="gramStart"/>
+      <w:r>
+        <w:t>avéré vrai</w:t>
+      </w:r>
+      <w:proofErr w:type="gramEnd"/>
+      <w:r>
+        <w:t xml:space="preserve">. Ce qui émerge des données, c'est que ce filtrage n'est pas une capacité statique mais une compétence qui se développe avec l'expertise. Les novices essaient de filtrer, mais de manière hésitante et incertaine—ils ne sont pas sûrs de ce qu'ils cherchent, donc il est difficile de juger si ce qu'on reçoit le satisfait. Les intermédiaires filtrent avec une assurance croissante : ils évaluent chaque suggestion selon des critères clairs (adaptation aux apprenants, alignement pédagogique) et extraient sélectivement les éléments utiles. L'expert ne filtre pratiquement pas au stade de </w:t>
+      </w:r>
+      <w:proofErr w:type="gramStart"/>
+      <w:r>
+        <w:t>l'évaluation;</w:t>
+      </w:r>
+      <w:proofErr w:type="gramEnd"/>
+      <w:r>
+        <w:t xml:space="preserve"> il formule sa demande avec tellement de précision que ce qui revient correspond déjà à ses besoins. C'est comme une évolution du filtrage : du filtrage réactif (évaluer après réception) au filtrage proactif (spécifier précisément pour recevoir directement ce qu'on veut). Cette progression n'invalide pas Borg, mais elle affine sa théorie en montrant que la qualité du filtrage dépend de l'expertise accumulée.</w:t>
+      </w:r>
+    </w:p>
+    <w:p>
+      <w:r>
+        <w:t>Ce qui frappe en réfléchissant à l'ensemble, c'est qu'il existe une progression de l'engagement que les théories existantes ne décrivent pas vraiment. Les novices affichent une polarisation binaire : acceptation ou rejet, souvent basée sur une première impression. PE01 a reconnu que sa confusion venait du fait qu'il ne savait pas que l'IA pouvait faire plus que générer des images ; une fois cette compréhension acquise, il est devenu ouvert. PE06, à l'inverse, a jugé l'outil inutile et a rejeté complètement. Les intermédiaires, en revanche, adoptent une posture de négociation sélective—ils dialoguent mentalement avec l'IA, prenant ce qui convient à leur contexte, rejetant ce qui ne convient pas. PE02 a explicitement décrit ce processus : "J'ai pris les meilleures idées de chacun et les ai intégrées à ce que j'avais déjà." L'expert, PE07, opère en optimisation : il connaît les paramètres du système et les ajuste pour obtenir exactement ce qu'il veut, sans friction ni adaptation. Ces ne sont pas trois points sur une échelle linéaire d'adoption, mais trois qualités d'interaction radicalement différentes. Cela suggère que l'expertise technologique ne prédit pas seulement si quelqu'un adoptera l'IA, mais comment il interagira avec elle—quel type de relation cognitif il développera.</w:t>
+      </w:r>
+    </w:p>
+    <w:p>
+      <w:r>
+        <w:lastRenderedPageBreak/>
+        <w:t xml:space="preserve">Une observation plus fine émerge en examinant la relation entre acceptation et intention d'adoption. Intuitivement, on s'attendrait à ce que les enseignants qui ont accepté et intégré des éléments IA adoptent l'outil à l'avenir. Or, c'est précisément le groupe des intermédiaires—ceux qui ont modifié et intégré partiellement—qui a montré la plus faible intention d'adoption future (0 sur 4 adopteraient). Ce paradoxe suggère que l'acceptation partielle ne mène à l'adoption que si le coût réel d'intégration est faible. Pour les intermédiaires, ce coût était élevé (adaptation, vérification, correction). Pour l'expert, il était minimal (presque aucune modification). Pour les novices, c'était une question de clarté (PE01 : ouvert si mieux </w:t>
+      </w:r>
+      <w:proofErr w:type="gramStart"/>
+      <w:r>
+        <w:t>compris;</w:t>
+      </w:r>
+      <w:proofErr w:type="gramEnd"/>
+      <w:r>
+        <w:t xml:space="preserve"> PE06 : fermé si confusion domine). Cela révèle que l'adoption ne dépend pas d'une simple accumulation de petites acceptations, mais d'un seuil d'efficacité pratique. Seul quand l'IA réduit réellement le travail net l'adoption devient probable.</w:t>
+      </w:r>
+    </w:p>
+    <w:p>
+      <w:r>
+        <w:t xml:space="preserve">La question des préoccupations éthiques et environnementales a aussi révélé une nuance importante. Cinq sur sept enseignants ont exprimé une inquiétude sur l'utilisation responsable de </w:t>
+      </w:r>
+      <w:proofErr w:type="gramStart"/>
+      <w:r>
+        <w:t>l'IA;</w:t>
+      </w:r>
+      <w:proofErr w:type="gramEnd"/>
+      <w:r>
+        <w:t xml:space="preserve"> deux ont mentionné explicitement l'impact environnemental et la protection des données. Plutôt que de voir ces préoccupations comme des obstacles irrationnels, elles reflètent une responsabilité professionnelle légitime. PE04 ne disait pas "je refuse l'IA" mais "je dois considérer l'impact environnemental." Ce qui est intéressant, c'est que PE07 (expert, qui adopte l'IA) n'a pas ignoré ces préoccupations. Il a rapporté avoir reçu une formation sur comment utiliser l'IA responsablement—en ne partageant pas de données personnelles, par exemple. Cela suggère que les préoccupations éthiques ne sont pas une barrière inévitable mais une compétence à développer : non pas "comment arrêter d'utiliser l'IA" mais "comment l'utiliser éthiquement."</w:t>
+      </w:r>
+    </w:p>
+    <w:p/>
+    <w:p>
+      <w:r>
+        <w:t>6.2 Les Limites : Ce Que Cette Étude Ne Peut Pas Affirmer</w:t>
+      </w:r>
+    </w:p>
+    <w:p>
+      <w:r>
+        <w:t>Malgré ces découvertes, il est important de reconnaître explicitement les frontières de ce qu'on peut conclure de cette étude.</w:t>
+      </w:r>
+    </w:p>
+    <w:p>
+      <w:r>
+        <w:t xml:space="preserve">La plus significative est que on a mesuré l'intention d'adoption, pas l'adoption réelle. Les enseignants ont répondu sincèrement à la question "réutiliseriez-vous cet </w:t>
+      </w:r>
+      <w:proofErr w:type="gramStart"/>
+      <w:r>
+        <w:t>outil?</w:t>
+      </w:r>
+      <w:proofErr w:type="gramEnd"/>
+      <w:r>
+        <w:t xml:space="preserve">" une heure après avoir utilisé l'IA. Mais une intention déclarée immédiatement post-intervention n'est pas le même phénomène que le comportement réel quelques mois plus tard. Un enseignant qui a dit "je vais explorer l'IA à l'avenir" peut, en pratique, ne jamais le faire une fois </w:t>
+      </w:r>
+      <w:proofErr w:type="gramStart"/>
+      <w:r>
+        <w:t>retourné</w:t>
+      </w:r>
+      <w:proofErr w:type="gramEnd"/>
+      <w:r>
+        <w:t xml:space="preserve"> à la routine quotidienne de sa classe. Inversement, quelqu'un qui a hésité pendant la session peut développer une pratique d'IA plus tard, après avoir eu le temps de réfléchir ou reçu une formation supplémentaire. Cela signifie que les conclusions sur l'adoption doivent être </w:t>
+      </w:r>
+      <w:r>
+        <w:lastRenderedPageBreak/>
+        <w:t xml:space="preserve">entendues avec prudence : on parle d'intention déclarée, pas d'adoption confirmée par le comportement dans le temps. Une étude longitudinale, suivant les enseignants pendant trois à six mois, aurait pu valider ou infirmer ces intentions et examiner si le calcul </w:t>
+      </w:r>
+      <w:proofErr w:type="spellStart"/>
+      <w:r>
+        <w:t>cost-benefit</w:t>
+      </w:r>
+      <w:proofErr w:type="spellEnd"/>
+      <w:r>
+        <w:t xml:space="preserve"> qu'ils ont décrit s'est maintenu ou a changé avec l'expérience réelle.</w:t>
+      </w:r>
+    </w:p>
+    <w:p>
+      <w:r>
+        <w:t xml:space="preserve">Il y a aussi une limite de scope et de contexte. Cette étude a impliqué sept enseignants d'une seule école dans une seule académie (Lyon), travaillant sur une seule plateforme (outils IA ouverts à ce moment-là) et planifiant des leçons un jour spécifique. Les patterns observés sont cohérents et clairs, mais ils pourraient être liés aux caractéristiques spécifiques de ce contexte. Serait-on arrivé aux mêmes conclusions avec des enseignants dans d'autres </w:t>
+      </w:r>
+      <w:proofErr w:type="gramStart"/>
+      <w:r>
+        <w:t>académies?</w:t>
+      </w:r>
+      <w:proofErr w:type="gramEnd"/>
+      <w:r>
+        <w:t xml:space="preserve"> Avec des lycéens au lieu de </w:t>
+      </w:r>
+      <w:proofErr w:type="gramStart"/>
+      <w:r>
+        <w:t>collégiens?</w:t>
+      </w:r>
+      <w:proofErr w:type="gramEnd"/>
+      <w:r>
+        <w:t xml:space="preserve"> Avec une plus grande variété de thèmes </w:t>
+      </w:r>
+      <w:proofErr w:type="gramStart"/>
+      <w:r>
+        <w:t>grammaticaux?</w:t>
+      </w:r>
+      <w:proofErr w:type="gramEnd"/>
+      <w:r>
+        <w:t xml:space="preserve"> On ne sait pas. Idéalement, une étude ultérieure comprendrait plusieurs écoles, plusieurs niveaux (collège ET lycée ET université), et plusieurs thèmes par discipline.</w:t>
+      </w:r>
+    </w:p>
+    <w:p>
+      <w:r>
+        <w:t xml:space="preserve">Liée à cela, il y a une limite sur les thèmes eux-mêmes. Chaque groupe d'enseignants a travaillé sur un seul thème grammatical : BE+ING pour l'anglais, Fonction du présent pour le français, Gérondif espagnol. Les barrières observées—manque de différenciation pour l'anglais, erreurs grammaticales pour le français—pourraient être spécifiques à ces thèmes ou à ce moment du curriculum. D'autres thèmes grammaticaux (modes verbaux, prépositions, articles) produiraient-ils les mêmes </w:t>
+      </w:r>
+      <w:proofErr w:type="gramStart"/>
+      <w:r>
+        <w:t>obstacles?</w:t>
+      </w:r>
+      <w:proofErr w:type="gramEnd"/>
+      <w:r>
+        <w:t xml:space="preserve"> L'IA gère-t-elle mieux certains contenus que </w:t>
+      </w:r>
+      <w:proofErr w:type="gramStart"/>
+      <w:r>
+        <w:t>d'autres?</w:t>
+      </w:r>
+      <w:proofErr w:type="gramEnd"/>
+      <w:r>
+        <w:t xml:space="preserve"> Une étude ayant testé plusieurs thèmes par discipline aurait renforcé la généralisation de ces résultats.</w:t>
+      </w:r>
+    </w:p>
+    <w:p>
+      <w:r>
+        <w:t xml:space="preserve">Il y a également une limite temporelle que peut-être on aurait pu anticiper. Une seule session de planification d'une heure offre une snapshot du processus, pas une compréhension du comportement d'adoption à long terme. Les enseignants apprennent à utiliser les outils au fil du </w:t>
+      </w:r>
+      <w:proofErr w:type="gramStart"/>
+      <w:r>
+        <w:t>temps;</w:t>
+      </w:r>
+      <w:proofErr w:type="gramEnd"/>
+      <w:r>
+        <w:t xml:space="preserve"> peut-être que ce qu'ils trouvaient difficile après une heure devient facile après une semaine d'utilisation. Inversement, peut-être que l'enthousiasme initial s'estompe. Une approche avec deux sessions séparées par une semaine ou un mois aurait permis d'observer comment les attitudes et les compétences évoluent avec l'exposition répétée.</w:t>
+      </w:r>
+    </w:p>
+    <w:p>
+      <w:r>
+        <w:t>Enfin, on n'a pas pu mesurer l'impact réel en classe. On a planifié une leçon avec l'IA, mais aucun enseignant n'a réellement enseigné cette leçon avec ses élèves pendant cette étude. Comment les élèves réagissent-</w:t>
+      </w:r>
+      <w:proofErr w:type="gramStart"/>
+      <w:r>
+        <w:t>ils?</w:t>
+      </w:r>
+      <w:proofErr w:type="gramEnd"/>
+      <w:r>
+        <w:t xml:space="preserve"> La leçon fonctionne-t-elle aussi bien que </w:t>
+      </w:r>
+      <w:proofErr w:type="gramStart"/>
+      <w:r>
+        <w:t>prévue?</w:t>
+      </w:r>
+      <w:proofErr w:type="gramEnd"/>
+      <w:r>
+        <w:t xml:space="preserve"> Les élèves voient-ils une différence entre une leçon planifiée par leur enseignant seul et une leçon planifiée avec l'aide de </w:t>
+      </w:r>
+      <w:proofErr w:type="gramStart"/>
+      <w:r>
+        <w:t>l'IA?</w:t>
+      </w:r>
+      <w:proofErr w:type="gramEnd"/>
+      <w:r>
+        <w:t xml:space="preserve"> Cela aurait fourni une validation externe des perceptions des enseignants sur l'utilité de l'IA. C'est probablement trop ambitieux pour une première étude, mais cela resterait un apport important.</w:t>
+      </w:r>
+    </w:p>
+    <w:p>
+      <w:r>
+        <w:lastRenderedPageBreak/>
+        <w:t xml:space="preserve">Malgré ces limites, les résultats restent solides et cohérents. Les patterns qui </w:t>
+      </w:r>
+      <w:proofErr w:type="spellStart"/>
+      <w:r>
+        <w:t>émergentt</w:t>
+      </w:r>
+      <w:proofErr w:type="spellEnd"/>
+      <w:r>
+        <w:t xml:space="preserve">—l'importance du calcul </w:t>
+      </w:r>
+      <w:proofErr w:type="spellStart"/>
+      <w:r>
+        <w:t>cost-benefit</w:t>
+      </w:r>
+      <w:proofErr w:type="spellEnd"/>
+      <w:r>
+        <w:t>, la variation selon l'expertise, les barrières disciplinaires spécifiques—apparaissent à travers plusieurs perspectives différentes (enregistrement d'écran, feedback post-test, comparaison Phase I vs Phase II) et chez tous les participants, indépendamment de leur profil. Cela donne une certaine confiance que ces patterns ne sont pas des artefacts méthodologiques, mais des éléments réels du processus d'adoption.</w:t>
+      </w:r>
+    </w:p>
+    <w:p>
+      <w:pPr>
         <w:rPr>
           <w:rFonts w:ascii="Microsoft Uighur" w:hAnsi="Microsoft Uighur" w:cs="Microsoft Uighur"/>
-          <w:color w:val="0E2841" w:themeColor="text2"/>
           <w:sz w:val="28"/>
           <w:szCs w:val="28"/>
         </w:rPr>
@@ -17352,27 +17604,7 @@
           <w:sz w:val="20"/>
           <w:lang w:val="en-GB"/>
         </w:rPr>
-        <w:t xml:space="preserve">Afdal, H. W., &amp; </w:t>
-      </w:r>
-      <w:proofErr w:type="spellStart"/>
-      <w:r>
-        <w:rPr>
-          <w:rFonts w:cs="Times New Roman"/>
-          <w:color w:val="000000" w:themeColor="text1"/>
-          <w:sz w:val="20"/>
-          <w:lang w:val="en-GB"/>
-        </w:rPr>
-        <w:t>Maaranen</w:t>
-      </w:r>
-      <w:proofErr w:type="spellEnd"/>
-      <w:r>
-        <w:rPr>
-          <w:rFonts w:cs="Times New Roman"/>
-          <w:color w:val="000000" w:themeColor="text1"/>
-          <w:sz w:val="20"/>
-          <w:lang w:val="en-GB"/>
-        </w:rPr>
-        <w:t xml:space="preserve">, K. (2023). </w:t>
+        <w:t xml:space="preserve">Afdal, H. W., &amp; Maaranen, K. (2023). </w:t>
       </w:r>
       <w:r>
         <w:rPr>
@@ -17473,7 +17705,6 @@
         </w:rPr>
         <w:t xml:space="preserve">Breen, M. P., Hird, B., Milton, M., Thwaite, A., &amp; Oliver, R. (2001). Making Sense of Language Teaching: Teachers’ Principles and Classroom Practices. </w:t>
       </w:r>
-      <w:proofErr w:type="spellStart"/>
       <w:r>
         <w:rPr>
           <w:rFonts w:cs="Times New Roman"/>
@@ -17482,9 +17713,16 @@
           <w:color w:val="000000" w:themeColor="text1"/>
           <w:sz w:val="20"/>
         </w:rPr>
-        <w:t>Applied</w:t>
-      </w:r>
-      <w:proofErr w:type="spellEnd"/>
+        <w:t>Applied Linguistics</w:t>
+      </w:r>
+      <w:r>
+        <w:rPr>
+          <w:rFonts w:cs="Times New Roman"/>
+          <w:color w:val="000000" w:themeColor="text1"/>
+          <w:sz w:val="20"/>
+        </w:rPr>
+        <w:t xml:space="preserve">, </w:t>
+      </w:r>
       <w:r>
         <w:rPr>
           <w:rFonts w:cs="Times New Roman"/>
@@ -17493,9 +17731,26 @@
           <w:color w:val="000000" w:themeColor="text1"/>
           <w:sz w:val="20"/>
         </w:rPr>
-        <w:t xml:space="preserve"> </w:t>
-      </w:r>
-      <w:proofErr w:type="spellStart"/>
+        <w:t>22</w:t>
+      </w:r>
+      <w:r>
+        <w:rPr>
+          <w:rFonts w:cs="Times New Roman"/>
+          <w:color w:val="000000" w:themeColor="text1"/>
+          <w:sz w:val="20"/>
+        </w:rPr>
+        <w:t>(4), 470–501. (EJ637407).</w:t>
+      </w:r>
+    </w:p>
+    <w:p>
+      <w:pPr>
+        <w:pStyle w:val="Bibliography"/>
+        <w:rPr>
+          <w:rFonts w:cs="Times New Roman"/>
+          <w:color w:val="000000" w:themeColor="text1"/>
+          <w:sz w:val="20"/>
+        </w:rPr>
+      </w:pPr>
       <w:r>
         <w:rPr>
           <w:rFonts w:cs="Times New Roman"/>
@@ -17504,80 +17759,15 @@
           <w:color w:val="000000" w:themeColor="text1"/>
           <w:sz w:val="20"/>
         </w:rPr>
-        <w:t>Linguistics</w:t>
-      </w:r>
-      <w:proofErr w:type="spellEnd"/>
+        <w:t>Cadre d’usage de l’IA en éducation</w:t>
+      </w:r>
       <w:r>
         <w:rPr>
           <w:rFonts w:cs="Times New Roman"/>
           <w:color w:val="000000" w:themeColor="text1"/>
           <w:sz w:val="20"/>
         </w:rPr>
-        <w:t xml:space="preserve">, </w:t>
-      </w:r>
-      <w:r>
-        <w:rPr>
-          <w:rFonts w:cs="Times New Roman"/>
-          <w:i/>
-          <w:iCs/>
-          <w:color w:val="000000" w:themeColor="text1"/>
-          <w:sz w:val="20"/>
-        </w:rPr>
-        <w:t>22</w:t>
-      </w:r>
-      <w:r>
-        <w:rPr>
-          <w:rFonts w:cs="Times New Roman"/>
-          <w:color w:val="000000" w:themeColor="text1"/>
-          <w:sz w:val="20"/>
-        </w:rPr>
-        <w:t>(4), 470–501. (EJ637407).</w:t>
-      </w:r>
-    </w:p>
-    <w:p>
-      <w:pPr>
-        <w:pStyle w:val="Bibliography"/>
-        <w:rPr>
-          <w:rFonts w:cs="Times New Roman"/>
-          <w:color w:val="000000" w:themeColor="text1"/>
-          <w:sz w:val="20"/>
-        </w:rPr>
-      </w:pPr>
-      <w:r>
-        <w:rPr>
-          <w:rFonts w:cs="Times New Roman"/>
-          <w:i/>
-          <w:iCs/>
-          <w:color w:val="000000" w:themeColor="text1"/>
-          <w:sz w:val="20"/>
-        </w:rPr>
-        <w:t>Cadre d’usage de l’IA en éducation</w:t>
-      </w:r>
-      <w:r>
-        <w:rPr>
-          <w:rFonts w:cs="Times New Roman"/>
-          <w:color w:val="000000" w:themeColor="text1"/>
-          <w:sz w:val="20"/>
-        </w:rPr>
-        <w:t>. (2025, June 13). Ministère de l’</w:t>
-      </w:r>
-      <w:proofErr w:type="spellStart"/>
-      <w:r>
-        <w:rPr>
-          <w:rFonts w:cs="Times New Roman"/>
-          <w:color w:val="000000" w:themeColor="text1"/>
-          <w:sz w:val="20"/>
-        </w:rPr>
-        <w:t>Education</w:t>
-      </w:r>
-      <w:proofErr w:type="spellEnd"/>
-      <w:r>
-        <w:rPr>
-          <w:rFonts w:cs="Times New Roman"/>
-          <w:color w:val="000000" w:themeColor="text1"/>
-          <w:sz w:val="20"/>
-        </w:rPr>
-        <w:t xml:space="preserve"> nationale. https://www.education.gouv.fr/cadre-d-usage-de-l-ia-en-education-450647</w:t>
+        <w:t>. (2025, June 13). Ministère de l’Education nationale. https://www.education.gouv.fr/cadre-d-usage-de-l-ia-en-education-450647</w:t>
       </w:r>
     </w:p>
     <w:p>
@@ -17608,9 +17798,17 @@
           <w:sz w:val="20"/>
           <w:lang w:val="en-GB"/>
         </w:rPr>
-        <w:t xml:space="preserve">Computers in Human </w:t>
-      </w:r>
-      <w:proofErr w:type="spellStart"/>
+        <w:t>Computers in Human Behavior</w:t>
+      </w:r>
+      <w:r>
+        <w:rPr>
+          <w:rFonts w:cs="Times New Roman"/>
+          <w:color w:val="000000" w:themeColor="text1"/>
+          <w:sz w:val="20"/>
+          <w:lang w:val="en-GB"/>
+        </w:rPr>
+        <w:t xml:space="preserve">, </w:t>
+      </w:r>
       <w:r>
         <w:rPr>
           <w:rFonts w:cs="Times New Roman"/>
@@ -17620,9 +17818,8 @@
           <w:sz w:val="20"/>
           <w:lang w:val="en-GB"/>
         </w:rPr>
-        <w:t>Behavior</w:t>
-      </w:r>
-      <w:proofErr w:type="spellEnd"/>
+        <w:t>138</w:t>
+      </w:r>
       <w:r>
         <w:rPr>
           <w:rFonts w:cs="Times New Roman"/>
@@ -17630,8 +17827,19 @@
           <w:sz w:val="20"/>
           <w:lang w:val="en-GB"/>
         </w:rPr>
-        <w:t xml:space="preserve">, </w:t>
-      </w:r>
+        <w:t>, 107468. https://doi.org/10.1016/j.chb.2022.107468</w:t>
+      </w:r>
+    </w:p>
+    <w:p>
+      <w:pPr>
+        <w:pStyle w:val="Bibliography"/>
+        <w:rPr>
+          <w:rFonts w:cs="Times New Roman"/>
+          <w:color w:val="000000" w:themeColor="text1"/>
+          <w:sz w:val="20"/>
+          <w:lang w:val="en-GB"/>
+        </w:rPr>
+      </w:pPr>
       <w:r>
         <w:rPr>
           <w:rFonts w:cs="Times New Roman"/>
@@ -17641,7 +17849,7 @@
           <w:sz w:val="20"/>
           <w:lang w:val="en-GB"/>
         </w:rPr>
-        <w:t>138</w:t>
+        <w:t>Circulaire de rentrée 2015</w:t>
       </w:r>
       <w:r>
         <w:rPr>
@@ -17650,20 +17858,45 @@
           <w:sz w:val="20"/>
           <w:lang w:val="en-GB"/>
         </w:rPr>
-        <w:t>, 107468. https://doi.org/10.1016/j.chb.2022.107468</w:t>
-      </w:r>
-    </w:p>
-    <w:p>
-      <w:pPr>
-        <w:pStyle w:val="Bibliography"/>
+        <w:t xml:space="preserve">. </w:t>
+      </w:r>
+      <w:r>
+        <w:rPr>
+          <w:rFonts w:cs="Times New Roman"/>
+          <w:color w:val="000000" w:themeColor="text1"/>
+          <w:sz w:val="20"/>
+        </w:rPr>
+        <w:t xml:space="preserve">(n.d.). Ministère de l’Education nationale. </w:t>
+      </w:r>
+      <w:r>
         <w:rPr>
           <w:rFonts w:cs="Times New Roman"/>
           <w:color w:val="000000" w:themeColor="text1"/>
           <w:sz w:val="20"/>
           <w:lang w:val="en-GB"/>
         </w:rPr>
-      </w:pPr>
-      <w:proofErr w:type="spellStart"/>
+        <w:t>Retrieved May 30, 2026, from https://www.education.gouv.fr/bo/15/Hebdo22/xxx.htm</w:t>
+      </w:r>
+    </w:p>
+    <w:p>
+      <w:pPr>
+        <w:pStyle w:val="Bibliography"/>
+        <w:rPr>
+          <w:rFonts w:cs="Times New Roman"/>
+          <w:color w:val="000000" w:themeColor="text1"/>
+          <w:sz w:val="20"/>
+          <w:lang w:val="en-GB"/>
+        </w:rPr>
+      </w:pPr>
+      <w:r>
+        <w:rPr>
+          <w:rFonts w:cs="Times New Roman"/>
+          <w:color w:val="000000" w:themeColor="text1"/>
+          <w:sz w:val="20"/>
+          <w:lang w:val="en-GB"/>
+        </w:rPr>
+        <w:t xml:space="preserve">Clark, C. M., &amp; Peterson, P. L. (1984). </w:t>
+      </w:r>
       <w:r>
         <w:rPr>
           <w:rFonts w:cs="Times New Roman"/>
@@ -17673,9 +17906,373 @@
           <w:sz w:val="20"/>
           <w:lang w:val="en-GB"/>
         </w:rPr>
-        <w:t>Circulaire</w:t>
-      </w:r>
-      <w:proofErr w:type="spellEnd"/>
+        <w:t>Teachers’ Thought Processes. Occasional Paper No. 72</w:t>
+      </w:r>
+      <w:r>
+        <w:rPr>
+          <w:rFonts w:cs="Times New Roman"/>
+          <w:color w:val="000000" w:themeColor="text1"/>
+          <w:sz w:val="20"/>
+          <w:lang w:val="en-GB"/>
+        </w:rPr>
+        <w:t>. Institute for Research on Teaching, College of Education, Michigan State University, 252 Erickson Hall, East Lansing, MI 48824, ($13. https://eric.ed.gov/?id=ED251449</w:t>
+      </w:r>
+    </w:p>
+    <w:p>
+      <w:pPr>
+        <w:pStyle w:val="Bibliography"/>
+        <w:rPr>
+          <w:rFonts w:cs="Times New Roman"/>
+          <w:color w:val="000000" w:themeColor="text1"/>
+          <w:sz w:val="20"/>
+        </w:rPr>
+      </w:pPr>
+      <w:r>
+        <w:rPr>
+          <w:rFonts w:cs="Times New Roman"/>
+          <w:i/>
+          <w:iCs/>
+          <w:color w:val="000000" w:themeColor="text1"/>
+          <w:sz w:val="20"/>
+        </w:rPr>
+        <w:t>Collège Charles de Gaulle</w:t>
+      </w:r>
+      <w:r>
+        <w:rPr>
+          <w:rFonts w:cs="Times New Roman"/>
+          <w:color w:val="000000" w:themeColor="text1"/>
+          <w:sz w:val="20"/>
+        </w:rPr>
+        <w:t>. (2006, November 30). https://charlesdegaulle-stpierredechandieu.ent.auvergnerhonealpes.fr/</w:t>
+      </w:r>
+    </w:p>
+    <w:p>
+      <w:pPr>
+        <w:pStyle w:val="Bibliography"/>
+        <w:rPr>
+          <w:rFonts w:cs="Times New Roman"/>
+          <w:color w:val="000000" w:themeColor="text1"/>
+          <w:sz w:val="20"/>
+          <w:lang w:val="en-GB"/>
+        </w:rPr>
+      </w:pPr>
+      <w:r>
+        <w:rPr>
+          <w:rFonts w:cs="Times New Roman"/>
+          <w:i/>
+          <w:iCs/>
+          <w:color w:val="000000" w:themeColor="text1"/>
+          <w:sz w:val="20"/>
+        </w:rPr>
+        <w:t>Collège Charles de Gaulle, Saint-Pierre-de-Chandieu (69), avis et classement, toutes les infos et les spécialités—L’Etudiant</w:t>
+      </w:r>
+      <w:r>
+        <w:rPr>
+          <w:rFonts w:cs="Times New Roman"/>
+          <w:color w:val="000000" w:themeColor="text1"/>
+          <w:sz w:val="20"/>
+        </w:rPr>
+        <w:t xml:space="preserve">. </w:t>
+      </w:r>
+      <w:r>
+        <w:rPr>
+          <w:rFonts w:cs="Times New Roman"/>
+          <w:color w:val="000000" w:themeColor="text1"/>
+          <w:sz w:val="20"/>
+          <w:lang w:val="en-GB"/>
+        </w:rPr>
+        <w:t>(n.d.). Retrieved May 30, 2026, from https://www.letudiant.fr/college/annuaire-des-colleges/fiche/college-charles-de-gaulle-69.html#presentation</w:t>
+      </w:r>
+    </w:p>
+    <w:p>
+      <w:pPr>
+        <w:pStyle w:val="Bibliography"/>
+        <w:rPr>
+          <w:rFonts w:cs="Times New Roman"/>
+          <w:color w:val="000000" w:themeColor="text1"/>
+          <w:sz w:val="20"/>
+        </w:rPr>
+      </w:pPr>
+      <w:r>
+        <w:rPr>
+          <w:rFonts w:cs="Times New Roman"/>
+          <w:color w:val="000000" w:themeColor="text1"/>
+          <w:sz w:val="20"/>
+          <w:lang w:val="en-GB"/>
+        </w:rPr>
+        <w:t xml:space="preserve">Davis, F. D. (1989). Perceived Usefulness, Perceived Ease of Use, and User Acceptance of Information Technology. </w:t>
+      </w:r>
+      <w:r>
+        <w:rPr>
+          <w:rFonts w:cs="Times New Roman"/>
+          <w:i/>
+          <w:iCs/>
+          <w:color w:val="000000" w:themeColor="text1"/>
+          <w:sz w:val="20"/>
+        </w:rPr>
+        <w:t>MIS Quarterly</w:t>
+      </w:r>
+      <w:r>
+        <w:rPr>
+          <w:rFonts w:cs="Times New Roman"/>
+          <w:color w:val="000000" w:themeColor="text1"/>
+          <w:sz w:val="20"/>
+        </w:rPr>
+        <w:t xml:space="preserve">, </w:t>
+      </w:r>
+      <w:r>
+        <w:rPr>
+          <w:rFonts w:cs="Times New Roman"/>
+          <w:i/>
+          <w:iCs/>
+          <w:color w:val="000000" w:themeColor="text1"/>
+          <w:sz w:val="20"/>
+        </w:rPr>
+        <w:t>13</w:t>
+      </w:r>
+      <w:r>
+        <w:rPr>
+          <w:rFonts w:cs="Times New Roman"/>
+          <w:color w:val="000000" w:themeColor="text1"/>
+          <w:sz w:val="20"/>
+        </w:rPr>
+        <w:t>(3), 319–340. https://doi.org/10.2307/249008</w:t>
+      </w:r>
+    </w:p>
+    <w:p>
+      <w:pPr>
+        <w:pStyle w:val="Bibliography"/>
+        <w:rPr>
+          <w:rFonts w:cs="Times New Roman"/>
+          <w:color w:val="000000" w:themeColor="text1"/>
+          <w:sz w:val="20"/>
+        </w:rPr>
+      </w:pPr>
+      <w:r>
+        <w:rPr>
+          <w:rFonts w:cs="Times New Roman"/>
+          <w:color w:val="000000" w:themeColor="text1"/>
+          <w:sz w:val="20"/>
+        </w:rPr>
+        <w:t xml:space="preserve">Devauchelle, B. (2025a). Les enseignants, les formateurs et les cadres éducatifs français face à l’intelligence artificielle. </w:t>
+      </w:r>
+      <w:r>
+        <w:rPr>
+          <w:rFonts w:cs="Times New Roman"/>
+          <w:i/>
+          <w:iCs/>
+          <w:color w:val="000000" w:themeColor="text1"/>
+          <w:sz w:val="20"/>
+        </w:rPr>
+        <w:t>Revue internationale d’éducation de Sèvres</w:t>
+      </w:r>
+      <w:r>
+        <w:rPr>
+          <w:rFonts w:cs="Times New Roman"/>
+          <w:color w:val="000000" w:themeColor="text1"/>
+          <w:sz w:val="20"/>
+        </w:rPr>
+        <w:t>, (HS-4). https://doi.org/10.4000/146vm</w:t>
+      </w:r>
+    </w:p>
+    <w:p>
+      <w:pPr>
+        <w:pStyle w:val="Bibliography"/>
+        <w:rPr>
+          <w:rFonts w:cs="Times New Roman"/>
+          <w:color w:val="000000" w:themeColor="text1"/>
+          <w:sz w:val="20"/>
+        </w:rPr>
+      </w:pPr>
+      <w:r>
+        <w:rPr>
+          <w:rFonts w:cs="Times New Roman"/>
+          <w:color w:val="000000" w:themeColor="text1"/>
+          <w:sz w:val="20"/>
+        </w:rPr>
+        <w:t xml:space="preserve">Devauchelle, B. (2025b, May 2). Enjeux économiques et politiques autour de l’IA à l’école. </w:t>
+      </w:r>
+      <w:r>
+        <w:rPr>
+          <w:rFonts w:cs="Times New Roman"/>
+          <w:i/>
+          <w:iCs/>
+          <w:color w:val="000000" w:themeColor="text1"/>
+          <w:sz w:val="20"/>
+        </w:rPr>
+        <w:t>Le Café pédagogique</w:t>
+      </w:r>
+      <w:r>
+        <w:rPr>
+          <w:rFonts w:cs="Times New Roman"/>
+          <w:color w:val="000000" w:themeColor="text1"/>
+          <w:sz w:val="20"/>
+        </w:rPr>
+        <w:t>. https://www.cafepedagogique.net/2025/05/02/enjeux-economiques-et-politiques-autour-de-lia-a-lecole/</w:t>
+      </w:r>
+    </w:p>
+    <w:p>
+      <w:pPr>
+        <w:pStyle w:val="Bibliography"/>
+        <w:rPr>
+          <w:rFonts w:cs="Times New Roman"/>
+          <w:color w:val="000000" w:themeColor="text1"/>
+          <w:sz w:val="20"/>
+          <w:lang w:val="en-GB"/>
+        </w:rPr>
+      </w:pPr>
+      <w:r>
+        <w:rPr>
+          <w:rFonts w:cs="Times New Roman"/>
+          <w:i/>
+          <w:iCs/>
+          <w:color w:val="000000" w:themeColor="text1"/>
+          <w:sz w:val="20"/>
+        </w:rPr>
+        <w:t>Devenir assistant de langue en France | France Education international</w:t>
+      </w:r>
+      <w:r>
+        <w:rPr>
+          <w:rFonts w:cs="Times New Roman"/>
+          <w:color w:val="000000" w:themeColor="text1"/>
+          <w:sz w:val="20"/>
+        </w:rPr>
+        <w:t xml:space="preserve">. </w:t>
+      </w:r>
+      <w:r>
+        <w:rPr>
+          <w:rFonts w:cs="Times New Roman"/>
+          <w:color w:val="000000" w:themeColor="text1"/>
+          <w:sz w:val="20"/>
+          <w:lang w:val="en-GB"/>
+        </w:rPr>
+        <w:t>(2021, May 10). https://www.france-education-international.fr/venir-en-france/devenir-assistant-de-langue-en-france</w:t>
+      </w:r>
+    </w:p>
+    <w:p>
+      <w:pPr>
+        <w:pStyle w:val="Bibliography"/>
+        <w:rPr>
+          <w:rFonts w:cs="Times New Roman"/>
+          <w:color w:val="000000" w:themeColor="text1"/>
+          <w:sz w:val="20"/>
+          <w:lang w:val="en-GB"/>
+        </w:rPr>
+      </w:pPr>
+      <w:r>
+        <w:rPr>
+          <w:rFonts w:cs="Times New Roman"/>
+          <w:i/>
+          <w:iCs/>
+          <w:color w:val="000000" w:themeColor="text1"/>
+          <w:sz w:val="20"/>
+        </w:rPr>
+        <w:lastRenderedPageBreak/>
+        <w:t>Droit national en vigueur—Jurisprudence—Jurisprudence administrative—Légifrance</w:t>
+      </w:r>
+      <w:r>
+        <w:rPr>
+          <w:rFonts w:cs="Times New Roman"/>
+          <w:color w:val="000000" w:themeColor="text1"/>
+          <w:sz w:val="20"/>
+        </w:rPr>
+        <w:t xml:space="preserve">. </w:t>
+      </w:r>
+      <w:r>
+        <w:rPr>
+          <w:rFonts w:cs="Times New Roman"/>
+          <w:color w:val="000000" w:themeColor="text1"/>
+          <w:sz w:val="20"/>
+          <w:lang w:val="en-GB"/>
+        </w:rPr>
+        <w:t>(2018, August 5). https://www.legifrance.gouv.fr/download/pdf?id=HFLUpbWxIOq4I6R3ktU6f-Z-PkK9A6thiDb3sgQcNsM=</w:t>
+      </w:r>
+    </w:p>
+    <w:p>
+      <w:pPr>
+        <w:pStyle w:val="Bibliography"/>
+        <w:rPr>
+          <w:rFonts w:cs="Times New Roman"/>
+          <w:color w:val="000000" w:themeColor="text1"/>
+          <w:sz w:val="20"/>
+        </w:rPr>
+      </w:pPr>
+      <w:r>
+        <w:rPr>
+          <w:rFonts w:cs="Times New Roman"/>
+          <w:i/>
+          <w:iCs/>
+          <w:color w:val="000000" w:themeColor="text1"/>
+          <w:sz w:val="20"/>
+        </w:rPr>
+        <w:t>Enseignant: Comment utiliser un système d’IA dans le cadre de vos missions ?</w:t>
+      </w:r>
+      <w:r>
+        <w:rPr>
+          <w:rFonts w:cs="Times New Roman"/>
+          <w:color w:val="000000" w:themeColor="text1"/>
+          <w:sz w:val="20"/>
+        </w:rPr>
+        <w:t xml:space="preserve"> (2025, June 20). https://www.cnil.fr/fr/enseignant-usage-systeme-ia</w:t>
+      </w:r>
+    </w:p>
+    <w:p>
+      <w:pPr>
+        <w:pStyle w:val="Bibliography"/>
+        <w:rPr>
+          <w:rFonts w:cs="Times New Roman"/>
+          <w:color w:val="000000" w:themeColor="text1"/>
+          <w:sz w:val="20"/>
+          <w:lang w:val="en-GB"/>
+        </w:rPr>
+      </w:pPr>
+      <w:r>
+        <w:rPr>
+          <w:rFonts w:cs="Times New Roman"/>
+          <w:i/>
+          <w:iCs/>
+          <w:color w:val="000000" w:themeColor="text1"/>
+          <w:sz w:val="20"/>
+        </w:rPr>
+        <w:t>Enseigner au cycle 3 | éduscol | Ministère de l’Éducation nationale | Direction générale de l’enseignement scolaire</w:t>
+      </w:r>
+      <w:r>
+        <w:rPr>
+          <w:rFonts w:cs="Times New Roman"/>
+          <w:color w:val="000000" w:themeColor="text1"/>
+          <w:sz w:val="20"/>
+        </w:rPr>
+        <w:t xml:space="preserve">. </w:t>
+      </w:r>
+      <w:r>
+        <w:rPr>
+          <w:rFonts w:cs="Times New Roman"/>
+          <w:color w:val="000000" w:themeColor="text1"/>
+          <w:sz w:val="20"/>
+          <w:lang w:val="en-GB"/>
+        </w:rPr>
+        <w:t>(n.d.). Retrieved May 30, 2026, from https://eduscol.education.gouv.fr/4356/enseigner-au-cycle-3</w:t>
+      </w:r>
+    </w:p>
+    <w:p>
+      <w:pPr>
+        <w:pStyle w:val="Bibliography"/>
+        <w:rPr>
+          <w:rFonts w:cs="Times New Roman"/>
+          <w:color w:val="000000" w:themeColor="text1"/>
+          <w:sz w:val="20"/>
+          <w:lang w:val="en-GB"/>
+        </w:rPr>
+      </w:pPr>
+      <w:r>
+        <w:rPr>
+          <w:rFonts w:cs="Times New Roman"/>
+          <w:color w:val="000000" w:themeColor="text1"/>
+          <w:sz w:val="20"/>
+          <w:lang w:val="en-GB"/>
+        </w:rPr>
+        <w:t xml:space="preserve">Ertmer, P. A. (1999). Addressing first- and second-order barriers to change: Strategies for technology integration. </w:t>
+      </w:r>
       <w:r>
         <w:rPr>
           <w:rFonts w:cs="Times New Roman"/>
@@ -17685,9 +18282,17 @@
           <w:sz w:val="20"/>
           <w:lang w:val="en-GB"/>
         </w:rPr>
-        <w:t xml:space="preserve"> de </w:t>
-      </w:r>
-      <w:proofErr w:type="spellStart"/>
+        <w:t>Educational Technology Research and Development</w:t>
+      </w:r>
+      <w:r>
+        <w:rPr>
+          <w:rFonts w:cs="Times New Roman"/>
+          <w:color w:val="000000" w:themeColor="text1"/>
+          <w:sz w:val="20"/>
+          <w:lang w:val="en-GB"/>
+        </w:rPr>
+        <w:t xml:space="preserve">, </w:t>
+      </w:r>
       <w:r>
         <w:rPr>
           <w:rFonts w:cs="Times New Roman"/>
@@ -17697,9 +18302,37 @@
           <w:sz w:val="20"/>
           <w:lang w:val="en-GB"/>
         </w:rPr>
-        <w:t>rentrée</w:t>
-      </w:r>
-      <w:proofErr w:type="spellEnd"/>
+        <w:t>47</w:t>
+      </w:r>
+      <w:r>
+        <w:rPr>
+          <w:rFonts w:cs="Times New Roman"/>
+          <w:color w:val="000000" w:themeColor="text1"/>
+          <w:sz w:val="20"/>
+          <w:lang w:val="en-GB"/>
+        </w:rPr>
+        <w:t>(4), 47–61. https://doi.org/10.1007/BF02299597</w:t>
+      </w:r>
+    </w:p>
+    <w:p>
+      <w:pPr>
+        <w:pStyle w:val="Bibliography"/>
+        <w:rPr>
+          <w:rFonts w:cs="Times New Roman"/>
+          <w:color w:val="000000" w:themeColor="text1"/>
+          <w:sz w:val="20"/>
+          <w:lang w:val="en-GB"/>
+        </w:rPr>
+      </w:pPr>
+      <w:r>
+        <w:rPr>
+          <w:rFonts w:cs="Times New Roman"/>
+          <w:color w:val="000000" w:themeColor="text1"/>
+          <w:sz w:val="20"/>
+          <w:lang w:val="en-GB"/>
+        </w:rPr>
+        <w:t xml:space="preserve">Ertmer, P. A., &amp; Ottenbreit-Leftwich, A. T. (2010). Teacher Technology Change: How Knowledge, Confidence, Beliefs, and Culture Intersect. </w:t>
+      </w:r>
       <w:r>
         <w:rPr>
           <w:rFonts w:cs="Times New Roman"/>
@@ -17709,7 +18342,7 @@
           <w:sz w:val="20"/>
           <w:lang w:val="en-GB"/>
         </w:rPr>
-        <w:t xml:space="preserve"> 2015</w:t>
+        <w:t>Journal of Research on Technology in Education</w:t>
       </w:r>
       <w:r>
         <w:rPr>
@@ -17718,90 +18351,7 @@
           <w:sz w:val="20"/>
           <w:lang w:val="en-GB"/>
         </w:rPr>
-        <w:t xml:space="preserve">. </w:t>
-      </w:r>
-      <w:r>
-        <w:rPr>
-          <w:rFonts w:cs="Times New Roman"/>
-          <w:color w:val="000000" w:themeColor="text1"/>
-          <w:sz w:val="20"/>
-        </w:rPr>
-        <w:t>(</w:t>
-      </w:r>
-      <w:proofErr w:type="spellStart"/>
-      <w:proofErr w:type="gramStart"/>
-      <w:r>
-        <w:rPr>
-          <w:rFonts w:cs="Times New Roman"/>
-          <w:color w:val="000000" w:themeColor="text1"/>
-          <w:sz w:val="20"/>
-        </w:rPr>
-        <w:t>n.d</w:t>
-      </w:r>
-      <w:proofErr w:type="spellEnd"/>
-      <w:r>
-        <w:rPr>
-          <w:rFonts w:cs="Times New Roman"/>
-          <w:color w:val="000000" w:themeColor="text1"/>
-          <w:sz w:val="20"/>
-        </w:rPr>
-        <w:t>.</w:t>
-      </w:r>
-      <w:proofErr w:type="gramEnd"/>
-      <w:r>
-        <w:rPr>
-          <w:rFonts w:cs="Times New Roman"/>
-          <w:color w:val="000000" w:themeColor="text1"/>
-          <w:sz w:val="20"/>
-        </w:rPr>
-        <w:t>). Ministère de l’</w:t>
-      </w:r>
-      <w:proofErr w:type="spellStart"/>
-      <w:r>
-        <w:rPr>
-          <w:rFonts w:cs="Times New Roman"/>
-          <w:color w:val="000000" w:themeColor="text1"/>
-          <w:sz w:val="20"/>
-        </w:rPr>
-        <w:t>Education</w:t>
-      </w:r>
-      <w:proofErr w:type="spellEnd"/>
-      <w:r>
-        <w:rPr>
-          <w:rFonts w:cs="Times New Roman"/>
-          <w:color w:val="000000" w:themeColor="text1"/>
-          <w:sz w:val="20"/>
-        </w:rPr>
-        <w:t xml:space="preserve"> nationale. </w:t>
-      </w:r>
-      <w:r>
-        <w:rPr>
-          <w:rFonts w:cs="Times New Roman"/>
-          <w:color w:val="000000" w:themeColor="text1"/>
-          <w:sz w:val="20"/>
-          <w:lang w:val="en-GB"/>
-        </w:rPr>
-        <w:t>Retrieved May 30, 2026, from https://www.education.gouv.fr/bo/15/Hebdo22/xxx.htm</w:t>
-      </w:r>
-    </w:p>
-    <w:p>
-      <w:pPr>
-        <w:pStyle w:val="Bibliography"/>
-        <w:rPr>
-          <w:rFonts w:cs="Times New Roman"/>
-          <w:color w:val="000000" w:themeColor="text1"/>
-          <w:sz w:val="20"/>
-          <w:lang w:val="en-GB"/>
-        </w:rPr>
-      </w:pPr>
-      <w:r>
-        <w:rPr>
-          <w:rFonts w:cs="Times New Roman"/>
-          <w:color w:val="000000" w:themeColor="text1"/>
-          <w:sz w:val="20"/>
-          <w:lang w:val="en-GB"/>
-        </w:rPr>
-        <w:t xml:space="preserve">Clark, C. M., &amp; Peterson, P. L. (1984). </w:t>
+        <w:t xml:space="preserve">, </w:t>
       </w:r>
       <w:r>
         <w:rPr>
@@ -17812,7 +18362,7 @@
           <w:sz w:val="20"/>
           <w:lang w:val="en-GB"/>
         </w:rPr>
-        <w:t>Teachers’ Thought Processes. Occasional Paper No. 72</w:t>
+        <w:t>42</w:t>
       </w:r>
       <w:r>
         <w:rPr>
@@ -17821,53 +18371,7 @@
           <w:sz w:val="20"/>
           <w:lang w:val="en-GB"/>
         </w:rPr>
-        <w:t>. Institute for Research on Teaching, College of Education, Michigan State University, 252 Erickson Hall, East Lansing, MI 48824, ($13. https://eric.ed.gov/?id=ED251449</w:t>
-      </w:r>
-    </w:p>
-    <w:p>
-      <w:pPr>
-        <w:pStyle w:val="Bibliography"/>
-        <w:rPr>
-          <w:rFonts w:cs="Times New Roman"/>
-          <w:color w:val="000000" w:themeColor="text1"/>
-          <w:sz w:val="20"/>
-        </w:rPr>
-      </w:pPr>
-      <w:r>
-        <w:rPr>
-          <w:rFonts w:cs="Times New Roman"/>
-          <w:i/>
-          <w:iCs/>
-          <w:color w:val="000000" w:themeColor="text1"/>
-          <w:sz w:val="20"/>
-        </w:rPr>
-        <w:t>Collège Charles de Gaulle</w:t>
-      </w:r>
-      <w:r>
-        <w:rPr>
-          <w:rFonts w:cs="Times New Roman"/>
-          <w:color w:val="000000" w:themeColor="text1"/>
-          <w:sz w:val="20"/>
-        </w:rPr>
-        <w:t xml:space="preserve">. (2006, </w:t>
-      </w:r>
-      <w:proofErr w:type="spellStart"/>
-      <w:r>
-        <w:rPr>
-          <w:rFonts w:cs="Times New Roman"/>
-          <w:color w:val="000000" w:themeColor="text1"/>
-          <w:sz w:val="20"/>
-        </w:rPr>
-        <w:t>November</w:t>
-      </w:r>
-      <w:proofErr w:type="spellEnd"/>
-      <w:r>
-        <w:rPr>
-          <w:rFonts w:cs="Times New Roman"/>
-          <w:color w:val="000000" w:themeColor="text1"/>
-          <w:sz w:val="20"/>
-        </w:rPr>
-        <w:t xml:space="preserve"> 30). https://charlesdegaulle-stpierredechandieu.ent.auvergnerhonealpes.fr/</w:t>
+        <w:t>(3), 255–284. https://doi.org/10.1080/15391523.2010.10782551</w:t>
       </w:r>
     </w:p>
     <w:p>
@@ -17883,32 +18387,10 @@
       <w:r>
         <w:rPr>
           <w:rFonts w:cs="Times New Roman"/>
-          <w:i/>
-          <w:iCs/>
           <w:color w:val="000000" w:themeColor="text1"/>
           <w:sz w:val="20"/>
         </w:rPr>
-        <w:t>Collège Charles de Gaulle, Saint-Pierre-de-Chandieu (69), avis et classement, toutes les infos et les spécialités—L’</w:t>
-      </w:r>
-      <w:proofErr w:type="spellStart"/>
-      <w:r>
-        <w:rPr>
-          <w:rFonts w:cs="Times New Roman"/>
-          <w:i/>
-          <w:iCs/>
-          <w:color w:val="000000" w:themeColor="text1"/>
-          <w:sz w:val="20"/>
-        </w:rPr>
-        <w:t>Etudiant</w:t>
-      </w:r>
-      <w:proofErr w:type="spellEnd"/>
-      <w:r>
-        <w:rPr>
-          <w:rFonts w:cs="Times New Roman"/>
-          <w:color w:val="000000" w:themeColor="text1"/>
-          <w:sz w:val="20"/>
-        </w:rPr>
-        <w:t xml:space="preserve">. </w:t>
+        <w:t xml:space="preserve">Feng, H., Li, K., &amp; Zhang, L. J. (2025). </w:t>
       </w:r>
       <w:r>
         <w:rPr>
@@ -17917,387 +18399,7 @@
           <w:sz w:val="20"/>
           <w:lang w:val="en-GB"/>
         </w:rPr>
-        <w:t>(n.d.). Retrieved May 30, 2026, from https://www.letudiant.fr/college/annuaire-des-colleges/fiche/college-charles-de-gaulle-69.html#presentation</w:t>
-      </w:r>
-    </w:p>
-    <w:p>
-      <w:pPr>
-        <w:pStyle w:val="Bibliography"/>
-        <w:rPr>
-          <w:rFonts w:cs="Times New Roman"/>
-          <w:color w:val="000000" w:themeColor="text1"/>
-          <w:sz w:val="20"/>
-        </w:rPr>
-      </w:pPr>
-      <w:r>
-        <w:rPr>
-          <w:rFonts w:cs="Times New Roman"/>
-          <w:color w:val="000000" w:themeColor="text1"/>
-          <w:sz w:val="20"/>
-          <w:lang w:val="en-GB"/>
-        </w:rPr>
-        <w:t xml:space="preserve">Davis, F. D. (1989). Perceived Usefulness, Perceived Ease of Use, and User Acceptance of Information Technology. </w:t>
-      </w:r>
-      <w:r>
-        <w:rPr>
-          <w:rFonts w:cs="Times New Roman"/>
-          <w:i/>
-          <w:iCs/>
-          <w:color w:val="000000" w:themeColor="text1"/>
-          <w:sz w:val="20"/>
-        </w:rPr>
-        <w:t xml:space="preserve">MIS </w:t>
-      </w:r>
-      <w:proofErr w:type="spellStart"/>
-      <w:r>
-        <w:rPr>
-          <w:rFonts w:cs="Times New Roman"/>
-          <w:i/>
-          <w:iCs/>
-          <w:color w:val="000000" w:themeColor="text1"/>
-          <w:sz w:val="20"/>
-        </w:rPr>
-        <w:t>Quarterly</w:t>
-      </w:r>
-      <w:proofErr w:type="spellEnd"/>
-      <w:r>
-        <w:rPr>
-          <w:rFonts w:cs="Times New Roman"/>
-          <w:color w:val="000000" w:themeColor="text1"/>
-          <w:sz w:val="20"/>
-        </w:rPr>
-        <w:t xml:space="preserve">, </w:t>
-      </w:r>
-      <w:r>
-        <w:rPr>
-          <w:rFonts w:cs="Times New Roman"/>
-          <w:i/>
-          <w:iCs/>
-          <w:color w:val="000000" w:themeColor="text1"/>
-          <w:sz w:val="20"/>
-        </w:rPr>
-        <w:t>13</w:t>
-      </w:r>
-      <w:r>
-        <w:rPr>
-          <w:rFonts w:cs="Times New Roman"/>
-          <w:color w:val="000000" w:themeColor="text1"/>
-          <w:sz w:val="20"/>
-        </w:rPr>
-        <w:t>(3), 319–340. https://doi.org/10.2307/249008</w:t>
-      </w:r>
-    </w:p>
-    <w:p>
-      <w:pPr>
-        <w:pStyle w:val="Bibliography"/>
-        <w:rPr>
-          <w:rFonts w:cs="Times New Roman"/>
-          <w:color w:val="000000" w:themeColor="text1"/>
-          <w:sz w:val="20"/>
-        </w:rPr>
-      </w:pPr>
-      <w:r>
-        <w:rPr>
-          <w:rFonts w:cs="Times New Roman"/>
-          <w:color w:val="000000" w:themeColor="text1"/>
-          <w:sz w:val="20"/>
-        </w:rPr>
-        <w:t xml:space="preserve">Devauchelle, B. (2025a). Les enseignants, les formateurs et les cadres éducatifs français face à l’intelligence artificielle. </w:t>
-      </w:r>
-      <w:r>
-        <w:rPr>
-          <w:rFonts w:cs="Times New Roman"/>
-          <w:i/>
-          <w:iCs/>
-          <w:color w:val="000000" w:themeColor="text1"/>
-          <w:sz w:val="20"/>
-        </w:rPr>
-        <w:t>Revue internationale d’éducation de Sèvres</w:t>
-      </w:r>
-      <w:r>
-        <w:rPr>
-          <w:rFonts w:cs="Times New Roman"/>
-          <w:color w:val="000000" w:themeColor="text1"/>
-          <w:sz w:val="20"/>
-        </w:rPr>
-        <w:t>, (HS-4). https://doi.org/10.4000/146vm</w:t>
-      </w:r>
-    </w:p>
-    <w:p>
-      <w:pPr>
-        <w:pStyle w:val="Bibliography"/>
-        <w:rPr>
-          <w:rFonts w:cs="Times New Roman"/>
-          <w:color w:val="000000" w:themeColor="text1"/>
-          <w:sz w:val="20"/>
-        </w:rPr>
-      </w:pPr>
-      <w:r>
-        <w:rPr>
-          <w:rFonts w:cs="Times New Roman"/>
-          <w:color w:val="000000" w:themeColor="text1"/>
-          <w:sz w:val="20"/>
-        </w:rPr>
-        <w:t xml:space="preserve">Devauchelle, B. (2025b, May 2). Enjeux économiques et politiques autour de l’IA à l’école. </w:t>
-      </w:r>
-      <w:r>
-        <w:rPr>
-          <w:rFonts w:cs="Times New Roman"/>
-          <w:i/>
-          <w:iCs/>
-          <w:color w:val="000000" w:themeColor="text1"/>
-          <w:sz w:val="20"/>
-        </w:rPr>
-        <w:t>Le Café pédagogique</w:t>
-      </w:r>
-      <w:r>
-        <w:rPr>
-          <w:rFonts w:cs="Times New Roman"/>
-          <w:color w:val="000000" w:themeColor="text1"/>
-          <w:sz w:val="20"/>
-        </w:rPr>
-        <w:t>. https://www.cafepedagogique.net/2025/05/02/enjeux-economiques-et-politiques-autour-de-lia-a-lecole/</w:t>
-      </w:r>
-    </w:p>
-    <w:p>
-      <w:pPr>
-        <w:pStyle w:val="Bibliography"/>
-        <w:rPr>
-          <w:rFonts w:cs="Times New Roman"/>
-          <w:color w:val="000000" w:themeColor="text1"/>
-          <w:sz w:val="20"/>
-          <w:lang w:val="en-GB"/>
-        </w:rPr>
-      </w:pPr>
-      <w:r>
-        <w:rPr>
-          <w:rFonts w:cs="Times New Roman"/>
-          <w:i/>
-          <w:iCs/>
-          <w:color w:val="000000" w:themeColor="text1"/>
-          <w:sz w:val="20"/>
-        </w:rPr>
-        <w:t xml:space="preserve">Devenir assistant de langue en France | France </w:t>
-      </w:r>
-      <w:proofErr w:type="spellStart"/>
-      <w:r>
-        <w:rPr>
-          <w:rFonts w:cs="Times New Roman"/>
-          <w:i/>
-          <w:iCs/>
-          <w:color w:val="000000" w:themeColor="text1"/>
-          <w:sz w:val="20"/>
-        </w:rPr>
-        <w:t>Education</w:t>
-      </w:r>
-      <w:proofErr w:type="spellEnd"/>
-      <w:r>
-        <w:rPr>
-          <w:rFonts w:cs="Times New Roman"/>
-          <w:i/>
-          <w:iCs/>
-          <w:color w:val="000000" w:themeColor="text1"/>
-          <w:sz w:val="20"/>
-        </w:rPr>
-        <w:t xml:space="preserve"> international</w:t>
-      </w:r>
-      <w:r>
-        <w:rPr>
-          <w:rFonts w:cs="Times New Roman"/>
-          <w:color w:val="000000" w:themeColor="text1"/>
-          <w:sz w:val="20"/>
-        </w:rPr>
-        <w:t xml:space="preserve">. </w:t>
-      </w:r>
-      <w:r>
-        <w:rPr>
-          <w:rFonts w:cs="Times New Roman"/>
-          <w:color w:val="000000" w:themeColor="text1"/>
-          <w:sz w:val="20"/>
-          <w:lang w:val="en-GB"/>
-        </w:rPr>
-        <w:t>(2021, May 10). https://www.france-education-international.fr/venir-en-france/devenir-assistant-de-langue-en-france</w:t>
-      </w:r>
-    </w:p>
-    <w:p>
-      <w:pPr>
-        <w:pStyle w:val="Bibliography"/>
-        <w:rPr>
-          <w:rFonts w:cs="Times New Roman"/>
-          <w:color w:val="000000" w:themeColor="text1"/>
-          <w:sz w:val="20"/>
-          <w:lang w:val="en-GB"/>
-        </w:rPr>
-      </w:pPr>
-      <w:r>
-        <w:rPr>
-          <w:rFonts w:cs="Times New Roman"/>
-          <w:i/>
-          <w:iCs/>
-          <w:color w:val="000000" w:themeColor="text1"/>
-          <w:sz w:val="20"/>
-        </w:rPr>
-        <w:lastRenderedPageBreak/>
-        <w:t>Droit national en vigueur—Jurisprudence—Jurisprudence administrative—Légifrance</w:t>
-      </w:r>
-      <w:r>
-        <w:rPr>
-          <w:rFonts w:cs="Times New Roman"/>
-          <w:color w:val="000000" w:themeColor="text1"/>
-          <w:sz w:val="20"/>
-        </w:rPr>
-        <w:t xml:space="preserve">. </w:t>
-      </w:r>
-      <w:r>
-        <w:rPr>
-          <w:rFonts w:cs="Times New Roman"/>
-          <w:color w:val="000000" w:themeColor="text1"/>
-          <w:sz w:val="20"/>
-          <w:lang w:val="en-GB"/>
-        </w:rPr>
-        <w:t>(2018, August 5). https://www.legifrance.gouv.fr/download/pdf?id=HFLUpbWxIOq4I6R3ktU6f-Z-PkK9A6thiDb3sgQcNsM=</w:t>
-      </w:r>
-    </w:p>
-    <w:p>
-      <w:pPr>
-        <w:pStyle w:val="Bibliography"/>
-        <w:rPr>
-          <w:rFonts w:cs="Times New Roman"/>
-          <w:color w:val="000000" w:themeColor="text1"/>
-          <w:sz w:val="20"/>
-        </w:rPr>
-      </w:pPr>
-      <w:proofErr w:type="gramStart"/>
-      <w:r>
-        <w:rPr>
-          <w:rFonts w:cs="Times New Roman"/>
-          <w:i/>
-          <w:iCs/>
-          <w:color w:val="000000" w:themeColor="text1"/>
-          <w:sz w:val="20"/>
-        </w:rPr>
-        <w:t>Enseignant:</w:t>
-      </w:r>
-      <w:proofErr w:type="gramEnd"/>
-      <w:r>
-        <w:rPr>
-          <w:rFonts w:cs="Times New Roman"/>
-          <w:i/>
-          <w:iCs/>
-          <w:color w:val="000000" w:themeColor="text1"/>
-          <w:sz w:val="20"/>
-        </w:rPr>
-        <w:t xml:space="preserve"> Comment utiliser un système d’IA dans le cadre de vos missions ?</w:t>
-      </w:r>
-      <w:r>
-        <w:rPr>
-          <w:rFonts w:cs="Times New Roman"/>
-          <w:color w:val="000000" w:themeColor="text1"/>
-          <w:sz w:val="20"/>
-        </w:rPr>
-        <w:t xml:space="preserve"> (2025, June 20). https://www.cnil.fr/fr/enseignant-usage-systeme-ia</w:t>
-      </w:r>
-    </w:p>
-    <w:p>
-      <w:pPr>
-        <w:pStyle w:val="Bibliography"/>
-        <w:rPr>
-          <w:rFonts w:cs="Times New Roman"/>
-          <w:color w:val="000000" w:themeColor="text1"/>
-          <w:sz w:val="20"/>
-          <w:lang w:val="en-GB"/>
-        </w:rPr>
-      </w:pPr>
-      <w:r>
-        <w:rPr>
-          <w:rFonts w:cs="Times New Roman"/>
-          <w:i/>
-          <w:iCs/>
-          <w:color w:val="000000" w:themeColor="text1"/>
-          <w:sz w:val="20"/>
-        </w:rPr>
-        <w:t xml:space="preserve">Enseigner au cycle 3 | </w:t>
-      </w:r>
-      <w:proofErr w:type="spellStart"/>
-      <w:r>
-        <w:rPr>
-          <w:rFonts w:cs="Times New Roman"/>
-          <w:i/>
-          <w:iCs/>
-          <w:color w:val="000000" w:themeColor="text1"/>
-          <w:sz w:val="20"/>
-        </w:rPr>
-        <w:t>éduscol</w:t>
-      </w:r>
-      <w:proofErr w:type="spellEnd"/>
-      <w:r>
-        <w:rPr>
-          <w:rFonts w:cs="Times New Roman"/>
-          <w:i/>
-          <w:iCs/>
-          <w:color w:val="000000" w:themeColor="text1"/>
-          <w:sz w:val="20"/>
-        </w:rPr>
-        <w:t xml:space="preserve"> | </w:t>
-      </w:r>
-      <w:proofErr w:type="gramStart"/>
-      <w:r>
-        <w:rPr>
-          <w:rFonts w:cs="Times New Roman"/>
-          <w:i/>
-          <w:iCs/>
-          <w:color w:val="000000" w:themeColor="text1"/>
-          <w:sz w:val="20"/>
-        </w:rPr>
-        <w:t>Ministère de l’Éducation</w:t>
-      </w:r>
-      <w:proofErr w:type="gramEnd"/>
-      <w:r>
-        <w:rPr>
-          <w:rFonts w:cs="Times New Roman"/>
-          <w:i/>
-          <w:iCs/>
-          <w:color w:val="000000" w:themeColor="text1"/>
-          <w:sz w:val="20"/>
-        </w:rPr>
-        <w:t xml:space="preserve"> nationale | Direction générale de l’enseignement scolaire</w:t>
-      </w:r>
-      <w:r>
-        <w:rPr>
-          <w:rFonts w:cs="Times New Roman"/>
-          <w:color w:val="000000" w:themeColor="text1"/>
-          <w:sz w:val="20"/>
-        </w:rPr>
-        <w:t xml:space="preserve">. </w:t>
-      </w:r>
-      <w:r>
-        <w:rPr>
-          <w:rFonts w:cs="Times New Roman"/>
-          <w:color w:val="000000" w:themeColor="text1"/>
-          <w:sz w:val="20"/>
-          <w:lang w:val="en-GB"/>
-        </w:rPr>
-        <w:t>(n.d.). Retrieved May 30, 2026, from https://eduscol.education.gouv.fr/4356/enseigner-au-cycle-3</w:t>
-      </w:r>
-    </w:p>
-    <w:p>
-      <w:pPr>
-        <w:pStyle w:val="Bibliography"/>
-        <w:rPr>
-          <w:rFonts w:cs="Times New Roman"/>
-          <w:color w:val="000000" w:themeColor="text1"/>
-          <w:sz w:val="20"/>
-          <w:lang w:val="en-GB"/>
-        </w:rPr>
-      </w:pPr>
-      <w:r>
-        <w:rPr>
-          <w:rFonts w:cs="Times New Roman"/>
-          <w:color w:val="000000" w:themeColor="text1"/>
-          <w:sz w:val="20"/>
-          <w:lang w:val="en-GB"/>
-        </w:rPr>
-        <w:t xml:space="preserve">Ertmer, P. A. (1999). Addressing first- and second-order barriers to change: Strategies for technology integration. </w:t>
+        <w:t xml:space="preserve">What does AI bring to second language writing? A systematic review (2014-2024). </w:t>
       </w:r>
       <w:r>
         <w:rPr>
@@ -18308,7 +18410,7 @@
           <w:sz w:val="20"/>
           <w:lang w:val="en-GB"/>
         </w:rPr>
-        <w:t>Educational Technology Research and Development</w:t>
+        <w:t>Language, Learning and Technology</w:t>
       </w:r>
       <w:r>
         <w:rPr>
@@ -18328,7 +18430,7 @@
           <w:sz w:val="20"/>
           <w:lang w:val="en-GB"/>
         </w:rPr>
-        <w:t>47</w:t>
+        <w:t>29</w:t>
       </w:r>
       <w:r>
         <w:rPr>
@@ -18337,7 +18439,7 @@
           <w:sz w:val="20"/>
           <w:lang w:val="en-GB"/>
         </w:rPr>
-        <w:t>(4), 47–61. https://doi.org/10.1007/BF02299597</w:t>
+        <w:t>, 1–27. https://doi.org/10.64152/10125/73629</w:t>
       </w:r>
     </w:p>
     <w:p>
@@ -18357,7 +18459,7 @@
           <w:sz w:val="20"/>
           <w:lang w:val="en-GB"/>
         </w:rPr>
-        <w:t xml:space="preserve">Ertmer, P. A., &amp; Ottenbreit-Leftwich, A. T. (2010). Teacher Technology Change: How Knowledge, Confidence, Beliefs, and Culture Intersect. </w:t>
+        <w:t xml:space="preserve">Godwin-Jones, R. (2023). </w:t>
       </w:r>
       <w:r>
         <w:rPr>
@@ -18368,7 +18470,7 @@
           <w:sz w:val="20"/>
           <w:lang w:val="en-GB"/>
         </w:rPr>
-        <w:t>Journal of Research on Technology in Education</w:t>
+        <w:t>Emerging spaces for language learning: AI bots, ambient intelligence, and the metaverse</w:t>
       </w:r>
       <w:r>
         <w:rPr>
@@ -18377,7 +18479,62 @@
           <w:sz w:val="20"/>
           <w:lang w:val="en-GB"/>
         </w:rPr>
-        <w:t xml:space="preserve">, </w:t>
+        <w:t>. https://www.lltjournal.org/item/10125-73501/</w:t>
+      </w:r>
+    </w:p>
+    <w:p>
+      <w:pPr>
+        <w:pStyle w:val="Bibliography"/>
+        <w:rPr>
+          <w:rFonts w:cs="Times New Roman"/>
+          <w:color w:val="000000" w:themeColor="text1"/>
+          <w:sz w:val="20"/>
+        </w:rPr>
+      </w:pPr>
+      <w:r>
+        <w:rPr>
+          <w:rFonts w:cs="Times New Roman"/>
+          <w:color w:val="000000" w:themeColor="text1"/>
+          <w:sz w:val="20"/>
+        </w:rPr>
+        <w:t xml:space="preserve">Goigoux, R. (2007). Un modèle d’analyse de l’activité des enseignants. </w:t>
+      </w:r>
+      <w:r>
+        <w:rPr>
+          <w:rFonts w:cs="Times New Roman"/>
+          <w:i/>
+          <w:iCs/>
+          <w:color w:val="000000" w:themeColor="text1"/>
+          <w:sz w:val="20"/>
+        </w:rPr>
+        <w:t>Éducation et didactique</w:t>
+      </w:r>
+      <w:r>
+        <w:rPr>
+          <w:rFonts w:cs="Times New Roman"/>
+          <w:color w:val="000000" w:themeColor="text1"/>
+          <w:sz w:val="20"/>
+        </w:rPr>
+        <w:t>, (1–3), Article 1–3. https://doi.org/10.4000/educationdidactique.232</w:t>
+      </w:r>
+    </w:p>
+    <w:p>
+      <w:pPr>
+        <w:pStyle w:val="Bibliography"/>
+        <w:rPr>
+          <w:rFonts w:cs="Times New Roman"/>
+          <w:color w:val="000000" w:themeColor="text1"/>
+          <w:sz w:val="20"/>
+          <w:lang w:val="en-GB"/>
+        </w:rPr>
+      </w:pPr>
+      <w:r>
+        <w:rPr>
+          <w:rFonts w:cs="Times New Roman"/>
+          <w:color w:val="000000" w:themeColor="text1"/>
+          <w:sz w:val="20"/>
+        </w:rPr>
+        <w:t xml:space="preserve">Hockly, N. (2023, April). </w:t>
       </w:r>
       <w:r>
         <w:rPr>
@@ -18388,7 +18545,7 @@
           <w:sz w:val="20"/>
           <w:lang w:val="en-GB"/>
         </w:rPr>
-        <w:t>42</w:t>
+        <w:t>Artificial Intelligence in English Language Teaching: The Good, the Bad and the Ugly</w:t>
       </w:r>
       <w:r>
         <w:rPr>
@@ -18397,7 +18554,7 @@
           <w:sz w:val="20"/>
           <w:lang w:val="en-GB"/>
         </w:rPr>
-        <w:t>(3), 255–284. https://doi.org/10.1080/15391523.2010.10782551</w:t>
+        <w:t>. https://doi.org/10.1177/00336882231168504</w:t>
       </w:r>
     </w:p>
     <w:p>
@@ -18415,17 +18572,9 @@
           <w:rFonts w:cs="Times New Roman"/>
           <w:color w:val="000000" w:themeColor="text1"/>
           <w:sz w:val="20"/>
-        </w:rPr>
-        <w:t xml:space="preserve">Feng, H., Li, K., &amp; Zhang, L. J. (2025). </w:t>
-      </w:r>
-      <w:r>
-        <w:rPr>
-          <w:rFonts w:cs="Times New Roman"/>
-          <w:color w:val="000000" w:themeColor="text1"/>
-          <w:sz w:val="20"/>
           <w:lang w:val="en-GB"/>
         </w:rPr>
-        <w:t xml:space="preserve">What does AI bring to second language writing? A systematic review (2014-2024). </w:t>
+        <w:t xml:space="preserve">Hollingsworth, S. (1989). </w:t>
       </w:r>
       <w:r>
         <w:rPr>
@@ -18436,7 +18585,7 @@
           <w:sz w:val="20"/>
           <w:lang w:val="en-GB"/>
         </w:rPr>
-        <w:t>Language, Learning and Technology</w:t>
+        <w:t>Prior Beliefs and Cognitive Change in Learning to Teach</w:t>
       </w:r>
       <w:r>
         <w:rPr>
@@ -18445,7 +18594,147 @@
           <w:sz w:val="20"/>
           <w:lang w:val="en-GB"/>
         </w:rPr>
+        <w:t>. https://doi.org/10.3102/00028312026002160</w:t>
+      </w:r>
+    </w:p>
+    <w:p>
+      <w:pPr>
+        <w:pStyle w:val="Bibliography"/>
+        <w:rPr>
+          <w:rFonts w:cs="Times New Roman"/>
+          <w:color w:val="000000" w:themeColor="text1"/>
+          <w:sz w:val="20"/>
+        </w:rPr>
+      </w:pPr>
+      <w:r>
+        <w:rPr>
+          <w:rFonts w:cs="Times New Roman"/>
+          <w:color w:val="000000" w:themeColor="text1"/>
+          <w:sz w:val="20"/>
+          <w:lang w:val="en-GB"/>
+        </w:rPr>
+        <w:t xml:space="preserve">Kohnke, L., Moorhouse, B., &amp; Zou, D. (2023). ChatGPT for Language Teaching and Learning. </w:t>
+      </w:r>
+      <w:r>
+        <w:rPr>
+          <w:rFonts w:cs="Times New Roman"/>
+          <w:i/>
+          <w:iCs/>
+          <w:color w:val="000000" w:themeColor="text1"/>
+          <w:sz w:val="20"/>
+        </w:rPr>
+        <w:t>RELC Journal</w:t>
+      </w:r>
+      <w:r>
+        <w:rPr>
+          <w:rFonts w:cs="Times New Roman"/>
+          <w:color w:val="000000" w:themeColor="text1"/>
+          <w:sz w:val="20"/>
+        </w:rPr>
         <w:t xml:space="preserve">, </w:t>
+      </w:r>
+      <w:r>
+        <w:rPr>
+          <w:rFonts w:cs="Times New Roman"/>
+          <w:i/>
+          <w:iCs/>
+          <w:color w:val="000000" w:themeColor="text1"/>
+          <w:sz w:val="20"/>
+        </w:rPr>
+        <w:t>54</w:t>
+      </w:r>
+      <w:r>
+        <w:rPr>
+          <w:rFonts w:cs="Times New Roman"/>
+          <w:color w:val="000000" w:themeColor="text1"/>
+          <w:sz w:val="20"/>
+        </w:rPr>
+        <w:t>. https://doi.org/10.1177/00336882231162868</w:t>
+      </w:r>
+    </w:p>
+    <w:p>
+      <w:pPr>
+        <w:pStyle w:val="Bibliography"/>
+        <w:rPr>
+          <w:rFonts w:cs="Times New Roman"/>
+          <w:color w:val="000000" w:themeColor="text1"/>
+          <w:sz w:val="20"/>
+        </w:rPr>
+      </w:pPr>
+      <w:r>
+        <w:rPr>
+          <w:rFonts w:cs="Times New Roman"/>
+          <w:color w:val="000000" w:themeColor="text1"/>
+          <w:sz w:val="20"/>
+        </w:rPr>
+        <w:t xml:space="preserve">l’Europe, C. de. (2022). </w:t>
+      </w:r>
+      <w:r>
+        <w:rPr>
+          <w:rFonts w:cs="Times New Roman"/>
+          <w:i/>
+          <w:iCs/>
+          <w:color w:val="000000" w:themeColor="text1"/>
+          <w:sz w:val="20"/>
+        </w:rPr>
+        <w:t>Cadre européen commun de référence pour les langues: Apprendre, enseigner, évaluer: Volume complémentaire</w:t>
+      </w:r>
+      <w:r>
+        <w:rPr>
+          <w:rFonts w:cs="Times New Roman"/>
+          <w:color w:val="000000" w:themeColor="text1"/>
+          <w:sz w:val="20"/>
+        </w:rPr>
+        <w:t>. Council of Europe.</w:t>
+      </w:r>
+    </w:p>
+    <w:p>
+      <w:pPr>
+        <w:pStyle w:val="Bibliography"/>
+        <w:rPr>
+          <w:rFonts w:cs="Times New Roman"/>
+          <w:color w:val="000000" w:themeColor="text1"/>
+          <w:sz w:val="20"/>
+        </w:rPr>
+      </w:pPr>
+      <w:r>
+        <w:rPr>
+          <w:rFonts w:cs="Times New Roman"/>
+          <w:i/>
+          <w:iCs/>
+          <w:color w:val="000000" w:themeColor="text1"/>
+          <w:sz w:val="20"/>
+        </w:rPr>
+        <w:t>La protection des élèves et de leurs données sur Internet</w:t>
+      </w:r>
+      <w:r>
+        <w:rPr>
+          <w:rFonts w:cs="Times New Roman"/>
+          <w:color w:val="000000" w:themeColor="text1"/>
+          <w:sz w:val="20"/>
+        </w:rPr>
+        <w:t>. (2019, November 7). Ministère de l’Education nationale. https://www.education.gouv.fr/la-protection-des-eleves-et-de-leurs-donnees-sur-internet-7073</w:t>
+      </w:r>
+    </w:p>
+    <w:p>
+      <w:pPr>
+        <w:pStyle w:val="Bibliography"/>
+        <w:rPr>
+          <w:rFonts w:cs="Times New Roman"/>
+          <w:color w:val="000000" w:themeColor="text1"/>
+          <w:sz w:val="20"/>
+          <w:lang w:val="en-GB"/>
+        </w:rPr>
+      </w:pPr>
+      <w:r>
+        <w:rPr>
+          <w:rFonts w:cs="Times New Roman"/>
+          <w:color w:val="000000" w:themeColor="text1"/>
+          <w:sz w:val="20"/>
+          <w:lang w:val="en-GB"/>
+        </w:rPr>
+        <w:lastRenderedPageBreak/>
+        <w:t xml:space="preserve">Lee, S. (2024). </w:t>
       </w:r>
       <w:r>
         <w:rPr>
@@ -18456,7 +18745,7 @@
           <w:sz w:val="20"/>
           <w:lang w:val="en-GB"/>
         </w:rPr>
-        <w:t>29</w:t>
+        <w:t>Enhancing pre-service EFL teachers’ TPACK through chatbot-integrated lesson planning projects</w:t>
       </w:r>
       <w:r>
         <w:rPr>
@@ -18465,27 +18754,26 @@
           <w:sz w:val="20"/>
           <w:lang w:val="en-GB"/>
         </w:rPr>
-        <w:t>, 1–27. https://doi.org/10.64152/10125/73629</w:t>
+        <w:t>.</w:t>
       </w:r>
     </w:p>
     <w:p>
       <w:pPr>
         <w:pStyle w:val="Bibliography"/>
+        <w:rPr>
+          <w:rFonts w:cs="Times New Roman"/>
+          <w:color w:val="000000" w:themeColor="text1"/>
+          <w:sz w:val="20"/>
+        </w:rPr>
+      </w:pPr>
+      <w:r>
         <w:rPr>
           <w:rFonts w:cs="Times New Roman"/>
           <w:color w:val="000000" w:themeColor="text1"/>
           <w:sz w:val="20"/>
           <w:lang w:val="en-GB"/>
         </w:rPr>
-      </w:pPr>
-      <w:r>
-        <w:rPr>
-          <w:rFonts w:cs="Times New Roman"/>
-          <w:color w:val="000000" w:themeColor="text1"/>
-          <w:sz w:val="20"/>
-          <w:lang w:val="en-GB"/>
-        </w:rPr>
-        <w:t xml:space="preserve">Godwin-Jones, R. (2023). </w:t>
+        <w:t xml:space="preserve">Liu, Y., &amp; Wang, H. (2024). </w:t>
       </w:r>
       <w:r>
         <w:rPr>
@@ -18496,7 +18784,7 @@
           <w:sz w:val="20"/>
           <w:lang w:val="en-GB"/>
         </w:rPr>
-        <w:t>Emerging spaces for language learning: AI bots, ambient intelligence, and the metaverse</w:t>
+        <w:t>Who on Earth Is Using Generative AI ?</w:t>
       </w:r>
       <w:r>
         <w:rPr>
@@ -18505,36 +18793,54 @@
           <w:sz w:val="20"/>
           <w:lang w:val="en-GB"/>
         </w:rPr>
-        <w:t>. https://www.lltjournal.org/item/10125-73501/</w:t>
-      </w:r>
-    </w:p>
-    <w:p>
-      <w:pPr>
-        <w:pStyle w:val="Bibliography"/>
+        <w:t xml:space="preserve"> </w:t>
+      </w:r>
+      <w:r>
         <w:rPr>
           <w:rFonts w:cs="Times New Roman"/>
           <w:color w:val="000000" w:themeColor="text1"/>
           <w:sz w:val="20"/>
         </w:rPr>
-      </w:pPr>
-      <w:proofErr w:type="spellStart"/>
-      <w:r>
+        <w:t>Washington, DC: World Bank. https://doi.org/10.1596/1813-9450-10870</w:t>
+      </w:r>
+    </w:p>
+    <w:p>
+      <w:pPr>
+        <w:pStyle w:val="Bibliography"/>
         <w:rPr>
           <w:rFonts w:cs="Times New Roman"/>
           <w:color w:val="000000" w:themeColor="text1"/>
           <w:sz w:val="20"/>
-        </w:rPr>
-        <w:t>Goigoux</w:t>
-      </w:r>
-      <w:proofErr w:type="spellEnd"/>
+          <w:lang w:val="en-GB"/>
+        </w:rPr>
+      </w:pPr>
       <w:r>
         <w:rPr>
           <w:rFonts w:cs="Times New Roman"/>
           <w:color w:val="000000" w:themeColor="text1"/>
           <w:sz w:val="20"/>
         </w:rPr>
-        <w:t xml:space="preserve">, R. (2007). Un modèle d’analyse de l’activité des enseignants. </w:t>
-      </w:r>
+        <w:t xml:space="preserve">LOI N° 2005-380 Du 23 Avril 2005 d’orientation et de Programme Pour l’avenir de l’école (1) - Légifrance, LOI n° 2005-380. </w:t>
+      </w:r>
+      <w:r>
+        <w:rPr>
+          <w:rFonts w:cs="Times New Roman"/>
+          <w:color w:val="000000" w:themeColor="text1"/>
+          <w:sz w:val="20"/>
+          <w:lang w:val="en-GB"/>
+        </w:rPr>
+        <w:t>Retrieved May 30, 2026, from https://www.legifrance.gouv.fr/jorf/id/JORFTEXT000000259787/</w:t>
+      </w:r>
+    </w:p>
+    <w:p>
+      <w:pPr>
+        <w:pStyle w:val="Bibliography"/>
+        <w:rPr>
+          <w:rFonts w:cs="Times New Roman"/>
+          <w:color w:val="000000" w:themeColor="text1"/>
+          <w:sz w:val="20"/>
+        </w:rPr>
+      </w:pPr>
       <w:r>
         <w:rPr>
           <w:rFonts w:cs="Times New Roman"/>
@@ -18543,7 +18849,7 @@
           <w:color w:val="000000" w:themeColor="text1"/>
           <w:sz w:val="20"/>
         </w:rPr>
-        <w:t>Éducation et didactique</w:t>
+        <w:t>Ministère de l’Education nationale 2025a</w:t>
       </w:r>
       <w:r>
         <w:rPr>
@@ -18551,7 +18857,7 @@
           <w:color w:val="000000" w:themeColor="text1"/>
           <w:sz w:val="20"/>
         </w:rPr>
-        <w:t>, (1–3), Article 1–3. https://doi.org/10.4000/educationdidactique.232</w:t>
+        <w:t>. (2025, June 13). Ministère de l’Education nationale. https://www.education.gouv.fr/cadre-d-usage-de-l-ia-en-education-450647</w:t>
       </w:r>
     </w:p>
     <w:p>
@@ -18564,23 +18870,14 @@
           <w:lang w:val="en-GB"/>
         </w:rPr>
       </w:pPr>
-      <w:proofErr w:type="spellStart"/>
       <w:r>
         <w:rPr>
           <w:rFonts w:cs="Times New Roman"/>
           <w:color w:val="000000" w:themeColor="text1"/>
           <w:sz w:val="20"/>
-        </w:rPr>
-        <w:t>Hockly</w:t>
-      </w:r>
-      <w:proofErr w:type="spellEnd"/>
-      <w:r>
-        <w:rPr>
-          <w:rFonts w:cs="Times New Roman"/>
-          <w:color w:val="000000" w:themeColor="text1"/>
-          <w:sz w:val="20"/>
-        </w:rPr>
-        <w:t xml:space="preserve">, N. (2023, April). </w:t>
+          <w:lang w:val="en-GB"/>
+        </w:rPr>
+        <w:t xml:space="preserve">Mishra, P., Henriksen, D., Woo, L. J., &amp; Oster, N. (2025). Control vs. Agency: Exploring the History of AI in Education. </w:t>
       </w:r>
       <w:r>
         <w:rPr>
@@ -18591,7 +18888,7 @@
           <w:sz w:val="20"/>
           <w:lang w:val="en-GB"/>
         </w:rPr>
-        <w:t>Artificial Intelligence in English Language Teaching: The Good, the Bad and the Ugly</w:t>
+        <w:t>TechTrends</w:t>
       </w:r>
       <w:r>
         <w:rPr>
@@ -18600,27 +18897,7 @@
           <w:sz w:val="20"/>
           <w:lang w:val="en-GB"/>
         </w:rPr>
-        <w:t>. https://doi.org/10.1177/00336882231168504</w:t>
-      </w:r>
-    </w:p>
-    <w:p>
-      <w:pPr>
-        <w:pStyle w:val="Bibliography"/>
-        <w:rPr>
-          <w:rFonts w:cs="Times New Roman"/>
-          <w:color w:val="000000" w:themeColor="text1"/>
-          <w:sz w:val="20"/>
-          <w:lang w:val="en-GB"/>
-        </w:rPr>
-      </w:pPr>
-      <w:r>
-        <w:rPr>
-          <w:rFonts w:cs="Times New Roman"/>
-          <w:color w:val="000000" w:themeColor="text1"/>
-          <w:sz w:val="20"/>
-          <w:lang w:val="en-GB"/>
-        </w:rPr>
-        <w:t xml:space="preserve">Hollingsworth, S. (1989). </w:t>
+        <w:t xml:space="preserve">, </w:t>
       </w:r>
       <w:r>
         <w:rPr>
@@ -18631,7 +18908,7 @@
           <w:sz w:val="20"/>
           <w:lang w:val="en-GB"/>
         </w:rPr>
-        <w:t>Prior Beliefs and Cognitive Change in Learning to Teach</w:t>
+        <w:t>69</w:t>
       </w:r>
       <w:r>
         <w:rPr>
@@ -18640,237 +18917,27 @@
           <w:sz w:val="20"/>
           <w:lang w:val="en-GB"/>
         </w:rPr>
-        <w:t>. https://doi.org/10.3102/00028312026002160</w:t>
+        <w:t>(2), 247–253. https://doi.org/10.1007/s11528-025-01064-2</w:t>
       </w:r>
     </w:p>
     <w:p>
       <w:pPr>
         <w:pStyle w:val="Bibliography"/>
-        <w:rPr>
-          <w:rFonts w:cs="Times New Roman"/>
-          <w:color w:val="000000" w:themeColor="text1"/>
-          <w:sz w:val="20"/>
-        </w:rPr>
-      </w:pPr>
-      <w:r>
         <w:rPr>
           <w:rFonts w:cs="Times New Roman"/>
           <w:color w:val="000000" w:themeColor="text1"/>
           <w:sz w:val="20"/>
           <w:lang w:val="en-GB"/>
         </w:rPr>
-        <w:t xml:space="preserve">Kohnke, L., Moorhouse, B., &amp; Zou, D. (2023). ChatGPT for Language Teaching and Learning. </w:t>
-      </w:r>
-      <w:r>
-        <w:rPr>
-          <w:rFonts w:cs="Times New Roman"/>
-          <w:i/>
-          <w:iCs/>
-          <w:color w:val="000000" w:themeColor="text1"/>
-          <w:sz w:val="20"/>
-        </w:rPr>
-        <w:t>RELC Journal</w:t>
-      </w:r>
-      <w:r>
-        <w:rPr>
-          <w:rFonts w:cs="Times New Roman"/>
-          <w:color w:val="000000" w:themeColor="text1"/>
-          <w:sz w:val="20"/>
-        </w:rPr>
-        <w:t xml:space="preserve">, </w:t>
-      </w:r>
-      <w:r>
-        <w:rPr>
-          <w:rFonts w:cs="Times New Roman"/>
-          <w:i/>
-          <w:iCs/>
-          <w:color w:val="000000" w:themeColor="text1"/>
-          <w:sz w:val="20"/>
-        </w:rPr>
-        <w:t>54</w:t>
-      </w:r>
-      <w:r>
-        <w:rPr>
-          <w:rFonts w:cs="Times New Roman"/>
-          <w:color w:val="000000" w:themeColor="text1"/>
-          <w:sz w:val="20"/>
-        </w:rPr>
-        <w:t>. https://doi.org/10.1177/00336882231162868</w:t>
-      </w:r>
-    </w:p>
-    <w:p>
-      <w:pPr>
-        <w:pStyle w:val="Bibliography"/>
-        <w:rPr>
-          <w:rFonts w:cs="Times New Roman"/>
-          <w:color w:val="000000" w:themeColor="text1"/>
-          <w:sz w:val="20"/>
-        </w:rPr>
-      </w:pPr>
-      <w:proofErr w:type="gramStart"/>
-      <w:r>
-        <w:rPr>
-          <w:rFonts w:cs="Times New Roman"/>
-          <w:color w:val="000000" w:themeColor="text1"/>
-          <w:sz w:val="20"/>
-        </w:rPr>
-        <w:t>l’Europe</w:t>
-      </w:r>
-      <w:proofErr w:type="gramEnd"/>
-      <w:r>
-        <w:rPr>
-          <w:rFonts w:cs="Times New Roman"/>
-          <w:color w:val="000000" w:themeColor="text1"/>
-          <w:sz w:val="20"/>
-        </w:rPr>
-        <w:t xml:space="preserve">, C. de. (2022). </w:t>
-      </w:r>
-      <w:r>
-        <w:rPr>
-          <w:rFonts w:cs="Times New Roman"/>
-          <w:i/>
-          <w:iCs/>
-          <w:color w:val="000000" w:themeColor="text1"/>
-          <w:sz w:val="20"/>
-        </w:rPr>
-        <w:t xml:space="preserve">Cadre européen commun de référence pour les </w:t>
-      </w:r>
-      <w:proofErr w:type="gramStart"/>
-      <w:r>
-        <w:rPr>
-          <w:rFonts w:cs="Times New Roman"/>
-          <w:i/>
-          <w:iCs/>
-          <w:color w:val="000000" w:themeColor="text1"/>
-          <w:sz w:val="20"/>
-        </w:rPr>
-        <w:t>langues:</w:t>
-      </w:r>
-      <w:proofErr w:type="gramEnd"/>
-      <w:r>
-        <w:rPr>
-          <w:rFonts w:cs="Times New Roman"/>
-          <w:i/>
-          <w:iCs/>
-          <w:color w:val="000000" w:themeColor="text1"/>
-          <w:sz w:val="20"/>
-        </w:rPr>
-        <w:t xml:space="preserve"> Apprendre, enseigner, </w:t>
-      </w:r>
-      <w:proofErr w:type="gramStart"/>
-      <w:r>
-        <w:rPr>
-          <w:rFonts w:cs="Times New Roman"/>
-          <w:i/>
-          <w:iCs/>
-          <w:color w:val="000000" w:themeColor="text1"/>
-          <w:sz w:val="20"/>
-        </w:rPr>
-        <w:t>évaluer:</w:t>
-      </w:r>
-      <w:proofErr w:type="gramEnd"/>
-      <w:r>
-        <w:rPr>
-          <w:rFonts w:cs="Times New Roman"/>
-          <w:i/>
-          <w:iCs/>
-          <w:color w:val="000000" w:themeColor="text1"/>
-          <w:sz w:val="20"/>
-        </w:rPr>
-        <w:t xml:space="preserve"> Volume complémentaire</w:t>
-      </w:r>
-      <w:r>
-        <w:rPr>
-          <w:rFonts w:cs="Times New Roman"/>
-          <w:color w:val="000000" w:themeColor="text1"/>
-          <w:sz w:val="20"/>
-        </w:rPr>
-        <w:t>. Council of Europe.</w:t>
-      </w:r>
-    </w:p>
-    <w:p>
-      <w:pPr>
-        <w:pStyle w:val="Bibliography"/>
-        <w:rPr>
-          <w:rFonts w:cs="Times New Roman"/>
-          <w:color w:val="000000" w:themeColor="text1"/>
-          <w:sz w:val="20"/>
-        </w:rPr>
-      </w:pPr>
-      <w:r>
-        <w:rPr>
-          <w:rFonts w:cs="Times New Roman"/>
-          <w:i/>
-          <w:iCs/>
-          <w:color w:val="000000" w:themeColor="text1"/>
-          <w:sz w:val="20"/>
-        </w:rPr>
-        <w:t>La protection des élèves et de leurs données sur Internet</w:t>
-      </w:r>
-      <w:r>
-        <w:rPr>
-          <w:rFonts w:cs="Times New Roman"/>
-          <w:color w:val="000000" w:themeColor="text1"/>
-          <w:sz w:val="20"/>
-        </w:rPr>
-        <w:t xml:space="preserve">. (2019, </w:t>
-      </w:r>
-      <w:proofErr w:type="spellStart"/>
-      <w:r>
-        <w:rPr>
-          <w:rFonts w:cs="Times New Roman"/>
-          <w:color w:val="000000" w:themeColor="text1"/>
-          <w:sz w:val="20"/>
-        </w:rPr>
-        <w:t>November</w:t>
-      </w:r>
-      <w:proofErr w:type="spellEnd"/>
-      <w:r>
-        <w:rPr>
-          <w:rFonts w:cs="Times New Roman"/>
-          <w:color w:val="000000" w:themeColor="text1"/>
-          <w:sz w:val="20"/>
-        </w:rPr>
-        <w:t xml:space="preserve"> 7). Ministère de l’</w:t>
-      </w:r>
-      <w:proofErr w:type="spellStart"/>
-      <w:r>
-        <w:rPr>
-          <w:rFonts w:cs="Times New Roman"/>
-          <w:color w:val="000000" w:themeColor="text1"/>
-          <w:sz w:val="20"/>
-        </w:rPr>
-        <w:t>Education</w:t>
-      </w:r>
-      <w:proofErr w:type="spellEnd"/>
-      <w:r>
-        <w:rPr>
-          <w:rFonts w:cs="Times New Roman"/>
-          <w:color w:val="000000" w:themeColor="text1"/>
-          <w:sz w:val="20"/>
-        </w:rPr>
-        <w:t xml:space="preserve"> nationale. https://www.education.gouv.fr/la-protection-des-eleves-et-de-leurs-donnees-sur-internet-7073</w:t>
-      </w:r>
-    </w:p>
-    <w:p>
-      <w:pPr>
-        <w:pStyle w:val="Bibliography"/>
+      </w:pPr>
+      <w:r>
         <w:rPr>
           <w:rFonts w:cs="Times New Roman"/>
           <w:color w:val="000000" w:themeColor="text1"/>
           <w:sz w:val="20"/>
           <w:lang w:val="en-GB"/>
         </w:rPr>
-      </w:pPr>
-      <w:r>
-        <w:rPr>
-          <w:rFonts w:cs="Times New Roman"/>
-          <w:color w:val="000000" w:themeColor="text1"/>
-          <w:sz w:val="20"/>
-          <w:lang w:val="en-GB"/>
-        </w:rPr>
-        <w:lastRenderedPageBreak/>
-        <w:t xml:space="preserve">Lee, S. (2024). </w:t>
+        <w:t xml:space="preserve">Morgan, K. L. K. (2025). Phonemic Awareness and AI: Evaluating ChatGPT Plus for Structured Lesson Development. </w:t>
       </w:r>
       <w:r>
         <w:rPr>
@@ -18881,7 +18948,7 @@
           <w:sz w:val="20"/>
           <w:lang w:val="en-GB"/>
         </w:rPr>
-        <w:t>Enhancing pre-service EFL teachers’ TPACK through chatbot-integrated lesson planning projects</w:t>
+        <w:t>Texas Journal of Literacy Education</w:t>
       </w:r>
       <w:r>
         <w:rPr>
@@ -18890,26 +18957,7 @@
           <w:sz w:val="20"/>
           <w:lang w:val="en-GB"/>
         </w:rPr>
-        <w:t>.</w:t>
-      </w:r>
-    </w:p>
-    <w:p>
-      <w:pPr>
-        <w:pStyle w:val="Bibliography"/>
-        <w:rPr>
-          <w:rFonts w:cs="Times New Roman"/>
-          <w:color w:val="000000" w:themeColor="text1"/>
-          <w:sz w:val="20"/>
-        </w:rPr>
-      </w:pPr>
-      <w:r>
-        <w:rPr>
-          <w:rFonts w:cs="Times New Roman"/>
-          <w:color w:val="000000" w:themeColor="text1"/>
-          <w:sz w:val="20"/>
-          <w:lang w:val="en-GB"/>
-        </w:rPr>
-        <w:t xml:space="preserve">Liu, Y., &amp; Wang, H. (2024). </w:t>
+        <w:t xml:space="preserve">, </w:t>
       </w:r>
       <w:r>
         <w:rPr>
@@ -18920,9 +18968,73 @@
           <w:sz w:val="20"/>
           <w:lang w:val="en-GB"/>
         </w:rPr>
-        <w:t xml:space="preserve">Who on Earth Is Using Generative </w:t>
-      </w:r>
-      <w:proofErr w:type="gramStart"/>
+        <w:t>12</w:t>
+      </w:r>
+      <w:r>
+        <w:rPr>
+          <w:rFonts w:cs="Times New Roman"/>
+          <w:color w:val="000000" w:themeColor="text1"/>
+          <w:sz w:val="20"/>
+          <w:lang w:val="en-GB"/>
+        </w:rPr>
+        <w:t>(1). https://www.talejournal.com/index.php/TJLE/article/view/175</w:t>
+      </w:r>
+    </w:p>
+    <w:p>
+      <w:pPr>
+        <w:pStyle w:val="Bibliography"/>
+        <w:rPr>
+          <w:rFonts w:cs="Times New Roman"/>
+          <w:color w:val="000000" w:themeColor="text1"/>
+          <w:sz w:val="20"/>
+        </w:rPr>
+      </w:pPr>
+      <w:r>
+        <w:rPr>
+          <w:rFonts w:cs="Times New Roman"/>
+          <w:color w:val="000000" w:themeColor="text1"/>
+          <w:sz w:val="20"/>
+        </w:rPr>
+        <w:t xml:space="preserve">Ollivier, C. (2018). </w:t>
+      </w:r>
+      <w:r>
+        <w:rPr>
+          <w:rFonts w:cs="Times New Roman"/>
+          <w:i/>
+          <w:iCs/>
+          <w:color w:val="000000" w:themeColor="text1"/>
+          <w:sz w:val="20"/>
+        </w:rPr>
+        <w:t>Littératie numérique et approche socio-interactionnelle pour l’enseignement-apprentissage des langues</w:t>
+      </w:r>
+      <w:r>
+        <w:rPr>
+          <w:rFonts w:cs="Times New Roman"/>
+          <w:color w:val="000000" w:themeColor="text1"/>
+          <w:sz w:val="20"/>
+        </w:rPr>
+        <w:t>.</w:t>
+      </w:r>
+    </w:p>
+    <w:p>
+      <w:pPr>
+        <w:pStyle w:val="Bibliography"/>
+        <w:rPr>
+          <w:rFonts w:cs="Times New Roman"/>
+          <w:color w:val="000000" w:themeColor="text1"/>
+          <w:sz w:val="20"/>
+          <w:lang w:val="en-GB"/>
+        </w:rPr>
+      </w:pPr>
+      <w:r>
+        <w:rPr>
+          <w:rFonts w:cs="Times New Roman"/>
+          <w:color w:val="000000" w:themeColor="text1"/>
+          <w:sz w:val="20"/>
+          <w:lang w:val="en-GB"/>
+        </w:rPr>
+        <w:t xml:space="preserve">Richards, J. C. (1998). </w:t>
+      </w:r>
       <w:r>
         <w:rPr>
           <w:rFonts w:cs="Times New Roman"/>
@@ -18932,9 +19044,8 @@
           <w:sz w:val="20"/>
           <w:lang w:val="en-GB"/>
         </w:rPr>
-        <w:t>AI ?</w:t>
-      </w:r>
-      <w:proofErr w:type="gramEnd"/>
+        <w:t>Beyond Training: Perspectives on Language Teacher Education</w:t>
+      </w:r>
       <w:r>
         <w:rPr>
           <w:rFonts w:cs="Times New Roman"/>
@@ -18942,33 +19053,7 @@
           <w:sz w:val="20"/>
           <w:lang w:val="en-GB"/>
         </w:rPr>
-        <w:t xml:space="preserve"> </w:t>
-      </w:r>
-      <w:r>
-        <w:rPr>
-          <w:rFonts w:cs="Times New Roman"/>
-          <w:color w:val="000000" w:themeColor="text1"/>
-          <w:sz w:val="20"/>
-        </w:rPr>
-        <w:t xml:space="preserve">Washington, </w:t>
-      </w:r>
-      <w:proofErr w:type="gramStart"/>
-      <w:r>
-        <w:rPr>
-          <w:rFonts w:cs="Times New Roman"/>
-          <w:color w:val="000000" w:themeColor="text1"/>
-          <w:sz w:val="20"/>
-        </w:rPr>
-        <w:t>DC:</w:t>
-      </w:r>
-      <w:proofErr w:type="gramEnd"/>
-      <w:r>
-        <w:rPr>
-          <w:rFonts w:cs="Times New Roman"/>
-          <w:color w:val="000000" w:themeColor="text1"/>
-          <w:sz w:val="20"/>
-        </w:rPr>
-        <w:t xml:space="preserve"> World Bank. https://doi.org/10.1596/1813-9450-10870</w:t>
+        <w:t>. Cambridge University Press.</w:t>
       </w:r>
     </w:p>
     <w:p>
@@ -18986,107 +19071,10 @@
           <w:rFonts w:cs="Times New Roman"/>
           <w:color w:val="000000" w:themeColor="text1"/>
           <w:sz w:val="20"/>
-        </w:rPr>
-        <w:t xml:space="preserve">LOI N° 2005-380 Du 23 Avril 2005 d’orientation et de Programme Pour l’avenir de l’école (1) - Légifrance, LOI n° 2005-380. </w:t>
-      </w:r>
-      <w:r>
-        <w:rPr>
-          <w:rFonts w:cs="Times New Roman"/>
-          <w:color w:val="000000" w:themeColor="text1"/>
-          <w:sz w:val="20"/>
           <w:lang w:val="en-GB"/>
         </w:rPr>
-        <w:t>Retrieved May 30, 2026, from https://www.legifrance.gouv.fr/jorf/id/JORFTEXT000000259787/</w:t>
-      </w:r>
-    </w:p>
-    <w:p>
-      <w:pPr>
-        <w:pStyle w:val="Bibliography"/>
-        <w:rPr>
-          <w:rFonts w:cs="Times New Roman"/>
-          <w:color w:val="000000" w:themeColor="text1"/>
-          <w:sz w:val="20"/>
-        </w:rPr>
-      </w:pPr>
-      <w:r>
-        <w:rPr>
-          <w:rFonts w:cs="Times New Roman"/>
-          <w:i/>
-          <w:iCs/>
-          <w:color w:val="000000" w:themeColor="text1"/>
-          <w:sz w:val="20"/>
-        </w:rPr>
-        <w:t>Ministère de l’</w:t>
-      </w:r>
-      <w:proofErr w:type="spellStart"/>
-      <w:r>
-        <w:rPr>
-          <w:rFonts w:cs="Times New Roman"/>
-          <w:i/>
-          <w:iCs/>
-          <w:color w:val="000000" w:themeColor="text1"/>
-          <w:sz w:val="20"/>
-        </w:rPr>
-        <w:t>Education</w:t>
-      </w:r>
-      <w:proofErr w:type="spellEnd"/>
-      <w:r>
-        <w:rPr>
-          <w:rFonts w:cs="Times New Roman"/>
-          <w:i/>
-          <w:iCs/>
-          <w:color w:val="000000" w:themeColor="text1"/>
-          <w:sz w:val="20"/>
-        </w:rPr>
-        <w:t xml:space="preserve"> nationale 2025a</w:t>
-      </w:r>
-      <w:r>
-        <w:rPr>
-          <w:rFonts w:cs="Times New Roman"/>
-          <w:color w:val="000000" w:themeColor="text1"/>
-          <w:sz w:val="20"/>
-        </w:rPr>
-        <w:t>. (2025, June 13). Ministère de l’</w:t>
-      </w:r>
-      <w:proofErr w:type="spellStart"/>
-      <w:r>
-        <w:rPr>
-          <w:rFonts w:cs="Times New Roman"/>
-          <w:color w:val="000000" w:themeColor="text1"/>
-          <w:sz w:val="20"/>
-        </w:rPr>
-        <w:t>Education</w:t>
-      </w:r>
-      <w:proofErr w:type="spellEnd"/>
-      <w:r>
-        <w:rPr>
-          <w:rFonts w:cs="Times New Roman"/>
-          <w:color w:val="000000" w:themeColor="text1"/>
-          <w:sz w:val="20"/>
-        </w:rPr>
-        <w:t xml:space="preserve"> nationale. https://www.education.gouv.fr/cadre-d-usage-de-l-ia-en-education-450647</w:t>
-      </w:r>
-    </w:p>
-    <w:p>
-      <w:pPr>
-        <w:pStyle w:val="Bibliography"/>
-        <w:rPr>
-          <w:rFonts w:cs="Times New Roman"/>
-          <w:color w:val="000000" w:themeColor="text1"/>
-          <w:sz w:val="20"/>
-          <w:lang w:val="en-GB"/>
-        </w:rPr>
-      </w:pPr>
-      <w:r>
-        <w:rPr>
-          <w:rFonts w:cs="Times New Roman"/>
-          <w:color w:val="000000" w:themeColor="text1"/>
-          <w:sz w:val="20"/>
-          <w:lang w:val="en-GB"/>
-        </w:rPr>
-        <w:t xml:space="preserve">Mishra, P., Henriksen, D., Woo, L. J., &amp; Oster, N. (2025). Control vs. Agency: Exploring the History of AI in Education. </w:t>
-      </w:r>
-      <w:proofErr w:type="spellStart"/>
+        <w:t xml:space="preserve">Richards, J. C., &amp; Rodgers, T. S. (2014). </w:t>
+      </w:r>
       <w:r>
         <w:rPr>
           <w:rFonts w:cs="Times New Roman"/>
@@ -19096,9 +19084,8 @@
           <w:sz w:val="20"/>
           <w:lang w:val="en-GB"/>
         </w:rPr>
-        <w:t>TechTrends</w:t>
-      </w:r>
-      <w:proofErr w:type="spellEnd"/>
+        <w:t>Approaches and Methods in Language Teaching</w:t>
+      </w:r>
       <w:r>
         <w:rPr>
           <w:rFonts w:cs="Times New Roman"/>
@@ -19106,7 +19093,27 @@
           <w:sz w:val="20"/>
           <w:lang w:val="en-GB"/>
         </w:rPr>
-        <w:t xml:space="preserve">, </w:t>
+        <w:t>. Cambridge University Press.</w:t>
+      </w:r>
+    </w:p>
+    <w:p>
+      <w:pPr>
+        <w:pStyle w:val="Bibliography"/>
+        <w:rPr>
+          <w:rFonts w:cs="Times New Roman"/>
+          <w:color w:val="000000" w:themeColor="text1"/>
+          <w:sz w:val="20"/>
+          <w:lang w:val="en-GB"/>
+        </w:rPr>
+      </w:pPr>
+      <w:r>
+        <w:rPr>
+          <w:rFonts w:cs="Times New Roman"/>
+          <w:color w:val="000000" w:themeColor="text1"/>
+          <w:sz w:val="20"/>
+          <w:lang w:val="en-GB"/>
+        </w:rPr>
+        <w:t xml:space="preserve">Rogers, E. M. (2003). </w:t>
       </w:r>
       <w:r>
         <w:rPr>
@@ -19117,7 +19124,7 @@
           <w:sz w:val="20"/>
           <w:lang w:val="en-GB"/>
         </w:rPr>
-        <w:t>69</w:t>
+        <w:t>Diffusion of Innovations, 5th Edition</w:t>
       </w:r>
       <w:r>
         <w:rPr>
@@ -19126,7 +19133,7 @@
           <w:sz w:val="20"/>
           <w:lang w:val="en-GB"/>
         </w:rPr>
-        <w:t>(2), 247–253. https://doi.org/10.1007/s11528-025-01064-2</w:t>
+        <w:t>. Simon and Schuster.</w:t>
       </w:r>
     </w:p>
     <w:p>
@@ -19146,245 +19153,7 @@
           <w:sz w:val="20"/>
           <w:lang w:val="en-GB"/>
         </w:rPr>
-        <w:t xml:space="preserve">Morgan, K. L. K. (2025). Phonemic Awareness and AI: Evaluating ChatGPT Plus for Structured Lesson Development. </w:t>
-      </w:r>
-      <w:r>
-        <w:rPr>
-          <w:rFonts w:cs="Times New Roman"/>
-          <w:i/>
-          <w:iCs/>
-          <w:color w:val="000000" w:themeColor="text1"/>
-          <w:sz w:val="20"/>
-          <w:lang w:val="en-GB"/>
-        </w:rPr>
-        <w:t>Texas Journal of Literacy Education</w:t>
-      </w:r>
-      <w:r>
-        <w:rPr>
-          <w:rFonts w:cs="Times New Roman"/>
-          <w:color w:val="000000" w:themeColor="text1"/>
-          <w:sz w:val="20"/>
-          <w:lang w:val="en-GB"/>
-        </w:rPr>
-        <w:t xml:space="preserve">, </w:t>
-      </w:r>
-      <w:r>
-        <w:rPr>
-          <w:rFonts w:cs="Times New Roman"/>
-          <w:i/>
-          <w:iCs/>
-          <w:color w:val="000000" w:themeColor="text1"/>
-          <w:sz w:val="20"/>
-          <w:lang w:val="en-GB"/>
-        </w:rPr>
-        <w:t>12</w:t>
-      </w:r>
-      <w:r>
-        <w:rPr>
-          <w:rFonts w:cs="Times New Roman"/>
-          <w:color w:val="000000" w:themeColor="text1"/>
-          <w:sz w:val="20"/>
-          <w:lang w:val="en-GB"/>
-        </w:rPr>
-        <w:t>(1). https://www.talejournal.com/index.php/TJLE/article/view/175</w:t>
-      </w:r>
-    </w:p>
-    <w:p>
-      <w:pPr>
-        <w:pStyle w:val="Bibliography"/>
-        <w:rPr>
-          <w:rFonts w:cs="Times New Roman"/>
-          <w:color w:val="000000" w:themeColor="text1"/>
-          <w:sz w:val="20"/>
-        </w:rPr>
-      </w:pPr>
-      <w:r>
-        <w:rPr>
-          <w:rFonts w:cs="Times New Roman"/>
-          <w:color w:val="000000" w:themeColor="text1"/>
-          <w:sz w:val="20"/>
-        </w:rPr>
-        <w:t xml:space="preserve">Ollivier, C. (2018). </w:t>
-      </w:r>
-      <w:r>
-        <w:rPr>
-          <w:rFonts w:cs="Times New Roman"/>
-          <w:i/>
-          <w:iCs/>
-          <w:color w:val="000000" w:themeColor="text1"/>
-          <w:sz w:val="20"/>
-        </w:rPr>
-        <w:t>Littératie numérique et approche socio-interactionnelle pour l’enseignement-apprentissage des langues</w:t>
-      </w:r>
-      <w:r>
-        <w:rPr>
-          <w:rFonts w:cs="Times New Roman"/>
-          <w:color w:val="000000" w:themeColor="text1"/>
-          <w:sz w:val="20"/>
-        </w:rPr>
-        <w:t>.</w:t>
-      </w:r>
-    </w:p>
-    <w:p>
-      <w:pPr>
-        <w:pStyle w:val="Bibliography"/>
-        <w:rPr>
-          <w:rFonts w:cs="Times New Roman"/>
-          <w:color w:val="000000" w:themeColor="text1"/>
-          <w:sz w:val="20"/>
-          <w:lang w:val="en-GB"/>
-        </w:rPr>
-      </w:pPr>
-      <w:r>
-        <w:rPr>
-          <w:rFonts w:cs="Times New Roman"/>
-          <w:color w:val="000000" w:themeColor="text1"/>
-          <w:sz w:val="20"/>
-          <w:lang w:val="en-GB"/>
-        </w:rPr>
-        <w:t xml:space="preserve">Richards, J. C. (1998). </w:t>
-      </w:r>
-      <w:r>
-        <w:rPr>
-          <w:rFonts w:cs="Times New Roman"/>
-          <w:i/>
-          <w:iCs/>
-          <w:color w:val="000000" w:themeColor="text1"/>
-          <w:sz w:val="20"/>
-          <w:lang w:val="en-GB"/>
-        </w:rPr>
-        <w:t>Beyond Training: Perspectives on Language Teacher Education</w:t>
-      </w:r>
-      <w:r>
-        <w:rPr>
-          <w:rFonts w:cs="Times New Roman"/>
-          <w:color w:val="000000" w:themeColor="text1"/>
-          <w:sz w:val="20"/>
-          <w:lang w:val="en-GB"/>
-        </w:rPr>
-        <w:t>. Cambridge University Press.</w:t>
-      </w:r>
-    </w:p>
-    <w:p>
-      <w:pPr>
-        <w:pStyle w:val="Bibliography"/>
-        <w:rPr>
-          <w:rFonts w:cs="Times New Roman"/>
-          <w:color w:val="000000" w:themeColor="text1"/>
-          <w:sz w:val="20"/>
-          <w:lang w:val="en-GB"/>
-        </w:rPr>
-      </w:pPr>
-      <w:r>
-        <w:rPr>
-          <w:rFonts w:cs="Times New Roman"/>
-          <w:color w:val="000000" w:themeColor="text1"/>
-          <w:sz w:val="20"/>
-          <w:lang w:val="en-GB"/>
-        </w:rPr>
-        <w:t xml:space="preserve">Richards, J. C., &amp; Rodgers, T. S. (2014). </w:t>
-      </w:r>
-      <w:r>
-        <w:rPr>
-          <w:rFonts w:cs="Times New Roman"/>
-          <w:i/>
-          <w:iCs/>
-          <w:color w:val="000000" w:themeColor="text1"/>
-          <w:sz w:val="20"/>
-          <w:lang w:val="en-GB"/>
-        </w:rPr>
-        <w:t>Approaches and Methods in Language Teaching</w:t>
-      </w:r>
-      <w:r>
-        <w:rPr>
-          <w:rFonts w:cs="Times New Roman"/>
-          <w:color w:val="000000" w:themeColor="text1"/>
-          <w:sz w:val="20"/>
-          <w:lang w:val="en-GB"/>
-        </w:rPr>
-        <w:t>. Cambridge University Press.</w:t>
-      </w:r>
-    </w:p>
-    <w:p>
-      <w:pPr>
-        <w:pStyle w:val="Bibliography"/>
-        <w:rPr>
-          <w:rFonts w:cs="Times New Roman"/>
-          <w:color w:val="000000" w:themeColor="text1"/>
-          <w:sz w:val="20"/>
-          <w:lang w:val="en-GB"/>
-        </w:rPr>
-      </w:pPr>
-      <w:r>
-        <w:rPr>
-          <w:rFonts w:cs="Times New Roman"/>
-          <w:color w:val="000000" w:themeColor="text1"/>
-          <w:sz w:val="20"/>
-          <w:lang w:val="en-GB"/>
-        </w:rPr>
-        <w:t xml:space="preserve">Rogers, E. M. (2003). </w:t>
-      </w:r>
-      <w:r>
-        <w:rPr>
-          <w:rFonts w:cs="Times New Roman"/>
-          <w:i/>
-          <w:iCs/>
-          <w:color w:val="000000" w:themeColor="text1"/>
-          <w:sz w:val="20"/>
-          <w:lang w:val="en-GB"/>
-        </w:rPr>
-        <w:t>Diffusion of Innovations, 5th Edition</w:t>
-      </w:r>
-      <w:r>
-        <w:rPr>
-          <w:rFonts w:cs="Times New Roman"/>
-          <w:color w:val="000000" w:themeColor="text1"/>
-          <w:sz w:val="20"/>
-          <w:lang w:val="en-GB"/>
-        </w:rPr>
-        <w:t>. Simon and Schuster.</w:t>
-      </w:r>
-    </w:p>
-    <w:p>
-      <w:pPr>
-        <w:pStyle w:val="Bibliography"/>
-        <w:rPr>
-          <w:rFonts w:cs="Times New Roman"/>
-          <w:color w:val="000000" w:themeColor="text1"/>
-          <w:sz w:val="20"/>
-          <w:lang w:val="en-GB"/>
-        </w:rPr>
-      </w:pPr>
-      <w:r>
-        <w:rPr>
-          <w:rFonts w:cs="Times New Roman"/>
-          <w:color w:val="000000" w:themeColor="text1"/>
-          <w:sz w:val="20"/>
-          <w:lang w:val="en-GB"/>
-        </w:rPr>
-        <w:t xml:space="preserve">Shulman, L. (1987). Knowledge and </w:t>
-      </w:r>
-      <w:proofErr w:type="spellStart"/>
-      <w:proofErr w:type="gramStart"/>
-      <w:r>
-        <w:rPr>
-          <w:rFonts w:cs="Times New Roman"/>
-          <w:color w:val="000000" w:themeColor="text1"/>
-          <w:sz w:val="20"/>
-          <w:lang w:val="en-GB"/>
-        </w:rPr>
-        <w:t>Teaching:Foundations</w:t>
-      </w:r>
-      <w:proofErr w:type="spellEnd"/>
-      <w:proofErr w:type="gramEnd"/>
-      <w:r>
-        <w:rPr>
-          <w:rFonts w:cs="Times New Roman"/>
-          <w:color w:val="000000" w:themeColor="text1"/>
-          <w:sz w:val="20"/>
-          <w:lang w:val="en-GB"/>
-        </w:rPr>
-        <w:t xml:space="preserve"> of the New Reform. </w:t>
+        <w:t xml:space="preserve">Shulman, L. (1987). Knowledge and Teaching:Foundations of the New Reform. </w:t>
       </w:r>
       <w:r>
         <w:rPr>
@@ -19754,9 +19523,9 @@
             <o:lock v:ext="edit" aspectratio="t"/>
           </v:shapetype>
           <v:shape id="_x0000_s2050" type="#_x0000_t75" alt="" style="position:absolute;left:0;text-align:left;margin-left:-14.55pt;margin-top:28.7pt;width:6in;height:658.95pt;z-index:251663360;mso-wrap-edited:f;mso-width-percent:0;mso-height-percent:0;mso-position-horizontal-relative:text;mso-position-vertical-relative:text;mso-width-percent:0;mso-height-percent:0">
-            <v:imagedata r:id="rId18" o:title=""/>
+            <v:imagedata r:id="rId19" o:title=""/>
           </v:shape>
-          <o:OLEObject Type="Embed" ProgID="Word.Document.12" ShapeID="_x0000_s2050" DrawAspect="Content" ObjectID="_1843508841" r:id="rId19">
+          <o:OLEObject Type="Embed" ProgID="Word.Document.12" ShapeID="_x0000_s2050" DrawAspect="Content" ObjectID="_1843588436" r:id="rId20">
             <o:FieldCodes>\s</o:FieldCodes>
           </o:OLEObject>
         </w:object>
@@ -30962,7 +30731,7 @@
                     </pic:cNvPicPr>
                   </pic:nvPicPr>
                   <pic:blipFill>
-                    <a:blip r:embed="rId20">
+                    <a:blip r:embed="rId21">
                       <a:extLst>
                         <a:ext uri="{28A0092B-C50C-407E-A947-70E740481C1C}">
                           <a14:useLocalDpi xmlns:a14="http://schemas.microsoft.com/office/drawing/2010/main" val="0"/>

</xml_diff>